<commit_message>
Update resume KPI: throughput as main metric, RTF as supporting
</commit_message>
<xml_diff>
--- a/assets/resume.docx
+++ b/assets/resume.docx
@@ -419,12 +419,16 @@
         <w:ind w:left="360"/>
       </w:pPr>
       <w:r>
-        <w:rPr>
-          <w:rFonts w:ascii="Calibri" w:eastAsia="Calibri" w:hAnsi="Calibri" w:cs="Calibri"/>
-          <w:sz w:val="22"/>
-          <w:szCs w:val="22"/>
-        </w:rPr>
-        <w:t>✓ 초저지연 스트리밍: RTF (Real-Time Factor): 0.1 이하</w:t>
+        <w:t>✓ Throughput: 0.68 → 1.41 rps (2배), 최적화 후 ~1.7 rps (2.5배 향상)</w:t>
+      </w:r>
+    </w:p>
+    <w:p>
+      <w:pPr>
+        <w:spacing w:after="40" w:line="260" w:lineRule="auto"/>
+        <w:ind w:left="360"/>
+      </w:pPr>
+      <w:r>
+        <w:t>✓ 단건 지연시간 15% 감소 | RTF (Real-Time Factor) 0.1 이하</w:t>
       </w:r>
     </w:p>
     <w:p>

</xml_diff>

<commit_message>
Add background/goal line to each project in resume
</commit_message>
<xml_diff>
--- a/assets/resume.docx
+++ b/assets/resume.docx
@@ -224,6 +224,17 @@
     </w:p>
     <w:p>
       <w:pPr>
+        <w:spacing w:after="120"/>
+      </w:pPr>
+      <w:r>
+        <w:rPr>
+          <w:b w:val="0"/>
+        </w:rPr>
+        <w:t>▸ 배경: 고객 상담 센터 실시간 음성 합성 필요 — 기존 응답 시간(2.3초)·동시 채널(12개) 제약 극복 목표</w:t>
+      </w:r>
+    </w:p>
+    <w:p>
+      <w:pPr>
         <w:spacing w:after="60"/>
         <w:ind w:left="360"/>
       </w:pPr>
@@ -766,6 +777,17 @@
           <w:szCs w:val="24"/>
         </w:rPr>
         <w:t>STT 배포 (AICESS)</w:t>
+      </w:r>
+    </w:p>
+    <w:p>
+      <w:pPr>
+        <w:spacing w:after="80" w:line="260" w:lineRule="auto"/>
+      </w:pPr>
+      <w:r>
+        <w:rPr>
+          <w:b w:val="0"/>
+        </w:rPr>
+        <w:t>• 배경: 하루 수천 건 상담 전화 실시간 처리 필요 — 기존 시스템 병목으로 동시 채널 부족</w:t>
       </w:r>
     </w:p>
     <w:p>
@@ -872,6 +894,17 @@
     </w:p>
     <w:p>
       <w:pPr>
+        <w:spacing w:after="80" w:line="260" w:lineRule="auto"/>
+      </w:pPr>
+      <w:r>
+        <w:rPr>
+          <w:b w:val="0"/>
+        </w:rPr>
+        <w:t>• 배경: 20개 이상 AI 서비스 수동 배포로 배포 시간 수 시간 소요 — 자동화 및 확장성 확보 목표</w:t>
+      </w:r>
+    </w:p>
+    <w:p>
+      <w:pPr>
         <w:spacing w:after="40" w:line="260" w:lineRule="auto"/>
         <w:ind w:left="300" w:hanging="300"/>
       </w:pPr>
@@ -947,6 +980,17 @@
     </w:p>
     <w:p>
       <w:pPr>
+        <w:spacing w:after="80" w:line="260" w:lineRule="auto"/>
+      </w:pPr>
+      <w:r>
+        <w:rPr>
+          <w:b w:val="0"/>
+        </w:rPr>
+        <w:t>• 배경: 자율주행 환경 인식에 3D 거리/높이 정보 필수 — 2D 세그멘테이션 한계 극복 위한 센서 퓨전 연구</w:t>
+      </w:r>
+    </w:p>
+    <w:p>
+      <w:pPr>
         <w:spacing w:after="40" w:line="260" w:lineRule="auto"/>
         <w:ind w:left="300" w:hanging="300"/>
       </w:pPr>
@@ -1019,6 +1063,17 @@
           <w:szCs w:val="24"/>
         </w:rPr>
         <w:t>NLP-based Text Summarization System</w:t>
+      </w:r>
+    </w:p>
+    <w:p>
+      <w:pPr>
+        <w:spacing w:after="80" w:line="260" w:lineRule="auto"/>
+      </w:pPr>
+      <w:r>
+        <w:rPr>
+          <w:b w:val="0"/>
+        </w:rPr>
+        <w:t>• 배경: 사내 회의록·업무 문서 다수 생성 — 핵심 내용 자동 요약 및 업무 효율화 필요</w:t>
       </w:r>
     </w:p>
     <w:p>
@@ -1123,6 +1178,17 @@
           <w:szCs w:val="24"/>
         </w:rPr>
         <w:t>OCR Dataset Auto-Generation Tool</w:t>
+      </w:r>
+    </w:p>
+    <w:p>
+      <w:pPr>
+        <w:spacing w:after="80" w:line="260" w:lineRule="auto"/>
+      </w:pPr>
+      <w:r>
+        <w:rPr>
+          <w:b w:val="0"/>
+        </w:rPr>
+        <w:t>• 배경: OCR 학습 데이터 대량 생성 필요 — 수동 주석 작업 병목 해결 목표</w:t>
       </w:r>
     </w:p>
     <w:p>

</xml_diff>

<commit_message>
Update downloadable resume: 13 improvements applied
</commit_message>
<xml_diff>
--- a/assets/resume.docx
+++ b/assets/resume.docx
@@ -44,7 +44,7 @@
         <w:jc w:val="center"/>
       </w:pPr>
       <w:r>
-        <w:t>yoon7829@gmail.com | github.com/ckc5800 | taepseon.tistory.com</w:t>
+        <w:t>yoon7829@gmail.com | ckc5800.github.io | github.com/ckc5800 | taepseon.tistory.com</w:t>
       </w:r>
     </w:p>
     <w:p>
@@ -102,7 +102,7 @@
         <w:ind w:left="300" w:hanging="300"/>
       </w:pPr>
       <w:r>
-        <w:t>• 6년차 AI 엔지니어, 프로덕션 ML 시스템 구축 전문</w:t>
+        <w:t>• 음성 AI·MLOps 전문 — 프로덕션 ML 시스템 구축 및 운영 6년차</w:t>
       </w:r>
     </w:p>
     <w:p>
@@ -398,6 +398,80 @@
           <w:sz w:val="22"/>
           <w:szCs w:val="22"/>
         </w:rPr>
+        <w:t>▸ 기능 확장</w:t>
+      </w:r>
+    </w:p>
+    <w:p>
+      <w:pPr>
+        <w:spacing w:after="100" w:line="280" w:lineRule="auto"/>
+        <w:ind w:left="360"/>
+      </w:pPr>
+      <w:proofErr w:type="spellStart"/>
+      <w:r>
+        <w:t>ICL(In-Context Learning) 기반 음성복제 기능 구현. OpenAI TTS API 호환 인터페이스 및 기존 WebSocket 프로토콜 호환 레이어 개발로 서비스 연동 지원.</w:t>
+      </w:r>
+      <w:proofErr w:type="spellEnd"/>
+      <w:r/>
+      <w:r/>
+      <w:r/>
+      <w:r/>
+      <w:r/>
+      <w:proofErr w:type="spellStart"/>
+      <w:r/>
+      <w:proofErr w:type="spellEnd"/>
+      <w:r/>
+      <w:r/>
+      <w:r/>
+      <w:r/>
+      <w:r/>
+      <w:proofErr w:type="spellStart"/>
+      <w:r/>
+      <w:proofErr w:type="spellEnd"/>
+      <w:r/>
+      <w:proofErr w:type="spellStart"/>
+      <w:r/>
+      <w:proofErr w:type="spellEnd"/>
+      <w:r/>
+      <w:r/>
+      <w:r/>
+      <w:r/>
+      <w:r/>
+      <w:r/>
+      <w:r/>
+      <w:r/>
+      <w:r/>
+      <w:r/>
+      <w:r/>
+      <w:r/>
+      <w:r/>
+      <w:proofErr w:type="spellStart"/>
+      <w:r/>
+      <w:proofErr w:type="spellEnd"/>
+      <w:r/>
+      <w:r/>
+      <w:r/>
+      <w:r/>
+      <w:r/>
+      <w:r/>
+      <w:r/>
+      <w:r/>
+      <w:r/>
+      <w:r/>
+      <w:r/>
+    </w:p>
+    <w:p>
+      <w:pPr>
+        <w:spacing w:after="60"/>
+        <w:ind w:left="360"/>
+      </w:pPr>
+      <w:r>
+        <w:rPr>
+          <w:rFonts w:ascii="Calibri" w:eastAsia="Calibri" w:hAnsi="Calibri" w:cs="Calibri"/>
+          <w:b/>
+          <w:bCs/>
+          <w:sz w:val="22"/>
+          <w:szCs w:val="22"/>
+        </w:rPr>
         <w:t>▸ 성과 (KPI)</w:t>
       </w:r>
     </w:p>
@@ -439,7 +513,7 @@
         <w:ind w:left="360"/>
       </w:pPr>
       <w:r>
-        <w:t>✓ 단건 지연시간 15% 감소 | RTF (Real-Time Factor) 0.1 이하</w:t>
+        <w:t>✓ 단건 지연시간 15% 감소 | RTF 0.1 이하 | CER(문자 오류율) 3~5%</w:t>
       </w:r>
     </w:p>
     <w:p>
@@ -744,24 +818,16 @@
         <w:ind w:left="360"/>
       </w:pPr>
       <w:r>
-        <w:t xml:space="preserve">Python 3.12, </w:t>
-      </w:r>
-      <w:proofErr w:type="spellStart"/>
-      <w:r>
-        <w:t>FastAPI</w:t>
-      </w:r>
-      <w:proofErr w:type="spellEnd"/>
-      <w:r>
-        <w:t xml:space="preserve">, WebSocket, </w:t>
-      </w:r>
-      <w:proofErr w:type="spellStart"/>
-      <w:r>
-        <w:t>vLLM</w:t>
-      </w:r>
-      <w:proofErr w:type="spellEnd"/>
-      <w:r>
-        <w:t>-Omni, Redis (Pub/Sub, Distributed Lock, TTL Cache), React 18, TypeScript, CUDA Optimization, FP8 Quantization</w:t>
-      </w:r>
+        <w:t>Python 3.11+, FastAPI, WebSocket, vLLM-Omni, Redis (Pub/Sub, Distributed Lock, TTL Cache), React 18, TypeScript, CUDA Optimization, FP8 Quantization</w:t>
+      </w:r>
+      <w:proofErr w:type="spellStart"/>
+      <w:r/>
+      <w:proofErr w:type="spellEnd"/>
+      <w:r/>
+      <w:proofErr w:type="spellStart"/>
+      <w:r/>
+      <w:proofErr w:type="spellEnd"/>
+      <w:r/>
     </w:p>
     <w:p>
       <w:pPr>
@@ -811,15 +877,14 @@
           <w:sz w:val="22"/>
           <w:szCs w:val="22"/>
         </w:rPr>
-        <w:t xml:space="preserve">• </w:t>
-      </w:r>
-      <w:r>
-        <w:rPr>
-          <w:rFonts w:ascii="Calibri" w:eastAsia="Calibri" w:hAnsi="Calibri" w:cs="Calibri"/>
-          <w:sz w:val="22"/>
-          <w:szCs w:val="22"/>
-        </w:rPr>
-        <w:t>Technologies: Triton Inference Server, Streaming ASR Pipeline</w:t>
+        <w:t>• 기술: Triton Inference Server, Streaming ASR Pipeline, Docker</w:t>
+      </w:r>
+      <w:r>
+        <w:rPr>
+          <w:rFonts w:ascii="Calibri" w:eastAsia="Calibri" w:hAnsi="Calibri" w:cs="Calibri"/>
+          <w:sz w:val="22"/>
+          <w:szCs w:val="22"/>
+        </w:rPr>
       </w:r>
     </w:p>
     <w:p>
@@ -829,6 +894,49 @@
       </w:pPr>
       <w:r>
         <w:t>• Triton Inference Server 기반 추론 환경 최적화로 동시 처리 채널 확장, 추론 파이프라인 개선</w:t>
+      </w:r>
+    </w:p>
+    <w:p>
+      <w:pPr>
+        <w:spacing w:after="80" w:line="260" w:lineRule="auto"/>
+      </w:pPr>
+      <w:r>
+        <w:rPr>
+          <w:rFonts w:ascii="Calibri" w:eastAsia="Calibri" w:hAnsi="Calibri" w:cs="Calibri"/>
+          <w:b/>
+          <w:bCs/>
+          <w:color w:val="333333"/>
+          <w:sz w:val="24"/>
+          <w:szCs w:val="24"/>
+        </w:rPr>
+        <w:t>Speaker Diarization (AICESS)</w:t>
+      </w:r>
+    </w:p>
+    <w:p>
+      <w:pPr>
+        <w:spacing w:after="250" w:line="260" w:lineRule="auto"/>
+        <w:ind w:left="300" w:hanging="300"/>
+      </w:pPr>
+      <w:r>
+        <w:t>• 배경: 상담 품질 분석 위한 발화자 식별 필요 — 상담사/고객 구분 자동화 목표</w:t>
+      </w:r>
+    </w:p>
+    <w:p>
+      <w:pPr>
+        <w:spacing w:after="250" w:line="260" w:lineRule="auto"/>
+        <w:ind w:left="300" w:hanging="300"/>
+      </w:pPr>
+      <w:r>
+        <w:t>• Pyannote 사전 학습 모델을 한국어 상담 데이터로 파인튜닝, 화자 분할 → STT → 분석 파이프라인 구축</w:t>
+      </w:r>
+    </w:p>
+    <w:p>
+      <w:pPr>
+        <w:spacing w:after="250" w:line="260" w:lineRule="auto"/>
+        <w:ind w:left="300" w:hanging="300"/>
+      </w:pPr>
+      <w:r>
+        <w:t>• 기술: Pyannote, PyTorch, Audio Processing</w:t>
       </w:r>
     </w:p>
     <w:p>
@@ -1274,276 +1382,243 @@
         <w:pBdr>
           <w:bottom w:val="single" w:sz="8" w:space="1" w:color="1F4788"/>
         </w:pBdr>
-        <w:spacing w:before="200" w:after="120"/>
-      </w:pPr>
-      <w:r>
-        <w:t>TECHNICAL SKILLS</w:t>
-      </w:r>
-    </w:p>
-    <w:p>
-      <w:pPr>
-        <w:spacing w:after="60" w:line="260" w:lineRule="auto"/>
-      </w:pPr>
-      <w:r>
-        <w:rPr>
-          <w:rFonts w:ascii="Calibri" w:eastAsia="Calibri" w:hAnsi="Calibri" w:cs="Calibri"/>
-          <w:b/>
-          <w:bCs/>
-          <w:sz w:val="22"/>
-          <w:szCs w:val="22"/>
-        </w:rPr>
-        <w:t xml:space="preserve">Languages: </w:t>
-      </w:r>
-      <w:r>
-        <w:rPr>
-          <w:rFonts w:ascii="Calibri" w:eastAsia="Calibri" w:hAnsi="Calibri" w:cs="Calibri"/>
-          <w:sz w:val="22"/>
-          <w:szCs w:val="22"/>
-        </w:rPr>
-        <w:t>Python (Expert), TypeScript, Bash, SQL</w:t>
-      </w:r>
-    </w:p>
-    <w:p>
-      <w:pPr>
-        <w:spacing w:after="60" w:line="260" w:lineRule="auto"/>
-      </w:pPr>
-      <w:r>
-        <w:rPr>
-          <w:rFonts w:ascii="Calibri" w:eastAsia="Calibri" w:hAnsi="Calibri" w:cs="Calibri"/>
-          <w:b/>
-          <w:bCs/>
-          <w:sz w:val="22"/>
-          <w:szCs w:val="22"/>
-        </w:rPr>
-        <w:t xml:space="preserve">AI/ML: </w:t>
-      </w:r>
-      <w:proofErr w:type="spellStart"/>
-      <w:r>
-        <w:rPr>
-          <w:rFonts w:ascii="Calibri" w:eastAsia="Calibri" w:hAnsi="Calibri" w:cs="Calibri"/>
-          <w:sz w:val="22"/>
-          <w:szCs w:val="22"/>
-        </w:rPr>
-        <w:t>PyTorch</w:t>
-      </w:r>
-      <w:proofErr w:type="spellEnd"/>
-      <w:r>
-        <w:rPr>
-          <w:rFonts w:ascii="Calibri" w:eastAsia="Calibri" w:hAnsi="Calibri" w:cs="Calibri"/>
-          <w:sz w:val="22"/>
-          <w:szCs w:val="22"/>
-        </w:rPr>
-        <w:t xml:space="preserve">, Hugging Face, </w:t>
-      </w:r>
-      <w:proofErr w:type="spellStart"/>
-      <w:r>
-        <w:rPr>
-          <w:rFonts w:ascii="Calibri" w:eastAsia="Calibri" w:hAnsi="Calibri" w:cs="Calibri"/>
-          <w:sz w:val="22"/>
-          <w:szCs w:val="22"/>
-        </w:rPr>
-        <w:t>vLLM</w:t>
-      </w:r>
-      <w:proofErr w:type="spellEnd"/>
-      <w:r>
-        <w:rPr>
-          <w:rFonts w:ascii="Calibri" w:eastAsia="Calibri" w:hAnsi="Calibri" w:cs="Calibri"/>
-          <w:sz w:val="22"/>
-          <w:szCs w:val="22"/>
-        </w:rPr>
-        <w:t>, ONNX Runtime, Whisper</w:t>
-      </w:r>
-    </w:p>
-    <w:p>
-      <w:pPr>
-        <w:spacing w:after="60" w:line="260" w:lineRule="auto"/>
-      </w:pPr>
-      <w:r>
-        <w:rPr>
-          <w:rFonts w:ascii="Calibri" w:eastAsia="Calibri" w:hAnsi="Calibri" w:cs="Calibri"/>
-          <w:b/>
-          <w:bCs/>
-          <w:sz w:val="22"/>
-          <w:szCs w:val="22"/>
-        </w:rPr>
-        <w:t xml:space="preserve">Model Serving: </w:t>
-      </w:r>
-      <w:proofErr w:type="spellStart"/>
-      <w:r>
-        <w:rPr>
-          <w:rFonts w:ascii="Calibri" w:eastAsia="Calibri" w:hAnsi="Calibri" w:cs="Calibri"/>
-          <w:sz w:val="22"/>
-          <w:szCs w:val="22"/>
-        </w:rPr>
-        <w:t>vLLM</w:t>
-      </w:r>
-      <w:proofErr w:type="spellEnd"/>
-      <w:r>
-        <w:rPr>
-          <w:rFonts w:ascii="Calibri" w:eastAsia="Calibri" w:hAnsi="Calibri" w:cs="Calibri"/>
-          <w:sz w:val="22"/>
-          <w:szCs w:val="22"/>
-        </w:rPr>
-        <w:t>, Triton Inference Server, ONNX Runtime</w:t>
-      </w:r>
-    </w:p>
-    <w:p>
-      <w:pPr>
-        <w:spacing w:after="60" w:line="260" w:lineRule="auto"/>
-      </w:pPr>
-      <w:r>
-        <w:rPr>
-          <w:rFonts w:ascii="Calibri" w:eastAsia="Calibri" w:hAnsi="Calibri" w:cs="Calibri"/>
-          <w:b/>
-          <w:bCs/>
-          <w:sz w:val="22"/>
-          <w:szCs w:val="22"/>
-        </w:rPr>
-        <w:t xml:space="preserve">Backend: </w:t>
-      </w:r>
-      <w:proofErr w:type="spellStart"/>
-      <w:r>
-        <w:rPr>
-          <w:rFonts w:ascii="Calibri" w:eastAsia="Calibri" w:hAnsi="Calibri" w:cs="Calibri"/>
-          <w:sz w:val="22"/>
-          <w:szCs w:val="22"/>
-        </w:rPr>
-        <w:t>FastAPI</w:t>
-      </w:r>
-      <w:proofErr w:type="spellEnd"/>
-      <w:r>
-        <w:rPr>
-          <w:rFonts w:ascii="Calibri" w:eastAsia="Calibri" w:hAnsi="Calibri" w:cs="Calibri"/>
-          <w:sz w:val="22"/>
-          <w:szCs w:val="22"/>
-        </w:rPr>
-        <w:t xml:space="preserve">, </w:t>
-      </w:r>
-      <w:proofErr w:type="spellStart"/>
-      <w:r>
-        <w:rPr>
-          <w:rFonts w:ascii="Calibri" w:eastAsia="Calibri" w:hAnsi="Calibri" w:cs="Calibri"/>
-          <w:sz w:val="22"/>
-          <w:szCs w:val="22"/>
-        </w:rPr>
-        <w:t>gRPC</w:t>
-      </w:r>
-      <w:proofErr w:type="spellEnd"/>
-      <w:r>
-        <w:rPr>
-          <w:rFonts w:ascii="Calibri" w:eastAsia="Calibri" w:hAnsi="Calibri" w:cs="Calibri"/>
-          <w:sz w:val="22"/>
-          <w:szCs w:val="22"/>
-        </w:rPr>
-        <w:t xml:space="preserve">, WebSocket, REST APIs, </w:t>
-      </w:r>
-      <w:proofErr w:type="spellStart"/>
-      <w:r>
-        <w:rPr>
-          <w:rFonts w:ascii="Calibri" w:eastAsia="Calibri" w:hAnsi="Calibri" w:cs="Calibri"/>
-          <w:sz w:val="22"/>
-          <w:szCs w:val="22"/>
-        </w:rPr>
-        <w:t>Asyncio</w:t>
-      </w:r>
-      <w:proofErr w:type="spellEnd"/>
-    </w:p>
-    <w:p>
-      <w:pPr>
-        <w:spacing w:after="60" w:line="260" w:lineRule="auto"/>
-      </w:pPr>
-      <w:r>
-        <w:rPr>
-          <w:rFonts w:ascii="Calibri" w:eastAsia="Calibri" w:hAnsi="Calibri" w:cs="Calibri"/>
-          <w:b/>
-          <w:bCs/>
-          <w:sz w:val="22"/>
-          <w:szCs w:val="22"/>
-        </w:rPr>
-        <w:t xml:space="preserve">DevOps: </w:t>
-      </w:r>
-      <w:r>
-        <w:rPr>
-          <w:rFonts w:ascii="Calibri" w:eastAsia="Calibri" w:hAnsi="Calibri" w:cs="Calibri"/>
-          <w:sz w:val="22"/>
-          <w:szCs w:val="22"/>
-        </w:rPr>
-        <w:t xml:space="preserve">Kubernetes, Docker, GitLab CI, Jenkins, </w:t>
-      </w:r>
-      <w:proofErr w:type="spellStart"/>
-      <w:r>
-        <w:rPr>
-          <w:rFonts w:ascii="Calibri" w:eastAsia="Calibri" w:hAnsi="Calibri" w:cs="Calibri"/>
-          <w:sz w:val="22"/>
-          <w:szCs w:val="22"/>
-        </w:rPr>
-        <w:t>ArgoCD</w:t>
-      </w:r>
-      <w:proofErr w:type="spellEnd"/>
-      <w:r>
-        <w:rPr>
-          <w:rFonts w:ascii="Calibri" w:eastAsia="Calibri" w:hAnsi="Calibri" w:cs="Calibri"/>
-          <w:sz w:val="22"/>
-          <w:szCs w:val="22"/>
-        </w:rPr>
-        <w:t>, Harbor, Nginx</w:t>
-      </w:r>
-    </w:p>
-    <w:p>
-      <w:pPr>
-        <w:spacing w:after="60" w:line="260" w:lineRule="auto"/>
-      </w:pPr>
-      <w:r>
-        <w:rPr>
-          <w:rFonts w:ascii="Calibri" w:eastAsia="Calibri" w:hAnsi="Calibri" w:cs="Calibri"/>
-          <w:b/>
-          <w:bCs/>
-          <w:sz w:val="22"/>
-          <w:szCs w:val="22"/>
-        </w:rPr>
-        <w:t xml:space="preserve">Data &amp; Storage: </w:t>
-      </w:r>
-      <w:r>
-        <w:rPr>
-          <w:rFonts w:ascii="Calibri" w:eastAsia="Calibri" w:hAnsi="Calibri" w:cs="Calibri"/>
-          <w:sz w:val="22"/>
-          <w:szCs w:val="22"/>
-        </w:rPr>
-        <w:t>Redis, PostgreSQL, MongoDB, S3, NFS</w:t>
-      </w:r>
-    </w:p>
-    <w:p>
-      <w:pPr>
-        <w:spacing w:after="250" w:line="260" w:lineRule="auto"/>
-      </w:pPr>
-      <w:r>
-        <w:rPr>
-          <w:rFonts w:ascii="Calibri" w:eastAsia="Calibri" w:hAnsi="Calibri" w:cs="Calibri"/>
-          <w:b/>
-          <w:bCs/>
-          <w:sz w:val="22"/>
-          <w:szCs w:val="22"/>
-        </w:rPr>
-        <w:t xml:space="preserve">Monitoring: </w:t>
-      </w:r>
-      <w:r>
-        <w:rPr>
-          <w:rFonts w:ascii="Calibri" w:eastAsia="Calibri" w:hAnsi="Calibri" w:cs="Calibri"/>
-          <w:sz w:val="22"/>
-          <w:szCs w:val="22"/>
-        </w:rPr>
-        <w:t xml:space="preserve">Prometheus, Grafana, Loki, ELK Stack, </w:t>
-      </w:r>
-      <w:proofErr w:type="spellStart"/>
-      <w:r>
-        <w:rPr>
-          <w:rFonts w:ascii="Calibri" w:eastAsia="Calibri" w:hAnsi="Calibri" w:cs="Calibri"/>
-          <w:sz w:val="22"/>
-          <w:szCs w:val="22"/>
-        </w:rPr>
-        <w:t>AlertManager</w:t>
-      </w:r>
-      <w:proofErr w:type="spellEnd"/>
+        <w:spacing w:before="200" w:after="100"/>
+      </w:pPr>
+      <w:r>
+        <w:t>QUHEDGE</w:t>
+      </w:r>
+    </w:p>
+    <w:p>
+      <w:pPr>
+        <w:spacing w:after="160"/>
+      </w:pPr>
+      <w:r>
+        <w:rPr>
+          <w:rFonts w:ascii="Calibri" w:eastAsia="Calibri" w:hAnsi="Calibri" w:cs="Calibri"/>
+          <w:b/>
+          <w:bCs/>
+          <w:color w:val="333333"/>
+          <w:sz w:val="24"/>
+          <w:szCs w:val="24"/>
+        </w:rPr>
+        <w:t>Intern  |  Sep 2020 – Sep 2021</w:t>
+      </w:r>
+      <w:proofErr w:type="gramStart"/>
+      <w:r>
+        <w:rPr>
+          <w:rFonts w:ascii="Calibri" w:eastAsia="Calibri" w:hAnsi="Calibri" w:cs="Calibri"/>
+          <w:b/>
+          <w:bCs/>
+          <w:color w:val="333333"/>
+          <w:sz w:val="24"/>
+          <w:szCs w:val="24"/>
+        </w:rPr>
+      </w:r>
+      <w:r>
+        <w:rPr>
+          <w:sz w:val="24"/>
+          <w:szCs w:val="24"/>
+        </w:rPr>
+      </w:r>
+      <w:r>
+        <w:rPr>
+          <w:rFonts w:ascii="Calibri" w:eastAsia="Calibri" w:hAnsi="Calibri" w:cs="Calibri"/>
+          <w:i/>
+          <w:iCs/>
+          <w:color w:val="666666"/>
+          <w:sz w:val="22"/>
+          <w:szCs w:val="22"/>
+        </w:rPr>
+      </w:r>
+      <w:proofErr w:type="gramEnd"/>
+      <w:r>
+        <w:rPr>
+          <w:rFonts w:ascii="Calibri" w:eastAsia="Calibri" w:hAnsi="Calibri" w:cs="Calibri"/>
+          <w:i/>
+          <w:iCs/>
+          <w:color w:val="666666"/>
+          <w:sz w:val="22"/>
+          <w:szCs w:val="22"/>
+        </w:rPr>
+      </w:r>
+    </w:p>
+    <w:p>
+      <w:pPr>
+        <w:spacing w:after="80" w:line="260" w:lineRule="auto"/>
+      </w:pPr>
+      <w:r>
+        <w:rPr>
+          <w:rFonts w:ascii="Calibri" w:eastAsia="Calibri" w:hAnsi="Calibri" w:cs="Calibri"/>
+          <w:b/>
+          <w:bCs/>
+          <w:color w:val="333333"/>
+          <w:sz w:val="24"/>
+          <w:szCs w:val="24"/>
+        </w:rPr>
+        <w:t>금융 데이터 수집 및 전처리 파이프라인</w:t>
+      </w:r>
+    </w:p>
+    <w:p>
+      <w:pPr>
+        <w:spacing w:after="40" w:line="260" w:lineRule="auto"/>
+        <w:ind w:left="300" w:hanging="300"/>
+      </w:pPr>
+      <w:r>
+        <w:rPr>
+          <w:b/>
+          <w:bCs/>
+          <w:sz w:val="22"/>
+          <w:szCs w:val="22"/>
+        </w:rPr>
+        <w:t>• 배경: 금융 데이터 분석 위한 고품질 데이터 확보 필요 — 다중 소스 수집·정제 자동화 목표</w:t>
+      </w:r>
+      <w:r>
+        <w:rPr>
+          <w:rFonts w:ascii="Calibri" w:eastAsia="Calibri" w:hAnsi="Calibri" w:cs="Calibri"/>
+          <w:sz w:val="22"/>
+          <w:szCs w:val="22"/>
+        </w:rPr>
+      </w:r>
+      <w:proofErr w:type="spellStart"/>
+      <w:r>
+        <w:rPr>
+          <w:rFonts w:ascii="Calibri" w:eastAsia="Calibri" w:hAnsi="Calibri" w:cs="Calibri"/>
+          <w:sz w:val="22"/>
+          <w:szCs w:val="22"/>
+        </w:rPr>
+      </w:r>
+      <w:proofErr w:type="spellEnd"/>
+      <w:r>
+        <w:rPr>
+          <w:rFonts w:ascii="Calibri" w:eastAsia="Calibri" w:hAnsi="Calibri" w:cs="Calibri"/>
+          <w:sz w:val="22"/>
+          <w:szCs w:val="22"/>
+        </w:rPr>
+      </w:r>
+      <w:proofErr w:type="spellStart"/>
+      <w:r>
+        <w:rPr>
+          <w:rFonts w:ascii="Calibri" w:eastAsia="Calibri" w:hAnsi="Calibri" w:cs="Calibri"/>
+          <w:sz w:val="22"/>
+          <w:szCs w:val="22"/>
+        </w:rPr>
+      </w:r>
+      <w:proofErr w:type="spellEnd"/>
+      <w:r>
+        <w:rPr>
+          <w:rFonts w:ascii="Calibri" w:eastAsia="Calibri" w:hAnsi="Calibri" w:cs="Calibri"/>
+          <w:sz w:val="22"/>
+          <w:szCs w:val="22"/>
+        </w:rPr>
+      </w:r>
+    </w:p>
+    <w:p>
+      <w:pPr>
+        <w:spacing w:after="40" w:line="260" w:lineRule="auto"/>
+        <w:ind w:left="300" w:hanging="300"/>
+      </w:pPr>
+      <w:r>
+        <w:rPr>
+          <w:b/>
+          <w:bCs/>
+          <w:sz w:val="22"/>
+          <w:szCs w:val="22"/>
+        </w:rPr>
+        <w:t>• 금융 데이터 크롤링 및 Pandas/NumPy 기반 정제·검증·저장 자동화 파이프라인 구축</w:t>
+      </w:r>
+      <w:r>
+        <w:rPr>
+          <w:rFonts w:ascii="Calibri" w:eastAsia="Calibri" w:hAnsi="Calibri" w:cs="Calibri"/>
+          <w:sz w:val="22"/>
+          <w:szCs w:val="22"/>
+        </w:rPr>
+      </w:r>
+      <w:proofErr w:type="spellStart"/>
+      <w:r>
+        <w:rPr>
+          <w:rFonts w:ascii="Calibri" w:eastAsia="Calibri" w:hAnsi="Calibri" w:cs="Calibri"/>
+          <w:sz w:val="22"/>
+          <w:szCs w:val="22"/>
+        </w:rPr>
+      </w:r>
+      <w:proofErr w:type="spellEnd"/>
+      <w:r>
+        <w:rPr>
+          <w:rFonts w:ascii="Calibri" w:eastAsia="Calibri" w:hAnsi="Calibri" w:cs="Calibri"/>
+          <w:sz w:val="22"/>
+          <w:szCs w:val="22"/>
+        </w:rPr>
+      </w:r>
+      <w:proofErr w:type="spellStart"/>
+      <w:r>
+        <w:rPr>
+          <w:rFonts w:ascii="Calibri" w:eastAsia="Calibri" w:hAnsi="Calibri" w:cs="Calibri"/>
+          <w:sz w:val="22"/>
+          <w:szCs w:val="22"/>
+        </w:rPr>
+      </w:r>
+      <w:proofErr w:type="spellEnd"/>
+      <w:r>
+        <w:rPr>
+          <w:rFonts w:ascii="Calibri" w:eastAsia="Calibri" w:hAnsi="Calibri" w:cs="Calibri"/>
+          <w:sz w:val="22"/>
+          <w:szCs w:val="22"/>
+        </w:rPr>
+      </w:r>
+    </w:p>
+    <w:p>
+      <w:pPr>
+        <w:spacing w:after="40" w:line="260" w:lineRule="auto"/>
+        <w:ind w:left="300" w:hanging="300"/>
+      </w:pPr>
+      <w:r>
+        <w:rPr>
+          <w:b/>
+          <w:bCs/>
+          <w:sz w:val="22"/>
+          <w:szCs w:val="22"/>
+        </w:rPr>
+        <w:t>• 기술: Python, Pandas, NumPy, SQL</w:t>
+      </w:r>
+      <w:r>
+        <w:rPr>
+          <w:rFonts w:ascii="Calibri" w:eastAsia="Calibri" w:hAnsi="Calibri" w:cs="Calibri"/>
+          <w:sz w:val="22"/>
+          <w:szCs w:val="22"/>
+        </w:rPr>
+      </w:r>
+      <w:proofErr w:type="spellStart"/>
+      <w:r>
+        <w:rPr>
+          <w:rFonts w:ascii="Calibri" w:eastAsia="Calibri" w:hAnsi="Calibri" w:cs="Calibri"/>
+          <w:sz w:val="22"/>
+          <w:szCs w:val="22"/>
+        </w:rPr>
+      </w:r>
+      <w:proofErr w:type="spellEnd"/>
+      <w:r>
+        <w:rPr>
+          <w:rFonts w:ascii="Calibri" w:eastAsia="Calibri" w:hAnsi="Calibri" w:cs="Calibri"/>
+          <w:sz w:val="22"/>
+          <w:szCs w:val="22"/>
+        </w:rPr>
+      </w:r>
+      <w:proofErr w:type="spellStart"/>
+      <w:r>
+        <w:rPr>
+          <w:rFonts w:ascii="Calibri" w:eastAsia="Calibri" w:hAnsi="Calibri" w:cs="Calibri"/>
+          <w:sz w:val="22"/>
+          <w:szCs w:val="22"/>
+        </w:rPr>
+      </w:r>
+      <w:proofErr w:type="spellEnd"/>
+      <w:r>
+        <w:rPr>
+          <w:rFonts w:ascii="Calibri" w:eastAsia="Calibri" w:hAnsi="Calibri" w:cs="Calibri"/>
+          <w:sz w:val="22"/>
+          <w:szCs w:val="22"/>
+        </w:rPr>
+      </w:r>
     </w:p>
     <w:p>
       <w:pPr>
@@ -1554,7 +1629,7 @@
         <w:spacing w:before="200" w:after="120"/>
       </w:pPr>
       <w:r>
-        <w:t>EDUCATION &amp; CREDENTIALS</w:t>
+        <w:t>TECHNICAL SKILLS</w:t>
       </w:r>
     </w:p>
     <w:p>
@@ -1569,35 +1644,15 @@
           <w:sz w:val="22"/>
           <w:szCs w:val="22"/>
         </w:rPr>
-        <w:t xml:space="preserve">M.S. Computer </w:t>
-      </w:r>
-      <w:proofErr w:type="gramStart"/>
-      <w:r>
-        <w:rPr>
-          <w:rFonts w:ascii="Calibri" w:eastAsia="Calibri" w:hAnsi="Calibri" w:cs="Calibri"/>
-          <w:b/>
-          <w:bCs/>
-          <w:sz w:val="22"/>
-          <w:szCs w:val="22"/>
-        </w:rPr>
-        <w:t>Science</w:t>
-      </w:r>
-      <w:r>
-        <w:rPr>
-          <w:rFonts w:ascii="Calibri" w:eastAsia="Calibri" w:hAnsi="Calibri" w:cs="Calibri"/>
-          <w:sz w:val="22"/>
-          <w:szCs w:val="22"/>
-        </w:rPr>
-        <w:t xml:space="preserve">  |</w:t>
-      </w:r>
-      <w:proofErr w:type="gramEnd"/>
-      <w:r>
-        <w:rPr>
-          <w:rFonts w:ascii="Calibri" w:eastAsia="Calibri" w:hAnsi="Calibri" w:cs="Calibri"/>
-          <w:sz w:val="22"/>
-          <w:szCs w:val="22"/>
-        </w:rPr>
-        <w:t xml:space="preserve">  Inha University (2021.08)  |  </w:t>
+        <w:t xml:space="preserve">Languages: </w:t>
+      </w:r>
+      <w:r>
+        <w:rPr>
+          <w:rFonts w:ascii="Calibri" w:eastAsia="Calibri" w:hAnsi="Calibri" w:cs="Calibri"/>
+          <w:sz w:val="22"/>
+          <w:szCs w:val="22"/>
+        </w:rPr>
+        <w:t>Python (Expert), TypeScript, Bash, SQL</w:t>
       </w:r>
     </w:p>
     <w:p>
@@ -1612,35 +1667,201 @@
           <w:sz w:val="22"/>
           <w:szCs w:val="22"/>
         </w:rPr>
-        <w:t xml:space="preserve">B.S. Computer </w:t>
-      </w:r>
-      <w:proofErr w:type="gramStart"/>
-      <w:r>
-        <w:rPr>
-          <w:rFonts w:ascii="Calibri" w:eastAsia="Calibri" w:hAnsi="Calibri" w:cs="Calibri"/>
-          <w:b/>
-          <w:bCs/>
-          <w:sz w:val="22"/>
-          <w:szCs w:val="22"/>
-        </w:rPr>
-        <w:t>Science</w:t>
-      </w:r>
-      <w:r>
-        <w:rPr>
-          <w:rFonts w:ascii="Calibri" w:eastAsia="Calibri" w:hAnsi="Calibri" w:cs="Calibri"/>
-          <w:sz w:val="22"/>
-          <w:szCs w:val="22"/>
-        </w:rPr>
-        <w:t xml:space="preserve">  |</w:t>
-      </w:r>
-      <w:proofErr w:type="gramEnd"/>
-      <w:r>
-        <w:rPr>
-          <w:rFonts w:ascii="Calibri" w:eastAsia="Calibri" w:hAnsi="Calibri" w:cs="Calibri"/>
-          <w:sz w:val="22"/>
-          <w:szCs w:val="22"/>
-        </w:rPr>
-        <w:t xml:space="preserve">  Hannam University</w:t>
+        <w:t xml:space="preserve">AI/ML: </w:t>
+      </w:r>
+      <w:proofErr w:type="spellStart"/>
+      <w:r>
+        <w:rPr>
+          <w:rFonts w:ascii="Calibri" w:eastAsia="Calibri" w:hAnsi="Calibri" w:cs="Calibri"/>
+          <w:sz w:val="22"/>
+          <w:szCs w:val="22"/>
+        </w:rPr>
+        <w:t>PyTorch</w:t>
+      </w:r>
+      <w:proofErr w:type="spellEnd"/>
+      <w:r>
+        <w:rPr>
+          <w:rFonts w:ascii="Calibri" w:eastAsia="Calibri" w:hAnsi="Calibri" w:cs="Calibri"/>
+          <w:sz w:val="22"/>
+          <w:szCs w:val="22"/>
+        </w:rPr>
+        <w:t xml:space="preserve">, Hugging Face, </w:t>
+      </w:r>
+      <w:proofErr w:type="spellStart"/>
+      <w:r>
+        <w:rPr>
+          <w:rFonts w:ascii="Calibri" w:eastAsia="Calibri" w:hAnsi="Calibri" w:cs="Calibri"/>
+          <w:sz w:val="22"/>
+          <w:szCs w:val="22"/>
+        </w:rPr>
+        <w:t>vLLM</w:t>
+      </w:r>
+      <w:proofErr w:type="spellEnd"/>
+      <w:r>
+        <w:rPr>
+          <w:rFonts w:ascii="Calibri" w:eastAsia="Calibri" w:hAnsi="Calibri" w:cs="Calibri"/>
+          <w:sz w:val="22"/>
+          <w:szCs w:val="22"/>
+        </w:rPr>
+        <w:t>, ONNX Runtime, Whisper</w:t>
+      </w:r>
+    </w:p>
+    <w:p>
+      <w:pPr>
+        <w:spacing w:after="60" w:line="260" w:lineRule="auto"/>
+      </w:pPr>
+      <w:r>
+        <w:rPr>
+          <w:rFonts w:ascii="Calibri" w:eastAsia="Calibri" w:hAnsi="Calibri" w:cs="Calibri"/>
+          <w:b/>
+          <w:bCs/>
+          <w:sz w:val="22"/>
+          <w:szCs w:val="22"/>
+        </w:rPr>
+        <w:t xml:space="preserve">Model Serving: </w:t>
+      </w:r>
+      <w:proofErr w:type="spellStart"/>
+      <w:r>
+        <w:rPr>
+          <w:rFonts w:ascii="Calibri" w:eastAsia="Calibri" w:hAnsi="Calibri" w:cs="Calibri"/>
+          <w:sz w:val="22"/>
+          <w:szCs w:val="22"/>
+        </w:rPr>
+        <w:t>vLLM</w:t>
+      </w:r>
+      <w:proofErr w:type="spellEnd"/>
+      <w:r>
+        <w:rPr>
+          <w:rFonts w:ascii="Calibri" w:eastAsia="Calibri" w:hAnsi="Calibri" w:cs="Calibri"/>
+          <w:sz w:val="22"/>
+          <w:szCs w:val="22"/>
+        </w:rPr>
+        <w:t>, Triton Inference Server, ONNX Runtime</w:t>
+      </w:r>
+    </w:p>
+    <w:p>
+      <w:pPr>
+        <w:spacing w:after="60" w:line="260" w:lineRule="auto"/>
+      </w:pPr>
+      <w:r>
+        <w:rPr>
+          <w:rFonts w:ascii="Calibri" w:eastAsia="Calibri" w:hAnsi="Calibri" w:cs="Calibri"/>
+          <w:b/>
+          <w:bCs/>
+          <w:sz w:val="22"/>
+          <w:szCs w:val="22"/>
+        </w:rPr>
+        <w:t xml:space="preserve">Backend: </w:t>
+      </w:r>
+      <w:proofErr w:type="spellStart"/>
+      <w:r>
+        <w:rPr>
+          <w:rFonts w:ascii="Calibri" w:eastAsia="Calibri" w:hAnsi="Calibri" w:cs="Calibri"/>
+          <w:sz w:val="22"/>
+          <w:szCs w:val="22"/>
+        </w:rPr>
+        <w:t>FastAPI</w:t>
+      </w:r>
+      <w:proofErr w:type="spellEnd"/>
+      <w:r>
+        <w:rPr>
+          <w:rFonts w:ascii="Calibri" w:eastAsia="Calibri" w:hAnsi="Calibri" w:cs="Calibri"/>
+          <w:sz w:val="22"/>
+          <w:szCs w:val="22"/>
+        </w:rPr>
+        <w:t xml:space="preserve">, </w:t>
+      </w:r>
+      <w:proofErr w:type="spellStart"/>
+      <w:r>
+        <w:rPr>
+          <w:rFonts w:ascii="Calibri" w:eastAsia="Calibri" w:hAnsi="Calibri" w:cs="Calibri"/>
+          <w:sz w:val="22"/>
+          <w:szCs w:val="22"/>
+        </w:rPr>
+        <w:t>gRPC</w:t>
+      </w:r>
+      <w:proofErr w:type="spellEnd"/>
+      <w:r>
+        <w:rPr>
+          <w:rFonts w:ascii="Calibri" w:eastAsia="Calibri" w:hAnsi="Calibri" w:cs="Calibri"/>
+          <w:sz w:val="22"/>
+          <w:szCs w:val="22"/>
+        </w:rPr>
+        <w:t xml:space="preserve">, WebSocket, REST APIs, </w:t>
+      </w:r>
+      <w:proofErr w:type="spellStart"/>
+      <w:r>
+        <w:rPr>
+          <w:rFonts w:ascii="Calibri" w:eastAsia="Calibri" w:hAnsi="Calibri" w:cs="Calibri"/>
+          <w:sz w:val="22"/>
+          <w:szCs w:val="22"/>
+        </w:rPr>
+        <w:t>Asyncio</w:t>
+      </w:r>
+      <w:proofErr w:type="spellEnd"/>
+    </w:p>
+    <w:p>
+      <w:pPr>
+        <w:spacing w:after="60" w:line="260" w:lineRule="auto"/>
+      </w:pPr>
+      <w:r>
+        <w:rPr>
+          <w:rFonts w:ascii="Calibri" w:eastAsia="Calibri" w:hAnsi="Calibri" w:cs="Calibri"/>
+          <w:b/>
+          <w:bCs/>
+          <w:sz w:val="22"/>
+          <w:szCs w:val="22"/>
+        </w:rPr>
+        <w:t xml:space="preserve">DevOps: </w:t>
+      </w:r>
+      <w:r>
+        <w:rPr>
+          <w:rFonts w:ascii="Calibri" w:eastAsia="Calibri" w:hAnsi="Calibri" w:cs="Calibri"/>
+          <w:sz w:val="22"/>
+          <w:szCs w:val="22"/>
+        </w:rPr>
+        <w:t xml:space="preserve">Kubernetes, Docker, GitLab CI, Jenkins, </w:t>
+      </w:r>
+      <w:proofErr w:type="spellStart"/>
+      <w:r>
+        <w:rPr>
+          <w:rFonts w:ascii="Calibri" w:eastAsia="Calibri" w:hAnsi="Calibri" w:cs="Calibri"/>
+          <w:sz w:val="22"/>
+          <w:szCs w:val="22"/>
+        </w:rPr>
+        <w:t>ArgoCD</w:t>
+      </w:r>
+      <w:proofErr w:type="spellEnd"/>
+      <w:r>
+        <w:rPr>
+          <w:rFonts w:ascii="Calibri" w:eastAsia="Calibri" w:hAnsi="Calibri" w:cs="Calibri"/>
+          <w:sz w:val="22"/>
+          <w:szCs w:val="22"/>
+        </w:rPr>
+        <w:t>, Harbor, Nginx</w:t>
+      </w:r>
+    </w:p>
+    <w:p>
+      <w:pPr>
+        <w:spacing w:after="60" w:line="260" w:lineRule="auto"/>
+      </w:pPr>
+      <w:r>
+        <w:rPr>
+          <w:rFonts w:ascii="Calibri" w:eastAsia="Calibri" w:hAnsi="Calibri" w:cs="Calibri"/>
+          <w:b/>
+          <w:bCs/>
+          <w:sz w:val="22"/>
+          <w:szCs w:val="22"/>
+        </w:rPr>
+        <w:t xml:space="preserve">Data &amp; Storage: </w:t>
+      </w:r>
+      <w:r>
+        <w:rPr>
+          <w:rFonts w:ascii="Calibri" w:eastAsia="Calibri" w:hAnsi="Calibri" w:cs="Calibri"/>
+          <w:sz w:val="22"/>
+          <w:szCs w:val="22"/>
+        </w:rPr>
+        <w:t>Redis, PostgreSQL, MongoDB, S3, NFS</w:t>
       </w:r>
     </w:p>
     <w:p>
@@ -1655,16 +1876,26 @@
           <w:sz w:val="22"/>
           <w:szCs w:val="22"/>
         </w:rPr>
-        <w:t xml:space="preserve">Certifications: </w:t>
-      </w:r>
-      <w:r>
-        <w:rPr>
-          <w:rFonts w:ascii="Calibri" w:eastAsia="Calibri" w:hAnsi="Calibri" w:cs="Calibri"/>
-          <w:sz w:val="22"/>
-          <w:szCs w:val="22"/>
-        </w:rPr>
-        <w:t>Linux Master (2016), Data Analytics Semi-Professional (2021)</w:t>
-      </w:r>
+        <w:t xml:space="preserve">Monitoring: </w:t>
+      </w:r>
+      <w:r>
+        <w:rPr>
+          <w:rFonts w:ascii="Calibri" w:eastAsia="Calibri" w:hAnsi="Calibri" w:cs="Calibri"/>
+          <w:sz w:val="22"/>
+          <w:szCs w:val="22"/>
+        </w:rPr>
+        <w:t xml:space="preserve">Prometheus, Grafana, Loki, ELK Stack, </w:t>
+      </w:r>
+      <w:proofErr w:type="spellStart"/>
+      <w:r>
+        <w:rPr>
+          <w:rFonts w:ascii="Calibri" w:eastAsia="Calibri" w:hAnsi="Calibri" w:cs="Calibri"/>
+          <w:sz w:val="22"/>
+          <w:szCs w:val="22"/>
+        </w:rPr>
+        <w:t>AlertManager</w:t>
+      </w:r>
+      <w:proofErr w:type="spellEnd"/>
     </w:p>
     <w:p>
       <w:pPr>
@@ -1675,6 +1906,124 @@
         <w:spacing w:before="200" w:after="120"/>
       </w:pPr>
       <w:r>
+        <w:t>EDUCATION &amp; CREDENTIALS</w:t>
+      </w:r>
+    </w:p>
+    <w:p>
+      <w:pPr>
+        <w:spacing w:after="60" w:line="260" w:lineRule="auto"/>
+      </w:pPr>
+      <w:r>
+        <w:rPr>
+          <w:rFonts w:ascii="Calibri" w:eastAsia="Calibri" w:hAnsi="Calibri" w:cs="Calibri"/>
+          <w:b/>
+          <w:bCs/>
+          <w:sz w:val="22"/>
+          <w:szCs w:val="22"/>
+        </w:rPr>
+        <w:t>M.S. Computer Science  |  Inha University (2021.08)</w:t>
+      </w:r>
+      <w:proofErr w:type="gramStart"/>
+      <w:r>
+        <w:rPr>
+          <w:rFonts w:ascii="Calibri" w:eastAsia="Calibri" w:hAnsi="Calibri" w:cs="Calibri"/>
+          <w:b/>
+          <w:bCs/>
+          <w:sz w:val="22"/>
+          <w:szCs w:val="22"/>
+        </w:rPr>
+      </w:r>
+      <w:r>
+        <w:rPr>
+          <w:rFonts w:ascii="Calibri" w:eastAsia="Calibri" w:hAnsi="Calibri" w:cs="Calibri"/>
+          <w:sz w:val="22"/>
+          <w:szCs w:val="22"/>
+        </w:rPr>
+      </w:r>
+      <w:proofErr w:type="gramEnd"/>
+      <w:r>
+        <w:rPr>
+          <w:rFonts w:ascii="Calibri" w:eastAsia="Calibri" w:hAnsi="Calibri" w:cs="Calibri"/>
+          <w:sz w:val="22"/>
+          <w:szCs w:val="22"/>
+        </w:rPr>
+      </w:r>
+    </w:p>
+    <w:p>
+      <w:pPr>
+        <w:spacing w:after="60" w:line="260" w:lineRule="auto"/>
+      </w:pPr>
+      <w:r>
+        <w:rPr>
+          <w:rFonts w:ascii="Calibri" w:eastAsia="Calibri" w:hAnsi="Calibri" w:cs="Calibri"/>
+          <w:b/>
+          <w:bCs/>
+          <w:sz w:val="22"/>
+          <w:szCs w:val="22"/>
+        </w:rPr>
+        <w:t xml:space="preserve">B.S. Computer </w:t>
+      </w:r>
+      <w:proofErr w:type="gramStart"/>
+      <w:r>
+        <w:rPr>
+          <w:rFonts w:ascii="Calibri" w:eastAsia="Calibri" w:hAnsi="Calibri" w:cs="Calibri"/>
+          <w:b/>
+          <w:bCs/>
+          <w:sz w:val="22"/>
+          <w:szCs w:val="22"/>
+        </w:rPr>
+        <w:t>Science</w:t>
+      </w:r>
+      <w:r>
+        <w:rPr>
+          <w:rFonts w:ascii="Calibri" w:eastAsia="Calibri" w:hAnsi="Calibri" w:cs="Calibri"/>
+          <w:sz w:val="22"/>
+          <w:szCs w:val="22"/>
+        </w:rPr>
+        <w:t xml:space="preserve">  |</w:t>
+      </w:r>
+      <w:proofErr w:type="gramEnd"/>
+      <w:r>
+        <w:rPr>
+          <w:rFonts w:ascii="Calibri" w:eastAsia="Calibri" w:hAnsi="Calibri" w:cs="Calibri"/>
+          <w:sz w:val="22"/>
+          <w:szCs w:val="22"/>
+        </w:rPr>
+        <w:t xml:space="preserve">  Hannam University</w:t>
+      </w:r>
+    </w:p>
+    <w:p>
+      <w:pPr>
+        <w:spacing w:after="250" w:line="260" w:lineRule="auto"/>
+      </w:pPr>
+      <w:r>
+        <w:rPr>
+          <w:rFonts w:ascii="Calibri" w:eastAsia="Calibri" w:hAnsi="Calibri" w:cs="Calibri"/>
+          <w:b/>
+          <w:bCs/>
+          <w:sz w:val="22"/>
+          <w:szCs w:val="22"/>
+        </w:rPr>
+        <w:t xml:space="preserve">Certifications: </w:t>
+      </w:r>
+      <w:r>
+        <w:rPr>
+          <w:rFonts w:ascii="Calibri" w:eastAsia="Calibri" w:hAnsi="Calibri" w:cs="Calibri"/>
+          <w:sz w:val="22"/>
+          <w:szCs w:val="22"/>
+        </w:rPr>
+        <w:t>Linux Master (2016), Data Analytics Semi-Professional (2021)</w:t>
+      </w:r>
+    </w:p>
+    <w:p>
+      <w:pPr>
+        <w:pStyle w:val="2"/>
+        <w:pBdr>
+          <w:bottom w:val="single" w:sz="8" w:space="1" w:color="1F4788"/>
+        </w:pBdr>
+        <w:spacing w:before="200" w:after="120"/>
+      </w:pPr>
+      <w:r>
         <w:t>PUBLICATIONS &amp; PATENTS</w:t>
       </w:r>
     </w:p>
@@ -1699,7 +2048,7 @@
         <w:ind w:left="360"/>
       </w:pPr>
       <w:r>
-        <w:t>• 국방 데이터 확보를 위한 생성 모델 Latent Diffusion  |  국방기술학회 (2023) 우수논문상</w:t>
+        <w:t>• 국방 데이터 확보를 위한 생성모델 Latent Diffusion 실험  |  국방기술학회 (2023) 우수논문상</w:t>
       </w:r>
     </w:p>
     <w:p>

</xml_diff>

<commit_message>
Fix formatting consistency in new resume sections
</commit_message>
<xml_diff>
--- a/assets/resume.docx
+++ b/assets/resume.docx
@@ -872,7 +872,7 @@
       </w:pPr>
       <w:r>
         <w:rPr>
-          <w:b/>
+          <w:b w:val="0"/>
           <w:bCs/>
           <w:sz w:val="22"/>
           <w:szCs w:val="22"/>
@@ -882,6 +882,7 @@
       <w:r>
         <w:rPr>
           <w:rFonts w:ascii="Calibri" w:eastAsia="Calibri" w:hAnsi="Calibri" w:cs="Calibri"/>
+          <w:b w:val="0"/>
           <w:sz w:val="22"/>
           <w:szCs w:val="22"/>
         </w:rPr>
@@ -1395,7 +1396,7 @@
       <w:r>
         <w:rPr>
           <w:rFonts w:ascii="Calibri" w:eastAsia="Calibri" w:hAnsi="Calibri" w:cs="Calibri"/>
-          <w:b/>
+          <w:b w:val="0"/>
           <w:bCs/>
           <w:color w:val="333333"/>
           <w:sz w:val="24"/>
@@ -1407,7 +1408,7 @@
       <w:r>
         <w:rPr>
           <w:rFonts w:ascii="Calibri" w:eastAsia="Calibri" w:hAnsi="Calibri" w:cs="Calibri"/>
-          <w:b/>
+          <w:b w:val="0"/>
           <w:bCs/>
           <w:color w:val="333333"/>
           <w:sz w:val="24"/>
@@ -1416,6 +1417,7 @@
       </w:r>
       <w:r>
         <w:rPr>
+          <w:b w:val="0"/>
           <w:sz w:val="24"/>
           <w:szCs w:val="24"/>
         </w:rPr>
@@ -1423,6 +1425,7 @@
       <w:r>
         <w:rPr>
           <w:rFonts w:ascii="Calibri" w:eastAsia="Calibri" w:hAnsi="Calibri" w:cs="Calibri"/>
+          <w:b w:val="0"/>
           <w:i/>
           <w:iCs/>
           <w:color w:val="666666"/>
@@ -1434,6 +1437,7 @@
       <w:r>
         <w:rPr>
           <w:rFonts w:ascii="Calibri" w:eastAsia="Calibri" w:hAnsi="Calibri" w:cs="Calibri"/>
+          <w:b w:val="0"/>
           <w:i/>
           <w:iCs/>
           <w:color w:val="666666"/>
@@ -1448,7 +1452,7 @@
       </w:pPr>
       <w:r>
         <w:rPr>
-          <w:rFonts w:ascii="Calibri" w:eastAsia="Calibri" w:hAnsi="Calibri" w:cs="Calibri"/>
+          <w:rFonts w:ascii="맑은 고딕" w:eastAsia="맑은 고딕" w:hAnsi="맑은 고딕" w:cs="Calibri"/>
           <w:b/>
           <w:bCs/>
           <w:color w:val="333333"/>
@@ -1465,7 +1469,7 @@
       </w:pPr>
       <w:r>
         <w:rPr>
-          <w:b/>
+          <w:b w:val="0"/>
           <w:bCs/>
           <w:sz w:val="22"/>
           <w:szCs w:val="22"/>
@@ -1475,38 +1479,43 @@
       <w:r>
         <w:rPr>
           <w:rFonts w:ascii="Calibri" w:eastAsia="Calibri" w:hAnsi="Calibri" w:cs="Calibri"/>
-          <w:sz w:val="22"/>
-          <w:szCs w:val="22"/>
-        </w:rPr>
-      </w:r>
-      <w:proofErr w:type="spellStart"/>
-      <w:r>
-        <w:rPr>
-          <w:rFonts w:ascii="Calibri" w:eastAsia="Calibri" w:hAnsi="Calibri" w:cs="Calibri"/>
-          <w:sz w:val="22"/>
-          <w:szCs w:val="22"/>
-        </w:rPr>
-      </w:r>
-      <w:proofErr w:type="spellEnd"/>
-      <w:r>
-        <w:rPr>
-          <w:rFonts w:ascii="Calibri" w:eastAsia="Calibri" w:hAnsi="Calibri" w:cs="Calibri"/>
-          <w:sz w:val="22"/>
-          <w:szCs w:val="22"/>
-        </w:rPr>
-      </w:r>
-      <w:proofErr w:type="spellStart"/>
-      <w:r>
-        <w:rPr>
-          <w:rFonts w:ascii="Calibri" w:eastAsia="Calibri" w:hAnsi="Calibri" w:cs="Calibri"/>
-          <w:sz w:val="22"/>
-          <w:szCs w:val="22"/>
-        </w:rPr>
-      </w:r>
-      <w:proofErr w:type="spellEnd"/>
-      <w:r>
-        <w:rPr>
-          <w:rFonts w:ascii="Calibri" w:eastAsia="Calibri" w:hAnsi="Calibri" w:cs="Calibri"/>
+          <w:b w:val="0"/>
+          <w:sz w:val="22"/>
+          <w:szCs w:val="22"/>
+        </w:rPr>
+      </w:r>
+      <w:proofErr w:type="spellStart"/>
+      <w:r>
+        <w:rPr>
+          <w:rFonts w:ascii="Calibri" w:eastAsia="Calibri" w:hAnsi="Calibri" w:cs="Calibri"/>
+          <w:b w:val="0"/>
+          <w:sz w:val="22"/>
+          <w:szCs w:val="22"/>
+        </w:rPr>
+      </w:r>
+      <w:proofErr w:type="spellEnd"/>
+      <w:r>
+        <w:rPr>
+          <w:rFonts w:ascii="Calibri" w:eastAsia="Calibri" w:hAnsi="Calibri" w:cs="Calibri"/>
+          <w:b w:val="0"/>
+          <w:sz w:val="22"/>
+          <w:szCs w:val="22"/>
+        </w:rPr>
+      </w:r>
+      <w:proofErr w:type="spellStart"/>
+      <w:r>
+        <w:rPr>
+          <w:rFonts w:ascii="Calibri" w:eastAsia="Calibri" w:hAnsi="Calibri" w:cs="Calibri"/>
+          <w:b w:val="0"/>
+          <w:sz w:val="22"/>
+          <w:szCs w:val="22"/>
+        </w:rPr>
+      </w:r>
+      <w:proofErr w:type="spellEnd"/>
+      <w:r>
+        <w:rPr>
+          <w:rFonts w:ascii="Calibri" w:eastAsia="Calibri" w:hAnsi="Calibri" w:cs="Calibri"/>
+          <w:b w:val="0"/>
           <w:sz w:val="22"/>
           <w:szCs w:val="22"/>
         </w:rPr>
@@ -1519,7 +1528,7 @@
       </w:pPr>
       <w:r>
         <w:rPr>
-          <w:b/>
+          <w:b w:val="0"/>
           <w:bCs/>
           <w:sz w:val="22"/>
           <w:szCs w:val="22"/>
@@ -1529,38 +1538,43 @@
       <w:r>
         <w:rPr>
           <w:rFonts w:ascii="Calibri" w:eastAsia="Calibri" w:hAnsi="Calibri" w:cs="Calibri"/>
-          <w:sz w:val="22"/>
-          <w:szCs w:val="22"/>
-        </w:rPr>
-      </w:r>
-      <w:proofErr w:type="spellStart"/>
-      <w:r>
-        <w:rPr>
-          <w:rFonts w:ascii="Calibri" w:eastAsia="Calibri" w:hAnsi="Calibri" w:cs="Calibri"/>
-          <w:sz w:val="22"/>
-          <w:szCs w:val="22"/>
-        </w:rPr>
-      </w:r>
-      <w:proofErr w:type="spellEnd"/>
-      <w:r>
-        <w:rPr>
-          <w:rFonts w:ascii="Calibri" w:eastAsia="Calibri" w:hAnsi="Calibri" w:cs="Calibri"/>
-          <w:sz w:val="22"/>
-          <w:szCs w:val="22"/>
-        </w:rPr>
-      </w:r>
-      <w:proofErr w:type="spellStart"/>
-      <w:r>
-        <w:rPr>
-          <w:rFonts w:ascii="Calibri" w:eastAsia="Calibri" w:hAnsi="Calibri" w:cs="Calibri"/>
-          <w:sz w:val="22"/>
-          <w:szCs w:val="22"/>
-        </w:rPr>
-      </w:r>
-      <w:proofErr w:type="spellEnd"/>
-      <w:r>
-        <w:rPr>
-          <w:rFonts w:ascii="Calibri" w:eastAsia="Calibri" w:hAnsi="Calibri" w:cs="Calibri"/>
+          <w:b w:val="0"/>
+          <w:sz w:val="22"/>
+          <w:szCs w:val="22"/>
+        </w:rPr>
+      </w:r>
+      <w:proofErr w:type="spellStart"/>
+      <w:r>
+        <w:rPr>
+          <w:rFonts w:ascii="Calibri" w:eastAsia="Calibri" w:hAnsi="Calibri" w:cs="Calibri"/>
+          <w:b w:val="0"/>
+          <w:sz w:val="22"/>
+          <w:szCs w:val="22"/>
+        </w:rPr>
+      </w:r>
+      <w:proofErr w:type="spellEnd"/>
+      <w:r>
+        <w:rPr>
+          <w:rFonts w:ascii="Calibri" w:eastAsia="Calibri" w:hAnsi="Calibri" w:cs="Calibri"/>
+          <w:b w:val="0"/>
+          <w:sz w:val="22"/>
+          <w:szCs w:val="22"/>
+        </w:rPr>
+      </w:r>
+      <w:proofErr w:type="spellStart"/>
+      <w:r>
+        <w:rPr>
+          <w:rFonts w:ascii="Calibri" w:eastAsia="Calibri" w:hAnsi="Calibri" w:cs="Calibri"/>
+          <w:b w:val="0"/>
+          <w:sz w:val="22"/>
+          <w:szCs w:val="22"/>
+        </w:rPr>
+      </w:r>
+      <w:proofErr w:type="spellEnd"/>
+      <w:r>
+        <w:rPr>
+          <w:rFonts w:ascii="Calibri" w:eastAsia="Calibri" w:hAnsi="Calibri" w:cs="Calibri"/>
+          <w:b w:val="0"/>
           <w:sz w:val="22"/>
           <w:szCs w:val="22"/>
         </w:rPr>
@@ -1573,7 +1587,7 @@
       </w:pPr>
       <w:r>
         <w:rPr>
-          <w:b/>
+          <w:b w:val="0"/>
           <w:bCs/>
           <w:sz w:val="22"/>
           <w:szCs w:val="22"/>
@@ -1583,38 +1597,43 @@
       <w:r>
         <w:rPr>
           <w:rFonts w:ascii="Calibri" w:eastAsia="Calibri" w:hAnsi="Calibri" w:cs="Calibri"/>
-          <w:sz w:val="22"/>
-          <w:szCs w:val="22"/>
-        </w:rPr>
-      </w:r>
-      <w:proofErr w:type="spellStart"/>
-      <w:r>
-        <w:rPr>
-          <w:rFonts w:ascii="Calibri" w:eastAsia="Calibri" w:hAnsi="Calibri" w:cs="Calibri"/>
-          <w:sz w:val="22"/>
-          <w:szCs w:val="22"/>
-        </w:rPr>
-      </w:r>
-      <w:proofErr w:type="spellEnd"/>
-      <w:r>
-        <w:rPr>
-          <w:rFonts w:ascii="Calibri" w:eastAsia="Calibri" w:hAnsi="Calibri" w:cs="Calibri"/>
-          <w:sz w:val="22"/>
-          <w:szCs w:val="22"/>
-        </w:rPr>
-      </w:r>
-      <w:proofErr w:type="spellStart"/>
-      <w:r>
-        <w:rPr>
-          <w:rFonts w:ascii="Calibri" w:eastAsia="Calibri" w:hAnsi="Calibri" w:cs="Calibri"/>
-          <w:sz w:val="22"/>
-          <w:szCs w:val="22"/>
-        </w:rPr>
-      </w:r>
-      <w:proofErr w:type="spellEnd"/>
-      <w:r>
-        <w:rPr>
-          <w:rFonts w:ascii="Calibri" w:eastAsia="Calibri" w:hAnsi="Calibri" w:cs="Calibri"/>
+          <w:b w:val="0"/>
+          <w:sz w:val="22"/>
+          <w:szCs w:val="22"/>
+        </w:rPr>
+      </w:r>
+      <w:proofErr w:type="spellStart"/>
+      <w:r>
+        <w:rPr>
+          <w:rFonts w:ascii="Calibri" w:eastAsia="Calibri" w:hAnsi="Calibri" w:cs="Calibri"/>
+          <w:b w:val="0"/>
+          <w:sz w:val="22"/>
+          <w:szCs w:val="22"/>
+        </w:rPr>
+      </w:r>
+      <w:proofErr w:type="spellEnd"/>
+      <w:r>
+        <w:rPr>
+          <w:rFonts w:ascii="Calibri" w:eastAsia="Calibri" w:hAnsi="Calibri" w:cs="Calibri"/>
+          <w:b w:val="0"/>
+          <w:sz w:val="22"/>
+          <w:szCs w:val="22"/>
+        </w:rPr>
+      </w:r>
+      <w:proofErr w:type="spellStart"/>
+      <w:r>
+        <w:rPr>
+          <w:rFonts w:ascii="Calibri" w:eastAsia="Calibri" w:hAnsi="Calibri" w:cs="Calibri"/>
+          <w:b w:val="0"/>
+          <w:sz w:val="22"/>
+          <w:szCs w:val="22"/>
+        </w:rPr>
+      </w:r>
+      <w:proofErr w:type="spellEnd"/>
+      <w:r>
+        <w:rPr>
+          <w:rFonts w:ascii="Calibri" w:eastAsia="Calibri" w:hAnsi="Calibri" w:cs="Calibri"/>
+          <w:b w:val="0"/>
           <w:sz w:val="22"/>
           <w:szCs w:val="22"/>
         </w:rPr>

</xml_diff>

<commit_message>
Add project periods, unify section structure, add language proficiency
</commit_message>
<xml_diff>
--- a/assets/resume.docx
+++ b/assets/resume.docx
@@ -179,7 +179,7 @@
           <w:sz w:val="24"/>
           <w:szCs w:val="24"/>
         </w:rPr>
-        <w:t>TTS 프로젝트</w:t>
+        <w:t>TTS 프로젝트 (2025.09 ~ 현재)</w:t>
       </w:r>
     </w:p>
     <w:p>
@@ -842,7 +842,7 @@
           <w:sz w:val="24"/>
           <w:szCs w:val="24"/>
         </w:rPr>
-        <w:t>STT 배포 (AICESS)</w:t>
+        <w:t>STT 배포 (2025.07 ~ 2025.09)</w:t>
       </w:r>
     </w:p>
     <w:p>
@@ -894,7 +894,7 @@
         <w:ind w:left="300" w:hanging="300"/>
       </w:pPr>
       <w:r>
-        <w:t>• Triton Inference Server 기반 추론 환경 최적화로 동시 처리 채널 확장, 추론 파이프라인 개선</w:t>
+        <w:t>• 성과: Triton 기반 추론 환경 최적화로 동시 처리 채널 확장, 파이프라인 개선 및 안정성 확보</w:t>
       </w:r>
     </w:p>
     <w:p>
@@ -910,7 +910,7 @@
           <w:sz w:val="24"/>
           <w:szCs w:val="24"/>
         </w:rPr>
-        <w:t>Speaker Diarization (AICESS)</w:t>
+        <w:t>Speaker Diarization (2025.04 ~ 2025.07)</w:t>
       </w:r>
     </w:p>
     <w:p>
@@ -938,6 +938,15 @@
       </w:pPr>
       <w:r>
         <w:t>• 기술: Pyannote, PyTorch, Audio Processing</w:t>
+      </w:r>
+    </w:p>
+    <w:p>
+      <w:pPr>
+        <w:spacing w:after="250" w:line="260" w:lineRule="auto"/>
+        <w:ind w:left="300" w:hanging="300"/>
+      </w:pPr>
+      <w:r>
+        <w:t>• 성과: 상담사/고객 발화 구분 자동화로 상담 품질 분석 기반 마련</w:t>
       </w:r>
     </w:p>
     <w:p>
@@ -974,7 +983,7 @@
           <w:sz w:val="24"/>
           <w:szCs w:val="24"/>
         </w:rPr>
-        <w:t>Kubernetes 기반 AI 인프라 (</w:t>
+        <w:t>Kubernetes 기반 AI 인프라 (2024.08 ~ 2025.04)</w:t>
       </w:r>
       <w:proofErr w:type="spellStart"/>
       <w:r>
@@ -986,7 +995,6 @@
           <w:sz w:val="24"/>
           <w:szCs w:val="24"/>
         </w:rPr>
-        <w:t>Infiniic</w:t>
       </w:r>
       <w:proofErr w:type="spellEnd"/>
       <w:r>
@@ -998,7 +1006,6 @@
           <w:sz w:val="24"/>
           <w:szCs w:val="24"/>
         </w:rPr>
-        <w:t>)</w:t>
       </w:r>
     </w:p>
     <w:p>
@@ -1084,7 +1091,7 @@
           <w:sz w:val="24"/>
           <w:szCs w:val="24"/>
         </w:rPr>
-        <w:t>3D Semantic Segmentation Research (Sensor Fusion)</w:t>
+        <w:t>3D Semantic Segmentation Research (2022.08 ~ 2022.12)</w:t>
       </w:r>
     </w:p>
     <w:p>
@@ -1171,7 +1178,7 @@
           <w:sz w:val="24"/>
           <w:szCs w:val="24"/>
         </w:rPr>
-        <w:t>NLP-based Text Summarization System</w:t>
+        <w:t>NLP-based Text Summarization System (2024.01 ~ 2024.07)</w:t>
       </w:r>
     </w:p>
     <w:p>
@@ -1192,6 +1199,15 @@
       </w:pPr>
       <w:r>
         <w:t>• 사내 메신저 및 업무 문서 데이터 기반 요약 모델(BART/T5) 학습 및 성능 개선</w:t>
+      </w:r>
+    </w:p>
+    <w:p>
+      <w:pPr>
+        <w:spacing w:after="250" w:line="260" w:lineRule="auto"/>
+        <w:ind w:left="300" w:hanging="300"/>
+      </w:pPr>
+      <w:r>
+        <w:t>• 기술: BART, T5, Hugging Face, PyTorch, Kubernetes</w:t>
       </w:r>
     </w:p>
     <w:p>
@@ -2032,6 +2048,28 @@
           <w:szCs w:val="22"/>
         </w:rPr>
         <w:t>Linux Master (2016), Data Analytics Semi-Professional (2021)</w:t>
+      </w:r>
+    </w:p>
+    <w:p>
+      <w:pPr>
+        <w:spacing w:after="250" w:line="260" w:lineRule="auto"/>
+      </w:pPr>
+      <w:r>
+        <w:rPr>
+          <w:rFonts w:ascii="Calibri" w:eastAsia="Calibri" w:hAnsi="Calibri" w:cs="Calibri"/>
+          <w:b/>
+          <w:bCs/>
+          <w:sz w:val="22"/>
+          <w:szCs w:val="22"/>
+        </w:rPr>
+        <w:t>Language: English (Intermediate, OPIc IM1)</w:t>
+      </w:r>
+      <w:r>
+        <w:rPr>
+          <w:rFonts w:ascii="Calibri" w:eastAsia="Calibri" w:hAnsi="Calibri" w:cs="Calibri"/>
+          <w:sz w:val="22"/>
+          <w:szCs w:val="22"/>
+        </w:rPr>
       </w:r>
     </w:p>
     <w:p>

</xml_diff>

<commit_message>
Add B.S. graduation date (2018.02)
</commit_message>
<xml_diff>
--- a/assets/resume.docx
+++ b/assets/resume.docx
@@ -1996,7 +1996,7 @@
           <w:sz w:val="22"/>
           <w:szCs w:val="22"/>
         </w:rPr>
-        <w:t xml:space="preserve">B.S. Computer </w:t>
+        <w:t>B.S. Computer Science  |  Hannam University (2018.02)</w:t>
       </w:r>
       <w:proofErr w:type="gramStart"/>
       <w:r>
@@ -2007,15 +2007,13 @@
           <w:sz w:val="22"/>
           <w:szCs w:val="22"/>
         </w:rPr>
-        <w:t>Science</w:t>
-      </w:r>
-      <w:r>
-        <w:rPr>
-          <w:rFonts w:ascii="Calibri" w:eastAsia="Calibri" w:hAnsi="Calibri" w:cs="Calibri"/>
-          <w:sz w:val="22"/>
-          <w:szCs w:val="22"/>
-        </w:rPr>
-        <w:t xml:space="preserve">  |</w:t>
+      </w:r>
+      <w:r>
+        <w:rPr>
+          <w:rFonts w:ascii="Calibri" w:eastAsia="Calibri" w:hAnsi="Calibri" w:cs="Calibri"/>
+          <w:sz w:val="22"/>
+          <w:szCs w:val="22"/>
+        </w:rPr>
       </w:r>
       <w:proofErr w:type="gramEnd"/>
       <w:r>
@@ -2024,7 +2022,6 @@
           <w:sz w:val="22"/>
           <w:szCs w:val="22"/>
         </w:rPr>
-        <w:t xml:space="preserve">  Hannam University</w:t>
       </w:r>
     </w:p>
     <w:p>

</xml_diff>

<commit_message>
Fix research period-paper mismatch, add Quhedge to career list, cleanup
</commit_message>
<xml_diff>
--- a/assets/resume.docx
+++ b/assets/resume.docx
@@ -34,9 +34,7 @@
       <w:r>
         <w:t>엔지니어</w:t>
       </w:r>
-      <w:r>
-        <w:t xml:space="preserve"> </w:t>
-      </w:r>
+      <w:r/>
     </w:p>
     <w:p>
       <w:pPr>
@@ -518,12 +516,6 @@
     </w:p>
     <w:p>
       <w:pPr>
-        <w:spacing w:after="120" w:line="260" w:lineRule="auto"/>
-        <w:ind w:left="360"/>
-      </w:pPr>
-    </w:p>
-    <w:p>
-      <w:pPr>
         <w:spacing w:after="80"/>
         <w:ind w:left="360"/>
       </w:pPr>
@@ -1091,7 +1083,7 @@
           <w:sz w:val="24"/>
           <w:szCs w:val="24"/>
         </w:rPr>
-        <w:t>3D Semantic Segmentation Research (2022.08 ~ 2022.12)</w:t>
+        <w:t>3D Segmentation &amp; Generative Model Research (2022.08 ~ 2023.12)</w:t>
       </w:r>
     </w:p>
     <w:p>

</xml_diff>

<commit_message>
Split 3D segmentation and generative model research into separate projects
</commit_message>
<xml_diff>
--- a/assets/resume.docx
+++ b/assets/resume.docx
@@ -1083,7 +1083,7 @@
           <w:sz w:val="24"/>
           <w:szCs w:val="24"/>
         </w:rPr>
-        <w:t>3D Segmentation &amp; Generative Model Research (2022.08 ~ 2023.12)</w:t>
+        <w:t>3D Semantic Segmentation Research (2022.08 ~ 2022.12)</w:t>
       </w:r>
     </w:p>
     <w:p>
@@ -1103,7 +1103,7 @@
         <w:ind w:left="300" w:hanging="300"/>
       </w:pPr>
       <w:r>
-        <w:t>• 논문 4편 게재(제1저자) | 특허 2건 등록(제1발명자) | 우수 논문상 수상(국방기술학회 2023.11)</w:t>
+        <w:t>• 성과: 논문 2편 게재(제1저자, 한국자동차공학회) | 특허 2건 등록(제1발명자)</w:t>
       </w:r>
     </w:p>
     <w:p>
@@ -1118,42 +1118,242 @@
           <w:sz w:val="22"/>
           <w:szCs w:val="22"/>
         </w:rPr>
-        <w:t xml:space="preserve">• </w:t>
-      </w:r>
-      <w:r>
-        <w:rPr>
-          <w:rFonts w:ascii="Calibri" w:eastAsia="Calibri" w:hAnsi="Calibri" w:cs="Calibri"/>
-          <w:sz w:val="22"/>
-          <w:szCs w:val="22"/>
-        </w:rPr>
-        <w:t>기술: Trans-</w:t>
-      </w:r>
-      <w:proofErr w:type="spellStart"/>
-      <w:r>
-        <w:rPr>
-          <w:rFonts w:ascii="Calibri" w:eastAsia="Calibri" w:hAnsi="Calibri" w:cs="Calibri"/>
-          <w:sz w:val="22"/>
-          <w:szCs w:val="22"/>
-        </w:rPr>
-        <w:t>Unet</w:t>
-      </w:r>
-      <w:proofErr w:type="spellEnd"/>
-      <w:r>
-        <w:rPr>
-          <w:rFonts w:ascii="Calibri" w:eastAsia="Calibri" w:hAnsi="Calibri" w:cs="Calibri"/>
-          <w:sz w:val="22"/>
-          <w:szCs w:val="22"/>
-        </w:rPr>
-        <w:t xml:space="preserve">, Latent Diffusion, LiDAR + Camera Sensor Fusion, </w:t>
-      </w:r>
-      <w:proofErr w:type="spellStart"/>
-      <w:r>
-        <w:rPr>
-          <w:rFonts w:ascii="Calibri" w:eastAsia="Calibri" w:hAnsi="Calibri" w:cs="Calibri"/>
-          <w:sz w:val="22"/>
-          <w:szCs w:val="22"/>
-        </w:rPr>
-        <w:t>PyTorch</w:t>
+        <w:t>• 기술: Trans-Unet, LiDAR + Camera Sensor Fusion, PyTorch</w:t>
+      </w:r>
+      <w:r>
+        <w:rPr>
+          <w:rFonts w:ascii="Calibri" w:eastAsia="Calibri" w:hAnsi="Calibri" w:cs="Calibri"/>
+          <w:sz w:val="22"/>
+          <w:szCs w:val="22"/>
+        </w:rPr>
+      </w:r>
+      <w:proofErr w:type="spellStart"/>
+      <w:r>
+        <w:rPr>
+          <w:rFonts w:ascii="Calibri" w:eastAsia="Calibri" w:hAnsi="Calibri" w:cs="Calibri"/>
+          <w:sz w:val="22"/>
+          <w:szCs w:val="22"/>
+        </w:rPr>
+      </w:r>
+      <w:proofErr w:type="spellEnd"/>
+      <w:r>
+        <w:rPr>
+          <w:rFonts w:ascii="Calibri" w:eastAsia="Calibri" w:hAnsi="Calibri" w:cs="Calibri"/>
+          <w:sz w:val="22"/>
+          <w:szCs w:val="22"/>
+        </w:rPr>
+      </w:r>
+      <w:proofErr w:type="spellStart"/>
+      <w:r>
+        <w:rPr>
+          <w:rFonts w:ascii="Calibri" w:eastAsia="Calibri" w:hAnsi="Calibri" w:cs="Calibri"/>
+          <w:sz w:val="22"/>
+          <w:szCs w:val="22"/>
+        </w:rPr>
+      </w:r>
+      <w:proofErr w:type="spellEnd"/>
+    </w:p>
+    <w:p>
+      <w:pPr>
+        <w:spacing w:after="80" w:line="260" w:lineRule="auto"/>
+      </w:pPr>
+      <w:r>
+        <w:rPr>
+          <w:rFonts w:ascii="Calibri" w:eastAsia="Calibri" w:hAnsi="Calibri" w:cs="Calibri"/>
+          <w:b/>
+          <w:bCs/>
+          <w:color w:val="333333"/>
+          <w:sz w:val="24"/>
+          <w:szCs w:val="24"/>
+        </w:rPr>
+        <w:t>Generative Model Research (2023.09 ~ 2023.12)</w:t>
+      </w:r>
+    </w:p>
+    <w:p>
+      <w:pPr>
+        <w:spacing w:after="120" w:line="260" w:lineRule="auto"/>
+        <w:ind w:left="300" w:hanging="300"/>
+      </w:pPr>
+      <w:r>
+        <w:rPr>
+          <w:b/>
+          <w:bCs/>
+          <w:sz w:val="22"/>
+          <w:szCs w:val="22"/>
+        </w:rPr>
+        <w:t>• 배경: 국방 도메인 학습 데이터 부족 — 생성 모델 기반 데이터 확보 연구</w:t>
+      </w:r>
+      <w:r>
+        <w:rPr>
+          <w:rFonts w:ascii="Calibri" w:eastAsia="Calibri" w:hAnsi="Calibri" w:cs="Calibri"/>
+          <w:sz w:val="22"/>
+          <w:szCs w:val="22"/>
+        </w:rPr>
+      </w:r>
+      <w:proofErr w:type="spellStart"/>
+      <w:r>
+        <w:rPr>
+          <w:rFonts w:ascii="Calibri" w:eastAsia="Calibri" w:hAnsi="Calibri" w:cs="Calibri"/>
+          <w:sz w:val="22"/>
+          <w:szCs w:val="22"/>
+        </w:rPr>
+      </w:r>
+      <w:proofErr w:type="spellEnd"/>
+      <w:r>
+        <w:rPr>
+          <w:rFonts w:ascii="Calibri" w:eastAsia="Calibri" w:hAnsi="Calibri" w:cs="Calibri"/>
+          <w:sz w:val="22"/>
+          <w:szCs w:val="22"/>
+        </w:rPr>
+      </w:r>
+      <w:proofErr w:type="spellStart"/>
+      <w:r>
+        <w:rPr>
+          <w:rFonts w:ascii="Calibri" w:eastAsia="Calibri" w:hAnsi="Calibri" w:cs="Calibri"/>
+          <w:sz w:val="22"/>
+          <w:szCs w:val="22"/>
+        </w:rPr>
+      </w:r>
+      <w:proofErr w:type="spellEnd"/>
+    </w:p>
+    <w:p>
+      <w:pPr>
+        <w:spacing w:after="120" w:line="260" w:lineRule="auto"/>
+        <w:ind w:left="300" w:hanging="300"/>
+      </w:pPr>
+      <w:r>
+        <w:rPr>
+          <w:b/>
+          <w:bCs/>
+          <w:sz w:val="22"/>
+          <w:szCs w:val="22"/>
+        </w:rPr>
+        <w:t>• Latent Diffusion 기반 합성 데이터 생성 및 실제 모델 학습 적용 검증</w:t>
+      </w:r>
+      <w:r>
+        <w:rPr>
+          <w:rFonts w:ascii="Calibri" w:eastAsia="Calibri" w:hAnsi="Calibri" w:cs="Calibri"/>
+          <w:sz w:val="22"/>
+          <w:szCs w:val="22"/>
+        </w:rPr>
+      </w:r>
+      <w:proofErr w:type="spellStart"/>
+      <w:r>
+        <w:rPr>
+          <w:rFonts w:ascii="Calibri" w:eastAsia="Calibri" w:hAnsi="Calibri" w:cs="Calibri"/>
+          <w:sz w:val="22"/>
+          <w:szCs w:val="22"/>
+        </w:rPr>
+      </w:r>
+      <w:proofErr w:type="spellEnd"/>
+      <w:r>
+        <w:rPr>
+          <w:rFonts w:ascii="Calibri" w:eastAsia="Calibri" w:hAnsi="Calibri" w:cs="Calibri"/>
+          <w:sz w:val="22"/>
+          <w:szCs w:val="22"/>
+        </w:rPr>
+      </w:r>
+      <w:proofErr w:type="spellStart"/>
+      <w:r>
+        <w:rPr>
+          <w:rFonts w:ascii="Calibri" w:eastAsia="Calibri" w:hAnsi="Calibri" w:cs="Calibri"/>
+          <w:sz w:val="22"/>
+          <w:szCs w:val="22"/>
+        </w:rPr>
+      </w:r>
+      <w:proofErr w:type="spellEnd"/>
+    </w:p>
+    <w:p>
+      <w:pPr>
+        <w:spacing w:after="120" w:line="260" w:lineRule="auto"/>
+        <w:ind w:left="300" w:hanging="300"/>
+      </w:pPr>
+      <w:r>
+        <w:rPr>
+          <w:b/>
+          <w:bCs/>
+          <w:sz w:val="22"/>
+          <w:szCs w:val="22"/>
+        </w:rPr>
+        <w:t>• 기술: Latent Diffusion, GAN, PyTorch</w:t>
+      </w:r>
+      <w:r>
+        <w:rPr>
+          <w:rFonts w:ascii="Calibri" w:eastAsia="Calibri" w:hAnsi="Calibri" w:cs="Calibri"/>
+          <w:sz w:val="22"/>
+          <w:szCs w:val="22"/>
+        </w:rPr>
+      </w:r>
+      <w:proofErr w:type="spellStart"/>
+      <w:r>
+        <w:rPr>
+          <w:rFonts w:ascii="Calibri" w:eastAsia="Calibri" w:hAnsi="Calibri" w:cs="Calibri"/>
+          <w:sz w:val="22"/>
+          <w:szCs w:val="22"/>
+        </w:rPr>
+      </w:r>
+      <w:proofErr w:type="spellEnd"/>
+      <w:r>
+        <w:rPr>
+          <w:rFonts w:ascii="Calibri" w:eastAsia="Calibri" w:hAnsi="Calibri" w:cs="Calibri"/>
+          <w:sz w:val="22"/>
+          <w:szCs w:val="22"/>
+        </w:rPr>
+      </w:r>
+      <w:proofErr w:type="spellStart"/>
+      <w:r>
+        <w:rPr>
+          <w:rFonts w:ascii="Calibri" w:eastAsia="Calibri" w:hAnsi="Calibri" w:cs="Calibri"/>
+          <w:sz w:val="22"/>
+          <w:szCs w:val="22"/>
+        </w:rPr>
+      </w:r>
+      <w:proofErr w:type="spellEnd"/>
+    </w:p>
+    <w:p>
+      <w:pPr>
+        <w:spacing w:after="120" w:line="260" w:lineRule="auto"/>
+        <w:ind w:left="300" w:hanging="300"/>
+      </w:pPr>
+      <w:r>
+        <w:rPr>
+          <w:b/>
+          <w:bCs/>
+          <w:sz w:val="22"/>
+          <w:szCs w:val="22"/>
+        </w:rPr>
+        <w:t>• 성과: 논문 2편 게재(제1저자) | 우수 논문상 수상(국방기술학회 2023.11)</w:t>
+      </w:r>
+      <w:r>
+        <w:rPr>
+          <w:rFonts w:ascii="Calibri" w:eastAsia="Calibri" w:hAnsi="Calibri" w:cs="Calibri"/>
+          <w:sz w:val="22"/>
+          <w:szCs w:val="22"/>
+        </w:rPr>
+      </w:r>
+      <w:proofErr w:type="spellStart"/>
+      <w:r>
+        <w:rPr>
+          <w:rFonts w:ascii="Calibri" w:eastAsia="Calibri" w:hAnsi="Calibri" w:cs="Calibri"/>
+          <w:sz w:val="22"/>
+          <w:szCs w:val="22"/>
+        </w:rPr>
+      </w:r>
+      <w:proofErr w:type="spellEnd"/>
+      <w:r>
+        <w:rPr>
+          <w:rFonts w:ascii="Calibri" w:eastAsia="Calibri" w:hAnsi="Calibri" w:cs="Calibri"/>
+          <w:sz w:val="22"/>
+          <w:szCs w:val="22"/>
+        </w:rPr>
+      </w:r>
+      <w:proofErr w:type="spellStart"/>
+      <w:r>
+        <w:rPr>
+          <w:rFonts w:ascii="Calibri" w:eastAsia="Calibri" w:hAnsi="Calibri" w:cs="Calibri"/>
+          <w:sz w:val="22"/>
+          <w:szCs w:val="22"/>
+        </w:rPr>
       </w:r>
       <w:proofErr w:type="spellEnd"/>
     </w:p>

</xml_diff>

<commit_message>
Full audit fixes: separate research projects, official society name, remove unverified claims, chronological order
</commit_message>
<xml_diff>
--- a/assets/resume.docx
+++ b/assets/resume.docx
@@ -845,7 +845,7 @@
         <w:rPr>
           <w:b w:val="0"/>
         </w:rPr>
-        <w:t>• 배경: 하루 수천 건 상담 전화 실시간 처리 필요 — 기존 시스템 병목으로 동시 채널 부족</w:t>
+        <w:t>• 배경: AIG 상담센터 대량 상담 전화 실시간 처리 필요 — 기존 시스템 병목으로 동시 채널 부족</w:t>
       </w:r>
     </w:p>
     <w:p>
@@ -1083,7 +1083,7 @@
           <w:sz w:val="24"/>
           <w:szCs w:val="24"/>
         </w:rPr>
-        <w:t>3D Semantic Segmentation Research (2022.08 ~ 2022.12)</w:t>
+        <w:t>NLP-based Text Summarization System (2024.01 ~ 2024.07)</w:t>
       </w:r>
     </w:p>
     <w:p>
@@ -1094,7 +1094,7 @@
         <w:rPr>
           <w:b w:val="0"/>
         </w:rPr>
-        <w:t>• 배경: 자율주행 환경 인식에 3D 거리/높이 정보 필수 — 2D 세그멘테이션 한계 극복 위한 센서 퓨전 연구</w:t>
+        <w:t>• 배경: 사내 회의록·업무 문서 다수 생성 — 핵심 내용 자동 요약 및 업무 효율화 필요</w:t>
       </w:r>
     </w:p>
     <w:p>
@@ -1103,55 +1103,26 @@
         <w:ind w:left="300" w:hanging="300"/>
       </w:pPr>
       <w:r>
-        <w:t>• 성과: 논문 2편 게재(제1저자, 한국자동차공학회) | 특허 2건 등록(제1발명자)</w:t>
-      </w:r>
-    </w:p>
-    <w:p>
-      <w:pPr>
-        <w:spacing w:after="120" w:line="260" w:lineRule="auto"/>
+        <w:t>• 사내 메신저 및 업무 문서 데이터 기반 요약 모델(BART/T5) 학습 및 성능 개선</w:t>
+      </w:r>
+    </w:p>
+    <w:p>
+      <w:pPr>
+        <w:spacing w:after="250" w:line="260" w:lineRule="auto"/>
         <w:ind w:left="300" w:hanging="300"/>
       </w:pPr>
       <w:r>
-        <w:rPr>
-          <w:b/>
-          <w:bCs/>
-          <w:sz w:val="22"/>
-          <w:szCs w:val="22"/>
-        </w:rPr>
-        <w:t>• 기술: Trans-Unet, LiDAR + Camera Sensor Fusion, PyTorch</w:t>
-      </w:r>
-      <w:r>
-        <w:rPr>
-          <w:rFonts w:ascii="Calibri" w:eastAsia="Calibri" w:hAnsi="Calibri" w:cs="Calibri"/>
-          <w:sz w:val="22"/>
-          <w:szCs w:val="22"/>
-        </w:rPr>
-      </w:r>
-      <w:proofErr w:type="spellStart"/>
-      <w:r>
-        <w:rPr>
-          <w:rFonts w:ascii="Calibri" w:eastAsia="Calibri" w:hAnsi="Calibri" w:cs="Calibri"/>
-          <w:sz w:val="22"/>
-          <w:szCs w:val="22"/>
-        </w:rPr>
-      </w:r>
-      <w:proofErr w:type="spellEnd"/>
-      <w:r>
-        <w:rPr>
-          <w:rFonts w:ascii="Calibri" w:eastAsia="Calibri" w:hAnsi="Calibri" w:cs="Calibri"/>
-          <w:sz w:val="22"/>
-          <w:szCs w:val="22"/>
-        </w:rPr>
-      </w:r>
-      <w:proofErr w:type="spellStart"/>
-      <w:r>
-        <w:rPr>
-          <w:rFonts w:ascii="Calibri" w:eastAsia="Calibri" w:hAnsi="Calibri" w:cs="Calibri"/>
-          <w:sz w:val="22"/>
-          <w:szCs w:val="22"/>
-        </w:rPr>
-      </w:r>
-      <w:proofErr w:type="spellEnd"/>
+        <w:t>• 기술: BART, T5, Hugging Face, PyTorch, Kubernetes</w:t>
+      </w:r>
+    </w:p>
+    <w:p>
+      <w:pPr>
+        <w:spacing w:after="250" w:line="260" w:lineRule="auto"/>
+        <w:ind w:left="300" w:hanging="300"/>
+      </w:pPr>
+      <w:r>
+        <w:t>• 성과: 사내 자체 개발 메신저에 기능 추가하여 회의록, 문서 요약에 적용</w:t>
+      </w:r>
     </w:p>
     <w:p>
       <w:pPr>
@@ -1176,7 +1147,7 @@
       </w:pPr>
       <w:r>
         <w:rPr>
-          <w:b/>
+          <w:b w:val="0"/>
           <w:bCs/>
           <w:sz w:val="22"/>
           <w:szCs w:val="22"/>
@@ -1186,30 +1157,34 @@
       <w:r>
         <w:rPr>
           <w:rFonts w:ascii="Calibri" w:eastAsia="Calibri" w:hAnsi="Calibri" w:cs="Calibri"/>
-          <w:sz w:val="22"/>
-          <w:szCs w:val="22"/>
-        </w:rPr>
-      </w:r>
-      <w:proofErr w:type="spellStart"/>
-      <w:r>
-        <w:rPr>
-          <w:rFonts w:ascii="Calibri" w:eastAsia="Calibri" w:hAnsi="Calibri" w:cs="Calibri"/>
-          <w:sz w:val="22"/>
-          <w:szCs w:val="22"/>
-        </w:rPr>
-      </w:r>
-      <w:proofErr w:type="spellEnd"/>
-      <w:r>
-        <w:rPr>
-          <w:rFonts w:ascii="Calibri" w:eastAsia="Calibri" w:hAnsi="Calibri" w:cs="Calibri"/>
-          <w:sz w:val="22"/>
-          <w:szCs w:val="22"/>
-        </w:rPr>
-      </w:r>
-      <w:proofErr w:type="spellStart"/>
-      <w:r>
-        <w:rPr>
-          <w:rFonts w:ascii="Calibri" w:eastAsia="Calibri" w:hAnsi="Calibri" w:cs="Calibri"/>
+          <w:b w:val="0"/>
+          <w:sz w:val="22"/>
+          <w:szCs w:val="22"/>
+        </w:rPr>
+      </w:r>
+      <w:proofErr w:type="spellStart"/>
+      <w:r>
+        <w:rPr>
+          <w:rFonts w:ascii="Calibri" w:eastAsia="Calibri" w:hAnsi="Calibri" w:cs="Calibri"/>
+          <w:b w:val="0"/>
+          <w:sz w:val="22"/>
+          <w:szCs w:val="22"/>
+        </w:rPr>
+      </w:r>
+      <w:proofErr w:type="spellEnd"/>
+      <w:r>
+        <w:rPr>
+          <w:rFonts w:ascii="Calibri" w:eastAsia="Calibri" w:hAnsi="Calibri" w:cs="Calibri"/>
+          <w:b w:val="0"/>
+          <w:sz w:val="22"/>
+          <w:szCs w:val="22"/>
+        </w:rPr>
+      </w:r>
+      <w:proofErr w:type="spellStart"/>
+      <w:r>
+        <w:rPr>
+          <w:rFonts w:ascii="Calibri" w:eastAsia="Calibri" w:hAnsi="Calibri" w:cs="Calibri"/>
+          <w:b w:val="0"/>
           <w:sz w:val="22"/>
           <w:szCs w:val="22"/>
         </w:rPr>
@@ -1223,7 +1198,7 @@
       </w:pPr>
       <w:r>
         <w:rPr>
-          <w:b/>
+          <w:b w:val="0"/>
           <w:bCs/>
           <w:sz w:val="22"/>
           <w:szCs w:val="22"/>
@@ -1233,30 +1208,34 @@
       <w:r>
         <w:rPr>
           <w:rFonts w:ascii="Calibri" w:eastAsia="Calibri" w:hAnsi="Calibri" w:cs="Calibri"/>
-          <w:sz w:val="22"/>
-          <w:szCs w:val="22"/>
-        </w:rPr>
-      </w:r>
-      <w:proofErr w:type="spellStart"/>
-      <w:r>
-        <w:rPr>
-          <w:rFonts w:ascii="Calibri" w:eastAsia="Calibri" w:hAnsi="Calibri" w:cs="Calibri"/>
-          <w:sz w:val="22"/>
-          <w:szCs w:val="22"/>
-        </w:rPr>
-      </w:r>
-      <w:proofErr w:type="spellEnd"/>
-      <w:r>
-        <w:rPr>
-          <w:rFonts w:ascii="Calibri" w:eastAsia="Calibri" w:hAnsi="Calibri" w:cs="Calibri"/>
-          <w:sz w:val="22"/>
-          <w:szCs w:val="22"/>
-        </w:rPr>
-      </w:r>
-      <w:proofErr w:type="spellStart"/>
-      <w:r>
-        <w:rPr>
-          <w:rFonts w:ascii="Calibri" w:eastAsia="Calibri" w:hAnsi="Calibri" w:cs="Calibri"/>
+          <w:b w:val="0"/>
+          <w:sz w:val="22"/>
+          <w:szCs w:val="22"/>
+        </w:rPr>
+      </w:r>
+      <w:proofErr w:type="spellStart"/>
+      <w:r>
+        <w:rPr>
+          <w:rFonts w:ascii="Calibri" w:eastAsia="Calibri" w:hAnsi="Calibri" w:cs="Calibri"/>
+          <w:b w:val="0"/>
+          <w:sz w:val="22"/>
+          <w:szCs w:val="22"/>
+        </w:rPr>
+      </w:r>
+      <w:proofErr w:type="spellEnd"/>
+      <w:r>
+        <w:rPr>
+          <w:rFonts w:ascii="Calibri" w:eastAsia="Calibri" w:hAnsi="Calibri" w:cs="Calibri"/>
+          <w:b w:val="0"/>
+          <w:sz w:val="22"/>
+          <w:szCs w:val="22"/>
+        </w:rPr>
+      </w:r>
+      <w:proofErr w:type="spellStart"/>
+      <w:r>
+        <w:rPr>
+          <w:rFonts w:ascii="Calibri" w:eastAsia="Calibri" w:hAnsi="Calibri" w:cs="Calibri"/>
+          <w:b w:val="0"/>
           <w:sz w:val="22"/>
           <w:szCs w:val="22"/>
         </w:rPr>
@@ -1270,7 +1249,7 @@
       </w:pPr>
       <w:r>
         <w:rPr>
-          <w:b/>
+          <w:b w:val="0"/>
           <w:bCs/>
           <w:sz w:val="22"/>
           <w:szCs w:val="22"/>
@@ -1280,30 +1259,34 @@
       <w:r>
         <w:rPr>
           <w:rFonts w:ascii="Calibri" w:eastAsia="Calibri" w:hAnsi="Calibri" w:cs="Calibri"/>
-          <w:sz w:val="22"/>
-          <w:szCs w:val="22"/>
-        </w:rPr>
-      </w:r>
-      <w:proofErr w:type="spellStart"/>
-      <w:r>
-        <w:rPr>
-          <w:rFonts w:ascii="Calibri" w:eastAsia="Calibri" w:hAnsi="Calibri" w:cs="Calibri"/>
-          <w:sz w:val="22"/>
-          <w:szCs w:val="22"/>
-        </w:rPr>
-      </w:r>
-      <w:proofErr w:type="spellEnd"/>
-      <w:r>
-        <w:rPr>
-          <w:rFonts w:ascii="Calibri" w:eastAsia="Calibri" w:hAnsi="Calibri" w:cs="Calibri"/>
-          <w:sz w:val="22"/>
-          <w:szCs w:val="22"/>
-        </w:rPr>
-      </w:r>
-      <w:proofErr w:type="spellStart"/>
-      <w:r>
-        <w:rPr>
-          <w:rFonts w:ascii="Calibri" w:eastAsia="Calibri" w:hAnsi="Calibri" w:cs="Calibri"/>
+          <w:b w:val="0"/>
+          <w:sz w:val="22"/>
+          <w:szCs w:val="22"/>
+        </w:rPr>
+      </w:r>
+      <w:proofErr w:type="spellStart"/>
+      <w:r>
+        <w:rPr>
+          <w:rFonts w:ascii="Calibri" w:eastAsia="Calibri" w:hAnsi="Calibri" w:cs="Calibri"/>
+          <w:b w:val="0"/>
+          <w:sz w:val="22"/>
+          <w:szCs w:val="22"/>
+        </w:rPr>
+      </w:r>
+      <w:proofErr w:type="spellEnd"/>
+      <w:r>
+        <w:rPr>
+          <w:rFonts w:ascii="Calibri" w:eastAsia="Calibri" w:hAnsi="Calibri" w:cs="Calibri"/>
+          <w:b w:val="0"/>
+          <w:sz w:val="22"/>
+          <w:szCs w:val="22"/>
+        </w:rPr>
+      </w:r>
+      <w:proofErr w:type="spellStart"/>
+      <w:r>
+        <w:rPr>
+          <w:rFonts w:ascii="Calibri" w:eastAsia="Calibri" w:hAnsi="Calibri" w:cs="Calibri"/>
+          <w:b w:val="0"/>
           <w:sz w:val="22"/>
           <w:szCs w:val="22"/>
         </w:rPr>
@@ -1317,7 +1300,7 @@
       </w:pPr>
       <w:r>
         <w:rPr>
-          <w:b/>
+          <w:b w:val="0"/>
           <w:bCs/>
           <w:sz w:val="22"/>
           <w:szCs w:val="22"/>
@@ -1327,30 +1310,34 @@
       <w:r>
         <w:rPr>
           <w:rFonts w:ascii="Calibri" w:eastAsia="Calibri" w:hAnsi="Calibri" w:cs="Calibri"/>
-          <w:sz w:val="22"/>
-          <w:szCs w:val="22"/>
-        </w:rPr>
-      </w:r>
-      <w:proofErr w:type="spellStart"/>
-      <w:r>
-        <w:rPr>
-          <w:rFonts w:ascii="Calibri" w:eastAsia="Calibri" w:hAnsi="Calibri" w:cs="Calibri"/>
-          <w:sz w:val="22"/>
-          <w:szCs w:val="22"/>
-        </w:rPr>
-      </w:r>
-      <w:proofErr w:type="spellEnd"/>
-      <w:r>
-        <w:rPr>
-          <w:rFonts w:ascii="Calibri" w:eastAsia="Calibri" w:hAnsi="Calibri" w:cs="Calibri"/>
-          <w:sz w:val="22"/>
-          <w:szCs w:val="22"/>
-        </w:rPr>
-      </w:r>
-      <w:proofErr w:type="spellStart"/>
-      <w:r>
-        <w:rPr>
-          <w:rFonts w:ascii="Calibri" w:eastAsia="Calibri" w:hAnsi="Calibri" w:cs="Calibri"/>
+          <w:b w:val="0"/>
+          <w:sz w:val="22"/>
+          <w:szCs w:val="22"/>
+        </w:rPr>
+      </w:r>
+      <w:proofErr w:type="spellStart"/>
+      <w:r>
+        <w:rPr>
+          <w:rFonts w:ascii="Calibri" w:eastAsia="Calibri" w:hAnsi="Calibri" w:cs="Calibri"/>
+          <w:b w:val="0"/>
+          <w:sz w:val="22"/>
+          <w:szCs w:val="22"/>
+        </w:rPr>
+      </w:r>
+      <w:proofErr w:type="spellEnd"/>
+      <w:r>
+        <w:rPr>
+          <w:rFonts w:ascii="Calibri" w:eastAsia="Calibri" w:hAnsi="Calibri" w:cs="Calibri"/>
+          <w:b w:val="0"/>
+          <w:sz w:val="22"/>
+          <w:szCs w:val="22"/>
+        </w:rPr>
+      </w:r>
+      <w:proofErr w:type="spellStart"/>
+      <w:r>
+        <w:rPr>
+          <w:rFonts w:ascii="Calibri" w:eastAsia="Calibri" w:hAnsi="Calibri" w:cs="Calibri"/>
+          <w:b w:val="0"/>
           <w:sz w:val="22"/>
           <w:szCs w:val="22"/>
         </w:rPr>
@@ -1370,7 +1357,7 @@
           <w:sz w:val="24"/>
           <w:szCs w:val="24"/>
         </w:rPr>
-        <w:t>NLP-based Text Summarization System (2024.01 ~ 2024.07)</w:t>
+        <w:t>3D Semantic Segmentation Research (2022.08 ~ 2022.12)</w:t>
       </w:r>
     </w:p>
     <w:p>
@@ -1381,7 +1368,7 @@
         <w:rPr>
           <w:b w:val="0"/>
         </w:rPr>
-        <w:t>• 배경: 사내 회의록·업무 문서 다수 생성 — 핵심 내용 자동 요약 및 업무 효율화 필요</w:t>
+        <w:t>• 배경: 자율주행 환경 인식에 3D 거리/높이 정보 필수 — 2D 세그멘테이션 한계 극복 위한 센서 퓨전 연구</w:t>
       </w:r>
     </w:p>
     <w:p>
@@ -1390,26 +1377,59 @@
         <w:ind w:left="300" w:hanging="300"/>
       </w:pPr>
       <w:r>
-        <w:t>• 사내 메신저 및 업무 문서 데이터 기반 요약 모델(BART/T5) 학습 및 성능 개선</w:t>
-      </w:r>
-    </w:p>
-    <w:p>
-      <w:pPr>
-        <w:spacing w:after="250" w:line="260" w:lineRule="auto"/>
+        <w:t>• 성과: 논문 2편 게재(제1저자, 한국자동차공학회) | 특허 2건 등록(제1발명자)</w:t>
+      </w:r>
+    </w:p>
+    <w:p>
+      <w:pPr>
+        <w:spacing w:after="120" w:line="260" w:lineRule="auto"/>
         <w:ind w:left="300" w:hanging="300"/>
       </w:pPr>
       <w:r>
-        <w:t>• 기술: BART, T5, Hugging Face, PyTorch, Kubernetes</w:t>
-      </w:r>
-    </w:p>
-    <w:p>
-      <w:pPr>
-        <w:spacing w:after="250" w:line="260" w:lineRule="auto"/>
-        <w:ind w:left="300" w:hanging="300"/>
-      </w:pPr>
-      <w:r>
-        <w:t>• 성과: 사내 자체 개발 메신저에 기능 추가하여 회의록, 문서 요약에 적용</w:t>
-      </w:r>
+        <w:rPr>
+          <w:b w:val="0"/>
+          <w:bCs/>
+          <w:sz w:val="22"/>
+          <w:szCs w:val="22"/>
+        </w:rPr>
+        <w:t>• 기술: Trans-Unet, LiDAR + Camera Sensor Fusion, PyTorch</w:t>
+      </w:r>
+      <w:r>
+        <w:rPr>
+          <w:rFonts w:ascii="Calibri" w:eastAsia="Calibri" w:hAnsi="Calibri" w:cs="Calibri"/>
+          <w:b w:val="0"/>
+          <w:sz w:val="22"/>
+          <w:szCs w:val="22"/>
+        </w:rPr>
+      </w:r>
+      <w:proofErr w:type="spellStart"/>
+      <w:r>
+        <w:rPr>
+          <w:rFonts w:ascii="Calibri" w:eastAsia="Calibri" w:hAnsi="Calibri" w:cs="Calibri"/>
+          <w:b w:val="0"/>
+          <w:sz w:val="22"/>
+          <w:szCs w:val="22"/>
+        </w:rPr>
+      </w:r>
+      <w:proofErr w:type="spellEnd"/>
+      <w:r>
+        <w:rPr>
+          <w:rFonts w:ascii="Calibri" w:eastAsia="Calibri" w:hAnsi="Calibri" w:cs="Calibri"/>
+          <w:b w:val="0"/>
+          <w:sz w:val="22"/>
+          <w:szCs w:val="22"/>
+        </w:rPr>
+      </w:r>
+      <w:proofErr w:type="spellStart"/>
+      <w:r>
+        <w:rPr>
+          <w:rFonts w:ascii="Calibri" w:eastAsia="Calibri" w:hAnsi="Calibri" w:cs="Calibri"/>
+          <w:b w:val="0"/>
+          <w:sz w:val="22"/>
+          <w:szCs w:val="22"/>
+        </w:rPr>
+      </w:r>
+      <w:proofErr w:type="spellEnd"/>
     </w:p>
     <w:p>
       <w:pPr>

</xml_diff>

<commit_message>
Content verification fixes: Python 3.12 confirmed, remove NLP-K8s timeline conflict
</commit_message>
<xml_diff>
--- a/assets/resume.docx
+++ b/assets/resume.docx
@@ -810,7 +810,7 @@
         <w:ind w:left="360"/>
       </w:pPr>
       <w:r>
-        <w:t>Python 3.11+, FastAPI, WebSocket, vLLM-Omni, Redis (Pub/Sub, Distributed Lock, TTL Cache), React 18, TypeScript, CUDA Optimization, FP8 Quantization</w:t>
+        <w:t>Python 3.12, FastAPI, WebSocket, vLLM-Omni, Redis (Pub/Sub, Distributed Lock, TTL Cache), React 18, TypeScript, CUDA Optimization, FP8 Quantization</w:t>
       </w:r>
       <w:proofErr w:type="spellStart"/>
       <w:r/>
@@ -1112,7 +1112,7 @@
         <w:ind w:left="300" w:hanging="300"/>
       </w:pPr>
       <w:r>
-        <w:t>• 기술: BART, T5, Hugging Face, PyTorch, Kubernetes</w:t>
+        <w:t>• 기술: BART, T5, Hugging Face, PyTorch</w:t>
       </w:r>
     </w:p>
     <w:p>

</xml_diff>

<commit_message>
Apply Notion project DB verified data: new KPIs, K8s period, diarization facts, Helm
</commit_message>
<xml_diff>
--- a/assets/resume.docx
+++ b/assets/resume.docx
@@ -516,6 +516,18 @@
     </w:p>
     <w:p>
       <w:pPr>
+        <w:spacing w:after="40" w:line="260" w:lineRule="auto"/>
+        <w:ind w:left="360"/>
+      </w:pPr>
+      <w:r>
+        <w:rPr>
+          <w:b w:val="0"/>
+        </w:rPr>
+        <w:t>✓ 32개 언어 지원 단일 플랫폼 | ITN 정규화 정확도 50.1% → 70.9%</w:t>
+      </w:r>
+    </w:p>
+    <w:p>
+      <w:pPr>
         <w:spacing w:after="80"/>
         <w:ind w:left="360"/>
       </w:pPr>
@@ -886,7 +898,7 @@
         <w:ind w:left="300" w:hanging="300"/>
       </w:pPr>
       <w:r>
-        <w:t>• 성과: Triton 기반 추론 환경 최적화로 동시 처리 채널 확장, 파이프라인 개선 및 안정성 확보</w:t>
+        <w:t>• 성과: AIG 요구사항 해결 4건, Triton 기반 추론 환경 최적화로 동시 처리 채널 확장 및 안정성 확보</w:t>
       </w:r>
     </w:p>
     <w:p>
@@ -930,15 +942,6 @@
       </w:pPr>
       <w:r>
         <w:t>• 기술: Pyannote, PyTorch, Audio Processing</w:t>
-      </w:r>
-    </w:p>
-    <w:p>
-      <w:pPr>
-        <w:spacing w:after="250" w:line="260" w:lineRule="auto"/>
-        <w:ind w:left="300" w:hanging="300"/>
-      </w:pPr>
-      <w:r>
-        <w:t>• 성과: 상담사/고객 발화 구분 자동화로 상담 품질 분석 기반 마련</w:t>
       </w:r>
     </w:p>
     <w:p>
@@ -975,7 +978,7 @@
           <w:sz w:val="24"/>
           <w:szCs w:val="24"/>
         </w:rPr>
-        <w:t>Kubernetes 기반 AI 인프라 (2024.08 ~ 2025.04)</w:t>
+        <w:t>Kubernetes 기반 AI 인프라 (2024.03 ~ 2025.04)</w:t>
       </w:r>
       <w:proofErr w:type="spellStart"/>
       <w:r>
@@ -1032,33 +1035,30 @@
           <w:sz w:val="22"/>
           <w:szCs w:val="22"/>
         </w:rPr>
-        <w:t xml:space="preserve">• </w:t>
-      </w:r>
-      <w:r>
-        <w:rPr>
-          <w:rFonts w:ascii="Calibri" w:eastAsia="Calibri" w:hAnsi="Calibri" w:cs="Calibri"/>
-          <w:sz w:val="22"/>
-          <w:szCs w:val="22"/>
-        </w:rPr>
-        <w:t xml:space="preserve">기술: Kubernetes, Docker, GitLab CI/CD, Jenkins, </w:t>
-      </w:r>
-      <w:proofErr w:type="spellStart"/>
-      <w:r>
-        <w:rPr>
-          <w:rFonts w:ascii="Calibri" w:eastAsia="Calibri" w:hAnsi="Calibri" w:cs="Calibri"/>
-          <w:sz w:val="22"/>
-          <w:szCs w:val="22"/>
-        </w:rPr>
-        <w:t>ArgoCD</w:t>
-      </w:r>
-      <w:proofErr w:type="spellEnd"/>
-      <w:r>
-        <w:rPr>
-          <w:rFonts w:ascii="Calibri" w:eastAsia="Calibri" w:hAnsi="Calibri" w:cs="Calibri"/>
-          <w:sz w:val="22"/>
-          <w:szCs w:val="22"/>
-        </w:rPr>
-        <w:t>, Prometheus/Grafana/Loki/ELK</w:t>
+        <w:t>• 기술: Kubernetes, Docker, Helm, GitLab CI/CD, Jenkins, ArgoCD, Prometheus/Grafana/Loki/ELK</w:t>
+      </w:r>
+      <w:r>
+        <w:rPr>
+          <w:rFonts w:ascii="Calibri" w:eastAsia="Calibri" w:hAnsi="Calibri" w:cs="Calibri"/>
+          <w:sz w:val="22"/>
+          <w:szCs w:val="22"/>
+        </w:rPr>
+      </w:r>
+      <w:proofErr w:type="spellStart"/>
+      <w:r>
+        <w:rPr>
+          <w:rFonts w:ascii="Calibri" w:eastAsia="Calibri" w:hAnsi="Calibri" w:cs="Calibri"/>
+          <w:sz w:val="22"/>
+          <w:szCs w:val="22"/>
+        </w:rPr>
+      </w:r>
+      <w:proofErr w:type="spellEnd"/>
+      <w:r>
+        <w:rPr>
+          <w:rFonts w:ascii="Calibri" w:eastAsia="Calibri" w:hAnsi="Calibri" w:cs="Calibri"/>
+          <w:sz w:val="22"/>
+          <w:szCs w:val="22"/>
+        </w:rPr>
       </w:r>
     </w:p>
     <w:p>

</xml_diff>

<commit_message>
Add KISTI internship (2017.10-2018.01) to career history
</commit_message>
<xml_diff>
--- a/assets/resume.docx
+++ b/assets/resume.docx
@@ -1821,6 +1821,150 @@
           <w:szCs w:val="22"/>
         </w:rPr>
         <w:t>• 기술: Python, Pandas, NumPy, SQL</w:t>
+      </w:r>
+      <w:r>
+        <w:rPr>
+          <w:rFonts w:ascii="Calibri" w:eastAsia="Calibri" w:hAnsi="Calibri" w:cs="Calibri"/>
+          <w:b w:val="0"/>
+          <w:sz w:val="22"/>
+          <w:szCs w:val="22"/>
+        </w:rPr>
+      </w:r>
+      <w:proofErr w:type="spellStart"/>
+      <w:r>
+        <w:rPr>
+          <w:rFonts w:ascii="Calibri" w:eastAsia="Calibri" w:hAnsi="Calibri" w:cs="Calibri"/>
+          <w:b w:val="0"/>
+          <w:sz w:val="22"/>
+          <w:szCs w:val="22"/>
+        </w:rPr>
+      </w:r>
+      <w:proofErr w:type="spellEnd"/>
+      <w:r>
+        <w:rPr>
+          <w:rFonts w:ascii="Calibri" w:eastAsia="Calibri" w:hAnsi="Calibri" w:cs="Calibri"/>
+          <w:b w:val="0"/>
+          <w:sz w:val="22"/>
+          <w:szCs w:val="22"/>
+        </w:rPr>
+      </w:r>
+      <w:proofErr w:type="spellStart"/>
+      <w:r>
+        <w:rPr>
+          <w:rFonts w:ascii="Calibri" w:eastAsia="Calibri" w:hAnsi="Calibri" w:cs="Calibri"/>
+          <w:b w:val="0"/>
+          <w:sz w:val="22"/>
+          <w:szCs w:val="22"/>
+        </w:rPr>
+      </w:r>
+      <w:proofErr w:type="spellEnd"/>
+      <w:r>
+        <w:rPr>
+          <w:rFonts w:ascii="Calibri" w:eastAsia="Calibri" w:hAnsi="Calibri" w:cs="Calibri"/>
+          <w:b w:val="0"/>
+          <w:sz w:val="22"/>
+          <w:szCs w:val="22"/>
+        </w:rPr>
+      </w:r>
+    </w:p>
+    <w:p>
+      <w:pPr>
+        <w:pStyle w:val="2"/>
+        <w:pBdr>
+          <w:bottom w:val="single" w:sz="8" w:space="1" w:color="1F4788"/>
+        </w:pBdr>
+        <w:spacing w:before="200" w:after="100"/>
+      </w:pPr>
+      <w:r>
+        <w:t>KISTI (한국과학기술정보연구원)</w:t>
+      </w:r>
+    </w:p>
+    <w:p>
+      <w:pPr>
+        <w:spacing w:after="160"/>
+      </w:pPr>
+      <w:r>
+        <w:rPr>
+          <w:rFonts w:ascii="Calibri" w:eastAsia="Calibri" w:hAnsi="Calibri" w:cs="Calibri"/>
+          <w:b w:val="0"/>
+          <w:bCs/>
+          <w:color w:val="333333"/>
+          <w:sz w:val="24"/>
+          <w:szCs w:val="24"/>
+        </w:rPr>
+        <w:t>Intern  |  Oct 2017 – Jan 2018</w:t>
+      </w:r>
+      <w:proofErr w:type="gramStart"/>
+      <w:r>
+        <w:rPr>
+          <w:rFonts w:ascii="Calibri" w:eastAsia="Calibri" w:hAnsi="Calibri" w:cs="Calibri"/>
+          <w:b w:val="0"/>
+          <w:bCs/>
+          <w:color w:val="333333"/>
+          <w:sz w:val="24"/>
+          <w:szCs w:val="24"/>
+        </w:rPr>
+      </w:r>
+      <w:r>
+        <w:rPr>
+          <w:b w:val="0"/>
+          <w:sz w:val="24"/>
+          <w:szCs w:val="24"/>
+        </w:rPr>
+      </w:r>
+      <w:r>
+        <w:rPr>
+          <w:rFonts w:ascii="Calibri" w:eastAsia="Calibri" w:hAnsi="Calibri" w:cs="Calibri"/>
+          <w:b w:val="0"/>
+          <w:i/>
+          <w:iCs/>
+          <w:color w:val="666666"/>
+          <w:sz w:val="22"/>
+          <w:szCs w:val="22"/>
+        </w:rPr>
+      </w:r>
+      <w:proofErr w:type="gramEnd"/>
+      <w:r>
+        <w:rPr>
+          <w:rFonts w:ascii="Calibri" w:eastAsia="Calibri" w:hAnsi="Calibri" w:cs="Calibri"/>
+          <w:b w:val="0"/>
+          <w:i/>
+          <w:iCs/>
+          <w:color w:val="666666"/>
+          <w:sz w:val="22"/>
+          <w:szCs w:val="22"/>
+        </w:rPr>
+      </w:r>
+    </w:p>
+    <w:p>
+      <w:pPr>
+        <w:spacing w:after="80" w:line="260" w:lineRule="auto"/>
+      </w:pPr>
+      <w:r>
+        <w:rPr>
+          <w:rFonts w:ascii="맑은 고딕" w:eastAsia="맑은 고딕" w:hAnsi="맑은 고딕" w:cs="Calibri"/>
+          <w:b/>
+          <w:bCs/>
+          <w:color w:val="333333"/>
+          <w:sz w:val="24"/>
+          <w:szCs w:val="24"/>
+        </w:rPr>
+        <w:t>한국어 고어 데이터 전처리</w:t>
+      </w:r>
+    </w:p>
+    <w:p>
+      <w:pPr>
+        <w:spacing w:after="40" w:line="260" w:lineRule="auto"/>
+        <w:ind w:left="300" w:hanging="300"/>
+      </w:pPr>
+      <w:r>
+        <w:rPr>
+          <w:b w:val="0"/>
+          <w:bCs/>
+          <w:sz w:val="22"/>
+          <w:szCs w:val="22"/>
+        </w:rPr>
+        <w:t>• 한국어 고어(古語) 데이터 정제 및 전처리 작업 수행</w:t>
       </w:r>
       <w:r>
         <w:rPr>

</xml_diff>

<commit_message>
Use Korean company names throughout
</commit_message>
<xml_diff>
--- a/assets/resume.docx
+++ b/assets/resume.docx
@@ -153,7 +153,7 @@
         <w:spacing w:before="200" w:after="100"/>
       </w:pPr>
       <w:r>
-        <w:t>AICESS</w:t>
+        <w:t>에이아이세스 (AICESS)</w:t>
       </w:r>
     </w:p>
     <w:p>
@@ -953,8 +953,7 @@
         <w:spacing w:before="200" w:after="100"/>
       </w:pPr>
       <w:r>
-        <w:lastRenderedPageBreak/>
-        <w:t>INFINIIC</w:t>
+        <w:t>인피닉 (INFINIIC)</w:t>
       </w:r>
     </w:p>
     <w:p>
@@ -1440,7 +1439,7 @@
         <w:spacing w:before="200" w:after="100"/>
       </w:pPr>
       <w:r>
-        <w:t>EDEN T&amp;S</w:t>
+        <w:t>이든티앤에스 (EDEN T&amp;S)</w:t>
       </w:r>
     </w:p>
     <w:p>
@@ -1614,7 +1613,7 @@
         <w:spacing w:before="200" w:after="100"/>
       </w:pPr>
       <w:r>
-        <w:t>QUHEDGE</w:t>
+        <w:t>큐헷지 (QUHEDGE)</w:t>
       </w:r>
     </w:p>
     <w:p>
@@ -1876,7 +1875,7 @@
         <w:spacing w:before="200" w:after="100"/>
       </w:pPr>
       <w:r>
-        <w:t>KISTI (한국과학기술정보연구원)</w:t>
+        <w:t>한국과학기술정보연구원 (KISTI)</w:t>
       </w:r>
     </w:p>
     <w:p>

</xml_diff>

<commit_message>
Quhedge back to Intern, KISTI as Part-time
</commit_message>
<xml_diff>
--- a/assets/resume.docx
+++ b/assets/resume.docx
@@ -1629,7 +1629,7 @@
           <w:sz w:val="24"/>
           <w:szCs w:val="24"/>
         </w:rPr>
-        <w:t>Contract (계약직)  |  Sep 2020 – Sep 2021</w:t>
+        <w:t>Intern  |  Sep 2020 – Sep 2021</w:t>
       </w:r>
       <w:proofErr w:type="gramStart"/>
       <w:r>
@@ -1875,7 +1875,7 @@
         <w:spacing w:before="200" w:after="100"/>
       </w:pPr>
       <w:r>
-        <w:t>한국과학기술정보연구원 (KISTI)</w:t>
+        <w:t>KISTI</w:t>
       </w:r>
     </w:p>
     <w:p>
@@ -1891,7 +1891,7 @@
           <w:sz w:val="24"/>
           <w:szCs w:val="24"/>
         </w:rPr>
-        <w:t>Intern  |  Oct 2017 – Jan 2018</w:t>
+        <w:t>Part-time  |  Oct 2017 – Jan 2018</w:t>
       </w:r>
       <w:proofErr w:type="gramStart"/>
       <w:r>

</xml_diff>

<commit_message>
Rewrite resume sentences for readability: one idea per bullet, natural word order
</commit_message>
<xml_diff>
--- a/assets/resume.docx
+++ b/assets/resume.docx
@@ -100,7 +100,7 @@
         <w:ind w:left="300" w:hanging="300"/>
       </w:pPr>
       <w:r>
-        <w:t>• AI·MLOps 전문 — 프로덕션 ML 시스템 구축 및 운영 6년차</w:t>
+        <w:t>• 프로덕션 ML 시스템을 직접 만들고 운영해 온 6년차 AI 엔지니어</w:t>
       </w:r>
     </w:p>
     <w:p>
@@ -115,15 +115,14 @@
           <w:sz w:val="22"/>
           <w:szCs w:val="22"/>
         </w:rPr>
-        <w:t xml:space="preserve">• </w:t>
-      </w:r>
-      <w:r>
-        <w:rPr>
-          <w:rFonts w:ascii="Calibri" w:eastAsia="Calibri" w:hAnsi="Calibri" w:cs="Calibri"/>
-          <w:sz w:val="22"/>
-          <w:szCs w:val="22"/>
-        </w:rPr>
-        <w:t>TTS 서비스: TTFB 85% 단축 (2292ms → 334ms, 6.85배 개선)</w:t>
+        <w:t>• TTS 서비스의 첫 응답 시간을 2292ms에서 334ms로 85% 단축</w:t>
+      </w:r>
+      <w:r>
+        <w:rPr>
+          <w:rFonts w:ascii="Calibri" w:eastAsia="Calibri" w:hAnsi="Calibri" w:cs="Calibri"/>
+          <w:sz w:val="22"/>
+          <w:szCs w:val="22"/>
+        </w:rPr>
       </w:r>
     </w:p>
     <w:p>
@@ -132,7 +131,7 @@
         <w:ind w:left="300" w:hanging="300"/>
       </w:pPr>
       <w:r>
-        <w:t>• MLOps 인프라: 회사 최초 Kubernetes 기반 AI 플랫폼 구축</w:t>
+        <w:t>• 사내 최초로 Kubernetes 기반 AI 운영 플랫폼을 구축</w:t>
       </w:r>
     </w:p>
     <w:p>
@@ -141,7 +140,7 @@
         <w:ind w:left="300" w:hanging="300"/>
       </w:pPr>
       <w:r>
-        <w:t>• 학술 성과: 논문 7편(제1저자), 특허 2건(제1발명자), 우수논문상</w:t>
+        <w:t>• 제1저자 논문 7편, 제1발명자 특허 2건, 우수논문상 수상</w:t>
       </w:r>
     </w:p>
     <w:p>
@@ -228,7 +227,7 @@
         <w:rPr>
           <w:b w:val="0"/>
         </w:rPr>
-        <w:t>▸ 배경: 고객 상담 센터 실시간 음성 합성 필요 — 기존 응답 시간(2.3초)·동시 채널(12개) 제약 극복 목표</w:t>
+        <w:t>▸ 배경: 고객 상담 센터에 실시간 음성 합성이 필요했으나, 기존 시스템은 응답까지 2.3초가 걸리고 동시 처리도 12채널이 한계였음</w:t>
       </w:r>
     </w:p>
     <w:p>
@@ -254,134 +253,56 @@
       </w:pPr>
       <w:proofErr w:type="spellStart"/>
       <w:r>
-        <w:t>FastAPI</w:t>
-      </w:r>
-      <w:proofErr w:type="spellEnd"/>
-      <w:r>
-        <w:t xml:space="preserve"> </w:t>
-      </w:r>
-      <w:r>
-        <w:t>기반</w:t>
-      </w:r>
-      <w:r>
-        <w:t xml:space="preserve"> WebSocket/REST API </w:t>
-      </w:r>
-      <w:r>
-        <w:t>게이트웨이</w:t>
-      </w:r>
-      <w:r>
-        <w:t xml:space="preserve">, </w:t>
-      </w:r>
-      <w:proofErr w:type="spellStart"/>
-      <w:r>
-        <w:t>vLLM</w:t>
-      </w:r>
-      <w:proofErr w:type="spellEnd"/>
-      <w:r>
-        <w:t xml:space="preserve">-Omni(Qwen3-TTS-1.7B) </w:t>
-      </w:r>
-      <w:r>
-        <w:t>추론</w:t>
-      </w:r>
-      <w:r>
-        <w:t xml:space="preserve"> </w:t>
-      </w:r>
-      <w:r>
-        <w:t>엔진</w:t>
-      </w:r>
-      <w:r>
-        <w:t xml:space="preserve">, Redis </w:t>
-      </w:r>
-      <w:proofErr w:type="spellStart"/>
-      <w:r>
-        <w:t>분산락</w:t>
-      </w:r>
-      <w:proofErr w:type="spellEnd"/>
-      <w:r>
-        <w:t xml:space="preserve"> &amp; </w:t>
-      </w:r>
-      <w:proofErr w:type="spellStart"/>
-      <w:r>
-        <w:t>캐싱</w:t>
-      </w:r>
-      <w:proofErr w:type="spellEnd"/>
-      <w:r>
-        <w:t xml:space="preserve"> </w:t>
-      </w:r>
-      <w:r>
-        <w:t>레이어</w:t>
-      </w:r>
-      <w:r>
-        <w:t xml:space="preserve">, React </w:t>
-      </w:r>
-      <w:r>
-        <w:t>관리자</w:t>
-      </w:r>
-      <w:r>
-        <w:t xml:space="preserve"> </w:t>
-      </w:r>
-      <w:r>
-        <w:t>대시보드</w:t>
-      </w:r>
-      <w:r>
-        <w:t xml:space="preserve">. </w:t>
-      </w:r>
-      <w:r>
-        <w:t>문장</w:t>
-      </w:r>
-      <w:r>
-        <w:t xml:space="preserve"> </w:t>
-      </w:r>
-      <w:r>
-        <w:t>단위</w:t>
-      </w:r>
-      <w:r>
-        <w:t xml:space="preserve"> </w:t>
-      </w:r>
-      <w:r>
-        <w:t>논리</w:t>
-      </w:r>
-      <w:r>
-        <w:t xml:space="preserve"> </w:t>
-      </w:r>
-      <w:proofErr w:type="spellStart"/>
-      <w:r>
-        <w:t>청킹</w:t>
-      </w:r>
-      <w:proofErr w:type="spellEnd"/>
-      <w:r>
-        <w:t xml:space="preserve">, </w:t>
-      </w:r>
-      <w:r>
-        <w:t>지속적</w:t>
-      </w:r>
-      <w:r>
-        <w:t xml:space="preserve"> WebSocket </w:t>
-      </w:r>
-      <w:r>
-        <w:t>스트리밍</w:t>
-      </w:r>
-      <w:r>
-        <w:t>, Pre-Normalization</w:t>
-      </w:r>
-      <w:r>
-        <w:t>으로</w:t>
-      </w:r>
-      <w:r>
-        <w:t xml:space="preserve"> </w:t>
-      </w:r>
-      <w:r>
-        <w:t>초저지연</w:t>
-      </w:r>
-      <w:r>
-        <w:t xml:space="preserve"> </w:t>
-      </w:r>
-      <w:r>
-        <w:t>구현</w:t>
-      </w:r>
-      <w:r>
-        <w:t>.</w:t>
-      </w:r>
+        <w:t>vLLM 추론 엔진 위에 FastAPI 게이트웨이, Redis 캐싱과 분산락, React 관리자 대시보드까지 서비스 전 구간을 설계하고 구축. 긴 텍스트를 문장 단위로 나눠 첫 문장부터 WebSocket으로 스트리밍하는 구조로 체감 지연을 최소화.</w:t>
+      </w:r>
+      <w:proofErr w:type="spellEnd"/>
+      <w:r/>
+      <w:r/>
+      <w:r/>
+      <w:r/>
+      <w:r/>
+      <w:proofErr w:type="spellStart"/>
+      <w:r/>
+      <w:proofErr w:type="spellEnd"/>
+      <w:r/>
+      <w:r/>
+      <w:r/>
+      <w:r/>
+      <w:r/>
+      <w:proofErr w:type="spellStart"/>
+      <w:r/>
+      <w:proofErr w:type="spellEnd"/>
+      <w:r/>
+      <w:proofErr w:type="spellStart"/>
+      <w:r/>
+      <w:proofErr w:type="spellEnd"/>
+      <w:r/>
+      <w:r/>
+      <w:r/>
+      <w:r/>
+      <w:r/>
+      <w:r/>
+      <w:r/>
+      <w:r/>
+      <w:r/>
+      <w:r/>
+      <w:r/>
+      <w:r/>
+      <w:r/>
+      <w:proofErr w:type="spellStart"/>
+      <w:r/>
+      <w:proofErr w:type="spellEnd"/>
+      <w:r/>
+      <w:r/>
+      <w:r/>
+      <w:r/>
+      <w:r/>
+      <w:r/>
+      <w:r/>
+      <w:r/>
+      <w:r/>
+      <w:r/>
+      <w:r/>
     </w:p>
     <w:p>
       <w:pPr>
@@ -406,7 +327,7 @@
       </w:pPr>
       <w:proofErr w:type="spellStart"/>
       <w:r>
-        <w:t>ICL(In-Context Learning) 기반 음성복제 기능 구현. OpenAI TTS API 호환 인터페이스 및 기존 WebSocket 프로토콜 호환 레이어 개발로 서비스 연동 지원.</w:t>
+        <w:t>참조 음성 5초만으로 화자 목소리를 복제하는 기능을 구현. OpenAI TTS API와 호환되는 인터페이스를 제공해 외부 서비스가 코드 수정 없이 연동되도록 지원.</w:t>
       </w:r>
       <w:proofErr w:type="spellEnd"/>
       <w:r/>
@@ -555,33 +476,30 @@
           <w:sz w:val="22"/>
           <w:szCs w:val="22"/>
         </w:rPr>
-        <w:t>① 스트리밍 오디오 팝 노이즈 제거</w:t>
-      </w:r>
-      <w:r>
-        <w:rPr>
-          <w:rFonts w:ascii="Calibri" w:eastAsia="Calibri" w:hAnsi="Calibri" w:cs="Calibri"/>
-          <w:sz w:val="22"/>
-          <w:szCs w:val="22"/>
-        </w:rPr>
-        <w:t xml:space="preserve"> – Residual Buffer 설계로 PCM </w:t>
-      </w:r>
-      <w:proofErr w:type="spellStart"/>
-      <w:r>
-        <w:rPr>
-          <w:rFonts w:ascii="Calibri" w:eastAsia="Calibri" w:hAnsi="Calibri" w:cs="Calibri"/>
-          <w:sz w:val="22"/>
-          <w:szCs w:val="22"/>
-        </w:rPr>
-        <w:t>얼라인먼트</w:t>
-      </w:r>
-      <w:proofErr w:type="spellEnd"/>
-      <w:r>
-        <w:rPr>
-          <w:rFonts w:ascii="Calibri" w:eastAsia="Calibri" w:hAnsi="Calibri" w:cs="Calibri"/>
-          <w:sz w:val="22"/>
-          <w:szCs w:val="22"/>
-        </w:rPr>
-        <w:t xml:space="preserve"> 문제 해결, Micro-fade 적용</w:t>
+        <w:t>① 스트리밍 팝 노이즈: 홀수 바이트로 끊겨 오는 PCM 청크를 잔여 버퍼로 정렬해 잡음을 제거</w:t>
+      </w:r>
+      <w:r>
+        <w:rPr>
+          <w:rFonts w:ascii="Calibri" w:eastAsia="Calibri" w:hAnsi="Calibri" w:cs="Calibri"/>
+          <w:sz w:val="22"/>
+          <w:szCs w:val="22"/>
+        </w:rPr>
+      </w:r>
+      <w:proofErr w:type="spellStart"/>
+      <w:r>
+        <w:rPr>
+          <w:rFonts w:ascii="Calibri" w:eastAsia="Calibri" w:hAnsi="Calibri" w:cs="Calibri"/>
+          <w:sz w:val="22"/>
+          <w:szCs w:val="22"/>
+        </w:rPr>
+      </w:r>
+      <w:proofErr w:type="spellEnd"/>
+      <w:r>
+        <w:rPr>
+          <w:rFonts w:ascii="Calibri" w:eastAsia="Calibri" w:hAnsi="Calibri" w:cs="Calibri"/>
+          <w:sz w:val="22"/>
+          <w:szCs w:val="22"/>
+        </w:rPr>
       </w:r>
     </w:p>
     <w:p>
@@ -597,33 +515,30 @@
           <w:sz w:val="22"/>
           <w:szCs w:val="22"/>
         </w:rPr>
-        <w:t>② 스토리지 누수 방지</w:t>
-      </w:r>
-      <w:r>
-        <w:rPr>
-          <w:rFonts w:ascii="Calibri" w:eastAsia="Calibri" w:hAnsi="Calibri" w:cs="Calibri"/>
-          <w:sz w:val="22"/>
-          <w:szCs w:val="22"/>
-        </w:rPr>
-        <w:t xml:space="preserve"> – Deep GC </w:t>
-      </w:r>
-      <w:proofErr w:type="spellStart"/>
-      <w:r>
-        <w:rPr>
-          <w:rFonts w:ascii="Calibri" w:eastAsia="Calibri" w:hAnsi="Calibri" w:cs="Calibri"/>
-          <w:sz w:val="22"/>
-          <w:szCs w:val="22"/>
-        </w:rPr>
-        <w:t>추적기</w:t>
-      </w:r>
-      <w:proofErr w:type="spellEnd"/>
-      <w:r>
-        <w:rPr>
-          <w:rFonts w:ascii="Calibri" w:eastAsia="Calibri" w:hAnsi="Calibri" w:cs="Calibri"/>
-          <w:sz w:val="22"/>
-          <w:szCs w:val="22"/>
-        </w:rPr>
-        <w:t xml:space="preserve"> 구현으로 MD5 해시 캐시 파일 완벽 정리</w:t>
+        <w:t>② 스토리지 누수: 보이스 삭제 시 파생된 해시 캐시 파일까지 추적해 지우는 정리 로직으로 디스크 누수를 차단</w:t>
+      </w:r>
+      <w:r>
+        <w:rPr>
+          <w:rFonts w:ascii="Calibri" w:eastAsia="Calibri" w:hAnsi="Calibri" w:cs="Calibri"/>
+          <w:sz w:val="22"/>
+          <w:szCs w:val="22"/>
+        </w:rPr>
+      </w:r>
+      <w:proofErr w:type="spellStart"/>
+      <w:r>
+        <w:rPr>
+          <w:rFonts w:ascii="Calibri" w:eastAsia="Calibri" w:hAnsi="Calibri" w:cs="Calibri"/>
+          <w:sz w:val="22"/>
+          <w:szCs w:val="22"/>
+        </w:rPr>
+      </w:r>
+      <w:proofErr w:type="spellEnd"/>
+      <w:r>
+        <w:rPr>
+          <w:rFonts w:ascii="Calibri" w:eastAsia="Calibri" w:hAnsi="Calibri" w:cs="Calibri"/>
+          <w:sz w:val="22"/>
+          <w:szCs w:val="22"/>
+        </w:rPr>
       </w:r>
     </w:p>
     <w:p>
@@ -639,55 +554,50 @@
           <w:sz w:val="22"/>
           <w:szCs w:val="22"/>
         </w:rPr>
-        <w:t xml:space="preserve">③ </w:t>
-      </w:r>
-      <w:proofErr w:type="spellStart"/>
-      <w:r>
-        <w:rPr>
-          <w:rFonts w:ascii="Calibri" w:eastAsia="Calibri" w:hAnsi="Calibri" w:cs="Calibri"/>
-          <w:b/>
-          <w:bCs/>
-          <w:sz w:val="22"/>
-          <w:szCs w:val="22"/>
-        </w:rPr>
-        <w:t>웹소켓</w:t>
-      </w:r>
-      <w:proofErr w:type="spellEnd"/>
-      <w:r>
-        <w:rPr>
-          <w:rFonts w:ascii="Calibri" w:eastAsia="Calibri" w:hAnsi="Calibri" w:cs="Calibri"/>
-          <w:b/>
-          <w:bCs/>
-          <w:sz w:val="22"/>
-          <w:szCs w:val="22"/>
-        </w:rPr>
-        <w:t xml:space="preserve"> 세션 탈취 방어</w:t>
-      </w:r>
-      <w:r>
-        <w:rPr>
-          <w:rFonts w:ascii="Calibri" w:eastAsia="Calibri" w:hAnsi="Calibri" w:cs="Calibri"/>
-          <w:sz w:val="22"/>
-          <w:szCs w:val="22"/>
-        </w:rPr>
-        <w:t xml:space="preserve"> – </w:t>
-      </w:r>
-      <w:proofErr w:type="spellStart"/>
-      <w:r>
-        <w:rPr>
-          <w:rFonts w:ascii="Calibri" w:eastAsia="Calibri" w:hAnsi="Calibri" w:cs="Calibri"/>
-          <w:sz w:val="22"/>
-          <w:szCs w:val="22"/>
-        </w:rPr>
-        <w:t>password_changed_at</w:t>
-      </w:r>
-      <w:proofErr w:type="spellEnd"/>
-      <w:r>
-        <w:rPr>
-          <w:rFonts w:ascii="Calibri" w:eastAsia="Calibri" w:hAnsi="Calibri" w:cs="Calibri"/>
-          <w:sz w:val="22"/>
-          <w:szCs w:val="22"/>
-        </w:rPr>
-        <w:t xml:space="preserve"> 검증으로 제로-트러스트 모델 구현</w:t>
+        <w:t>③ 세션 보안: 비밀번호 변경 시점과 토큰 발급 시점을 대조해, 탈취된 토큰으로 웹소켓을 여는 우회를 차단</w:t>
+      </w:r>
+      <w:proofErr w:type="spellStart"/>
+      <w:r>
+        <w:rPr>
+          <w:rFonts w:ascii="Calibri" w:eastAsia="Calibri" w:hAnsi="Calibri" w:cs="Calibri"/>
+          <w:b/>
+          <w:bCs/>
+          <w:sz w:val="22"/>
+          <w:szCs w:val="22"/>
+        </w:rPr>
+      </w:r>
+      <w:proofErr w:type="spellEnd"/>
+      <w:r>
+        <w:rPr>
+          <w:rFonts w:ascii="Calibri" w:eastAsia="Calibri" w:hAnsi="Calibri" w:cs="Calibri"/>
+          <w:b/>
+          <w:bCs/>
+          <w:sz w:val="22"/>
+          <w:szCs w:val="22"/>
+        </w:rPr>
+      </w:r>
+      <w:r>
+        <w:rPr>
+          <w:rFonts w:ascii="Calibri" w:eastAsia="Calibri" w:hAnsi="Calibri" w:cs="Calibri"/>
+          <w:sz w:val="22"/>
+          <w:szCs w:val="22"/>
+        </w:rPr>
+      </w:r>
+      <w:proofErr w:type="spellStart"/>
+      <w:r>
+        <w:rPr>
+          <w:rFonts w:ascii="Calibri" w:eastAsia="Calibri" w:hAnsi="Calibri" w:cs="Calibri"/>
+          <w:sz w:val="22"/>
+          <w:szCs w:val="22"/>
+        </w:rPr>
+      </w:r>
+      <w:proofErr w:type="spellEnd"/>
+      <w:r>
+        <w:rPr>
+          <w:rFonts w:ascii="Calibri" w:eastAsia="Calibri" w:hAnsi="Calibri" w:cs="Calibri"/>
+          <w:sz w:val="22"/>
+          <w:szCs w:val="22"/>
+        </w:rPr>
       </w:r>
     </w:p>
     <w:p>
@@ -703,59 +613,54 @@
           <w:sz w:val="22"/>
           <w:szCs w:val="22"/>
         </w:rPr>
-        <w:t xml:space="preserve">④ </w:t>
-      </w:r>
-      <w:proofErr w:type="spellStart"/>
-      <w:r>
-        <w:rPr>
-          <w:rFonts w:ascii="Calibri" w:eastAsia="Calibri" w:hAnsi="Calibri" w:cs="Calibri"/>
-          <w:b/>
-          <w:bCs/>
-          <w:sz w:val="22"/>
-          <w:szCs w:val="22"/>
-        </w:rPr>
-        <w:t>정규식</w:t>
-      </w:r>
-      <w:proofErr w:type="spellEnd"/>
-      <w:r>
-        <w:rPr>
-          <w:rFonts w:ascii="Calibri" w:eastAsia="Calibri" w:hAnsi="Calibri" w:cs="Calibri"/>
-          <w:b/>
-          <w:bCs/>
-          <w:sz w:val="22"/>
-          <w:szCs w:val="22"/>
-        </w:rPr>
-        <w:t xml:space="preserve"> </w:t>
-      </w:r>
-      <w:proofErr w:type="spellStart"/>
-      <w:r>
-        <w:rPr>
-          <w:rFonts w:ascii="Calibri" w:eastAsia="Calibri" w:hAnsi="Calibri" w:cs="Calibri"/>
-          <w:b/>
-          <w:bCs/>
-          <w:sz w:val="22"/>
-          <w:szCs w:val="22"/>
-        </w:rPr>
-        <w:t>토크나이저</w:t>
-      </w:r>
-      <w:proofErr w:type="spellEnd"/>
-      <w:r>
-        <w:rPr>
-          <w:rFonts w:ascii="Calibri" w:eastAsia="Calibri" w:hAnsi="Calibri" w:cs="Calibri"/>
-          <w:b/>
-          <w:bCs/>
-          <w:sz w:val="22"/>
-          <w:szCs w:val="22"/>
-        </w:rPr>
-        <w:t xml:space="preserve"> 고도화</w:t>
-      </w:r>
-      <w:r>
-        <w:rPr>
-          <w:rFonts w:ascii="Calibri" w:eastAsia="Calibri" w:hAnsi="Calibri" w:cs="Calibri"/>
-          <w:sz w:val="22"/>
-          <w:szCs w:val="22"/>
-        </w:rPr>
-        <w:t xml:space="preserve"> – 스마트 ITN 엔진 개발로 URL/이메일 자연스럽게 처리</w:t>
+        <w:t>④ ITN 정규화: URL과 이메일을 자연스러운 한국어 발음으로 읽어 주는 정규식 토크나이저를 직접 개발</w:t>
+      </w:r>
+      <w:proofErr w:type="spellStart"/>
+      <w:r>
+        <w:rPr>
+          <w:rFonts w:ascii="Calibri" w:eastAsia="Calibri" w:hAnsi="Calibri" w:cs="Calibri"/>
+          <w:b/>
+          <w:bCs/>
+          <w:sz w:val="22"/>
+          <w:szCs w:val="22"/>
+        </w:rPr>
+      </w:r>
+      <w:proofErr w:type="spellEnd"/>
+      <w:r>
+        <w:rPr>
+          <w:rFonts w:ascii="Calibri" w:eastAsia="Calibri" w:hAnsi="Calibri" w:cs="Calibri"/>
+          <w:b/>
+          <w:bCs/>
+          <w:sz w:val="22"/>
+          <w:szCs w:val="22"/>
+        </w:rPr>
+      </w:r>
+      <w:proofErr w:type="spellStart"/>
+      <w:r>
+        <w:rPr>
+          <w:rFonts w:ascii="Calibri" w:eastAsia="Calibri" w:hAnsi="Calibri" w:cs="Calibri"/>
+          <w:b/>
+          <w:bCs/>
+          <w:sz w:val="22"/>
+          <w:szCs w:val="22"/>
+        </w:rPr>
+      </w:r>
+      <w:proofErr w:type="spellEnd"/>
+      <w:r>
+        <w:rPr>
+          <w:rFonts w:ascii="Calibri" w:eastAsia="Calibri" w:hAnsi="Calibri" w:cs="Calibri"/>
+          <w:b/>
+          <w:bCs/>
+          <w:sz w:val="22"/>
+          <w:szCs w:val="22"/>
+        </w:rPr>
+      </w:r>
+      <w:r>
+        <w:rPr>
+          <w:rFonts w:ascii="Calibri" w:eastAsia="Calibri" w:hAnsi="Calibri" w:cs="Calibri"/>
+          <w:sz w:val="22"/>
+          <w:szCs w:val="22"/>
+        </w:rPr>
       </w:r>
     </w:p>
     <w:p>
@@ -771,33 +676,30 @@
           <w:sz w:val="22"/>
           <w:szCs w:val="22"/>
         </w:rPr>
-        <w:t>⑤ CPU 병목 제거</w:t>
-      </w:r>
-      <w:r>
-        <w:rPr>
-          <w:rFonts w:ascii="Calibri" w:eastAsia="Calibri" w:hAnsi="Calibri" w:cs="Calibri"/>
-          <w:sz w:val="22"/>
-          <w:szCs w:val="22"/>
-        </w:rPr>
-        <w:t xml:space="preserve"> – </w:t>
-      </w:r>
-      <w:proofErr w:type="spellStart"/>
-      <w:r>
-        <w:rPr>
-          <w:rFonts w:ascii="Calibri" w:eastAsia="Calibri" w:hAnsi="Calibri" w:cs="Calibri"/>
-          <w:sz w:val="22"/>
-          <w:szCs w:val="22"/>
-        </w:rPr>
-        <w:t>ThreadPoolExecutor</w:t>
-      </w:r>
-      <w:proofErr w:type="spellEnd"/>
-      <w:r>
-        <w:rPr>
-          <w:rFonts w:ascii="Calibri" w:eastAsia="Calibri" w:hAnsi="Calibri" w:cs="Calibri"/>
-          <w:sz w:val="22"/>
-          <w:szCs w:val="22"/>
-        </w:rPr>
-        <w:t xml:space="preserve"> 오버헤드 제거, O(N²) → O(1) 성능 개선</w:t>
+        <w:t>⑤ CPU 병목: 요청마다 새로 생성되던 스레드풀을 걷어내 텍스트 처리 병목을 해소</w:t>
+      </w:r>
+      <w:r>
+        <w:rPr>
+          <w:rFonts w:ascii="Calibri" w:eastAsia="Calibri" w:hAnsi="Calibri" w:cs="Calibri"/>
+          <w:sz w:val="22"/>
+          <w:szCs w:val="22"/>
+        </w:rPr>
+      </w:r>
+      <w:proofErr w:type="spellStart"/>
+      <w:r>
+        <w:rPr>
+          <w:rFonts w:ascii="Calibri" w:eastAsia="Calibri" w:hAnsi="Calibri" w:cs="Calibri"/>
+          <w:sz w:val="22"/>
+          <w:szCs w:val="22"/>
+        </w:rPr>
+      </w:r>
+      <w:proofErr w:type="spellEnd"/>
+      <w:r>
+        <w:rPr>
+          <w:rFonts w:ascii="Calibri" w:eastAsia="Calibri" w:hAnsi="Calibri" w:cs="Calibri"/>
+          <w:sz w:val="22"/>
+          <w:szCs w:val="22"/>
+        </w:rPr>
       </w:r>
     </w:p>
     <w:p>
@@ -857,7 +759,7 @@
         <w:rPr>
           <w:b w:val="0"/>
         </w:rPr>
-        <w:t>• 배경: AIG 상담센터 대량 상담 전화 실시간 처리 필요 — 기존 시스템 병목으로 동시 채널 부족</w:t>
+        <w:t>• 배경: AIG 상담센터의 대량 상담 전화를 실시간으로 처리해야 했으나 기존 시스템은 동시 채널이 부족했음</w:t>
       </w:r>
     </w:p>
     <w:p>
@@ -866,7 +768,7 @@
         <w:ind w:left="300" w:hanging="300"/>
       </w:pPr>
       <w:r>
-        <w:t>• WhisperX 기반 STT 엔진 성능 개선 및 운영 고도화 (배포/서빙 담당, 팀 협업)</w:t>
+        <w:t>• 팀 내 배포·서빙 담당으로 WhisperX 기반 STT 엔진의 성능 개선과 운영 고도화를 수행</w:t>
       </w:r>
     </w:p>
     <w:p>
@@ -898,7 +800,7 @@
         <w:ind w:left="300" w:hanging="300"/>
       </w:pPr>
       <w:r>
-        <w:t>• 성과: AIG 요구사항 해결 4건, Triton 기반 추론 환경 최적화로 동시 처리 채널 확장 및 안정성 확보</w:t>
+        <w:t>• Triton 기반으로 추론 환경을 최적화해 동시 처리 채널을 늘리고, AIG 요구사항 4건을 해결</w:t>
       </w:r>
     </w:p>
     <w:p>
@@ -923,7 +825,7 @@
         <w:ind w:left="300" w:hanging="300"/>
       </w:pPr>
       <w:r>
-        <w:t>• 배경: 상담 품질 분석 위한 발화자 식별 필요 — 상담사/고객 구분 자동화 목표</w:t>
+        <w:t>• 배경: 상담 품질 분석을 위해 상담사와 고객의 발화를 자동으로 구분할 필요가 있었음</w:t>
       </w:r>
     </w:p>
     <w:p>
@@ -932,7 +834,7 @@
         <w:ind w:left="300" w:hanging="300"/>
       </w:pPr>
       <w:r>
-        <w:t>• Pyannote 사전 학습 모델을 한국어 상담 데이터로 파인튜닝, 화자 분할 → STT → 분석 파이프라인 구축</w:t>
+        <w:t>• Pyannote 사전 학습 모델을 한국어 상담 데이터로 파인튜닝하고, 화자 분할 결과를 STT와 연동하는 작업을 수행</w:t>
       </w:r>
     </w:p>
     <w:p>
@@ -1010,7 +912,7 @@
         <w:rPr>
           <w:b w:val="0"/>
         </w:rPr>
-        <w:t>• 배경: 20개 이상 AI 서비스 수동 배포로 배포 시간 수 시간 소요 — 자동화 및 확장성 확보 목표</w:t>
+        <w:t>• 배경: 20개가 넘는 AI 서비스를 수동으로 배포하느라 배포 한 번에 수 시간이 걸렸음</w:t>
       </w:r>
     </w:p>
     <w:p>
@@ -1019,7 +921,7 @@
         <w:ind w:left="300" w:hanging="300"/>
       </w:pPr>
       <w:r>
-        <w:t>• 회사 최초 Kubernetes 도입: VM/수동 배포에서 컨테이너 기반 자동화 배포 체계로 전환</w:t>
+        <w:t>• 사내 최초로 Kubernetes를 도입해 VM 수동 배포를 컨테이너 기반 자동 배포 체계로 전환</w:t>
       </w:r>
     </w:p>
     <w:p>
@@ -1066,7 +968,7 @@
         <w:ind w:left="300" w:hanging="300"/>
       </w:pPr>
       <w:r>
-        <w:t>• 성과: 20개 이상 ML 모델 운영 환경 구축, GitLab → Jenkins → ArgoCD 배포 자동화</w:t>
+        <w:t>• GitLab, Jenkins, ArgoCD로 이어지는 CI/CD 파이프라인을 구축해 20개 이상의 ML 모델 운영 환경을 마련</w:t>
       </w:r>
     </w:p>
     <w:p>
@@ -1093,7 +995,7 @@
         <w:rPr>
           <w:b w:val="0"/>
         </w:rPr>
-        <w:t>• 배경: 사내 회의록·업무 문서 다수 생성 — 핵심 내용 자동 요약 및 업무 효율화 필요</w:t>
+        <w:t>• 배경: 사내에서 쏟아지는 회의록과 업무 문서를 자동으로 요약할 필요가 있었음</w:t>
       </w:r>
     </w:p>
     <w:p>
@@ -1102,7 +1004,7 @@
         <w:ind w:left="300" w:hanging="300"/>
       </w:pPr>
       <w:r>
-        <w:t>• 사내 메신저 및 업무 문서 데이터 기반 요약 모델(BART/T5) 학습 및 성능 개선</w:t>
+        <w:t>• BART 대화 요약과 T5 문서 요약 모델을 사내 데이터로 학습하고 성능을 개선</w:t>
       </w:r>
     </w:p>
     <w:p>
@@ -1120,7 +1022,7 @@
         <w:ind w:left="300" w:hanging="300"/>
       </w:pPr>
       <w:r>
-        <w:t>• 성과: 사내 자체 개발 메신저에 기능 추가하여 회의록, 문서 요약에 적용</w:t>
+        <w:t>• 사내 자체 개발 메신저에 요약 기능을 붙여 회의록과 문서 요약에 실제 적용</w:t>
       </w:r>
     </w:p>
     <w:p>
@@ -1151,7 +1053,7 @@
           <w:sz w:val="22"/>
           <w:szCs w:val="22"/>
         </w:rPr>
-        <w:t>• 배경: 국방 도메인 학습 데이터 부족 — 생성 모델 기반 데이터 확보 연구</w:t>
+        <w:t>• 배경: 국방 도메인은 보안 제약으로 학습 데이터 확보가 어려워, 생성 모델로 데이터를 만드는 연구를 수행</w:t>
       </w:r>
       <w:r>
         <w:rPr>
@@ -1202,7 +1104,7 @@
           <w:sz w:val="22"/>
           <w:szCs w:val="22"/>
         </w:rPr>
-        <w:t>• Latent Diffusion 기반 합성 데이터 생성 및 실제 모델 학습 적용 검증</w:t>
+        <w:t>• Latent Diffusion으로 합성 데이터를 생성하고 실제 모델 학습에 적용해 유효성을 검증</w:t>
       </w:r>
       <w:r>
         <w:rPr>
@@ -1304,7 +1206,7 @@
           <w:sz w:val="22"/>
           <w:szCs w:val="22"/>
         </w:rPr>
-        <w:t>• 성과: 논문 2편 게재(제1저자) | 우수 논문상 수상(국방기술학회 2023.11)</w:t>
+        <w:t>• 제1저자 논문 2편을 게재하고 국방기술학회에서 우수논문상을 수상 (2023.11)</w:t>
       </w:r>
       <w:r>
         <w:rPr>
@@ -1367,7 +1269,7 @@
         <w:rPr>
           <w:b w:val="0"/>
         </w:rPr>
-        <w:t>• 배경: 자율주행 환경 인식에 3D 거리/높이 정보 필수 — 2D 세그멘테이션 한계 극복 위한 센서 퓨전 연구</w:t>
+        <w:t>• 배경: 자율주행 인식에는 거리·높이 같은 3D 정보가 필요해, LiDAR와 카메라를 결합하는 센서 퓨전을 연구</w:t>
       </w:r>
     </w:p>
     <w:p>
@@ -1376,7 +1278,7 @@
         <w:ind w:left="300" w:hanging="300"/>
       </w:pPr>
       <w:r>
-        <w:t>• 성과: 논문 2편 게재(제1저자, 한국자동차공학회) | 특허 2건 등록(제1발명자)</w:t>
+        <w:t>• 한국자동차공학회에 제1저자 논문 2편을 게재하고, 제1발명자로 특허 2건을 등록</w:t>
       </w:r>
     </w:p>
     <w:p>
@@ -1524,7 +1426,7 @@
         <w:rPr>
           <w:b w:val="0"/>
         </w:rPr>
-        <w:t>• 배경: OCR 학습 데이터 대량 생성 필요 — 수동 주석 작업 병목 해결 목표</w:t>
+        <w:t>• 배경: OCR 학습 데이터를 대량으로 만들어야 했지만 수동 주석 작업이 병목이었음</w:t>
       </w:r>
     </w:p>
     <w:p>
@@ -1533,7 +1435,7 @@
         <w:ind w:left="300" w:hanging="300"/>
       </w:pPr>
       <w:r>
-        <w:t>• Annotation Tool 설계 및 단독 개발 (이미지 로딩, 라벨링, 데이터 저장 기능)</w:t>
+        <w:t>• 이미지 로딩부터 라벨링, 저장까지 갖춘 어노테이션 툴을 단독으로 설계하고 개발</w:t>
       </w:r>
     </w:p>
     <w:p>
@@ -1601,7 +1503,7 @@
         <w:ind w:left="300" w:hanging="300"/>
       </w:pPr>
       <w:r>
-        <w:t>• 성과: OCR 학습 데이터 생성 자동화, 문서 인식 성능 개선, 프로젝트 성공 성과금 수령</w:t>
+        <w:t>• 학습 데이터 생성을 자동화하고 문서 인식 성능을 개선해, 프로젝트 성공 성과금을 받음</w:t>
       </w:r>
     </w:p>
     <w:p>
@@ -1701,7 +1603,7 @@
           <w:sz w:val="22"/>
           <w:szCs w:val="22"/>
         </w:rPr>
-        <w:t>• 배경: 금융 데이터 분석 위한 고품질 데이터 확보 필요 — 다중 소스 수집·정제 자동화 목표</w:t>
+        <w:t>• 배경: 금융 데이터 분석에 필요한 데이터를 여러 소스에서 자동으로 수집하고 정제할 필요가 있었음</w:t>
       </w:r>
       <w:r>
         <w:rPr>
@@ -1760,7 +1662,7 @@
           <w:sz w:val="22"/>
           <w:szCs w:val="22"/>
         </w:rPr>
-        <w:t>• 금융 데이터 크롤링 및 Pandas/NumPy 기반 정제·검증·저장 자동화 파이프라인 구축</w:t>
+        <w:t>• 금융 데이터를 크롤링하고 정제부터 검증, 저장까지 이어지는 자동화 파이프라인을 구축</w:t>
       </w:r>
       <w:r>
         <w:rPr>

</xml_diff>

<commit_message>
Narrative summary, natural phrasing, expanded Kubernetes details
</commit_message>
<xml_diff>
--- a/assets/resume.docx
+++ b/assets/resume.docx
@@ -100,7 +100,10 @@
         <w:ind w:left="300" w:hanging="300"/>
       </w:pPr>
       <w:r>
-        <w:t>• 프로덕션 ML 시스템을 직접 만들고 운영해 온 6년차 AI 엔지니어</w:t>
+        <w:rPr>
+          <w:b w:val="0"/>
+        </w:rPr>
+        <w:t>연구에서 시작해 인프라를 거쳐 서비스로 넘어온 6년차 AI 엔지니어입니다.</w:t>
       </w:r>
     </w:p>
     <w:p>
@@ -110,16 +113,17 @@
       </w:pPr>
       <w:r>
         <w:rPr>
-          <w:b/>
-          <w:bCs/>
-          <w:sz w:val="22"/>
-          <w:szCs w:val="22"/>
-        </w:rPr>
-        <w:t>• TTS 서비스의 첫 응답 시간을 2292ms에서 334ms로 85% 단축</w:t>
-      </w:r>
-      <w:r>
-        <w:rPr>
-          <w:rFonts w:ascii="Calibri" w:eastAsia="Calibri" w:hAnsi="Calibri" w:cs="Calibri"/>
+          <w:b w:val="0"/>
+          <w:bCs/>
+          <w:sz w:val="22"/>
+          <w:szCs w:val="22"/>
+        </w:rPr>
+        <w:t>석사와 첫 직장들에서 논문 7편과 특허 2건을 쓰며 모델을 연구했고, 인피닉에서는 사내 첫 Kubernetes를 도입해 20여 개 모델의 배포 체계를 만들었습니다.</w:t>
+      </w:r>
+      <w:r>
+        <w:rPr>
+          <w:rFonts w:ascii="Calibri" w:eastAsia="Calibri" w:hAnsi="Calibri" w:cs="Calibri"/>
+          <w:b w:val="0"/>
           <w:sz w:val="22"/>
           <w:szCs w:val="22"/>
         </w:rPr>
@@ -131,7 +135,10 @@
         <w:ind w:left="300" w:hanging="300"/>
       </w:pPr>
       <w:r>
-        <w:t>• 사내 최초로 Kubernetes 기반 AI 운영 플랫폼을 구축</w:t>
+        <w:rPr>
+          <w:b w:val="0"/>
+        </w:rPr>
+        <w:t>지금은 TTS 서비스를 설계부터 운영까지 맡아 첫 응답 시간을 2.3초에서 0.33초로 줄였습니다.</w:t>
       </w:r>
     </w:p>
     <w:p>
@@ -140,7 +147,10 @@
         <w:ind w:left="300" w:hanging="300"/>
       </w:pPr>
       <w:r>
-        <w:t>• 제1저자 논문 7편, 제1발명자 특허 2건, 우수논문상 수상</w:t>
+        <w:rPr>
+          <w:b w:val="0"/>
+        </w:rPr>
+        <w:t>최근에는 RAG와 Multi-Agent 시스템을 만들며 LLM 시스템 엔지니어링으로 영역을 넓히는 중입니다.</w:t>
       </w:r>
     </w:p>
     <w:p>
@@ -825,7 +835,7 @@
         <w:ind w:left="300" w:hanging="300"/>
       </w:pPr>
       <w:r>
-        <w:t>• 배경: 상담 품질 분석을 위해 상담사와 고객의 발화를 자동으로 구분할 필요가 있었음</w:t>
+        <w:t>• 배경: 상담 품질을 분석하려면 상담사와 고객의 발화부터 구분해야 했음</w:t>
       </w:r>
     </w:p>
     <w:p>
@@ -834,7 +844,7 @@
         <w:ind w:left="300" w:hanging="300"/>
       </w:pPr>
       <w:r>
-        <w:t>• Pyannote 사전 학습 모델을 한국어 상담 데이터로 파인튜닝하고, 화자 분할 결과를 STT와 연동하는 작업을 수행</w:t>
+        <w:t>• Pyannote 사전 학습 모델을 한국어 상담 데이터로 파인튜닝하고, 그 결과를 STT와 연동</w:t>
       </w:r>
     </w:p>
     <w:p>
@@ -931,6 +941,18 @@
       </w:pPr>
       <w:r>
         <w:rPr>
+          <w:b w:val="0"/>
+        </w:rPr>
+        <w:t>• MetalLB 로드밸런서와 Nginx Ingress로 서비스 노출 구조를 잡고, NFS 기반 PV/PVC로 영속 스토리지를 구성</w:t>
+      </w:r>
+    </w:p>
+    <w:p>
+      <w:pPr>
+        <w:spacing w:after="40" w:line="260" w:lineRule="auto"/>
+        <w:ind w:left="300" w:hanging="300"/>
+      </w:pPr>
+      <w:r>
+        <w:rPr>
           <w:b/>
           <w:bCs/>
           <w:sz w:val="22"/>
@@ -968,7 +990,19 @@
         <w:ind w:left="300" w:hanging="300"/>
       </w:pPr>
       <w:r>
-        <w:t>• GitLab, Jenkins, ArgoCD로 이어지는 CI/CD 파이프라인을 구축해 20개 이상의 ML 모델 운영 환경을 마련</w:t>
+        <w:t>• GitLab에서 Jenkins와 Harbor 레지스트리를 거쳐 ArgoCD로 배포되는 CI/CD 파이프라인을 구축해 20개 이상의 ML 모델 운영 환경을 마련</w:t>
+      </w:r>
+    </w:p>
+    <w:p>
+      <w:pPr>
+        <w:spacing w:after="120" w:line="260" w:lineRule="auto"/>
+        <w:ind w:left="300" w:hanging="300"/>
+      </w:pPr>
+      <w:r>
+        <w:rPr>
+          <w:b w:val="0"/>
+        </w:rPr>
+        <w:t>• Prometheus와 Grafana로 모니터링을, Loki와 ELK로 로그 수집을 구축하고 클러스터 장애 대응과 리소스 관리까지 담당</w:t>
       </w:r>
     </w:p>
     <w:p>
@@ -995,7 +1029,7 @@
         <w:rPr>
           <w:b w:val="0"/>
         </w:rPr>
-        <w:t>• 배경: 사내에서 쏟아지는 회의록과 업무 문서를 자동으로 요약할 필요가 있었음</w:t>
+        <w:t>• 배경: 회의록과 업무 문서는 계속 쌓이는데 요약은 전부 수작업이었음</w:t>
       </w:r>
     </w:p>
     <w:p>
@@ -1053,7 +1087,7 @@
           <w:sz w:val="22"/>
           <w:szCs w:val="22"/>
         </w:rPr>
-        <w:t>• 배경: 국방 도메인은 보안 제약으로 학습 데이터 확보가 어려워, 생성 모델로 데이터를 만드는 연구를 수행</w:t>
+        <w:t>• 배경: 국방 도메인은 보안 제약 때문에 학습 데이터를 구하기 어려워, 생성 모델로 데이터를 만드는 쪽을 연구</w:t>
       </w:r>
       <w:r>
         <w:rPr>
@@ -1435,7 +1469,7 @@
         <w:ind w:left="300" w:hanging="300"/>
       </w:pPr>
       <w:r>
-        <w:t>• 이미지 로딩부터 라벨링, 저장까지 갖춘 어노테이션 툴을 단독으로 설계하고 개발</w:t>
+        <w:t>• 이미지 로딩부터 라벨링, 저장까지 갖춘 어노테이션 툴을 혼자 설계하고 개발</w:t>
       </w:r>
     </w:p>
     <w:p>
@@ -1603,7 +1637,7 @@
           <w:sz w:val="22"/>
           <w:szCs w:val="22"/>
         </w:rPr>
-        <w:t>• 배경: 금융 데이터 분석에 필요한 데이터를 여러 소스에서 자동으로 수집하고 정제할 필요가 있었음</w:t>
+        <w:t>• 배경: 여러 소스에 흩어진 금융 데이터를 손으로 모아 쓰고 있었음</w:t>
       </w:r>
       <w:r>
         <w:rPr>

</xml_diff>

<commit_message>
Sync resume: unpack sentences, lead with outcomes
Co-Authored-By: Claude Fable 5 <noreply@anthropic.com>
</commit_message>
<xml_diff>
--- a/assets/resume.docx
+++ b/assets/resume.docx
@@ -263,7 +263,7 @@
       </w:pPr>
       <w:proofErr w:type="spellStart"/>
       <w:r>
-        <w:t>vLLM 추론 엔진 위에 FastAPI 게이트웨이, Redis 캐싱과 분산락, React 관리자 대시보드까지 서비스 전 구간을 설계하고 구축. 긴 텍스트를 문장 단위로 나눠 첫 문장부터 WebSocket으로 스트리밍하는 구조로 체감 지연을 최소화.</w:t>
+        <w:t>vLLM 추론 엔진 위에 FastAPI 게이트웨이, Redis 캐싱과 분산락, React 관리자 대시보드까지 서비스 전 구간을 설계하고 구축. 긴 텍스트를 문장 단위로 나눠 전체 합성이 끝나기 전에 첫 문장부터 WebSocket으로 내보내는 스트리밍 구조를 만들어, 사용자가 첫 소리를 듣기까지의 대기 시간을 줄임.</w:t>
       </w:r>
       <w:proofErr w:type="spellEnd"/>
       <w:r/>
@@ -486,7 +486,7 @@
           <w:sz w:val="22"/>
           <w:szCs w:val="22"/>
         </w:rPr>
-        <w:t>① 스트리밍 팝 노이즈: 홀수 바이트로 끊겨 오는 PCM 청크를 잔여 버퍼로 정렬해 잡음을 제거</w:t>
+        <w:t>① 스트리밍 팝 노이즈: 재생 중 간헐적으로 '틱' 잡음이 나는 문제를 추적해, PCM 청크가 홀수 바이트로 끊겨 와 샘플 정렬이 깨지는 것을 원인으로 확인. 잔여 바이트를 다음 청크에 이어 붙이는 버퍼로 잡음을 제거</w:t>
       </w:r>
       <w:r>
         <w:rPr>
@@ -525,7 +525,7 @@
           <w:sz w:val="22"/>
           <w:szCs w:val="22"/>
         </w:rPr>
-        <w:t>② 스토리지 누수: 보이스 삭제 시 파생된 해시 캐시 파일까지 추적해 지우는 정리 로직으로 디스크 누수를 차단</w:t>
+        <w:t>② 스토리지 누수: 보이스를 지워도 디스크 사용량이 계속 늘어나는 문제에서 파생 해시 캐시 파일이 남는 구조를 찾아내고, 파생 파일까지 추적해 지우는 정리 로직으로 누수를 차단</w:t>
       </w:r>
       <w:r>
         <w:rPr>
@@ -564,7 +564,7 @@
           <w:sz w:val="22"/>
           <w:szCs w:val="22"/>
         </w:rPr>
-        <w:t>③ 세션 보안: 비밀번호 변경 시점과 토큰 발급 시점을 대조해, 탈취된 토큰으로 웹소켓을 여는 우회를 차단</w:t>
+        <w:t>③ 세션 보안: 비밀번호를 바꿔도 이미 발급된 토큰으로 웹소켓이 열리는 허점을 발견하고, 토큰 발급 시점과 비밀번호 변경 시점을 대조해 변경 이전 토큰을 전부 무효화</w:t>
       </w:r>
       <w:proofErr w:type="spellStart"/>
       <w:r>
@@ -623,7 +623,7 @@
           <w:sz w:val="22"/>
           <w:szCs w:val="22"/>
         </w:rPr>
-        <w:t>④ ITN 정규화: URL과 이메일을 자연스러운 한국어 발음으로 읽어 주는 정규식 토크나이저를 직접 개발</w:t>
+        <w:t>④ ITN 정규화: URL과 이메일이 섞인 문장을 자연스러운 한국어 발음으로 읽어 주는 정규식 토크나이저를 직접 개발해 낭독 품질을 개선</w:t>
       </w:r>
       <w:proofErr w:type="spellStart"/>
       <w:r>
@@ -686,7 +686,7 @@
           <w:sz w:val="22"/>
           <w:szCs w:val="22"/>
         </w:rPr>
-        <w:t>⑤ CPU 병목: 요청마다 새로 생성되던 스레드풀을 걷어내 텍스트 처리 병목을 해소</w:t>
+        <w:t>⑤ CPU 병목: 요청마다 스레드풀이 새로 만들어지던 오버헤드를 프로파일링으로 찾아 제거하고, 텍스트 처리 로직을 O(N²)에서 O(1)로 개선</w:t>
       </w:r>
       <w:r>
         <w:rPr>
@@ -778,7 +778,7 @@
         <w:ind w:left="300" w:hanging="300"/>
       </w:pPr>
       <w:r>
-        <w:t>• 팀 내 배포·서빙 담당으로 WhisperX 기반 STT 엔진의 성능 개선과 운영 고도화를 수행</w:t>
+        <w:t>• 팀 내 배포·서빙 담당으로 WhisperX 기반 STT 엔진을 맡아, 배치 처리와 실시간 스트리밍을 모두 지원하도록 운영 구조를 고도화</w:t>
       </w:r>
     </w:p>
     <w:p>
@@ -810,7 +810,7 @@
         <w:ind w:left="300" w:hanging="300"/>
       </w:pPr>
       <w:r>
-        <w:t>• Triton 기반으로 추론 환경을 최적화해 동시 처리 채널을 늘리고, AIG 요구사항 4건을 해결</w:t>
+        <w:t>• Triton Inference Server 기반으로 추론 환경을 최적화해 동시 처리 채널을 늘렸고, 고객사 AIG의 요구사항 4건을 해결</w:t>
       </w:r>
     </w:p>
     <w:p>
@@ -844,7 +844,7 @@
         <w:ind w:left="300" w:hanging="300"/>
       </w:pPr>
       <w:r>
-        <w:t>• Pyannote 사전 학습 모델을 한국어 상담 데이터로 파인튜닝하고, 그 결과를 STT와 연동</w:t>
+        <w:t>• Pyannote 사전 학습 모델을 한국어 상담 데이터로 파인튜닝하고 STT와 연동해, 상담사와 고객이 구분된 전사 결과가 나오는 파이프라인을 구성</w:t>
       </w:r>
     </w:p>
     <w:p>
@@ -1038,7 +1038,7 @@
         <w:ind w:left="300" w:hanging="300"/>
       </w:pPr>
       <w:r>
-        <w:t>• BART 대화 요약과 T5 문서 요약 모델을 사내 데이터로 학습하고 성능을 개선</w:t>
+        <w:t>• BART 대화 요약과 T5 문서 요약 모델을 사내 데이터로 학습시켜, 실제 업무에 쓸 수 있는 수준까지 요약 품질을 끌어올림</w:t>
       </w:r>
     </w:p>
     <w:p>
@@ -1138,7 +1138,7 @@
           <w:sz w:val="22"/>
           <w:szCs w:val="22"/>
         </w:rPr>
-        <w:t>• Latent Diffusion으로 합성 데이터를 생성하고 실제 모델 학습에 적용해 유효성을 검증</w:t>
+        <w:t>• Latent Diffusion으로 합성 데이터를 생성하고 실제 모델 학습에 투입해, 부족한 학습 데이터를 보완할 수 있음을 검증</w:t>
       </w:r>
       <w:r>
         <w:rPr>
@@ -1696,7 +1696,7 @@
           <w:sz w:val="22"/>
           <w:szCs w:val="22"/>
         </w:rPr>
-        <w:t>• 금융 데이터를 크롤링하고 정제부터 검증, 저장까지 이어지는 자동화 파이프라인을 구축</w:t>
+        <w:t>• 크롤링으로 데이터를 모으고 정제, 검증, 저장까지 이어지는 자동화 파이프라인을 구축해 수작업 수집을 대체</w:t>
       </w:r>
       <w:r>
         <w:rPr>

</xml_diff>

<commit_message>
Expand K8s details from verified 0630 record
On-premise MetalLB rationale, Deployment/StatefulSet, Argo Workflow in
CI/CD, AlertManager alerts, Loki/ELK. Applied to both resume and
projects page.

Co-Authored-By: Claude Fable 5 <noreply@anthropic.com>
</commit_message>
<xml_diff>
--- a/assets/resume.docx
+++ b/assets/resume.docx
@@ -931,7 +931,7 @@
         <w:ind w:left="300" w:hanging="300"/>
       </w:pPr>
       <w:r>
-        <w:t>• 사내 최초로 Kubernetes를 도입해 VM 수동 배포를 컨테이너 기반 자동 배포 체계로 전환</w:t>
+        <w:t>• 사내 최초 Kubernetes 도입 프로젝트를 맡아, 기존 ML 서비스 운영 환경 분석부터 온프레미스 클러스터 아키텍처 설계, 배포, 운영까지 전 과정을 수행</w:t>
       </w:r>
     </w:p>
     <w:p>
@@ -943,7 +943,7 @@
         <w:rPr>
           <w:b w:val="0"/>
         </w:rPr>
-        <w:t>• MetalLB 로드밸런서와 Nginx Ingress로 서비스 노출 구조를 잡고, NFS 기반 PV/PVC로 영속 스토리지를 구성</w:t>
+        <w:t>• 서비스들을 Docker로 컨테이너화하고 Kubernetes Deployment와 StatefulSet으로 올려, VM 수동 배포를 컨테이너 기반 자동 배포 체계로 전환</w:t>
       </w:r>
     </w:p>
     <w:p>
@@ -953,12 +953,24 @@
       </w:pPr>
       <w:r>
         <w:rPr>
-          <w:b/>
-          <w:bCs/>
-          <w:sz w:val="22"/>
-          <w:szCs w:val="22"/>
-        </w:rPr>
-        <w:t>• 기술: Kubernetes, Docker, Helm, GitLab CI/CD, Jenkins, ArgoCD, Prometheus/Grafana/Loki/ELK</w:t>
+          <w:b w:val="0"/>
+        </w:rPr>
+        <w:t>• 온프레미스에는 클라우드식 로드밸런서가 없어 MetalLB로 LoadBalancer를 직접 구성하고, Nginx Ingress Controller로 외부 요청 라우팅과 서비스 노출 구조를 설계. 영속 데이터는 NFS 기반 PV/PVC로 구성</w:t>
+      </w:r>
+    </w:p>
+    <w:p>
+      <w:pPr>
+        <w:spacing w:after="40" w:line="260" w:lineRule="auto"/>
+        <w:ind w:left="300" w:hanging="300"/>
+      </w:pPr>
+      <w:r>
+        <w:rPr>
+          <w:b/>
+          <w:bCs/>
+          <w:sz w:val="22"/>
+          <w:szCs w:val="22"/>
+        </w:rPr>
+        <w:t>• 기술: Kubernetes, Docker, Helm, GitLab CI/CD, Jenkins, Argo Workflow, ArgoCD, Harbor, MetalLB, Nginx Ingress, NFS(PV/PVC), Prometheus/Grafana/AlertManager, Loki/ELK</w:t>
       </w:r>
       <w:r>
         <w:rPr>
@@ -990,7 +1002,7 @@
         <w:ind w:left="300" w:hanging="300"/>
       </w:pPr>
       <w:r>
-        <w:t>• GitLab에서 Jenkins와 Harbor 레지스트리를 거쳐 ArgoCD로 배포되는 CI/CD 파이프라인을 구축해 20개 이상의 ML 모델 운영 환경을 마련</w:t>
+        <w:t>• GitLab에 소스가 올라오면 Jenkins와 Argo Workflow가 이미지를 빌드해 Harbor 레지스트리에 올리고, ArgoCD가 클러스터에 배포하는 CI/CD 파이프라인을 구축해 20개 이상의 ML 모델을 자동 배포</w:t>
       </w:r>
     </w:p>
     <w:p>
@@ -1002,7 +1014,7 @@
         <w:rPr>
           <w:b w:val="0"/>
         </w:rPr>
-        <w:t>• Prometheus와 Grafana로 모니터링을, Loki와 ELK로 로그 수집을 구축하고 클러스터 장애 대응과 리소스 관리까지 담당</w:t>
+        <w:t>• Prometheus와 Grafana로 서비스·클러스터 모니터링을, AlertManager로 경보를, Loki와 ELK로 로그 수집·분석을 구축하고, 이후 클러스터 장애 대응과 리소스 관리까지 운영을 담당</w:t>
       </w:r>
     </w:p>
     <w:p>

</xml_diff>

<commit_message>
Expand NLP summarization details from Notion slides
Real problem statement (catching up on group chats after leave),
BART+R3F dialogue / T5 document split, Korean pair-data pipeline,
ROUGE + human eval, messenger integration results (one-line notice
summary, ~2s dialogue summary, side-by-side with KakaoTalk).

Co-Authored-By: Claude Fable 5 <noreply@anthropic.com>
</commit_message>
<xml_diff>
--- a/assets/resume.docx
+++ b/assets/resume.docx
@@ -1041,7 +1041,7 @@
         <w:rPr>
           <w:b w:val="0"/>
         </w:rPr>
-        <w:t>• 배경: 회의록과 업무 문서는 계속 쌓이는데 요약은 전부 수작업이었음</w:t>
+        <w:t>• 배경: 휴가나 부재 후 복귀한 직원이 단체방에 쌓인 업무 대화를 따라잡는 데 오랜 시간이 걸린다는 문제에서 출발, 사내 메신저(단비챗)에 넣을 요약 모델을 개발</w:t>
       </w:r>
     </w:p>
     <w:p>
@@ -1050,7 +1050,19 @@
         <w:ind w:left="300" w:hanging="300"/>
       </w:pPr>
       <w:r>
-        <w:t>• BART 대화 요약과 T5 문서 요약 모델을 사내 데이터로 학습시켜, 실제 업무에 쓸 수 있는 수준까지 요약 품질을 끌어올림</w:t>
+        <w:t>• 대화 요약은 BART, 문서 요약은 T5로 나눠 개발. 한국어 대화-요약 쌍 데이터 수집과 전처리, 임베딩 모델 선정까지 학습 파이프라인을 직접 구축</w:t>
+      </w:r>
+    </w:p>
+    <w:p>
+      <w:pPr>
+        <w:spacing w:after="40" w:line="260" w:lineRule="auto"/>
+        <w:ind w:left="300" w:hanging="300"/>
+      </w:pPr>
+      <w:r>
+        <w:rPr>
+          <w:b w:val="0"/>
+        </w:rPr>
+        <w:t>• 파인튜닝에는 사전 학습 표현을 훼손하지 않는 R3F 정규화 기법을 적용하고, ROUGE 점수와 사내 인원 휴먼 평가를 품질 지표로 사용</w:t>
       </w:r>
     </w:p>
     <w:p>
@@ -1059,7 +1071,7 @@
         <w:ind w:left="300" w:hanging="300"/>
       </w:pPr>
       <w:r>
-        <w:t>• 기술: BART, T5, Hugging Face, PyTorch</w:t>
+        <w:t>• 기술: BART, T5, R3F Fine-tuning, Hugging Face, PyTorch</w:t>
       </w:r>
     </w:p>
     <w:p>
@@ -1068,7 +1080,19 @@
         <w:ind w:left="300" w:hanging="300"/>
       </w:pPr>
       <w:r>
-        <w:t>• 사내 자체 개발 메신저에 요약 기능을 붙여 회의록과 문서 요약에 실제 적용</w:t>
+        <w:t>• 사내 메신저에 요약 기능을 붙여 실제 적용. 긴 사내 공지를 한 줄로 줄이고, 실제 업무 대화를 2초대에 요약하는 결과까지 확인</w:t>
+      </w:r>
+    </w:p>
+    <w:p>
+      <w:pPr>
+        <w:spacing w:after="250" w:line="260" w:lineRule="auto"/>
+        <w:ind w:left="300" w:hanging="300"/>
+      </w:pPr>
+      <w:r>
+        <w:rPr>
+          <w:b w:val="0"/>
+        </w:rPr>
+        <w:t>• STT 결과 텍스트를 활용한 자연어 처리 기능 개발과 모델 적용용 데이터 전처리·평가 환경 구축도 함께 수행</w:t>
       </w:r>
     </w:p>
     <w:p>

</xml_diff>

<commit_message>
Expand STT details from Notion record
AIG STT: modularization, log/docker restructure, preprocessing
parallelization, container restart monitoring. New: in-house meeting
notes STT (Whisper model comparison, WhisperX param tuning, file +
streaming modes, engine-broker fix, QA).

Co-Authored-By: Claude Fable 5 <noreply@anthropic.com>
</commit_message>
<xml_diff>
--- a/assets/resume.docx
+++ b/assets/resume.docx
@@ -779,6 +779,30 @@
       </w:pPr>
       <w:r>
         <w:t>• 팀 내 배포·서빙 담당으로 WhisperX 기반 STT 엔진을 맡아, 배치 처리와 실시간 스트리밍을 모두 지원하도록 운영 구조를 고도화</w:t>
+      </w:r>
+    </w:p>
+    <w:p>
+      <w:pPr>
+        <w:spacing w:after="40" w:line="260" w:lineRule="auto"/>
+        <w:ind w:left="300" w:hanging="300"/>
+      </w:pPr>
+      <w:r>
+        <w:rPr>
+          <w:b w:val="0"/>
+        </w:rPr>
+        <w:t>• 코드 모듈화와 전처리 병렬화로 처리 속도를 높이고, 로그·Docker 구조 개선과 컨테이너 재시작 모니터링으로 안정성을 보강</w:t>
+      </w:r>
+    </w:p>
+    <w:p>
+      <w:pPr>
+        <w:spacing w:after="40" w:line="260" w:lineRule="auto"/>
+        <w:ind w:left="300" w:hanging="300"/>
+      </w:pPr>
+      <w:r>
+        <w:rPr>
+          <w:b w:val="0"/>
+        </w:rPr>
+        <w:t>• 사내 회의록 기능에도 STT를 탑재 — Whisper 계열 모델별 성능을 조사해 최적 파라미터를 찾고, 파일 기반과 스트리밍 기반 처리를 모두 구현</w:t>
       </w:r>
     </w:p>
     <w:p>

</xml_diff>

<commit_message>
Add sixth TTS troubleshooting case (SSE WAV header)
From Notion incident report: ZipVoice SSE chunks after the first
lacked WAV headers, breaking browser decodeAudioData(); fixed with
per-chunk headers and a new realtime SSE endpoint.

Co-Authored-By: Claude Fable 5 <noreply@anthropic.com>
</commit_message>
<xml_diff>
--- a/assets/resume.docx
+++ b/assets/resume.docx
@@ -470,7 +470,7 @@
           <w:sz w:val="22"/>
           <w:szCs w:val="22"/>
         </w:rPr>
-        <w:t>▸ 핵심 엔지니어링 (5가지 문제 해결)</w:t>
+        <w:t>▸ 핵심 엔지니어링 (6가지 문제 해결)</w:t>
       </w:r>
     </w:p>
     <w:p>
@@ -707,6 +707,48 @@
       <w:r>
         <w:rPr>
           <w:rFonts w:ascii="Calibri" w:eastAsia="Calibri" w:hAnsi="Calibri" w:cs="Calibri"/>
+          <w:sz w:val="22"/>
+          <w:szCs w:val="22"/>
+        </w:rPr>
+      </w:r>
+    </w:p>
+    <w:p>
+      <w:pPr>
+        <w:spacing w:after="120" w:line="260" w:lineRule="auto"/>
+        <w:ind w:left="360"/>
+      </w:pPr>
+      <w:r>
+        <w:rPr>
+          <w:rFonts w:ascii="Calibri" w:eastAsia="Calibri" w:hAnsi="Calibri" w:cs="Calibri"/>
+          <w:b w:val="0"/>
+          <w:bCs/>
+          <w:sz w:val="22"/>
+          <w:szCs w:val="22"/>
+        </w:rPr>
+        <w:t>⑥ SSE 스트리밍 호환: 첫 청크에만 WAV 헤더가 붙어 브라우저 오디오 디코딩이 이후 청크에서 실패하던 문제를 분석해, 청크별 헤더 수정과 실시간 SSE 엔드포인트 신설로 해결</w:t>
+      </w:r>
+      <w:r>
+        <w:rPr>
+          <w:rFonts w:ascii="Calibri" w:eastAsia="Calibri" w:hAnsi="Calibri" w:cs="Calibri"/>
+          <w:b w:val="0"/>
+          <w:sz w:val="22"/>
+          <w:szCs w:val="22"/>
+        </w:rPr>
+      </w:r>
+      <w:proofErr w:type="spellStart"/>
+      <w:r>
+        <w:rPr>
+          <w:rFonts w:ascii="Calibri" w:eastAsia="Calibri" w:hAnsi="Calibri" w:cs="Calibri"/>
+          <w:b w:val="0"/>
+          <w:sz w:val="22"/>
+          <w:szCs w:val="22"/>
+        </w:rPr>
+      </w:r>
+      <w:proofErr w:type="spellEnd"/>
+      <w:r>
+        <w:rPr>
+          <w:rFonts w:ascii="Calibri" w:eastAsia="Calibri" w:hAnsi="Calibri" w:cs="Calibri"/>
+          <w:b w:val="0"/>
           <w:sz w:val="22"/>
           <w:szCs w:val="22"/>
         </w:rPr>

</xml_diff>

<commit_message>
Add TTS/STT details from project READMEs
TTS: dual engine (vLLM GPU + Supertonic CPU), zero-downtime rolling
deploys, runbook/SLO documentation, 2026.07 measured p50 TTFB 70ms
at 8.6 rps. STT: Triton Python backend with file-based (diarization-
merged) and streaming models, HTTP+gRPC, hybrid speaker assignment
with Ambiguous handling.

Co-Authored-By: Claude Fable 5 <noreply@anthropic.com>
</commit_message>
<xml_diff>
--- a/assets/resume.docx
+++ b/assets/resume.docx
@@ -401,6 +401,239 @@
           <w:sz w:val="22"/>
           <w:szCs w:val="22"/>
         </w:rPr>
+        <w:t>▸ 운영 고도화</w:t>
+      </w:r>
+    </w:p>
+    <w:p>
+      <w:pPr>
+        <w:spacing w:after="100" w:line="280" w:lineRule="auto"/>
+        <w:ind w:left="360"/>
+      </w:pPr>
+      <w:proofErr w:type="spellStart"/>
+      <w:r>
+        <w:rPr>
+          <w:b w:val="0"/>
+        </w:rPr>
+        <w:t>vLLM(GPU)과 Supertonic(CPU) 듀얼 엔진 구성. 무중단 롤링 재배포 체계를 만들고, 온보딩 가이드·운영 런북·장애복구 절차·SLO까지 문서화해 운영 이관이 가능한 수준으로 정비.</w:t>
+      </w:r>
+      <w:proofErr w:type="spellEnd"/>
+      <w:r>
+        <w:rPr>
+          <w:b w:val="0"/>
+        </w:rPr>
+      </w:r>
+      <w:r>
+        <w:rPr>
+          <w:b w:val="0"/>
+        </w:rPr>
+      </w:r>
+      <w:r>
+        <w:rPr>
+          <w:b w:val="0"/>
+        </w:rPr>
+      </w:r>
+      <w:r>
+        <w:rPr>
+          <w:b w:val="0"/>
+        </w:rPr>
+      </w:r>
+      <w:r>
+        <w:rPr>
+          <w:b w:val="0"/>
+        </w:rPr>
+      </w:r>
+      <w:proofErr w:type="spellStart"/>
+      <w:r>
+        <w:rPr>
+          <w:b w:val="0"/>
+        </w:rPr>
+      </w:r>
+      <w:proofErr w:type="spellEnd"/>
+      <w:r>
+        <w:rPr>
+          <w:b w:val="0"/>
+        </w:rPr>
+      </w:r>
+      <w:r>
+        <w:rPr>
+          <w:b w:val="0"/>
+        </w:rPr>
+      </w:r>
+      <w:r>
+        <w:rPr>
+          <w:b w:val="0"/>
+        </w:rPr>
+      </w:r>
+      <w:r>
+        <w:rPr>
+          <w:b w:val="0"/>
+        </w:rPr>
+      </w:r>
+      <w:r>
+        <w:rPr>
+          <w:b w:val="0"/>
+        </w:rPr>
+      </w:r>
+      <w:proofErr w:type="spellStart"/>
+      <w:r>
+        <w:rPr>
+          <w:b w:val="0"/>
+        </w:rPr>
+      </w:r>
+      <w:proofErr w:type="spellEnd"/>
+      <w:r>
+        <w:rPr>
+          <w:b w:val="0"/>
+        </w:rPr>
+      </w:r>
+      <w:proofErr w:type="spellStart"/>
+      <w:r>
+        <w:rPr>
+          <w:b w:val="0"/>
+        </w:rPr>
+      </w:r>
+      <w:proofErr w:type="spellEnd"/>
+      <w:r>
+        <w:rPr>
+          <w:b w:val="0"/>
+        </w:rPr>
+      </w:r>
+      <w:r>
+        <w:rPr>
+          <w:b w:val="0"/>
+        </w:rPr>
+      </w:r>
+      <w:r>
+        <w:rPr>
+          <w:b w:val="0"/>
+        </w:rPr>
+      </w:r>
+      <w:r>
+        <w:rPr>
+          <w:b w:val="0"/>
+        </w:rPr>
+      </w:r>
+      <w:r>
+        <w:rPr>
+          <w:b w:val="0"/>
+        </w:rPr>
+      </w:r>
+      <w:r>
+        <w:rPr>
+          <w:b w:val="0"/>
+        </w:rPr>
+      </w:r>
+      <w:r>
+        <w:rPr>
+          <w:b w:val="0"/>
+        </w:rPr>
+      </w:r>
+      <w:r>
+        <w:rPr>
+          <w:b w:val="0"/>
+        </w:rPr>
+      </w:r>
+      <w:r>
+        <w:rPr>
+          <w:b w:val="0"/>
+        </w:rPr>
+      </w:r>
+      <w:r>
+        <w:rPr>
+          <w:b w:val="0"/>
+        </w:rPr>
+      </w:r>
+      <w:r>
+        <w:rPr>
+          <w:b w:val="0"/>
+        </w:rPr>
+      </w:r>
+      <w:r>
+        <w:rPr>
+          <w:b w:val="0"/>
+        </w:rPr>
+      </w:r>
+      <w:r>
+        <w:rPr>
+          <w:b w:val="0"/>
+        </w:rPr>
+      </w:r>
+      <w:proofErr w:type="spellStart"/>
+      <w:r>
+        <w:rPr>
+          <w:b w:val="0"/>
+        </w:rPr>
+      </w:r>
+      <w:proofErr w:type="spellEnd"/>
+      <w:r>
+        <w:rPr>
+          <w:b w:val="0"/>
+        </w:rPr>
+      </w:r>
+      <w:r>
+        <w:rPr>
+          <w:b w:val="0"/>
+        </w:rPr>
+      </w:r>
+      <w:r>
+        <w:rPr>
+          <w:b w:val="0"/>
+        </w:rPr>
+      </w:r>
+      <w:r>
+        <w:rPr>
+          <w:b w:val="0"/>
+        </w:rPr>
+      </w:r>
+      <w:r>
+        <w:rPr>
+          <w:b w:val="0"/>
+        </w:rPr>
+      </w:r>
+      <w:r>
+        <w:rPr>
+          <w:b w:val="0"/>
+        </w:rPr>
+      </w:r>
+      <w:r>
+        <w:rPr>
+          <w:b w:val="0"/>
+        </w:rPr>
+      </w:r>
+      <w:r>
+        <w:rPr>
+          <w:b w:val="0"/>
+        </w:rPr>
+      </w:r>
+      <w:r>
+        <w:rPr>
+          <w:b w:val="0"/>
+        </w:rPr>
+      </w:r>
+      <w:r>
+        <w:rPr>
+          <w:b w:val="0"/>
+        </w:rPr>
+      </w:r>
+      <w:r>
+        <w:rPr>
+          <w:b w:val="0"/>
+        </w:rPr>
+      </w:r>
+    </w:p>
+    <w:p>
+      <w:pPr>
+        <w:spacing w:after="60"/>
+        <w:ind w:left="360"/>
+      </w:pPr>
+      <w:r>
+        <w:rPr>
+          <w:rFonts w:ascii="Calibri" w:eastAsia="Calibri" w:hAnsi="Calibri" w:cs="Calibri"/>
+          <w:b/>
+          <w:bCs/>
+          <w:sz w:val="22"/>
+          <w:szCs w:val="22"/>
+        </w:rPr>
         <w:t>▸ 성과 (KPI)</w:t>
       </w:r>
     </w:p>
@@ -455,6 +688,18 @@
           <w:b w:val="0"/>
         </w:rPr>
         <w:t>✓ 32개 언어 지원 단일 플랫폼 | ITN 정규화 정확도 50.1% → 70.9%</w:t>
+      </w:r>
+    </w:p>
+    <w:p>
+      <w:pPr>
+        <w:spacing w:after="40" w:line="260" w:lineRule="auto"/>
+        <w:ind w:left="360"/>
+      </w:pPr>
+      <w:r>
+        <w:rPr>
+          <w:b w:val="0"/>
+        </w:rPr>
+        <w:t>✓ 이후 고도화(vLLM 마이그레이션·FP8): TTFB p50 70ms, 처리량 8.6 rps — 콜센터 활성 400명 규모 여유 (2026.07 실측)</w:t>
       </w:r>
     </w:p>
     <w:p>
@@ -832,7 +1077,7 @@
         <w:rPr>
           <w:b w:val="0"/>
         </w:rPr>
-        <w:t>• 코드 모듈화와 전처리 병렬화로 처리 속도를 높이고, 로그·Docker 구조 개선과 컨테이너 재시작 모니터링으로 안정성을 보강</w:t>
+        <w:t>• Triton Python 백엔드로 파일 기반(화자 분리 결합)과 실시간 스트리밍 두 추론 모델을 구성하고, HTTP와 gRPC 인터페이스를 모두 제공</w:t>
       </w:r>
     </w:p>
     <w:p>
@@ -844,7 +1089,7 @@
         <w:rPr>
           <w:b w:val="0"/>
         </w:rPr>
-        <w:t>• 사내 회의록 기능에도 STT를 탑재 — Whisper 계열 모델별 성능을 조사해 최적 파라미터를 찾고, 파일 기반과 스트리밍 기반 처리를 모두 구현</w:t>
+        <w:t>• 화자 분리 결과를 STT에 결합하는 하이브리드 화자 할당 로직을 구현 — 경계가 모호한 발화는 Ambiguous로 분리해 화자 오할당을 방지</w:t>
       </w:r>
     </w:p>
     <w:p>
@@ -855,11 +1100,35 @@
       <w:r>
         <w:rPr>
           <w:b w:val="0"/>
-          <w:bCs/>
-          <w:sz w:val="22"/>
-          <w:szCs w:val="22"/>
-        </w:rPr>
-        <w:t>• 기술: Triton Inference Server, Streaming ASR Pipeline, Docker</w:t>
+        </w:rPr>
+        <w:t>• 코드 모듈화와 전처리 병렬화로 처리 속도를 높이고, 로그·Docker 구조 개선과 컨테이너 재시작 모니터링으로 안정성을 보강</w:t>
+      </w:r>
+    </w:p>
+    <w:p>
+      <w:pPr>
+        <w:spacing w:after="40" w:line="260" w:lineRule="auto"/>
+        <w:ind w:left="300" w:hanging="300"/>
+      </w:pPr>
+      <w:r>
+        <w:rPr>
+          <w:b w:val="0"/>
+        </w:rPr>
+        <w:t>• 사내 회의록 기능에도 STT를 탑재 — Whisper 계열 모델별 성능을 조사해 최적 파라미터를 찾고, 파일 기반과 스트리밍 기반 처리를 모두 구현</w:t>
+      </w:r>
+    </w:p>
+    <w:p>
+      <w:pPr>
+        <w:spacing w:after="40" w:line="260" w:lineRule="auto"/>
+        <w:ind w:left="300" w:hanging="300"/>
+      </w:pPr>
+      <w:r>
+        <w:rPr>
+          <w:b w:val="0"/>
+          <w:bCs/>
+          <w:sz w:val="22"/>
+          <w:szCs w:val="22"/>
+        </w:rPr>
+        <w:t>• 기술: Triton Inference Server(Python Backend), Faster Whisper, Streaming ASR, gRPC/HTTP, Docker</w:t>
       </w:r>
       <w:r>
         <w:rPr>

</xml_diff>

<commit_message>
포지셔닝 전환 — 'AI 엔지니어' → 'AI Inference/Serving Engineer'
TTS 개발자로 좁게 읽히던 정체성을 추론 서빙 직무로 재프레이밍
(본인이 받은 외부 피드백 반영). 이력서 타이틀·요약·Qwen3 배경,
포폴 hero·intro·Qwen3 해결 리드를 서빙 관점으로 통일.
사실은 전부 기검증분 유지 — '대규모 모델' 같은 과장 표현은
면접 리스크라 배제하고 실제 스펙(1.7B→0.6B, L40S, 듀얼 엔진,
0.68→3.09rps)으로만 구성.

Co-Authored-By: Claude Fable 5 <noreply@anthropic.com>
</commit_message>
<xml_diff>
--- a/assets/resume.docx
+++ b/assets/resume.docx
@@ -8,10 +8,6 @@
         <w:jc w:val="center"/>
       </w:pPr>
       <w:r>
-        <w:rPr>
-          <w:rFonts w:ascii="맑은 고딕" w:hAnsi="맑은 고딕" w:eastAsia="맑은 고딕" w:cs="맑은 고딕"/>
-          <w:sz w:val="20"/>
-        </w:rPr>
         <w:t>이윤선</w:t>
       </w:r>
     </w:p>
@@ -21,45 +17,7 @@
         <w:jc w:val="center"/>
       </w:pPr>
       <w:r>
-        <w:rPr>
-          <w:rFonts w:ascii="맑은 고딕" w:hAnsi="맑은 고딕" w:eastAsia="맑은 고딕" w:cs="맑은 고딕"/>
-          <w:sz w:val="20"/>
-        </w:rPr>
-        <w:t>6</w:t>
-      </w:r>
-      <w:r>
-        <w:rPr>
-          <w:rFonts w:ascii="맑은 고딕" w:hAnsi="맑은 고딕" w:eastAsia="맑은 고딕" w:cs="맑은 고딕"/>
-          <w:sz w:val="20"/>
-        </w:rPr>
-        <w:t>년</w:t>
-      </w:r>
-      <w:r>
-        <w:rPr>
-          <w:rFonts w:hint="eastAsia" w:ascii="맑은 고딕" w:hAnsi="맑은 고딕" w:eastAsia="맑은 고딕" w:cs="맑은 고딕"/>
-          <w:sz w:val="20"/>
-        </w:rPr>
-        <w:t>차</w:t>
-      </w:r>
-      <w:r>
-        <w:rPr>
-          <w:rFonts w:ascii="맑은 고딕" w:hAnsi="맑은 고딕" w:eastAsia="맑은 고딕" w:cs="맑은 고딕"/>
-          <w:sz w:val="20"/>
-        </w:rPr>
-        <w:t xml:space="preserve"> AI </w:t>
-      </w:r>
-      <w:r>
-        <w:rPr>
-          <w:rFonts w:ascii="맑은 고딕" w:hAnsi="맑은 고딕" w:eastAsia="맑은 고딕" w:cs="맑은 고딕"/>
-          <w:sz w:val="20"/>
-        </w:rPr>
-        <w:t>엔지니어</w:t>
-      </w:r>
-      <w:r>
-        <w:rPr>
-          <w:rFonts w:ascii="맑은 고딕" w:hAnsi="맑은 고딕" w:eastAsia="맑은 고딕" w:cs="맑은 고딕"/>
-          <w:sz w:val="20"/>
-        </w:rPr>
+        <w:t>AI Inference/Serving Engineer</w:t>
       </w:r>
     </w:p>
     <w:p>
@@ -68,10 +26,6 @@
         <w:jc w:val="center"/>
       </w:pPr>
       <w:r>
-        <w:rPr>
-          <w:rFonts w:ascii="맑은 고딕" w:hAnsi="맑은 고딕" w:eastAsia="맑은 고딕" w:cs="맑은 고딕"/>
-          <w:sz w:val="20"/>
-        </w:rPr>
         <w:t>yoon7829@gmail.com | ckc5800.github.io | github.com/ckc5800 | taepseon.tistory.com</w:t>
       </w:r>
     </w:p>
@@ -84,10 +38,6 @@
         <w:spacing w:before="150" w:after="80"/>
       </w:pPr>
       <w:r>
-        <w:rPr>
-          <w:rFonts w:ascii="맑은 고딕" w:hAnsi="맑은 고딕" w:eastAsia="맑은 고딕" w:cs="맑은 고딕"/>
-          <w:sz w:val="26"/>
-        </w:rPr>
         <w:t>PROFESSIONAL SUMMARY</w:t>
       </w:r>
     </w:p>
@@ -97,36 +47,16 @@
       </w:pPr>
       <w:r>
         <w:rPr>
-          <w:rFonts w:ascii="맑은 고딕" w:eastAsia="맑은 고딕" w:hAnsi="맑은 고딕" w:cs="맑은 고딕"/>
-          <w:b/>
-          <w:bCs/>
-          <w:sz w:val="20"/>
-          <w:szCs w:val="22"/>
-        </w:rPr>
-        <w:t xml:space="preserve">AI Engineer | </w:t>
-      </w:r>
-      <w:proofErr w:type="spellStart"/>
-      <w:r>
-        <w:rPr>
-          <w:rFonts w:ascii="맑은 고딕" w:eastAsia="맑은 고딕" w:hAnsi="맑은 고딕" w:cs="맑은 고딕"/>
-          <w:b/>
-          <w:bCs/>
-          <w:sz w:val="20"/>
-          <w:szCs w:val="22"/>
-        </w:rPr>
-        <w:t>MLOps</w:t>
-      </w:r>
-      <w:proofErr w:type="spellEnd"/>
-      <w:r>
-        <w:rPr>
-          <w:rFonts w:ascii="맑은 고딕" w:eastAsia="맑은 고딕" w:hAnsi="맑은 고딕" w:cs="맑은 고딕"/>
-          <w:b/>
-          <w:bCs/>
-          <w:sz w:val="20"/>
-          <w:szCs w:val="22"/>
-        </w:rPr>
-        <w:t xml:space="preserve"> Specialist</w:t>
-      </w:r>
+          <w:rFonts w:ascii="Calibri" w:eastAsia="맑은 고딕" w:hAnsi="Calibri" w:cs="Calibri"/>
+          <w:b/>
+          <w:bCs/>
+          <w:sz w:val="22"/>
+          <w:szCs w:val="22"/>
+        </w:rPr>
+        <w:t>AI Inference/Serving Engineer | MLOps</w:t>
+      </w:r>
+      <w:proofErr w:type="spellStart"/>
+      <w:proofErr w:type="spellEnd"/>
     </w:p>
     <w:p>
       <w:pPr>
@@ -135,11 +65,10 @@
       </w:pPr>
       <w:r>
         <w:rPr>
-          <w:rFonts w:eastAsia="맑은 고딕" w:ascii="맑은 고딕" w:hAnsi="맑은 고딕" w:cs="맑은 고딕"/>
-          <w:b w:val="0"/>
-          <w:sz w:val="20"/>
-        </w:rPr>
-        <w:t>연구에서 시작해 인프라를 거쳐 서비스로 넘어온 6년차 AI 엔지니어입니다.</w:t>
+          <w:rFonts w:eastAsia="맑은 고딕"/>
+          <w:b w:val="0"/>
+        </w:rPr>
+        <w:t>연구에서 시작해 인프라를 거쳐 모델 추론 서빙으로 넘어온 6년차 AI 엔지니어입니다.</w:t>
       </w:r>
     </w:p>
     <w:p>
@@ -149,10 +78,10 @@
       </w:pPr>
       <w:r>
         <w:rPr>
-          <w:rFonts w:eastAsia="맑은 고딕" w:ascii="맑은 고딕" w:hAnsi="맑은 고딕" w:cs="맑은 고딕"/>
-          <w:b w:val="0"/>
-          <w:bCs/>
-          <w:sz w:val="20"/>
+          <w:rFonts w:eastAsia="맑은 고딕"/>
+          <w:b w:val="0"/>
+          <w:bCs/>
+          <w:sz w:val="22"/>
           <w:szCs w:val="22"/>
         </w:rPr>
         <w:t>석사와 경력 초반 연구원 시절에 논문 7편과 특허 2건을 쓰며 모델을 연구했고, 인피닉에서는 사내 첫 Kubernetes를 도입해 20여 개 모델의 배포 체계를 만들었습니다.</w:t>
@@ -165,11 +94,10 @@
       </w:pPr>
       <w:r>
         <w:rPr>
-          <w:rFonts w:eastAsia="맑은 고딕" w:ascii="맑은 고딕" w:hAnsi="맑은 고딕" w:cs="맑은 고딕"/>
-          <w:b w:val="0"/>
-          <w:sz w:val="20"/>
-        </w:rPr>
-        <w:t>지금은 TTS를 맡아 기존 시스템의 첫 응답 시간을 2.3초에서 0.33초로 줄였고, 신규 TTS 플랫폼을 단독으로 구축해 운영하고 있습니다.</w:t>
+          <w:rFonts w:eastAsia="맑은 고딕"/>
+          <w:b w:val="0"/>
+        </w:rPr>
+        <w:t>지금은 AI 모델 추론 서빙을 맡아 — 기존 TTS 스트리밍 API의 첫 응답을 2.3초에서 0.33초로 줄였고, GPU/CPU 듀얼 엔진 서빙 플랫폼을 단독 설계·구축해 엔진 처리량을 4.5배(0.68→3.09rps) 끌어올렸습니다.</w:t>
       </w:r>
     </w:p>
     <w:p>
@@ -179,9 +107,8 @@
       </w:pPr>
       <w:r>
         <w:rPr>
-          <w:rFonts w:eastAsia="맑은 고딕" w:ascii="맑은 고딕" w:hAnsi="맑은 고딕" w:cs="맑은 고딕"/>
-          <w:b w:val="0"/>
-          <w:sz w:val="20"/>
+          <w:rFonts w:eastAsia="맑은 고딕"/>
+          <w:b w:val="0"/>
         </w:rPr>
         <w:t>최근에는 RAG와 Multi-Agent 시스템을 만들며 LLM 시스템 엔지니어링으로 영역을 넓히는 중입니다.</w:t>
       </w:r>
@@ -195,10 +122,6 @@
         <w:spacing w:before="160" w:after="80"/>
       </w:pPr>
       <w:r>
-        <w:rPr>
-          <w:rFonts w:ascii="맑은 고딕" w:hAnsi="맑은 고딕" w:eastAsia="맑은 고딕" w:cs="맑은 고딕"/>
-          <w:sz w:val="26"/>
-        </w:rPr>
         <w:t>MiCo AI (구 에이아이세스)</w:t>
       </w:r>
     </w:p>
@@ -208,8 +131,7 @@
       </w:pPr>
       <w:r>
         <w:rPr>
-          <w:rFonts w:eastAsia="맑은 고딕" w:ascii="맑은 고딕" w:hAnsi="맑은 고딕" w:cs="맑은 고딕"/>
-          <w:sz w:val="20"/>
+          <w:rFonts w:eastAsia="맑은 고딕"/>
         </w:rPr>
         <w:t>Manager  |  Apr 2025 – Present</w:t>
       </w:r>
@@ -220,7 +142,7 @@
       </w:pPr>
       <w:r>
         <w:rPr>
-          <w:rFonts w:ascii="맑은 고딕" w:eastAsia="맑은 고딕" w:hAnsi="맑은 고딕" w:cs="맑은 고딕"/>
+          <w:rFonts w:ascii="Calibri" w:eastAsia="맑은 고딕" w:hAnsi="Calibri" w:cs="Calibri"/>
           <w:b/>
           <w:bCs/>
           <w:color w:val="333333"/>
@@ -236,29 +158,470 @@
       </w:pPr>
       <w:r>
         <w:rPr>
-          <w:rFonts w:ascii="맑은 고딕" w:eastAsia="맑은 고딕" w:hAnsi="맑은 고딕" w:cs="맑은 고딕"/>
+          <w:rFonts w:ascii="Calibri" w:eastAsia="맑은 고딕" w:hAnsi="Calibri" w:cs="Calibri"/>
           <w:i/>
           <w:iCs/>
           <w:color w:val="555555"/>
+          <w:sz w:val="22"/>
+          <w:szCs w:val="22"/>
+        </w:rPr>
+        <w:t>PM 및 풀스택 단독 개발 (Backend/Frontend/Infrastructure)</w:t>
+      </w:r>
+      <w:proofErr w:type="spellStart"/>
+      <w:proofErr w:type="spellEnd"/>
+    </w:p>
+    <w:p>
+      <w:pPr>
+        <w:spacing w:after="47" w:line="240" w:lineRule="auto"/>
+      </w:pPr>
+      <w:r>
+        <w:rPr>
+          <w:rFonts w:eastAsia="맑은 고딕"/>
+          <w:b w:val="0"/>
+        </w:rPr>
+        <w:t>▸ 배경: 상담 센터용 음성 합성 모델의 추론 서빙 플랫폼을 단독 재구축 — 모델 선정(Qwen3-TTS 1.7B→0.6B)부터 vLLM(GPU)·Supertonic(CPU) 듀얼 엔진 서빙 아키텍처 설계, latency·throughput 최적화, 백엔드·프론트엔드, 배포·운영까지 전 구간 수행</w:t>
+      </w:r>
+    </w:p>
+    <w:p>
+      <w:pPr>
+        <w:spacing w:after="40" w:line="240" w:lineRule="auto"/>
+        <w:ind w:left="360"/>
+      </w:pPr>
+      <w:r>
+        <w:rPr>
+          <w:rFonts w:ascii="Calibri" w:eastAsia="맑은 고딕" w:hAnsi="Calibri" w:cs="Calibri"/>
+          <w:b/>
+          <w:bCs/>
+          <w:sz w:val="22"/>
+          <w:szCs w:val="22"/>
+        </w:rPr>
+        <w:t>▸ 시스템 아키텍처</w:t>
+      </w:r>
+    </w:p>
+    <w:p>
+      <w:pPr>
+        <w:spacing w:after="40" w:line="240" w:lineRule="auto"/>
+        <w:ind w:left="360"/>
+      </w:pPr>
+      <w:proofErr w:type="spellStart"/>
+      <w:r>
+        <w:rPr>
+          <w:rFonts w:eastAsia="맑은 고딕"/>
+        </w:rPr>
+        <w:t>Qwen3-TTS 기반 신규 플랫폼을 단독으로 구축 — vLLM 추론 엔진 위에 FastAPI 게이트웨이, Redis 캐싱과 분산락, React 관리자 대시보드까지 서비스 전 구간을 설계하고 개발. 긴 텍스트를 문장 단위로 나눠 전체 합성이 끝나기 전에 첫 문장부터 WebSocket으로 내보내는 스트리밍 구조로 사용자가 첫 소리를 듣기까지의 대기 시간을 줄임.</w:t>
+      </w:r>
+      <w:proofErr w:type="spellEnd"/>
+      <w:proofErr w:type="spellStart"/>
+      <w:proofErr w:type="spellEnd"/>
+      <w:proofErr w:type="spellStart"/>
+      <w:proofErr w:type="spellEnd"/>
+      <w:proofErr w:type="spellStart"/>
+      <w:proofErr w:type="spellEnd"/>
+      <w:proofErr w:type="spellStart"/>
+      <w:proofErr w:type="spellEnd"/>
+    </w:p>
+    <w:p>
+      <w:pPr>
+        <w:spacing w:after="40" w:line="240" w:lineRule="auto"/>
+        <w:ind w:left="360"/>
+      </w:pPr>
+      <w:r>
+        <w:rPr>
+          <w:rFonts w:ascii="Calibri" w:eastAsia="맑은 고딕" w:hAnsi="Calibri" w:cs="Calibri"/>
+          <w:b/>
+          <w:bCs/>
+          <w:sz w:val="22"/>
+          <w:szCs w:val="22"/>
+        </w:rPr>
+        <w:t>▸ 기능 확장</w:t>
+      </w:r>
+    </w:p>
+    <w:p>
+      <w:pPr>
+        <w:spacing w:after="40" w:line="240" w:lineRule="auto"/>
+        <w:ind w:left="360"/>
+      </w:pPr>
+      <w:proofErr w:type="spellStart"/>
+      <w:r>
+        <w:rPr>
+          <w:rFonts w:eastAsia="맑은 고딕"/>
+        </w:rPr>
+        <w:t>참조 음성 5초만으로 화자 목소리를 복제하는 기능을 구현. OpenAI TTS API와 호환되는 인터페이스를 제공해 외부 서비스가 코드 수정 없이 연동되도록 지원.</w:t>
+      </w:r>
+      <w:proofErr w:type="spellEnd"/>
+      <w:r>
+        <w:rPr>
+          <w:rFonts w:eastAsia="맑은 고딕"/>
+        </w:rPr>
+      </w:r>
+      <w:r>
+        <w:rPr>
+          <w:rFonts w:eastAsia="맑은 고딕"/>
+        </w:rPr>
+      </w:r>
+      <w:r>
+        <w:rPr>
+          <w:rFonts w:eastAsia="맑은 고딕"/>
+        </w:rPr>
+      </w:r>
+      <w:r>
+        <w:rPr>
+          <w:rFonts w:eastAsia="맑은 고딕"/>
+        </w:rPr>
+      </w:r>
+      <w:r>
+        <w:rPr>
+          <w:rFonts w:eastAsia="맑은 고딕"/>
+        </w:rPr>
+      </w:r>
+      <w:proofErr w:type="spellStart"/>
+      <w:r>
+        <w:rPr>
+          <w:rFonts w:eastAsia="맑은 고딕"/>
+        </w:rPr>
+      </w:r>
+      <w:proofErr w:type="spellEnd"/>
+      <w:r>
+        <w:rPr>
+          <w:rFonts w:eastAsia="맑은 고딕"/>
+        </w:rPr>
+      </w:r>
+      <w:r>
+        <w:rPr>
+          <w:rFonts w:eastAsia="맑은 고딕"/>
+        </w:rPr>
+      </w:r>
+      <w:r>
+        <w:rPr>
+          <w:rFonts w:eastAsia="맑은 고딕"/>
+        </w:rPr>
+      </w:r>
+      <w:r>
+        <w:rPr>
+          <w:rFonts w:eastAsia="맑은 고딕"/>
+        </w:rPr>
+      </w:r>
+      <w:r>
+        <w:rPr>
+          <w:rFonts w:eastAsia="맑은 고딕"/>
+        </w:rPr>
+      </w:r>
+      <w:proofErr w:type="spellStart"/>
+      <w:r>
+        <w:rPr>
+          <w:rFonts w:eastAsia="맑은 고딕"/>
+        </w:rPr>
+      </w:r>
+      <w:proofErr w:type="spellEnd"/>
+      <w:r>
+        <w:rPr>
+          <w:rFonts w:eastAsia="맑은 고딕"/>
+        </w:rPr>
+      </w:r>
+      <w:proofErr w:type="spellStart"/>
+      <w:r>
+        <w:rPr>
+          <w:rFonts w:eastAsia="맑은 고딕"/>
+        </w:rPr>
+      </w:r>
+      <w:proofErr w:type="spellEnd"/>
+      <w:r>
+        <w:rPr>
+          <w:rFonts w:eastAsia="맑은 고딕"/>
+        </w:rPr>
+      </w:r>
+      <w:r>
+        <w:rPr>
+          <w:rFonts w:eastAsia="맑은 고딕"/>
+        </w:rPr>
+      </w:r>
+      <w:r>
+        <w:rPr>
+          <w:rFonts w:eastAsia="맑은 고딕"/>
+        </w:rPr>
+      </w:r>
+      <w:r>
+        <w:rPr>
+          <w:rFonts w:eastAsia="맑은 고딕"/>
+        </w:rPr>
+      </w:r>
+      <w:r>
+        <w:rPr>
+          <w:rFonts w:eastAsia="맑은 고딕"/>
+        </w:rPr>
+      </w:r>
+      <w:r>
+        <w:rPr>
+          <w:rFonts w:eastAsia="맑은 고딕"/>
+        </w:rPr>
+      </w:r>
+      <w:r>
+        <w:rPr>
+          <w:rFonts w:eastAsia="맑은 고딕"/>
+        </w:rPr>
+      </w:r>
+      <w:r>
+        <w:rPr>
+          <w:rFonts w:eastAsia="맑은 고딕"/>
+        </w:rPr>
+      </w:r>
+      <w:r>
+        <w:rPr>
+          <w:rFonts w:eastAsia="맑은 고딕"/>
+        </w:rPr>
+      </w:r>
+      <w:r>
+        <w:rPr>
+          <w:rFonts w:eastAsia="맑은 고딕"/>
+        </w:rPr>
+      </w:r>
+      <w:r>
+        <w:rPr>
+          <w:rFonts w:eastAsia="맑은 고딕"/>
+        </w:rPr>
+      </w:r>
+      <w:r>
+        <w:rPr>
+          <w:rFonts w:eastAsia="맑은 고딕"/>
+        </w:rPr>
+      </w:r>
+      <w:r>
+        <w:rPr>
+          <w:rFonts w:eastAsia="맑은 고딕"/>
+        </w:rPr>
+      </w:r>
+      <w:proofErr w:type="spellStart"/>
+      <w:r>
+        <w:rPr>
+          <w:rFonts w:eastAsia="맑은 고딕"/>
+        </w:rPr>
+      </w:r>
+      <w:proofErr w:type="spellEnd"/>
+      <w:r>
+        <w:rPr>
+          <w:rFonts w:eastAsia="맑은 고딕"/>
+        </w:rPr>
+      </w:r>
+      <w:r>
+        <w:rPr>
+          <w:rFonts w:eastAsia="맑은 고딕"/>
+        </w:rPr>
+      </w:r>
+      <w:r>
+        <w:rPr>
+          <w:rFonts w:eastAsia="맑은 고딕"/>
+        </w:rPr>
+      </w:r>
+      <w:r>
+        <w:rPr>
+          <w:rFonts w:eastAsia="맑은 고딕"/>
+        </w:rPr>
+      </w:r>
+      <w:r>
+        <w:rPr>
+          <w:rFonts w:eastAsia="맑은 고딕"/>
+        </w:rPr>
+      </w:r>
+      <w:r>
+        <w:rPr>
+          <w:rFonts w:eastAsia="맑은 고딕"/>
+        </w:rPr>
+      </w:r>
+      <w:r>
+        <w:rPr>
+          <w:rFonts w:eastAsia="맑은 고딕"/>
+        </w:rPr>
+      </w:r>
+      <w:r>
+        <w:rPr>
+          <w:rFonts w:eastAsia="맑은 고딕"/>
+        </w:rPr>
+      </w:r>
+      <w:r>
+        <w:rPr>
+          <w:rFonts w:eastAsia="맑은 고딕"/>
+        </w:rPr>
+      </w:r>
+      <w:r>
+        <w:rPr>
+          <w:rFonts w:eastAsia="맑은 고딕"/>
+        </w:rPr>
+      </w:r>
+      <w:r>
+        <w:rPr>
+          <w:rFonts w:eastAsia="맑은 고딕"/>
+        </w:rPr>
+      </w:r>
+    </w:p>
+    <w:p>
+      <w:pPr>
+        <w:spacing w:after="40" w:line="240" w:lineRule="auto"/>
+        <w:ind w:left="360"/>
+      </w:pPr>
+      <w:r>
+        <w:rPr>
+          <w:rFonts w:ascii="Calibri" w:eastAsia="맑은 고딕" w:hAnsi="Calibri" w:cs="Calibri"/>
+          <w:b/>
+          <w:bCs/>
+          <w:sz w:val="22"/>
+          <w:szCs w:val="22"/>
+        </w:rPr>
+        <w:t>▸ 운영 고도화</w:t>
+      </w:r>
+    </w:p>
+    <w:p>
+      <w:pPr>
+        <w:spacing w:after="40" w:line="240" w:lineRule="auto"/>
+        <w:ind w:left="360"/>
+      </w:pPr>
+      <w:proofErr w:type="spellStart"/>
+      <w:r>
+        <w:rPr>
+          <w:rFonts w:eastAsia="맑은 고딕"/>
+          <w:b w:val="0"/>
+        </w:rPr>
+        <w:t>vLLM(GPU)과 Supertonic(CPU) 듀얼 엔진 구성 — 장애 시 Circuit Breaker가 CPU 엔진으로 자동 폴백. 무중단 롤링 재배포 체계를 만들고, 온보딩 가이드·운영 런북·장애복구 절차·성능 명세까지 문서화해 운영 이관이 가능한 수준으로 정비.</w:t>
+      </w:r>
+      <w:proofErr w:type="spellEnd"/>
+      <w:proofErr w:type="spellStart"/>
+      <w:proofErr w:type="spellEnd"/>
+      <w:proofErr w:type="spellStart"/>
+      <w:proofErr w:type="spellEnd"/>
+      <w:proofErr w:type="spellStart"/>
+      <w:proofErr w:type="spellEnd"/>
+      <w:proofErr w:type="spellStart"/>
+      <w:proofErr w:type="spellEnd"/>
+    </w:p>
+    <w:p>
+      <w:pPr>
+        <w:spacing w:after="40" w:line="240" w:lineRule="auto"/>
+        <w:ind w:left="360"/>
+      </w:pPr>
+      <w:r>
+        <w:rPr>
+          <w:rFonts w:ascii="Calibri" w:eastAsia="맑은 고딕" w:hAnsi="Calibri" w:cs="Calibri"/>
+          <w:b/>
+          <w:bCs/>
+          <w:sz w:val="22"/>
+          <w:szCs w:val="22"/>
+        </w:rPr>
+        <w:t>▸ 성과 (KPI)</w:t>
+      </w:r>
+    </w:p>
+    <w:p>
+      <w:pPr>
+        <w:spacing w:after="40" w:line="240" w:lineRule="auto"/>
+        <w:ind w:left="360"/>
+      </w:pPr>
+      <w:r>
+        <w:rPr>
+          <w:rFonts w:eastAsia="맑은 고딕"/>
+        </w:rPr>
+        <w:t>✓ Throughput: 0.68 → 1.41 rps (FP8·executor 최적화) → 3.09 rps (vLLM 0.24 마이그레이션, +80%)</w:t>
+      </w:r>
+    </w:p>
+    <w:p>
+      <w:pPr>
+        <w:spacing w:after="40" w:line="240" w:lineRule="auto"/>
+        <w:ind w:left="360"/>
+      </w:pPr>
+      <w:r>
+        <w:rPr>
+          <w:rFonts w:eastAsia="맑은 고딕"/>
+          <w:b w:val="0"/>
+        </w:rPr>
+        <w:t>✓ 32개 언어 지원 단일 플랫폼 (vLLM 10개 + Supertonic 22개) | ITN 정규화 정확도 50.1% → 70.9% (검증셋 기준)</w:t>
+      </w:r>
+    </w:p>
+    <w:p>
+      <w:pPr>
+        <w:spacing w:after="40" w:line="240" w:lineRule="auto"/>
+        <w:ind w:left="360"/>
+      </w:pPr>
+      <w:r>
+        <w:rPr>
+          <w:rFonts w:eastAsia="맑은 고딕"/>
+          <w:b w:val="0"/>
+        </w:rPr>
+        <w:t>✓ 이후 고도화(vLLM 마이그레이션·FP8): TTFB p50 70ms, 처리량 8.6 rps — 콜센터 활성 400명 규모 여유 (2026.07 실측)</w:t>
+      </w:r>
+    </w:p>
+    <w:p>
+      <w:pPr>
+        <w:spacing w:after="40" w:line="240" w:lineRule="auto"/>
+        <w:ind w:left="360"/>
+      </w:pPr>
+      <w:r>
+        <w:rPr>
+          <w:rFonts w:eastAsia="맑은 고딕"/>
+          <w:b w:val="0"/>
+        </w:rPr>
+        <w:t>✓ 모델 경량화 전환(1.7B→0.6B) 후 엔진 재튜닝: burst p95 TTFB 0.5초(동시 15)·1초(동시 30), 동시 스트림 수용 한계 36 실측 (2026.07 말)</w:t>
+      </w:r>
+    </w:p>
+    <w:p>
+      <w:pPr>
+        <w:spacing w:after="40" w:line="240" w:lineRule="auto"/>
+        <w:ind w:left="360"/>
+      </w:pPr>
+      <w:r>
+        <w:rPr>
+          <w:rFonts w:ascii="Calibri" w:eastAsia="맑은 고딕" w:hAnsi="Calibri" w:cs="Calibri"/>
+          <w:b/>
+          <w:bCs/>
+          <w:sz w:val="22"/>
+          <w:szCs w:val="22"/>
+        </w:rPr>
+        <w:t>▸ 핵심 엔지니어링 (7가지 문제 해결)</w:t>
+      </w:r>
+    </w:p>
+    <w:p>
+      <w:pPr>
+        <w:spacing w:after="40" w:line="240" w:lineRule="auto"/>
+        <w:ind w:left="360"/>
+      </w:pPr>
+      <w:r>
+        <w:rPr>
+          <w:rFonts w:ascii="Calibri" w:eastAsia="맑은 고딕" w:hAnsi="Calibri" w:cs="Calibri"/>
+          <w:b/>
+          <w:bCs/>
           <w:sz w:val="20"/>
           <w:szCs w:val="22"/>
         </w:rPr>
-        <w:t>PM 및 풀스택 단독 개발 (Backend/Frontend/Infrastructure)</w:t>
-      </w:r>
-      <w:proofErr w:type="spellStart"/>
-      <w:proofErr w:type="spellEnd"/>
-    </w:p>
-    <w:p>
-      <w:pPr>
-        <w:spacing w:after="47" w:line="240" w:lineRule="auto"/>
-      </w:pPr>
-      <w:r>
-        <w:rPr>
-          <w:rFonts w:eastAsia="맑은 고딕" w:ascii="맑은 고딕" w:hAnsi="맑은 고딕" w:cs="맑은 고딕"/>
-          <w:b w:val="0"/>
+        <w:t>1. 스트리밍 팝 노이즈:</w:t>
+      </w:r>
+      <w:r>
+        <w:rPr>
+          <w:rFonts w:ascii="Times New Roman" w:eastAsia="맑은 고딕" w:hAnsi="Times New Roman" w:cs="Calibri"/>
+          <w:b w:val="0"/>
+          <w:bCs/>
           <w:sz w:val="20"/>
-        </w:rPr>
-        <w:t>▸ 배경: 고객 상담 센터용 TTS를 차세대 플랫폼으로 전면 재구축 — 모델 선정(Qwen3-TTS)부터 서빙 아키텍처, 백엔드·프론트엔드, 배포·운영까지 전 구간을 단독으로 수행</w:t>
+          <w:szCs w:val="22"/>
+        </w:rPr>
+        <w:t xml:space="preserve"> 재생 중 간헐적으로 '틱' 잡음이 나는 문제를 추적해, PCM 청크가 홀수 바이트로 끊겨 와 샘플 정렬이 깨지는 것을 원인으로 확인. 잔여 바이트를 다음 청크에 이어 붙이는 버퍼로 잡음을 제거</w:t>
+      </w:r>
+      <w:r>
+        <w:rPr>
+          <w:rFonts w:ascii="Calibri" w:eastAsia="맑은 고딕" w:hAnsi="Calibri" w:cs="Calibri"/>
+          <w:sz w:val="20"/>
+          <w:szCs w:val="22"/>
+        </w:rPr>
+      </w:r>
+      <w:proofErr w:type="spellStart"/>
+      <w:r>
+        <w:rPr>
+          <w:rFonts w:ascii="Calibri" w:eastAsia="맑은 고딕" w:hAnsi="Calibri" w:cs="Calibri"/>
+          <w:sz w:val="20"/>
+          <w:szCs w:val="22"/>
+        </w:rPr>
+      </w:r>
+      <w:proofErr w:type="spellEnd"/>
+      <w:r>
+        <w:rPr>
+          <w:rFonts w:ascii="Calibri" w:eastAsia="맑은 고딕" w:hAnsi="Calibri" w:cs="Calibri"/>
+          <w:sz w:val="20"/>
+          <w:szCs w:val="22"/>
+        </w:rPr>
       </w:r>
     </w:p>
     <w:p>
@@ -268,13 +631,46 @@
       </w:pPr>
       <w:r>
         <w:rPr>
-          <w:rFonts w:ascii="맑은 고딕" w:eastAsia="맑은 고딕" w:hAnsi="맑은 고딕" w:cs="맑은 고딕"/>
+          <w:rFonts w:ascii="Calibri" w:eastAsia="맑은 고딕" w:hAnsi="Calibri" w:cs="Calibri"/>
           <w:b/>
           <w:bCs/>
           <w:sz w:val="20"/>
           <w:szCs w:val="22"/>
         </w:rPr>
-        <w:t>▸ 시스템 아키텍처</w:t>
+        <w:t>2. 스토리지 누수:</w:t>
+      </w:r>
+      <w:r>
+        <w:rPr>
+          <w:rFonts w:ascii="Times New Roman" w:eastAsia="맑은 고딕" w:hAnsi="Times New Roman" w:cs="Calibri"/>
+          <w:b w:val="0"/>
+          <w:bCs/>
+          <w:sz w:val="20"/>
+          <w:szCs w:val="22"/>
+        </w:rPr>
+        <w:t xml:space="preserve"> 보이스를 지워도 디스크 사용량이 계속 늘어나는 문제에서 파생 해시 캐시 파일이 남는 구조를 찾아내고, 파생 파일까지 추적해 지우는 정리 로직으로 누수를 차단</w:t>
+      </w:r>
+      <w:r>
+        <w:rPr>
+          <w:rFonts w:ascii="Calibri" w:eastAsia="맑은 고딕" w:hAnsi="Calibri" w:cs="Calibri"/>
+          <w:sz w:val="20"/>
+          <w:szCs w:val="22"/>
+        </w:rPr>
+      </w:r>
+      <w:proofErr w:type="spellStart"/>
+      <w:r>
+        <w:rPr>
+          <w:rFonts w:ascii="Calibri" w:eastAsia="맑은 고딕" w:hAnsi="Calibri" w:cs="Calibri"/>
+          <w:sz w:val="20"/>
+          <w:szCs w:val="22"/>
+        </w:rPr>
+      </w:r>
+      <w:proofErr w:type="spellEnd"/>
+      <w:r>
+        <w:rPr>
+          <w:rFonts w:ascii="Calibri" w:eastAsia="맑은 고딕" w:hAnsi="Calibri" w:cs="Calibri"/>
+          <w:sz w:val="20"/>
+          <w:szCs w:val="22"/>
+        </w:rPr>
       </w:r>
     </w:p>
     <w:p>
@@ -282,23 +678,69 @@
         <w:spacing w:after="40" w:line="240" w:lineRule="auto"/>
         <w:ind w:left="360"/>
       </w:pPr>
-      <w:proofErr w:type="spellStart"/>
-      <w:r>
-        <w:rPr>
-          <w:rFonts w:eastAsia="맑은 고딕" w:ascii="맑은 고딕" w:hAnsi="맑은 고딕" w:cs="맑은 고딕"/>
+      <w:r>
+        <w:rPr>
+          <w:rFonts w:ascii="Calibri" w:eastAsia="맑은 고딕" w:hAnsi="Calibri" w:cs="Calibri"/>
+          <w:b/>
+          <w:bCs/>
           <w:sz w:val="20"/>
-        </w:rPr>
-        <w:t>Qwen3-TTS 기반 신규 플랫폼을 단독으로 구축 — vLLM 추론 엔진 위에 FastAPI 게이트웨이, Redis 캐싱과 분산락, React 관리자 대시보드까지 서비스 전 구간을 설계하고 개발. 긴 텍스트를 문장 단위로 나눠 전체 합성이 끝나기 전에 첫 문장부터 WebSocket으로 내보내는 스트리밍 구조로 사용자가 첫 소리를 듣기까지의 대기 시간을 줄임.</w:t>
-      </w:r>
-      <w:proofErr w:type="spellEnd"/>
-      <w:proofErr w:type="spellStart"/>
-      <w:proofErr w:type="spellEnd"/>
-      <w:proofErr w:type="spellStart"/>
-      <w:proofErr w:type="spellEnd"/>
-      <w:proofErr w:type="spellStart"/>
-      <w:proofErr w:type="spellEnd"/>
-      <w:proofErr w:type="spellStart"/>
-      <w:proofErr w:type="spellEnd"/>
+          <w:szCs w:val="22"/>
+        </w:rPr>
+        <w:t>3. 세션 보안:</w:t>
+      </w:r>
+      <w:r>
+        <w:rPr>
+          <w:rFonts w:ascii="Times New Roman" w:eastAsia="맑은 고딕" w:hAnsi="Times New Roman" w:cs="Calibri"/>
+          <w:b w:val="0"/>
+          <w:bCs/>
+          <w:sz w:val="20"/>
+          <w:szCs w:val="22"/>
+        </w:rPr>
+        <w:t xml:space="preserve"> 비밀번호를 바꿔도 이미 발급된 토큰으로 웹소켓이 열리는 허점을 발견하고, 토큰 발급 시점과 비밀번호 변경 시점을 대조해 변경 이전 토큰을 전부 무효화</w:t>
+      </w:r>
+      <w:proofErr w:type="spellStart"/>
+      <w:r>
+        <w:rPr>
+          <w:rFonts w:ascii="Calibri" w:eastAsia="맑은 고딕" w:hAnsi="Calibri" w:cs="Calibri"/>
+          <w:b/>
+          <w:bCs/>
+          <w:sz w:val="20"/>
+          <w:szCs w:val="22"/>
+        </w:rPr>
+      </w:r>
+      <w:proofErr w:type="spellEnd"/>
+      <w:r>
+        <w:rPr>
+          <w:rFonts w:ascii="Calibri" w:eastAsia="맑은 고딕" w:hAnsi="Calibri" w:cs="Calibri"/>
+          <w:b/>
+          <w:bCs/>
+          <w:sz w:val="20"/>
+          <w:szCs w:val="22"/>
+        </w:rPr>
+      </w:r>
+      <w:r>
+        <w:rPr>
+          <w:rFonts w:ascii="Calibri" w:eastAsia="맑은 고딕" w:hAnsi="Calibri" w:cs="Calibri"/>
+          <w:sz w:val="20"/>
+          <w:szCs w:val="22"/>
+        </w:rPr>
+      </w:r>
+      <w:proofErr w:type="spellStart"/>
+      <w:r>
+        <w:rPr>
+          <w:rFonts w:ascii="Calibri" w:eastAsia="맑은 고딕" w:hAnsi="Calibri" w:cs="Calibri"/>
+          <w:sz w:val="20"/>
+          <w:szCs w:val="22"/>
+        </w:rPr>
+      </w:r>
+      <w:proofErr w:type="spellEnd"/>
+      <w:r>
+        <w:rPr>
+          <w:rFonts w:ascii="Calibri" w:eastAsia="맑은 고딕" w:hAnsi="Calibri" w:cs="Calibri"/>
+          <w:sz w:val="20"/>
+          <w:szCs w:val="22"/>
+        </w:rPr>
+      </w:r>
     </w:p>
     <w:p>
       <w:pPr>
@@ -307,634 +749,67 @@
       </w:pPr>
       <w:r>
         <w:rPr>
-          <w:rFonts w:ascii="맑은 고딕" w:eastAsia="맑은 고딕" w:hAnsi="맑은 고딕" w:cs="맑은 고딕"/>
+          <w:rFonts w:ascii="Calibri" w:eastAsia="맑은 고딕" w:hAnsi="Calibri" w:cs="Calibri"/>
           <w:b/>
           <w:bCs/>
           <w:sz w:val="20"/>
           <w:szCs w:val="22"/>
         </w:rPr>
-        <w:t>▸ 기능 확장</w:t>
-      </w:r>
-    </w:p>
-    <w:p>
-      <w:pPr>
-        <w:spacing w:after="40" w:line="240" w:lineRule="auto"/>
-        <w:ind w:left="360"/>
-      </w:pPr>
-      <w:proofErr w:type="spellStart"/>
-      <w:r>
-        <w:rPr>
-          <w:rFonts w:eastAsia="맑은 고딕" w:ascii="맑은 고딕" w:hAnsi="맑은 고딕" w:cs="맑은 고딕"/>
+        <w:t>4. ITN 정규화:</w:t>
+      </w:r>
+      <w:r>
+        <w:rPr>
+          <w:rFonts w:ascii="Times New Roman" w:eastAsia="맑은 고딕" w:hAnsi="Times New Roman" w:cs="Calibri"/>
+          <w:b w:val="0"/>
+          <w:bCs/>
           <w:sz w:val="20"/>
-        </w:rPr>
-        <w:t>참조 음성 5초만으로 화자 목소리를 복제하는 기능을 구현. OpenAI TTS API와 호환되는 인터페이스를 제공해 외부 서비스가 코드 수정 없이 연동되도록 지원.</w:t>
-      </w:r>
-      <w:proofErr w:type="spellEnd"/>
-      <w:r>
-        <w:rPr>
-          <w:rFonts w:eastAsia="맑은 고딕" w:ascii="맑은 고딕" w:hAnsi="맑은 고딕" w:cs="맑은 고딕"/>
+          <w:szCs w:val="22"/>
+        </w:rPr>
+        <w:t xml:space="preserve"> URL과 이메일이 섞인 문장을 자연스러운 한국어 발음으로 읽어 주는 정규식 토크나이저를 직접 개발해 낭독 품질을 개선</w:t>
+      </w:r>
+      <w:proofErr w:type="spellStart"/>
+      <w:r>
+        <w:rPr>
+          <w:rFonts w:ascii="Calibri" w:eastAsia="맑은 고딕" w:hAnsi="Calibri" w:cs="Calibri"/>
+          <w:b/>
+          <w:bCs/>
           <w:sz w:val="20"/>
-        </w:rPr>
-      </w:r>
-      <w:r>
-        <w:rPr>
-          <w:rFonts w:eastAsia="맑은 고딕" w:ascii="맑은 고딕" w:hAnsi="맑은 고딕" w:cs="맑은 고딕"/>
+          <w:szCs w:val="22"/>
+        </w:rPr>
+      </w:r>
+      <w:proofErr w:type="spellEnd"/>
+      <w:r>
+        <w:rPr>
+          <w:rFonts w:ascii="Calibri" w:eastAsia="맑은 고딕" w:hAnsi="Calibri" w:cs="Calibri"/>
+          <w:b/>
+          <w:bCs/>
           <w:sz w:val="20"/>
-        </w:rPr>
-      </w:r>
-      <w:r>
-        <w:rPr>
-          <w:rFonts w:eastAsia="맑은 고딕" w:ascii="맑은 고딕" w:hAnsi="맑은 고딕" w:cs="맑은 고딕"/>
+          <w:szCs w:val="22"/>
+        </w:rPr>
+      </w:r>
+      <w:proofErr w:type="spellStart"/>
+      <w:r>
+        <w:rPr>
+          <w:rFonts w:ascii="Calibri" w:eastAsia="맑은 고딕" w:hAnsi="Calibri" w:cs="Calibri"/>
+          <w:b/>
+          <w:bCs/>
           <w:sz w:val="20"/>
-        </w:rPr>
-      </w:r>
-      <w:r>
-        <w:rPr>
-          <w:rFonts w:eastAsia="맑은 고딕" w:ascii="맑은 고딕" w:hAnsi="맑은 고딕" w:cs="맑은 고딕"/>
+          <w:szCs w:val="22"/>
+        </w:rPr>
+      </w:r>
+      <w:proofErr w:type="spellEnd"/>
+      <w:r>
+        <w:rPr>
+          <w:rFonts w:ascii="Calibri" w:eastAsia="맑은 고딕" w:hAnsi="Calibri" w:cs="Calibri"/>
+          <w:b/>
+          <w:bCs/>
           <w:sz w:val="20"/>
-        </w:rPr>
-      </w:r>
-      <w:r>
-        <w:rPr>
-          <w:rFonts w:eastAsia="맑은 고딕" w:ascii="맑은 고딕" w:hAnsi="맑은 고딕" w:cs="맑은 고딕"/>
-          <w:sz w:val="20"/>
-        </w:rPr>
-      </w:r>
-      <w:proofErr w:type="spellStart"/>
-      <w:r>
-        <w:rPr>
-          <w:rFonts w:eastAsia="맑은 고딕" w:ascii="맑은 고딕" w:hAnsi="맑은 고딕" w:cs="맑은 고딕"/>
-          <w:sz w:val="20"/>
-        </w:rPr>
-      </w:r>
-      <w:proofErr w:type="spellEnd"/>
-      <w:r>
-        <w:rPr>
-          <w:rFonts w:eastAsia="맑은 고딕" w:ascii="맑은 고딕" w:hAnsi="맑은 고딕" w:cs="맑은 고딕"/>
-          <w:sz w:val="20"/>
-        </w:rPr>
-      </w:r>
-      <w:r>
-        <w:rPr>
-          <w:rFonts w:eastAsia="맑은 고딕" w:ascii="맑은 고딕" w:hAnsi="맑은 고딕" w:cs="맑은 고딕"/>
-          <w:sz w:val="20"/>
-        </w:rPr>
-      </w:r>
-      <w:r>
-        <w:rPr>
-          <w:rFonts w:eastAsia="맑은 고딕" w:ascii="맑은 고딕" w:hAnsi="맑은 고딕" w:cs="맑은 고딕"/>
-          <w:sz w:val="20"/>
-        </w:rPr>
-      </w:r>
-      <w:r>
-        <w:rPr>
-          <w:rFonts w:eastAsia="맑은 고딕" w:ascii="맑은 고딕" w:hAnsi="맑은 고딕" w:cs="맑은 고딕"/>
-          <w:sz w:val="20"/>
-        </w:rPr>
-      </w:r>
-      <w:r>
-        <w:rPr>
-          <w:rFonts w:eastAsia="맑은 고딕" w:ascii="맑은 고딕" w:hAnsi="맑은 고딕" w:cs="맑은 고딕"/>
-          <w:sz w:val="20"/>
-        </w:rPr>
-      </w:r>
-      <w:proofErr w:type="spellStart"/>
-      <w:r>
-        <w:rPr>
-          <w:rFonts w:eastAsia="맑은 고딕" w:ascii="맑은 고딕" w:hAnsi="맑은 고딕" w:cs="맑은 고딕"/>
-          <w:sz w:val="20"/>
-        </w:rPr>
-      </w:r>
-      <w:proofErr w:type="spellEnd"/>
-      <w:r>
-        <w:rPr>
-          <w:rFonts w:eastAsia="맑은 고딕" w:ascii="맑은 고딕" w:hAnsi="맑은 고딕" w:cs="맑은 고딕"/>
-          <w:sz w:val="20"/>
-        </w:rPr>
-      </w:r>
-      <w:proofErr w:type="spellStart"/>
-      <w:r>
-        <w:rPr>
-          <w:rFonts w:eastAsia="맑은 고딕" w:ascii="맑은 고딕" w:hAnsi="맑은 고딕" w:cs="맑은 고딕"/>
-          <w:sz w:val="20"/>
-        </w:rPr>
-      </w:r>
-      <w:proofErr w:type="spellEnd"/>
-      <w:r>
-        <w:rPr>
-          <w:rFonts w:eastAsia="맑은 고딕" w:ascii="맑은 고딕" w:hAnsi="맑은 고딕" w:cs="맑은 고딕"/>
-          <w:sz w:val="20"/>
-        </w:rPr>
-      </w:r>
-      <w:r>
-        <w:rPr>
-          <w:rFonts w:eastAsia="맑은 고딕" w:ascii="맑은 고딕" w:hAnsi="맑은 고딕" w:cs="맑은 고딕"/>
-          <w:sz w:val="20"/>
-        </w:rPr>
-      </w:r>
-      <w:r>
-        <w:rPr>
-          <w:rFonts w:eastAsia="맑은 고딕" w:ascii="맑은 고딕" w:hAnsi="맑은 고딕" w:cs="맑은 고딕"/>
-          <w:sz w:val="20"/>
-        </w:rPr>
-      </w:r>
-      <w:r>
-        <w:rPr>
-          <w:rFonts w:eastAsia="맑은 고딕" w:ascii="맑은 고딕" w:hAnsi="맑은 고딕" w:cs="맑은 고딕"/>
-          <w:sz w:val="20"/>
-        </w:rPr>
-      </w:r>
-      <w:r>
-        <w:rPr>
-          <w:rFonts w:eastAsia="맑은 고딕" w:ascii="맑은 고딕" w:hAnsi="맑은 고딕" w:cs="맑은 고딕"/>
-          <w:sz w:val="20"/>
-        </w:rPr>
-      </w:r>
-      <w:r>
-        <w:rPr>
-          <w:rFonts w:eastAsia="맑은 고딕" w:ascii="맑은 고딕" w:hAnsi="맑은 고딕" w:cs="맑은 고딕"/>
-          <w:sz w:val="20"/>
-        </w:rPr>
-      </w:r>
-      <w:r>
-        <w:rPr>
-          <w:rFonts w:eastAsia="맑은 고딕" w:ascii="맑은 고딕" w:hAnsi="맑은 고딕" w:cs="맑은 고딕"/>
-          <w:sz w:val="20"/>
-        </w:rPr>
-      </w:r>
-      <w:r>
-        <w:rPr>
-          <w:rFonts w:eastAsia="맑은 고딕" w:ascii="맑은 고딕" w:hAnsi="맑은 고딕" w:cs="맑은 고딕"/>
-          <w:sz w:val="20"/>
-        </w:rPr>
-      </w:r>
-      <w:r>
-        <w:rPr>
-          <w:rFonts w:eastAsia="맑은 고딕" w:ascii="맑은 고딕" w:hAnsi="맑은 고딕" w:cs="맑은 고딕"/>
-          <w:sz w:val="20"/>
-        </w:rPr>
-      </w:r>
-      <w:r>
-        <w:rPr>
-          <w:rFonts w:eastAsia="맑은 고딕" w:ascii="맑은 고딕" w:hAnsi="맑은 고딕" w:cs="맑은 고딕"/>
-          <w:sz w:val="20"/>
-        </w:rPr>
-      </w:r>
-      <w:r>
-        <w:rPr>
-          <w:rFonts w:eastAsia="맑은 고딕" w:ascii="맑은 고딕" w:hAnsi="맑은 고딕" w:cs="맑은 고딕"/>
-          <w:sz w:val="20"/>
-        </w:rPr>
-      </w:r>
-      <w:r>
-        <w:rPr>
-          <w:rFonts w:eastAsia="맑은 고딕" w:ascii="맑은 고딕" w:hAnsi="맑은 고딕" w:cs="맑은 고딕"/>
-          <w:sz w:val="20"/>
-        </w:rPr>
-      </w:r>
-      <w:r>
-        <w:rPr>
-          <w:rFonts w:eastAsia="맑은 고딕" w:ascii="맑은 고딕" w:hAnsi="맑은 고딕" w:cs="맑은 고딕"/>
-          <w:sz w:val="20"/>
-        </w:rPr>
-      </w:r>
-      <w:proofErr w:type="spellStart"/>
-      <w:r>
-        <w:rPr>
-          <w:rFonts w:eastAsia="맑은 고딕" w:ascii="맑은 고딕" w:hAnsi="맑은 고딕" w:cs="맑은 고딕"/>
-          <w:sz w:val="20"/>
-        </w:rPr>
-      </w:r>
-      <w:proofErr w:type="spellEnd"/>
-      <w:r>
-        <w:rPr>
-          <w:rFonts w:eastAsia="맑은 고딕" w:ascii="맑은 고딕" w:hAnsi="맑은 고딕" w:cs="맑은 고딕"/>
-          <w:sz w:val="20"/>
-        </w:rPr>
-      </w:r>
-      <w:r>
-        <w:rPr>
-          <w:rFonts w:eastAsia="맑은 고딕" w:ascii="맑은 고딕" w:hAnsi="맑은 고딕" w:cs="맑은 고딕"/>
-          <w:sz w:val="20"/>
-        </w:rPr>
-      </w:r>
-      <w:r>
-        <w:rPr>
-          <w:rFonts w:eastAsia="맑은 고딕" w:ascii="맑은 고딕" w:hAnsi="맑은 고딕" w:cs="맑은 고딕"/>
-          <w:sz w:val="20"/>
-        </w:rPr>
-      </w:r>
-      <w:r>
-        <w:rPr>
-          <w:rFonts w:eastAsia="맑은 고딕" w:ascii="맑은 고딕" w:hAnsi="맑은 고딕" w:cs="맑은 고딕"/>
-          <w:sz w:val="20"/>
-        </w:rPr>
-      </w:r>
-      <w:r>
-        <w:rPr>
-          <w:rFonts w:eastAsia="맑은 고딕" w:ascii="맑은 고딕" w:hAnsi="맑은 고딕" w:cs="맑은 고딕"/>
-          <w:sz w:val="20"/>
-        </w:rPr>
-      </w:r>
-      <w:r>
-        <w:rPr>
-          <w:rFonts w:eastAsia="맑은 고딕" w:ascii="맑은 고딕" w:hAnsi="맑은 고딕" w:cs="맑은 고딕"/>
-          <w:sz w:val="20"/>
-        </w:rPr>
-      </w:r>
-      <w:r>
-        <w:rPr>
-          <w:rFonts w:eastAsia="맑은 고딕" w:ascii="맑은 고딕" w:hAnsi="맑은 고딕" w:cs="맑은 고딕"/>
-          <w:sz w:val="20"/>
-        </w:rPr>
-      </w:r>
-      <w:r>
-        <w:rPr>
-          <w:rFonts w:eastAsia="맑은 고딕" w:ascii="맑은 고딕" w:hAnsi="맑은 고딕" w:cs="맑은 고딕"/>
-          <w:sz w:val="20"/>
-        </w:rPr>
-      </w:r>
-      <w:r>
-        <w:rPr>
-          <w:rFonts w:eastAsia="맑은 고딕" w:ascii="맑은 고딕" w:hAnsi="맑은 고딕" w:cs="맑은 고딕"/>
-          <w:sz w:val="20"/>
-        </w:rPr>
-      </w:r>
-      <w:r>
-        <w:rPr>
-          <w:rFonts w:eastAsia="맑은 고딕" w:ascii="맑은 고딕" w:hAnsi="맑은 고딕" w:cs="맑은 고딕"/>
-          <w:sz w:val="20"/>
-        </w:rPr>
-      </w:r>
-      <w:r>
-        <w:rPr>
-          <w:rFonts w:eastAsia="맑은 고딕" w:ascii="맑은 고딕" w:hAnsi="맑은 고딕" w:cs="맑은 고딕"/>
-          <w:sz w:val="20"/>
-        </w:rPr>
-      </w:r>
-    </w:p>
-    <w:p>
-      <w:pPr>
-        <w:spacing w:after="40" w:line="240" w:lineRule="auto"/>
-        <w:ind w:left="360"/>
-      </w:pPr>
-      <w:r>
-        <w:rPr>
-          <w:rFonts w:ascii="맑은 고딕" w:eastAsia="맑은 고딕" w:hAnsi="맑은 고딕" w:cs="맑은 고딕"/>
-          <w:b/>
-          <w:bCs/>
-          <w:sz w:val="20"/>
-          <w:szCs w:val="22"/>
-        </w:rPr>
-        <w:t>▸ 운영 고도화</w:t>
-      </w:r>
-    </w:p>
-    <w:p>
-      <w:pPr>
-        <w:spacing w:after="40" w:line="240" w:lineRule="auto"/>
-        <w:ind w:left="360"/>
-      </w:pPr>
-      <w:proofErr w:type="spellStart"/>
-      <w:r>
-        <w:rPr>
-          <w:rFonts w:eastAsia="맑은 고딕" w:ascii="맑은 고딕" w:hAnsi="맑은 고딕" w:cs="맑은 고딕"/>
-          <w:b w:val="0"/>
-          <w:sz w:val="20"/>
-        </w:rPr>
-        <w:t>vLLM(GPU)과 Supertonic(CPU) 듀얼 엔진 구성 — 장애 시 Circuit Breaker가 CPU 엔진으로 자동 폴백. 무중단 롤링 재배포 체계를 만들고, 온보딩 가이드·운영 런북·장애복구 절차·성능 명세까지 문서화해 운영 이관이 가능한 수준으로 정비.</w:t>
-      </w:r>
-      <w:proofErr w:type="spellEnd"/>
-      <w:proofErr w:type="spellStart"/>
-      <w:proofErr w:type="spellEnd"/>
-      <w:proofErr w:type="spellStart"/>
-      <w:proofErr w:type="spellEnd"/>
-      <w:proofErr w:type="spellStart"/>
-      <w:proofErr w:type="spellEnd"/>
-      <w:proofErr w:type="spellStart"/>
-      <w:proofErr w:type="spellEnd"/>
-    </w:p>
-    <w:p>
-      <w:pPr>
-        <w:spacing w:after="40" w:line="240" w:lineRule="auto"/>
-        <w:ind w:left="360"/>
-      </w:pPr>
-      <w:r>
-        <w:rPr>
-          <w:rFonts w:ascii="맑은 고딕" w:eastAsia="맑은 고딕" w:hAnsi="맑은 고딕" w:cs="맑은 고딕"/>
-          <w:b/>
-          <w:bCs/>
-          <w:sz w:val="20"/>
-          <w:szCs w:val="22"/>
-        </w:rPr>
-        <w:t>▸ 성과 (KPI)</w:t>
-      </w:r>
-    </w:p>
-    <w:p>
-      <w:pPr>
-        <w:spacing w:after="40" w:line="240" w:lineRule="auto"/>
-        <w:ind w:left="360"/>
-      </w:pPr>
-      <w:r>
-        <w:rPr>
-          <w:rFonts w:eastAsia="맑은 고딕" w:ascii="맑은 고딕" w:hAnsi="맑은 고딕" w:cs="맑은 고딕"/>
-          <w:sz w:val="20"/>
-        </w:rPr>
-        <w:t>✓ Throughput: 0.68 → 1.41 rps (FP8·executor 최적화) → 3.09 rps (vLLM 0.24 마이그레이션, +80%)</w:t>
-      </w:r>
-    </w:p>
-    <w:p>
-      <w:pPr>
-        <w:spacing w:after="40" w:line="240" w:lineRule="auto"/>
-        <w:ind w:left="360"/>
-      </w:pPr>
-      <w:r>
-        <w:rPr>
-          <w:rFonts w:eastAsia="맑은 고딕" w:ascii="맑은 고딕" w:hAnsi="맑은 고딕" w:cs="맑은 고딕"/>
-          <w:b w:val="0"/>
-          <w:sz w:val="20"/>
-        </w:rPr>
-        <w:t>✓ 32개 언어 지원 단일 플랫폼 (vLLM 10개 + Supertonic 22개) | ITN 정규화 정확도 50.1% → 70.9% (검증셋 기준)</w:t>
-      </w:r>
-    </w:p>
-    <w:p>
-      <w:pPr>
-        <w:spacing w:after="40" w:line="240" w:lineRule="auto"/>
-        <w:ind w:left="360"/>
-      </w:pPr>
-      <w:r>
-        <w:rPr>
-          <w:rFonts w:eastAsia="맑은 고딕" w:ascii="맑은 고딕" w:hAnsi="맑은 고딕" w:cs="맑은 고딕"/>
-          <w:b w:val="0"/>
-          <w:sz w:val="20"/>
-        </w:rPr>
-        <w:t>✓ 이후 고도화(vLLM 마이그레이션·FP8): TTFB p50 70ms, 처리량 8.6 rps — 콜센터 활성 400명 규모 여유 (2026.07 실측)</w:t>
-      </w:r>
-    </w:p>
-    <w:p>
-      <w:pPr>
-        <w:spacing w:after="40" w:line="240" w:lineRule="auto"/>
-        <w:ind w:left="360"/>
-      </w:pPr>
-      <w:r>
-        <w:rPr>
-          <w:rFonts w:eastAsia="맑은 고딕" w:ascii="맑은 고딕" w:hAnsi="맑은 고딕" w:cs="맑은 고딕"/>
-          <w:b w:val="0"/>
-          <w:sz w:val="20"/>
-        </w:rPr>
-        <w:t>✓ 모델 경량화 전환(1.7B→0.6B) 후 엔진 재튜닝: burst p95 TTFB 0.5초(동시 15)·1초(동시 30), 동시 스트림 수용 한계 36 실측 (2026.07 말)</w:t>
-      </w:r>
-    </w:p>
-    <w:p>
-      <w:pPr>
-        <w:spacing w:after="40" w:line="240" w:lineRule="auto"/>
-        <w:ind w:left="360"/>
-      </w:pPr>
-      <w:r>
-        <w:rPr>
-          <w:rFonts w:ascii="맑은 고딕" w:eastAsia="맑은 고딕" w:hAnsi="맑은 고딕" w:cs="맑은 고딕"/>
-          <w:b/>
-          <w:bCs/>
-          <w:sz w:val="20"/>
-          <w:szCs w:val="22"/>
-        </w:rPr>
-        <w:t>▸ 핵심 엔지니어링 (7가지 문제 해결)</w:t>
-      </w:r>
-    </w:p>
-    <w:p>
-      <w:pPr>
-        <w:spacing w:after="40" w:line="240" w:lineRule="auto"/>
-        <w:ind w:left="360"/>
-      </w:pPr>
-      <w:r>
-        <w:rPr>
-          <w:rFonts w:ascii="맑은 고딕" w:eastAsia="맑은 고딕" w:hAnsi="맑은 고딕" w:cs="맑은 고딕"/>
-          <w:b/>
-          <w:bCs/>
-          <w:sz w:val="20"/>
-          <w:szCs w:val="22"/>
-        </w:rPr>
-        <w:t>1. 스트리밍 팝 노이즈:</w:t>
-      </w:r>
-      <w:r>
-        <w:rPr>
-          <w:rFonts w:ascii="맑은 고딕" w:eastAsia="맑은 고딕" w:hAnsi="맑은 고딕" w:cs="맑은 고딕"/>
-          <w:b w:val="0"/>
-          <w:bCs/>
-          <w:sz w:val="20"/>
-          <w:szCs w:val="22"/>
-        </w:rPr>
-        <w:t xml:space="preserve"> 재생 중 간헐적으로 '틱' 잡음이 나는 문제를 추적해, PCM 청크가 홀수 바이트로 끊겨 와 샘플 정렬이 깨지는 것을 원인으로 확인. 잔여 바이트를 다음 청크에 이어 붙이는 버퍼로 잡음을 제거</w:t>
-      </w:r>
-      <w:r>
-        <w:rPr>
-          <w:rFonts w:ascii="맑은 고딕" w:eastAsia="맑은 고딕" w:hAnsi="맑은 고딕" w:cs="맑은 고딕"/>
-          <w:sz w:val="20"/>
-          <w:szCs w:val="22"/>
-        </w:rPr>
-      </w:r>
-      <w:proofErr w:type="spellStart"/>
-      <w:r>
-        <w:rPr>
-          <w:rFonts w:ascii="맑은 고딕" w:eastAsia="맑은 고딕" w:hAnsi="맑은 고딕" w:cs="맑은 고딕"/>
-          <w:sz w:val="20"/>
-          <w:szCs w:val="22"/>
-        </w:rPr>
-      </w:r>
-      <w:proofErr w:type="spellEnd"/>
-      <w:r>
-        <w:rPr>
-          <w:rFonts w:ascii="맑은 고딕" w:eastAsia="맑은 고딕" w:hAnsi="맑은 고딕" w:cs="맑은 고딕"/>
-          <w:sz w:val="20"/>
-          <w:szCs w:val="22"/>
-        </w:rPr>
-      </w:r>
-    </w:p>
-    <w:p>
-      <w:pPr>
-        <w:spacing w:after="40" w:line="240" w:lineRule="auto"/>
-        <w:ind w:left="360"/>
-      </w:pPr>
-      <w:r>
-        <w:rPr>
-          <w:rFonts w:ascii="맑은 고딕" w:eastAsia="맑은 고딕" w:hAnsi="맑은 고딕" w:cs="맑은 고딕"/>
-          <w:b/>
-          <w:bCs/>
-          <w:sz w:val="20"/>
-          <w:szCs w:val="22"/>
-        </w:rPr>
-        <w:t>2. 스토리지 누수:</w:t>
-      </w:r>
-      <w:r>
-        <w:rPr>
-          <w:rFonts w:ascii="맑은 고딕" w:eastAsia="맑은 고딕" w:hAnsi="맑은 고딕" w:cs="맑은 고딕"/>
-          <w:b w:val="0"/>
-          <w:bCs/>
-          <w:sz w:val="20"/>
-          <w:szCs w:val="22"/>
-        </w:rPr>
-        <w:t xml:space="preserve"> 보이스를 지워도 디스크 사용량이 계속 늘어나는 문제에서 파생 해시 캐시 파일이 남는 구조를 찾아내고, 파생 파일까지 추적해 지우는 정리 로직으로 누수를 차단</w:t>
-      </w:r>
-      <w:r>
-        <w:rPr>
-          <w:rFonts w:ascii="맑은 고딕" w:eastAsia="맑은 고딕" w:hAnsi="맑은 고딕" w:cs="맑은 고딕"/>
-          <w:sz w:val="20"/>
-          <w:szCs w:val="22"/>
-        </w:rPr>
-      </w:r>
-      <w:proofErr w:type="spellStart"/>
-      <w:r>
-        <w:rPr>
-          <w:rFonts w:ascii="맑은 고딕" w:eastAsia="맑은 고딕" w:hAnsi="맑은 고딕" w:cs="맑은 고딕"/>
-          <w:sz w:val="20"/>
-          <w:szCs w:val="22"/>
-        </w:rPr>
-      </w:r>
-      <w:proofErr w:type="spellEnd"/>
-      <w:r>
-        <w:rPr>
-          <w:rFonts w:ascii="맑은 고딕" w:eastAsia="맑은 고딕" w:hAnsi="맑은 고딕" w:cs="맑은 고딕"/>
-          <w:sz w:val="20"/>
-          <w:szCs w:val="22"/>
-        </w:rPr>
-      </w:r>
-    </w:p>
-    <w:p>
-      <w:pPr>
-        <w:spacing w:after="40" w:line="240" w:lineRule="auto"/>
-        <w:ind w:left="360"/>
-      </w:pPr>
-      <w:r>
-        <w:rPr>
-          <w:rFonts w:ascii="맑은 고딕" w:eastAsia="맑은 고딕" w:hAnsi="맑은 고딕" w:cs="맑은 고딕"/>
-          <w:b/>
-          <w:bCs/>
-          <w:sz w:val="20"/>
-          <w:szCs w:val="22"/>
-        </w:rPr>
-        <w:t>3. 세션 보안:</w:t>
-      </w:r>
-      <w:r>
-        <w:rPr>
-          <w:rFonts w:ascii="맑은 고딕" w:eastAsia="맑은 고딕" w:hAnsi="맑은 고딕" w:cs="맑은 고딕"/>
-          <w:b w:val="0"/>
-          <w:bCs/>
-          <w:sz w:val="20"/>
-          <w:szCs w:val="22"/>
-        </w:rPr>
-        <w:t xml:space="preserve"> 비밀번호를 바꿔도 이미 발급된 토큰으로 웹소켓이 열리는 허점을 발견하고, 토큰 발급 시점과 비밀번호 변경 시점을 대조해 변경 이전 토큰을 전부 무효화</w:t>
-      </w:r>
-      <w:proofErr w:type="spellStart"/>
-      <w:r>
-        <w:rPr>
-          <w:rFonts w:ascii="맑은 고딕" w:eastAsia="맑은 고딕" w:hAnsi="맑은 고딕" w:cs="맑은 고딕"/>
-          <w:b/>
-          <w:bCs/>
-          <w:sz w:val="20"/>
-          <w:szCs w:val="22"/>
-        </w:rPr>
-      </w:r>
-      <w:proofErr w:type="spellEnd"/>
-      <w:r>
-        <w:rPr>
-          <w:rFonts w:ascii="맑은 고딕" w:eastAsia="맑은 고딕" w:hAnsi="맑은 고딕" w:cs="맑은 고딕"/>
-          <w:b/>
-          <w:bCs/>
-          <w:sz w:val="20"/>
-          <w:szCs w:val="22"/>
-        </w:rPr>
-      </w:r>
-      <w:r>
-        <w:rPr>
-          <w:rFonts w:ascii="맑은 고딕" w:eastAsia="맑은 고딕" w:hAnsi="맑은 고딕" w:cs="맑은 고딕"/>
-          <w:sz w:val="20"/>
-          <w:szCs w:val="22"/>
-        </w:rPr>
-      </w:r>
-      <w:proofErr w:type="spellStart"/>
-      <w:r>
-        <w:rPr>
-          <w:rFonts w:ascii="맑은 고딕" w:eastAsia="맑은 고딕" w:hAnsi="맑은 고딕" w:cs="맑은 고딕"/>
-          <w:sz w:val="20"/>
-          <w:szCs w:val="22"/>
-        </w:rPr>
-      </w:r>
-      <w:proofErr w:type="spellEnd"/>
-      <w:r>
-        <w:rPr>
-          <w:rFonts w:ascii="맑은 고딕" w:eastAsia="맑은 고딕" w:hAnsi="맑은 고딕" w:cs="맑은 고딕"/>
-          <w:sz w:val="20"/>
-          <w:szCs w:val="22"/>
-        </w:rPr>
-      </w:r>
-    </w:p>
-    <w:p>
-      <w:pPr>
-        <w:spacing w:after="40" w:line="240" w:lineRule="auto"/>
-        <w:ind w:left="360"/>
-      </w:pPr>
-      <w:r>
-        <w:rPr>
-          <w:rFonts w:ascii="맑은 고딕" w:eastAsia="맑은 고딕" w:hAnsi="맑은 고딕" w:cs="맑은 고딕"/>
-          <w:b/>
-          <w:bCs/>
-          <w:sz w:val="20"/>
-          <w:szCs w:val="22"/>
-        </w:rPr>
-        <w:t>4. ITN 정규화:</w:t>
-      </w:r>
-      <w:r>
-        <w:rPr>
-          <w:rFonts w:ascii="맑은 고딕" w:eastAsia="맑은 고딕" w:hAnsi="맑은 고딕" w:cs="맑은 고딕"/>
-          <w:b w:val="0"/>
-          <w:bCs/>
-          <w:sz w:val="20"/>
-          <w:szCs w:val="22"/>
-        </w:rPr>
-        <w:t xml:space="preserve"> URL과 이메일이 섞인 문장을 자연스러운 한국어 발음으로 읽어 주는 정규식 토크나이저를 직접 개발해 낭독 품질을 개선</w:t>
-      </w:r>
-      <w:proofErr w:type="spellStart"/>
-      <w:r>
-        <w:rPr>
-          <w:rFonts w:ascii="맑은 고딕" w:eastAsia="맑은 고딕" w:hAnsi="맑은 고딕" w:cs="맑은 고딕"/>
-          <w:b/>
-          <w:bCs/>
-          <w:sz w:val="20"/>
-          <w:szCs w:val="22"/>
-        </w:rPr>
-      </w:r>
-      <w:proofErr w:type="spellEnd"/>
-      <w:r>
-        <w:rPr>
-          <w:rFonts w:ascii="맑은 고딕" w:eastAsia="맑은 고딕" w:hAnsi="맑은 고딕" w:cs="맑은 고딕"/>
-          <w:b/>
-          <w:bCs/>
-          <w:sz w:val="20"/>
-          <w:szCs w:val="22"/>
-        </w:rPr>
-      </w:r>
-      <w:proofErr w:type="spellStart"/>
-      <w:r>
-        <w:rPr>
-          <w:rFonts w:ascii="맑은 고딕" w:eastAsia="맑은 고딕" w:hAnsi="맑은 고딕" w:cs="맑은 고딕"/>
-          <w:b/>
-          <w:bCs/>
-          <w:sz w:val="20"/>
-          <w:szCs w:val="22"/>
-        </w:rPr>
-      </w:r>
-      <w:proofErr w:type="spellEnd"/>
-      <w:r>
-        <w:rPr>
-          <w:rFonts w:ascii="맑은 고딕" w:eastAsia="맑은 고딕" w:hAnsi="맑은 고딕" w:cs="맑은 고딕"/>
-          <w:b/>
-          <w:bCs/>
-          <w:sz w:val="20"/>
-          <w:szCs w:val="22"/>
-        </w:rPr>
-      </w:r>
-      <w:r>
-        <w:rPr>
-          <w:rFonts w:ascii="맑은 고딕" w:eastAsia="맑은 고딕" w:hAnsi="맑은 고딕" w:cs="맑은 고딕"/>
+          <w:szCs w:val="22"/>
+        </w:rPr>
+      </w:r>
+      <w:r>
+        <w:rPr>
+          <w:rFonts w:ascii="Calibri" w:eastAsia="맑은 고딕" w:hAnsi="Calibri" w:cs="Calibri"/>
           <w:sz w:val="20"/>
           <w:szCs w:val="22"/>
         </w:rPr>
@@ -947,7 +822,7 @@
       </w:pPr>
       <w:r>
         <w:rPr>
-          <w:rFonts w:ascii="맑은 고딕" w:eastAsia="맑은 고딕" w:hAnsi="맑은 고딕" w:cs="맑은 고딕"/>
+          <w:rFonts w:ascii="Calibri" w:eastAsia="맑은 고딕" w:hAnsi="Calibri" w:cs="Calibri"/>
           <w:b/>
           <w:bCs/>
           <w:sz w:val="20"/>
@@ -957,7 +832,7 @@
       </w:r>
       <w:r>
         <w:rPr>
-          <w:rFonts w:ascii="맑은 고딕" w:eastAsia="맑은 고딕" w:hAnsi="맑은 고딕" w:cs="맑은 고딕"/>
+          <w:rFonts w:ascii="Times New Roman" w:eastAsia="맑은 고딕" w:hAnsi="Times New Roman" w:cs="Calibri"/>
           <w:b w:val="0"/>
           <w:bCs/>
           <w:sz w:val="20"/>
@@ -975,7 +850,7 @@
       </w:pPr>
       <w:r>
         <w:rPr>
-          <w:rFonts w:ascii="맑은 고딕" w:eastAsia="맑은 고딕" w:hAnsi="맑은 고딕" w:cs="맑은 고딕"/>
+          <w:rFonts w:ascii="Calibri" w:eastAsia="맑은 고딕" w:hAnsi="Calibri" w:cs="Calibri"/>
           <w:b/>
           <w:bCs/>
           <w:sz w:val="20"/>
@@ -985,7 +860,7 @@
       </w:r>
       <w:r>
         <w:rPr>
-          <w:rFonts w:ascii="맑은 고딕" w:eastAsia="맑은 고딕" w:hAnsi="맑은 고딕" w:cs="맑은 고딕"/>
+          <w:rFonts w:ascii="Times New Roman" w:eastAsia="맑은 고딕" w:hAnsi="Times New Roman" w:cs="Calibri"/>
           <w:b w:val="0"/>
           <w:bCs/>
           <w:sz w:val="20"/>
@@ -1003,7 +878,7 @@
       </w:pPr>
       <w:r>
         <w:rPr>
-          <w:rFonts w:ascii="맑은 고딕" w:eastAsia="맑은 고딕" w:hAnsi="맑은 고딕" w:cs="맑은 고딕"/>
+          <w:rFonts w:ascii="Calibri" w:eastAsia="맑은 고딕" w:hAnsi="Calibri" w:cs="Calibri"/>
           <w:b/>
           <w:bCs/>
           <w:sz w:val="20"/>
@@ -1013,7 +888,7 @@
       </w:r>
       <w:r>
         <w:rPr>
-          <w:rFonts w:ascii="맑은 고딕" w:eastAsia="맑은 고딕" w:hAnsi="맑은 고딕" w:cs="맑은 고딕"/>
+          <w:rFonts w:ascii="Times New Roman" w:eastAsia="맑은 고딕" w:hAnsi="Times New Roman" w:cs="Calibri"/>
           <w:b w:val="0"/>
           <w:bCs/>
           <w:sz w:val="20"/>
@@ -1031,10 +906,10 @@
       </w:pPr>
       <w:r>
         <w:rPr>
-          <w:rFonts w:ascii="맑은 고딕" w:eastAsia="맑은 고딕" w:hAnsi="맑은 고딕" w:cs="맑은 고딕"/>
-          <w:b/>
-          <w:bCs/>
-          <w:sz w:val="20"/>
+          <w:rFonts w:ascii="Calibri" w:eastAsia="맑은 고딕" w:hAnsi="Calibri" w:cs="Calibri"/>
+          <w:b/>
+          <w:bCs/>
+          <w:sz w:val="22"/>
           <w:szCs w:val="22"/>
         </w:rPr>
         <w:t>▸ 기술 스택</w:t>
@@ -1047,47 +922,42 @@
       </w:pPr>
       <w:r>
         <w:rPr>
-          <w:rFonts w:eastAsia="맑은 고딕" w:ascii="맑은 고딕" w:hAnsi="맑은 고딕" w:cs="맑은 고딕"/>
-          <w:sz w:val="20"/>
+          <w:rFonts w:eastAsia="맑은 고딕"/>
         </w:rPr>
         <w:t>Python 3.12, FastAPI, WebSocket, vLLM-Omni, Redis (Pub/Sub, Distributed Lock, TTL Cache), React 18, TypeScript, CUDA Optimization, FP8 Quantization</w:t>
       </w:r>
       <w:proofErr w:type="spellStart"/>
       <w:r>
         <w:rPr>
-          <w:rFonts w:eastAsia="맑은 고딕" w:ascii="맑은 고딕" w:hAnsi="맑은 고딕" w:cs="맑은 고딕"/>
-          <w:sz w:val="20"/>
-        </w:rPr>
-      </w:r>
-      <w:proofErr w:type="spellEnd"/>
-      <w:r>
-        <w:rPr>
-          <w:rFonts w:eastAsia="맑은 고딕" w:ascii="맑은 고딕" w:hAnsi="맑은 고딕" w:cs="맑은 고딕"/>
-          <w:sz w:val="20"/>
-        </w:rPr>
-      </w:r>
-      <w:proofErr w:type="spellStart"/>
-      <w:r>
-        <w:rPr>
-          <w:rFonts w:eastAsia="맑은 고딕" w:ascii="맑은 고딕" w:hAnsi="맑은 고딕" w:cs="맑은 고딕"/>
-          <w:sz w:val="20"/>
-        </w:rPr>
-      </w:r>
-      <w:proofErr w:type="spellEnd"/>
-      <w:r>
-        <w:rPr>
-          <w:rFonts w:eastAsia="맑은 고딕" w:ascii="맑은 고딕" w:hAnsi="맑은 고딕" w:cs="맑은 고딕"/>
-          <w:sz w:val="20"/>
-        </w:rPr>
-      </w:r>
-    </w:p>
-    <w:p>
-      <w:pPr>
-        <w:spacing w:after="40" w:line="240" w:lineRule="auto"/>
-      </w:pPr>
-      <w:r>
-        <w:rPr>
-          <w:rFonts w:ascii="맑은 고딕" w:eastAsia="맑은 고딕" w:hAnsi="맑은 고딕" w:cs="맑은 고딕"/>
+          <w:rFonts w:eastAsia="맑은 고딕"/>
+        </w:rPr>
+      </w:r>
+      <w:proofErr w:type="spellEnd"/>
+      <w:r>
+        <w:rPr>
+          <w:rFonts w:eastAsia="맑은 고딕"/>
+        </w:rPr>
+      </w:r>
+      <w:proofErr w:type="spellStart"/>
+      <w:r>
+        <w:rPr>
+          <w:rFonts w:eastAsia="맑은 고딕"/>
+        </w:rPr>
+      </w:r>
+      <w:proofErr w:type="spellEnd"/>
+      <w:r>
+        <w:rPr>
+          <w:rFonts w:eastAsia="맑은 고딕"/>
+        </w:rPr>
+      </w:r>
+    </w:p>
+    <w:p>
+      <w:pPr>
+        <w:spacing w:after="40" w:line="240" w:lineRule="auto"/>
+      </w:pPr>
+      <w:r>
+        <w:rPr>
+          <w:rFonts w:ascii="Calibri" w:eastAsia="맑은 고딕" w:hAnsi="Calibri" w:cs="Calibri"/>
           <w:b/>
           <w:bCs/>
           <w:color w:val="333333"/>
@@ -1103,9 +973,8 @@
       </w:pPr>
       <w:r>
         <w:rPr>
-          <w:rFonts w:eastAsia="맑은 고딕" w:ascii="맑은 고딕" w:hAnsi="맑은 고딕" w:cs="맑은 고딕"/>
-          <w:b w:val="0"/>
-          <w:sz w:val="20"/>
+          <w:rFonts w:eastAsia="맑은 고딕"/>
+          <w:b w:val="0"/>
         </w:rPr>
         <w:t>• 배경: 기존 TTS(ZipVoice 기반)의 응답 지연(TTFB 2.3초)이 심각해 실시간 상담에 부적합했음</w:t>
       </w:r>
@@ -1116,9 +985,8 @@
       </w:pPr>
       <w:r>
         <w:rPr>
-          <w:rFonts w:eastAsia="맑은 고딕" w:ascii="맑은 고딕" w:hAnsi="맑은 고딕" w:cs="맑은 고딕"/>
-          <w:b w:val="0"/>
-          <w:sz w:val="20"/>
+          <w:rFonts w:eastAsia="맑은 고딕"/>
+          <w:b w:val="0"/>
         </w:rPr>
         <w:t>• 기존 담당자에게 인수인계 받아 스트리밍 API 리팩토링을 담당 (기여도 100%)</w:t>
       </w:r>
@@ -1129,9 +997,8 @@
       </w:pPr>
       <w:r>
         <w:rPr>
-          <w:rFonts w:eastAsia="맑은 고딕" w:ascii="맑은 고딕" w:hAnsi="맑은 고딕" w:cs="맑은 고딕"/>
-          <w:b w:val="0"/>
-          <w:sz w:val="20"/>
+          <w:rFonts w:eastAsia="맑은 고딕"/>
+          <w:b w:val="0"/>
         </w:rPr>
         <w:t>• 브라우저 decodeAudioData()가 두 번째 청크부터 실패하는 고객 이슈를 추적 — 엔진이 첫 청크에만 RIFF WAV 헤더를 포함하는 것이 원인. 모든 SSE 청크에 독립 WAV 헤더를 부착해 해결</w:t>
       </w:r>
@@ -1142,9 +1009,8 @@
       </w:pPr>
       <w:r>
         <w:rPr>
-          <w:rFonts w:eastAsia="맑은 고딕" w:ascii="맑은 고딕" w:hAnsi="맑은 고딕" w:cs="맑은 고딕"/>
-          <w:b w:val="0"/>
-          <w:sz w:val="20"/>
+          <w:rFonts w:eastAsia="맑은 고딕"/>
+          <w:b w:val="0"/>
         </w:rPr>
         <w:t>• 전체 합성 완료 후 분할 전송하던 기존 구조의 TTFB 한계를 확인하고, gRPC server streaming 기반 실시간 엔드포인트를 신설 — 문장 단위 합성 즉시 전송. API v2 표준화(v1 하위 호환)·Swagger 문서 정비·비교 데모 페이지 제공</w:t>
       </w:r>
@@ -1155,9 +1021,8 @@
       </w:pPr>
       <w:r>
         <w:rPr>
-          <w:rFonts w:eastAsia="맑은 고딕" w:ascii="맑은 고딕" w:hAnsi="맑은 고딕" w:cs="맑은 고딕"/>
-          <w:b w:val="0"/>
-          <w:sz w:val="20"/>
+          <w:rFonts w:eastAsia="맑은 고딕"/>
+          <w:b w:val="0"/>
         </w:rPr>
         <w:t>• 성과: TTFB 2292ms → 334ms (85.4% 단축, 6.85배 개선 — 측정 로그 기록)</w:t>
       </w:r>
@@ -1168,9 +1033,8 @@
       </w:pPr>
       <w:r>
         <w:rPr>
-          <w:rFonts w:eastAsia="맑은 고딕" w:ascii="맑은 고딕" w:hAnsi="맑은 고딕" w:cs="맑은 고딕"/>
-          <w:b w:val="0"/>
-          <w:sz w:val="20"/>
+          <w:rFonts w:eastAsia="맑은 고딕"/>
+          <w:b w:val="0"/>
         </w:rPr>
         <w:t>• 기술: Python, FastAPI, Streaming API, ZipVoice</w:t>
       </w:r>
@@ -1181,7 +1045,7 @@
       </w:pPr>
       <w:r>
         <w:rPr>
-          <w:rFonts w:ascii="맑은 고딕" w:eastAsia="맑은 고딕" w:hAnsi="맑은 고딕" w:cs="맑은 고딕"/>
+          <w:rFonts w:ascii="Calibri" w:eastAsia="맑은 고딕" w:hAnsi="Calibri" w:cs="Calibri"/>
           <w:b/>
           <w:bCs/>
           <w:color w:val="333333"/>
@@ -1197,9 +1061,8 @@
       </w:pPr>
       <w:r>
         <w:rPr>
-          <w:rFonts w:eastAsia="맑은 고딕" w:ascii="맑은 고딕" w:hAnsi="맑은 고딕" w:cs="맑은 고딕"/>
-          <w:b w:val="0"/>
-          <w:sz w:val="20"/>
+          <w:rFonts w:eastAsia="맑은 고딕"/>
+          <w:b w:val="0"/>
         </w:rPr>
         <w:t>• 배경: AIG 상담센터의 대량 상담 전화를 실시간으로 처리해야 했으나 기존 시스템은 동시 채널이 부족했음</w:t>
       </w:r>
@@ -1211,8 +1074,7 @@
       </w:pPr>
       <w:r>
         <w:rPr>
-          <w:rFonts w:eastAsia="맑은 고딕" w:ascii="맑은 고딕" w:hAnsi="맑은 고딕" w:cs="맑은 고딕"/>
-          <w:sz w:val="20"/>
+          <w:rFonts w:eastAsia="맑은 고딕"/>
         </w:rPr>
         <w:t>• 팀 내 배포·서빙 담당으로 Faster Whisper 기반 STT 엔진을 맡아, 파일 배치 처리와 실시간 스트리밍을 모두 지원하도록 운영 구조를 정비</w:t>
       </w:r>
@@ -1224,9 +1086,8 @@
       </w:pPr>
       <w:r>
         <w:rPr>
-          <w:rFonts w:eastAsia="맑은 고딕" w:ascii="맑은 고딕" w:hAnsi="맑은 고딕" w:cs="맑은 고딕"/>
-          <w:b w:val="0"/>
-          <w:sz w:val="20"/>
+          <w:rFonts w:eastAsia="맑은 고딕"/>
+          <w:b w:val="0"/>
         </w:rPr>
         <w:t>• Triton Python 백엔드로 파일 기반(화자 분리 결합)과 실시간 스트리밍 두 추론 모델을 구성하고, HTTP와 gRPC 인터페이스를 모두 제공</w:t>
       </w:r>
@@ -1238,9 +1099,8 @@
       </w:pPr>
       <w:r>
         <w:rPr>
-          <w:rFonts w:eastAsia="맑은 고딕" w:ascii="맑은 고딕" w:hAnsi="맑은 고딕" w:cs="맑은 고딕"/>
-          <w:b w:val="0"/>
-          <w:sz w:val="20"/>
+          <w:rFonts w:eastAsia="맑은 고딕"/>
+          <w:b w:val="0"/>
         </w:rPr>
         <w:t>• 화자 분리 결과를 STT에 결합해 화자별 전사를 생성 — 화자 구간을 추론 파라미터(clip timestamps)로 전달해 화자마다 정확한 전사를 얻는 구조를 구현</w:t>
       </w:r>
@@ -1252,9 +1112,8 @@
       </w:pPr>
       <w:r>
         <w:rPr>
-          <w:rFonts w:eastAsia="맑은 고딕" w:ascii="맑은 고딕" w:hAnsi="맑은 고딕" w:cs="맑은 고딕"/>
-          <w:b w:val="0"/>
-          <w:sz w:val="20"/>
+          <w:rFonts w:eastAsia="맑은 고딕"/>
+          <w:b w:val="0"/>
         </w:rPr>
         <w:t>• 전처리·후처리·서비스 계층으로 코드를 모듈화하고, 로그 로테이션·아카이빙 체계와 Docker 구성 정비, 컨테이너 자동 재시작 정책으로 안정성을 보강</w:t>
       </w:r>
@@ -1266,9 +1125,8 @@
       </w:pPr>
       <w:r>
         <w:rPr>
-          <w:rFonts w:eastAsia="맑은 고딕" w:ascii="맑은 고딕" w:hAnsi="맑은 고딕" w:cs="맑은 고딕"/>
-          <w:b w:val="0"/>
-          <w:sz w:val="20"/>
+          <w:rFonts w:eastAsia="맑은 고딕"/>
+          <w:b w:val="0"/>
         </w:rPr>
         <w:t>• 사내 회의록 기능에도 STT를 탑재 — Whisper 계열 모델별 성능을 조사해 최적 파라미터를 찾고, 파일 기반과 스트리밍 기반 처리를 모두 구현</w:t>
       </w:r>
@@ -1280,19 +1138,19 @@
       </w:pPr>
       <w:r>
         <w:rPr>
-          <w:rFonts w:eastAsia="맑은 고딕" w:ascii="맑은 고딕" w:hAnsi="맑은 고딕" w:cs="맑은 고딕"/>
-          <w:b w:val="0"/>
-          <w:bCs/>
-          <w:sz w:val="20"/>
+          <w:rFonts w:eastAsia="맑은 고딕"/>
+          <w:b w:val="0"/>
+          <w:bCs/>
+          <w:sz w:val="22"/>
           <w:szCs w:val="22"/>
         </w:rPr>
         <w:t>• 기술: Triton Inference Server(Python Backend), Faster Whisper, Streaming ASR, gRPC/HTTP, Docker</w:t>
       </w:r>
       <w:r>
         <w:rPr>
-          <w:rFonts w:ascii="맑은 고딕" w:eastAsia="맑은 고딕" w:hAnsi="맑은 고딕" w:cs="맑은 고딕"/>
-          <w:b w:val="0"/>
-          <w:sz w:val="20"/>
+          <w:rFonts w:ascii="Calibri" w:eastAsia="맑은 고딕" w:hAnsi="Calibri" w:cs="Calibri"/>
+          <w:b w:val="0"/>
+          <w:sz w:val="22"/>
           <w:szCs w:val="22"/>
         </w:rPr>
       </w:r>
@@ -1304,8 +1162,7 @@
       </w:pPr>
       <w:r>
         <w:rPr>
-          <w:rFonts w:eastAsia="맑은 고딕" w:ascii="맑은 고딕" w:hAnsi="맑은 고딕" w:cs="맑은 고딕"/>
-          <w:sz w:val="20"/>
+          <w:rFonts w:eastAsia="맑은 고딕"/>
         </w:rPr>
         <w:t>• Triton 기반 추론 환경을 구성·개선하고, 고객사 AIG의 요구사항 4건을 해결</w:t>
       </w:r>
@@ -1316,7 +1173,7 @@
       </w:pPr>
       <w:r>
         <w:rPr>
-          <w:rFonts w:ascii="맑은 고딕" w:eastAsia="맑은 고딕" w:hAnsi="맑은 고딕" w:cs="맑은 고딕"/>
+          <w:rFonts w:ascii="Calibri" w:eastAsia="맑은 고딕" w:hAnsi="Calibri" w:cs="Calibri"/>
           <w:b/>
           <w:bCs/>
           <w:color w:val="333333"/>
@@ -1333,8 +1190,7 @@
       </w:pPr>
       <w:r>
         <w:rPr>
-          <w:rFonts w:eastAsia="맑은 고딕" w:ascii="맑은 고딕" w:hAnsi="맑은 고딕" w:cs="맑은 고딕"/>
-          <w:sz w:val="20"/>
+          <w:rFonts w:eastAsia="맑은 고딕"/>
         </w:rPr>
         <w:t>• 배경: 상담 품질을 분석하려면 상담사와 고객의 발화부터 구분해야 했음</w:t>
       </w:r>
@@ -1346,8 +1202,7 @@
       </w:pPr>
       <w:r>
         <w:rPr>
-          <w:rFonts w:eastAsia="맑은 고딕" w:ascii="맑은 고딕" w:hAnsi="맑은 고딕" w:cs="맑은 고딕"/>
-          <w:sz w:val="20"/>
+          <w:rFonts w:eastAsia="맑은 고딕"/>
         </w:rPr>
         <w:t>• Pyannote 사전 학습 모델을 공개 화자분할 데이터로 파인튜닝해 DER로 검증하고, STT와 연동해 상담사와 고객이 구분된 전사 결과가 나오는 파이프라인을 구성</w:t>
       </w:r>
@@ -1359,8 +1214,7 @@
       </w:pPr>
       <w:r>
         <w:rPr>
-          <w:rFonts w:eastAsia="맑은 고딕" w:ascii="맑은 고딕" w:hAnsi="맑은 고딕" w:cs="맑은 고딕"/>
-          <w:sz w:val="20"/>
+          <w:rFonts w:eastAsia="맑은 고딕"/>
         </w:rPr>
         <w:t>• 기술: Pyannote, PyTorch, Audio Processing</w:t>
       </w:r>
@@ -1374,10 +1228,6 @@
         <w:spacing w:before="160" w:after="80"/>
       </w:pPr>
       <w:r>
-        <w:rPr>
-          <w:rFonts w:ascii="맑은 고딕" w:hAnsi="맑은 고딕" w:eastAsia="맑은 고딕" w:cs="맑은 고딕"/>
-          <w:sz w:val="26"/>
-        </w:rPr>
         <w:t>인피닉 (INFINIIC)</w:t>
       </w:r>
     </w:p>
@@ -1387,8 +1237,7 @@
       </w:pPr>
       <w:r>
         <w:rPr>
-          <w:rFonts w:eastAsia="맑은 고딕" w:ascii="맑은 고딕" w:hAnsi="맑은 고딕" w:cs="맑은 고딕"/>
-          <w:sz w:val="20"/>
+          <w:rFonts w:eastAsia="맑은 고딕"/>
         </w:rPr>
         <w:t>AI Engineer/MLOps Engineer  Aug 2022 – Apr 2025</w:t>
       </w:r>
@@ -1399,7 +1248,7 @@
       </w:pPr>
       <w:r>
         <w:rPr>
-          <w:rFonts w:ascii="맑은 고딕" w:eastAsia="맑은 고딕" w:hAnsi="맑은 고딕" w:cs="맑은 고딕"/>
+          <w:rFonts w:ascii="Calibri" w:eastAsia="맑은 고딕" w:hAnsi="Calibri" w:cs="Calibri"/>
           <w:b/>
           <w:bCs/>
           <w:color w:val="333333"/>
@@ -1411,7 +1260,7 @@
       <w:proofErr w:type="spellStart"/>
       <w:r>
         <w:rPr>
-          <w:rFonts w:ascii="맑은 고딕" w:eastAsia="맑은 고딕" w:hAnsi="맑은 고딕" w:cs="맑은 고딕"/>
+          <w:rFonts w:ascii="Calibri" w:eastAsia="맑은 고딕" w:hAnsi="Calibri" w:cs="Calibri"/>
           <w:b/>
           <w:bCs/>
           <w:color w:val="333333"/>
@@ -1422,7 +1271,7 @@
       <w:proofErr w:type="spellEnd"/>
       <w:r>
         <w:rPr>
-          <w:rFonts w:ascii="맑은 고딕" w:eastAsia="맑은 고딕" w:hAnsi="맑은 고딕" w:cs="맑은 고딕"/>
+          <w:rFonts w:ascii="Calibri" w:eastAsia="맑은 고딕" w:hAnsi="Calibri" w:cs="Calibri"/>
           <w:b/>
           <w:bCs/>
           <w:color w:val="333333"/>
@@ -1437,9 +1286,8 @@
       </w:pPr>
       <w:r>
         <w:rPr>
-          <w:rFonts w:eastAsia="맑은 고딕" w:ascii="맑은 고딕" w:hAnsi="맑은 고딕" w:cs="맑은 고딕"/>
-          <w:b w:val="0"/>
-          <w:sz w:val="20"/>
+          <w:rFonts w:eastAsia="맑은 고딕"/>
+          <w:b w:val="0"/>
         </w:rPr>
         <w:t>• 배경: 20개가 넘는 AI 서비스를 수동으로 배포하느라 배포 한 번에 수 시간이 걸렸음</w:t>
       </w:r>
@@ -1451,8 +1299,7 @@
       </w:pPr>
       <w:r>
         <w:rPr>
-          <w:rFonts w:eastAsia="맑은 고딕" w:ascii="맑은 고딕" w:hAnsi="맑은 고딕" w:cs="맑은 고딕"/>
-          <w:sz w:val="20"/>
+          <w:rFonts w:eastAsia="맑은 고딕"/>
         </w:rPr>
         <w:t>• 사내 최초 Kubernetes 도입 프로젝트를 맡아, 기존 ML 서비스 운영 환경 분석부터 온프레미스 클러스터 아키텍처 설계, 배포, 운영까지 전 과정을 수행</w:t>
       </w:r>
@@ -1464,9 +1311,8 @@
       </w:pPr>
       <w:r>
         <w:rPr>
-          <w:rFonts w:eastAsia="맑은 고딕" w:ascii="맑은 고딕" w:hAnsi="맑은 고딕" w:cs="맑은 고딕"/>
-          <w:b w:val="0"/>
-          <w:sz w:val="20"/>
+          <w:rFonts w:eastAsia="맑은 고딕"/>
+          <w:b w:val="0"/>
         </w:rPr>
         <w:t>• 서비스들을 Docker로 컨테이너화하고 Kubernetes Deployment와 StatefulSet으로 올려, VM 수동 배포를 컨테이너 기반 자동 배포 체계로 전환</w:t>
       </w:r>
@@ -1478,9 +1324,8 @@
       </w:pPr>
       <w:r>
         <w:rPr>
-          <w:rFonts w:eastAsia="맑은 고딕" w:ascii="맑은 고딕" w:hAnsi="맑은 고딕" w:cs="맑은 고딕"/>
-          <w:b w:val="0"/>
-          <w:sz w:val="20"/>
+          <w:rFonts w:eastAsia="맑은 고딕"/>
+          <w:b w:val="0"/>
         </w:rPr>
         <w:t>• 온프레미스에는 클라우드식 로드밸런서가 없어 MetalLB로 LoadBalancer를 직접 구성하고, Nginx Ingress Controller로 외부 요청 라우팅과 서비스 노출 구조를 설계. 영속 데이터는 NFS 기반 PV/PVC로 구성</w:t>
       </w:r>
@@ -1492,34 +1337,34 @@
       </w:pPr>
       <w:r>
         <w:rPr>
-          <w:rFonts w:eastAsia="맑은 고딕" w:ascii="맑은 고딕" w:hAnsi="맑은 고딕" w:cs="맑은 고딕"/>
-          <w:b/>
-          <w:bCs/>
-          <w:sz w:val="20"/>
+          <w:rFonts w:eastAsia="맑은 고딕"/>
+          <w:b/>
+          <w:bCs/>
+          <w:sz w:val="22"/>
           <w:szCs w:val="22"/>
         </w:rPr>
         <w:t>• 기술: Kubernetes, Docker, Helm, GitLab CI/CD, Jenkins, Argo Workflow, ArgoCD, Harbor, MetalLB, Nginx Ingress, NFS(PV/PVC), Prometheus/Grafana/AlertManager, Loki/ELK</w:t>
       </w:r>
       <w:r>
         <w:rPr>
-          <w:rFonts w:ascii="맑은 고딕" w:eastAsia="맑은 고딕" w:hAnsi="맑은 고딕" w:cs="맑은 고딕"/>
-          <w:sz w:val="20"/>
-          <w:szCs w:val="22"/>
-        </w:rPr>
-      </w:r>
-      <w:proofErr w:type="spellStart"/>
-      <w:r>
-        <w:rPr>
-          <w:rFonts w:ascii="맑은 고딕" w:eastAsia="맑은 고딕" w:hAnsi="맑은 고딕" w:cs="맑은 고딕"/>
-          <w:sz w:val="20"/>
-          <w:szCs w:val="22"/>
-        </w:rPr>
-      </w:r>
-      <w:proofErr w:type="spellEnd"/>
-      <w:r>
-        <w:rPr>
-          <w:rFonts w:ascii="맑은 고딕" w:eastAsia="맑은 고딕" w:hAnsi="맑은 고딕" w:cs="맑은 고딕"/>
-          <w:sz w:val="20"/>
+          <w:rFonts w:ascii="Calibri" w:eastAsia="맑은 고딕" w:hAnsi="Calibri" w:cs="Calibri"/>
+          <w:sz w:val="22"/>
+          <w:szCs w:val="22"/>
+        </w:rPr>
+      </w:r>
+      <w:proofErr w:type="spellStart"/>
+      <w:r>
+        <w:rPr>
+          <w:rFonts w:ascii="Calibri" w:eastAsia="맑은 고딕" w:hAnsi="Calibri" w:cs="Calibri"/>
+          <w:sz w:val="22"/>
+          <w:szCs w:val="22"/>
+        </w:rPr>
+      </w:r>
+      <w:proofErr w:type="spellEnd"/>
+      <w:r>
+        <w:rPr>
+          <w:rFonts w:ascii="Calibri" w:eastAsia="맑은 고딕" w:hAnsi="Calibri" w:cs="Calibri"/>
+          <w:sz w:val="22"/>
           <w:szCs w:val="22"/>
         </w:rPr>
       </w:r>
@@ -1531,8 +1376,7 @@
       </w:pPr>
       <w:r>
         <w:rPr>
-          <w:rFonts w:eastAsia="맑은 고딕" w:ascii="맑은 고딕" w:hAnsi="맑은 고딕" w:cs="맑은 고딕"/>
-          <w:sz w:val="20"/>
+          <w:rFonts w:eastAsia="맑은 고딕"/>
         </w:rPr>
         <w:t>• GitLab에 소스가 올라오면 Jenkins와 Argo Workflow가 이미지를 빌드해 Harbor 레지스트리에 올리고, ArgoCD가 클러스터에 배포하는 CI/CD 파이프라인을 구축해 20개 이상의 ML 모델을 자동 배포</w:t>
       </w:r>
@@ -1544,9 +1388,8 @@
       </w:pPr>
       <w:r>
         <w:rPr>
-          <w:rFonts w:eastAsia="맑은 고딕" w:ascii="맑은 고딕" w:hAnsi="맑은 고딕" w:cs="맑은 고딕"/>
-          <w:b w:val="0"/>
-          <w:sz w:val="20"/>
+          <w:rFonts w:eastAsia="맑은 고딕"/>
+          <w:b w:val="0"/>
         </w:rPr>
         <w:t>• Prometheus와 Grafana로 서비스·클러스터 모니터링을, AlertManager로 경보를 구축. 로그는 클러스터에 Elasticsearch(ELK 스택)와 Loki를 직접 설치해 수집·조회 환경을 만들고, 이후 클러스터 장애 대응과 리소스 관리까지 운영을 담당</w:t>
       </w:r>
@@ -1557,7 +1400,7 @@
       </w:pPr>
       <w:r>
         <w:rPr>
-          <w:rFonts w:ascii="맑은 고딕" w:eastAsia="맑은 고딕" w:hAnsi="맑은 고딕" w:cs="맑은 고딕"/>
+          <w:rFonts w:ascii="Calibri" w:eastAsia="맑은 고딕" w:hAnsi="Calibri" w:cs="Calibri"/>
           <w:b/>
           <w:bCs/>
           <w:color w:val="333333"/>
@@ -1573,9 +1416,8 @@
       </w:pPr>
       <w:r>
         <w:rPr>
-          <w:rFonts w:eastAsia="맑은 고딕" w:ascii="맑은 고딕" w:hAnsi="맑은 고딕" w:cs="맑은 고딕"/>
-          <w:b w:val="0"/>
-          <w:sz w:val="20"/>
+          <w:rFonts w:eastAsia="맑은 고딕"/>
+          <w:b w:val="0"/>
         </w:rPr>
         <w:t>• 배경: 휴가나 부재 후 복귀한 직원이 단체방에 쌓인 업무 대화를 따라잡는 데 오랜 시간이 걸린다는 문제에서 출발, 사내 메신저에 넣을 요약 모델을 개발</w:t>
       </w:r>
@@ -1587,8 +1429,7 @@
       </w:pPr>
       <w:r>
         <w:rPr>
-          <w:rFonts w:eastAsia="맑은 고딕" w:ascii="맑은 고딕" w:hAnsi="맑은 고딕" w:cs="맑은 고딕"/>
-          <w:sz w:val="20"/>
+          <w:rFonts w:eastAsia="맑은 고딕"/>
         </w:rPr>
         <w:t>• 대화 요약은 BART, 문서 요약은 T5로 나눠 개발. 한국어 대화-요약 쌍 데이터 수집과 전처리, 임베딩 모델 선정까지 학습 파이프라인을 직접 구축</w:t>
       </w:r>
@@ -1600,9 +1441,8 @@
       </w:pPr>
       <w:r>
         <w:rPr>
-          <w:rFonts w:eastAsia="맑은 고딕" w:ascii="맑은 고딕" w:hAnsi="맑은 고딕" w:cs="맑은 고딕"/>
-          <w:b w:val="0"/>
-          <w:sz w:val="20"/>
+          <w:rFonts w:eastAsia="맑은 고딕"/>
+          <w:b w:val="0"/>
         </w:rPr>
         <w:t>• 파인튜닝에는 사전 학습 표현을 훼손하지 않는 R3F 정규화 기법을 적용하고, ROUGE 점수와 사내 인원 휴먼 평가를 품질 지표로 사용</w:t>
       </w:r>
@@ -1614,8 +1454,7 @@
       </w:pPr>
       <w:r>
         <w:rPr>
-          <w:rFonts w:eastAsia="맑은 고딕" w:ascii="맑은 고딕" w:hAnsi="맑은 고딕" w:cs="맑은 고딕"/>
-          <w:sz w:val="20"/>
+          <w:rFonts w:eastAsia="맑은 고딕"/>
         </w:rPr>
         <w:t>• 기술: BART, T5, R3F Fine-tuning, Hugging Face, PyTorch</w:t>
       </w:r>
@@ -1627,8 +1466,7 @@
       </w:pPr>
       <w:r>
         <w:rPr>
-          <w:rFonts w:eastAsia="맑은 고딕" w:ascii="맑은 고딕" w:hAnsi="맑은 고딕" w:cs="맑은 고딕"/>
-          <w:sz w:val="20"/>
+          <w:rFonts w:eastAsia="맑은 고딕"/>
         </w:rPr>
         <w:t>• 사내 메신저에 요약 기능을 붙여 실제 적용. 긴 사내 공지를 한 줄로 줄이고, 실제 업무 대화를 2초대에 요약하는 결과까지 확인</w:t>
       </w:r>
@@ -1640,9 +1478,8 @@
       </w:pPr>
       <w:r>
         <w:rPr>
-          <w:rFonts w:eastAsia="맑은 고딕" w:ascii="맑은 고딕" w:hAnsi="맑은 고딕" w:cs="맑은 고딕"/>
-          <w:b w:val="0"/>
-          <w:sz w:val="20"/>
+          <w:rFonts w:eastAsia="맑은 고딕"/>
+          <w:b w:val="0"/>
         </w:rPr>
         <w:t>• STT 결과 텍스트를 활용한 자연어 처리 기능 개발과 모델 적용용 데이터 전처리·평가 환경 구축도 함께 수행</w:t>
       </w:r>
@@ -1653,7 +1490,7 @@
       </w:pPr>
       <w:r>
         <w:rPr>
-          <w:rFonts w:ascii="맑은 고딕" w:eastAsia="맑은 고딕" w:hAnsi="맑은 고딕" w:cs="맑은 고딕"/>
+          <w:rFonts w:ascii="Calibri" w:eastAsia="맑은 고딕" w:hAnsi="Calibri" w:cs="Calibri"/>
           <w:b/>
           <w:bCs/>
           <w:color w:val="333333"/>
@@ -1670,46 +1507,46 @@
       </w:pPr>
       <w:r>
         <w:rPr>
-          <w:rFonts w:eastAsia="맑은 고딕" w:ascii="맑은 고딕" w:hAnsi="맑은 고딕" w:cs="맑은 고딕"/>
-          <w:b w:val="0"/>
-          <w:bCs/>
-          <w:sz w:val="20"/>
+          <w:rFonts w:eastAsia="맑은 고딕"/>
+          <w:b w:val="0"/>
+          <w:bCs/>
+          <w:sz w:val="22"/>
           <w:szCs w:val="22"/>
         </w:rPr>
         <w:t>• 배경: 국방 도메인은 보안 제약 때문에 학습 데이터를 구하기 어려워, 생성 모델로 데이터를 만드는 쪽을 연구</w:t>
       </w:r>
       <w:r>
         <w:rPr>
-          <w:rFonts w:ascii="맑은 고딕" w:eastAsia="맑은 고딕" w:hAnsi="맑은 고딕" w:cs="맑은 고딕"/>
-          <w:b w:val="0"/>
-          <w:sz w:val="20"/>
-          <w:szCs w:val="22"/>
-        </w:rPr>
-      </w:r>
-      <w:proofErr w:type="spellStart"/>
-      <w:r>
-        <w:rPr>
-          <w:rFonts w:ascii="맑은 고딕" w:eastAsia="맑은 고딕" w:hAnsi="맑은 고딕" w:cs="맑은 고딕"/>
-          <w:b w:val="0"/>
-          <w:sz w:val="20"/>
-          <w:szCs w:val="22"/>
-        </w:rPr>
-      </w:r>
-      <w:proofErr w:type="spellEnd"/>
-      <w:r>
-        <w:rPr>
-          <w:rFonts w:ascii="맑은 고딕" w:eastAsia="맑은 고딕" w:hAnsi="맑은 고딕" w:cs="맑은 고딕"/>
-          <w:b w:val="0"/>
-          <w:sz w:val="20"/>
-          <w:szCs w:val="22"/>
-        </w:rPr>
-      </w:r>
-      <w:proofErr w:type="spellStart"/>
-      <w:r>
-        <w:rPr>
-          <w:rFonts w:ascii="맑은 고딕" w:eastAsia="맑은 고딕" w:hAnsi="맑은 고딕" w:cs="맑은 고딕"/>
-          <w:b w:val="0"/>
-          <w:sz w:val="20"/>
+          <w:rFonts w:ascii="Calibri" w:eastAsia="맑은 고딕" w:hAnsi="Calibri" w:cs="Calibri"/>
+          <w:b w:val="0"/>
+          <w:sz w:val="22"/>
+          <w:szCs w:val="22"/>
+        </w:rPr>
+      </w:r>
+      <w:proofErr w:type="spellStart"/>
+      <w:r>
+        <w:rPr>
+          <w:rFonts w:ascii="Calibri" w:eastAsia="맑은 고딕" w:hAnsi="Calibri" w:cs="Calibri"/>
+          <w:b w:val="0"/>
+          <w:sz w:val="22"/>
+          <w:szCs w:val="22"/>
+        </w:rPr>
+      </w:r>
+      <w:proofErr w:type="spellEnd"/>
+      <w:r>
+        <w:rPr>
+          <w:rFonts w:ascii="Calibri" w:eastAsia="맑은 고딕" w:hAnsi="Calibri" w:cs="Calibri"/>
+          <w:b w:val="0"/>
+          <w:sz w:val="22"/>
+          <w:szCs w:val="22"/>
+        </w:rPr>
+      </w:r>
+      <w:proofErr w:type="spellStart"/>
+      <w:r>
+        <w:rPr>
+          <w:rFonts w:ascii="Calibri" w:eastAsia="맑은 고딕" w:hAnsi="Calibri" w:cs="Calibri"/>
+          <w:b w:val="0"/>
+          <w:sz w:val="22"/>
           <w:szCs w:val="22"/>
         </w:rPr>
       </w:r>
@@ -1722,46 +1559,46 @@
       </w:pPr>
       <w:r>
         <w:rPr>
-          <w:rFonts w:eastAsia="맑은 고딕" w:ascii="맑은 고딕" w:hAnsi="맑은 고딕" w:cs="맑은 고딕"/>
-          <w:b w:val="0"/>
-          <w:bCs/>
-          <w:sz w:val="20"/>
+          <w:rFonts w:eastAsia="맑은 고딕"/>
+          <w:b w:val="0"/>
+          <w:bCs/>
+          <w:sz w:val="22"/>
           <w:szCs w:val="22"/>
         </w:rPr>
         <w:t>• Latent Diffusion으로 합성 데이터를 생성하고 실제 모델 학습에 투입해, 부족한 학습 데이터를 보완할 수 있음을 검증</w:t>
       </w:r>
       <w:r>
         <w:rPr>
-          <w:rFonts w:ascii="맑은 고딕" w:eastAsia="맑은 고딕" w:hAnsi="맑은 고딕" w:cs="맑은 고딕"/>
-          <w:b w:val="0"/>
-          <w:sz w:val="20"/>
-          <w:szCs w:val="22"/>
-        </w:rPr>
-      </w:r>
-      <w:proofErr w:type="spellStart"/>
-      <w:r>
-        <w:rPr>
-          <w:rFonts w:ascii="맑은 고딕" w:eastAsia="맑은 고딕" w:hAnsi="맑은 고딕" w:cs="맑은 고딕"/>
-          <w:b w:val="0"/>
-          <w:sz w:val="20"/>
-          <w:szCs w:val="22"/>
-        </w:rPr>
-      </w:r>
-      <w:proofErr w:type="spellEnd"/>
-      <w:r>
-        <w:rPr>
-          <w:rFonts w:ascii="맑은 고딕" w:eastAsia="맑은 고딕" w:hAnsi="맑은 고딕" w:cs="맑은 고딕"/>
-          <w:b w:val="0"/>
-          <w:sz w:val="20"/>
-          <w:szCs w:val="22"/>
-        </w:rPr>
-      </w:r>
-      <w:proofErr w:type="spellStart"/>
-      <w:r>
-        <w:rPr>
-          <w:rFonts w:ascii="맑은 고딕" w:eastAsia="맑은 고딕" w:hAnsi="맑은 고딕" w:cs="맑은 고딕"/>
-          <w:b w:val="0"/>
-          <w:sz w:val="20"/>
+          <w:rFonts w:ascii="Calibri" w:eastAsia="맑은 고딕" w:hAnsi="Calibri" w:cs="Calibri"/>
+          <w:b w:val="0"/>
+          <w:sz w:val="22"/>
+          <w:szCs w:val="22"/>
+        </w:rPr>
+      </w:r>
+      <w:proofErr w:type="spellStart"/>
+      <w:r>
+        <w:rPr>
+          <w:rFonts w:ascii="Calibri" w:eastAsia="맑은 고딕" w:hAnsi="Calibri" w:cs="Calibri"/>
+          <w:b w:val="0"/>
+          <w:sz w:val="22"/>
+          <w:szCs w:val="22"/>
+        </w:rPr>
+      </w:r>
+      <w:proofErr w:type="spellEnd"/>
+      <w:r>
+        <w:rPr>
+          <w:rFonts w:ascii="Calibri" w:eastAsia="맑은 고딕" w:hAnsi="Calibri" w:cs="Calibri"/>
+          <w:b w:val="0"/>
+          <w:sz w:val="22"/>
+          <w:szCs w:val="22"/>
+        </w:rPr>
+      </w:r>
+      <w:proofErr w:type="spellStart"/>
+      <w:r>
+        <w:rPr>
+          <w:rFonts w:ascii="Calibri" w:eastAsia="맑은 고딕" w:hAnsi="Calibri" w:cs="Calibri"/>
+          <w:b w:val="0"/>
+          <w:sz w:val="22"/>
           <w:szCs w:val="22"/>
         </w:rPr>
       </w:r>
@@ -1774,46 +1611,46 @@
       </w:pPr>
       <w:r>
         <w:rPr>
-          <w:rFonts w:eastAsia="맑은 고딕" w:ascii="맑은 고딕" w:hAnsi="맑은 고딕" w:cs="맑은 고딕"/>
-          <w:b w:val="0"/>
-          <w:bCs/>
-          <w:sz w:val="20"/>
+          <w:rFonts w:eastAsia="맑은 고딕"/>
+          <w:b w:val="0"/>
+          <w:bCs/>
+          <w:sz w:val="22"/>
           <w:szCs w:val="22"/>
         </w:rPr>
         <w:t>• 기술: Latent Diffusion, GAN, PyTorch</w:t>
       </w:r>
       <w:r>
         <w:rPr>
-          <w:rFonts w:ascii="맑은 고딕" w:eastAsia="맑은 고딕" w:hAnsi="맑은 고딕" w:cs="맑은 고딕"/>
-          <w:b w:val="0"/>
-          <w:sz w:val="20"/>
-          <w:szCs w:val="22"/>
-        </w:rPr>
-      </w:r>
-      <w:proofErr w:type="spellStart"/>
-      <w:r>
-        <w:rPr>
-          <w:rFonts w:ascii="맑은 고딕" w:eastAsia="맑은 고딕" w:hAnsi="맑은 고딕" w:cs="맑은 고딕"/>
-          <w:b w:val="0"/>
-          <w:sz w:val="20"/>
-          <w:szCs w:val="22"/>
-        </w:rPr>
-      </w:r>
-      <w:proofErr w:type="spellEnd"/>
-      <w:r>
-        <w:rPr>
-          <w:rFonts w:ascii="맑은 고딕" w:eastAsia="맑은 고딕" w:hAnsi="맑은 고딕" w:cs="맑은 고딕"/>
-          <w:b w:val="0"/>
-          <w:sz w:val="20"/>
-          <w:szCs w:val="22"/>
-        </w:rPr>
-      </w:r>
-      <w:proofErr w:type="spellStart"/>
-      <w:r>
-        <w:rPr>
-          <w:rFonts w:ascii="맑은 고딕" w:eastAsia="맑은 고딕" w:hAnsi="맑은 고딕" w:cs="맑은 고딕"/>
-          <w:b w:val="0"/>
-          <w:sz w:val="20"/>
+          <w:rFonts w:ascii="Calibri" w:eastAsia="맑은 고딕" w:hAnsi="Calibri" w:cs="Calibri"/>
+          <w:b w:val="0"/>
+          <w:sz w:val="22"/>
+          <w:szCs w:val="22"/>
+        </w:rPr>
+      </w:r>
+      <w:proofErr w:type="spellStart"/>
+      <w:r>
+        <w:rPr>
+          <w:rFonts w:ascii="Calibri" w:eastAsia="맑은 고딕" w:hAnsi="Calibri" w:cs="Calibri"/>
+          <w:b w:val="0"/>
+          <w:sz w:val="22"/>
+          <w:szCs w:val="22"/>
+        </w:rPr>
+      </w:r>
+      <w:proofErr w:type="spellEnd"/>
+      <w:r>
+        <w:rPr>
+          <w:rFonts w:ascii="Calibri" w:eastAsia="맑은 고딕" w:hAnsi="Calibri" w:cs="Calibri"/>
+          <w:b w:val="0"/>
+          <w:sz w:val="22"/>
+          <w:szCs w:val="22"/>
+        </w:rPr>
+      </w:r>
+      <w:proofErr w:type="spellStart"/>
+      <w:r>
+        <w:rPr>
+          <w:rFonts w:ascii="Calibri" w:eastAsia="맑은 고딕" w:hAnsi="Calibri" w:cs="Calibri"/>
+          <w:b w:val="0"/>
+          <w:sz w:val="22"/>
           <w:szCs w:val="22"/>
         </w:rPr>
       </w:r>
@@ -1826,58 +1663,58 @@
       </w:pPr>
       <w:r>
         <w:rPr>
-          <w:rFonts w:eastAsia="맑은 고딕" w:ascii="맑은 고딕" w:hAnsi="맑은 고딕" w:cs="맑은 고딕"/>
-          <w:b w:val="0"/>
-          <w:bCs/>
-          <w:sz w:val="20"/>
+          <w:rFonts w:eastAsia="맑은 고딕"/>
+          <w:b w:val="0"/>
+          <w:bCs/>
+          <w:sz w:val="22"/>
           <w:szCs w:val="22"/>
         </w:rPr>
         <w:t>• 제1저자 논문 2편을 게재하고 국방기술학회에서 우수논문상을 수상 (2023.11)</w:t>
       </w:r>
       <w:r>
         <w:rPr>
-          <w:rFonts w:ascii="맑은 고딕" w:eastAsia="맑은 고딕" w:hAnsi="맑은 고딕" w:cs="맑은 고딕"/>
-          <w:b w:val="0"/>
-          <w:sz w:val="20"/>
-          <w:szCs w:val="22"/>
-        </w:rPr>
-      </w:r>
-      <w:proofErr w:type="spellStart"/>
-      <w:r>
-        <w:rPr>
-          <w:rFonts w:ascii="맑은 고딕" w:eastAsia="맑은 고딕" w:hAnsi="맑은 고딕" w:cs="맑은 고딕"/>
-          <w:b w:val="0"/>
-          <w:sz w:val="20"/>
-          <w:szCs w:val="22"/>
-        </w:rPr>
-      </w:r>
-      <w:proofErr w:type="spellEnd"/>
-      <w:r>
-        <w:rPr>
-          <w:rFonts w:ascii="맑은 고딕" w:eastAsia="맑은 고딕" w:hAnsi="맑은 고딕" w:cs="맑은 고딕"/>
-          <w:b w:val="0"/>
-          <w:sz w:val="20"/>
-          <w:szCs w:val="22"/>
-        </w:rPr>
-      </w:r>
-      <w:proofErr w:type="spellStart"/>
-      <w:r>
-        <w:rPr>
-          <w:rFonts w:ascii="맑은 고딕" w:eastAsia="맑은 고딕" w:hAnsi="맑은 고딕" w:cs="맑은 고딕"/>
-          <w:b w:val="0"/>
-          <w:sz w:val="20"/>
-          <w:szCs w:val="22"/>
-        </w:rPr>
-      </w:r>
-      <w:proofErr w:type="spellEnd"/>
-    </w:p>
-    <w:p>
-      <w:pPr>
-        <w:spacing w:after="40" w:line="240" w:lineRule="auto"/>
-      </w:pPr>
-      <w:r>
-        <w:rPr>
-          <w:rFonts w:ascii="맑은 고딕" w:eastAsia="맑은 고딕" w:hAnsi="맑은 고딕" w:cs="맑은 고딕"/>
+          <w:rFonts w:ascii="Calibri" w:eastAsia="맑은 고딕" w:hAnsi="Calibri" w:cs="Calibri"/>
+          <w:b w:val="0"/>
+          <w:sz w:val="22"/>
+          <w:szCs w:val="22"/>
+        </w:rPr>
+      </w:r>
+      <w:proofErr w:type="spellStart"/>
+      <w:r>
+        <w:rPr>
+          <w:rFonts w:ascii="Calibri" w:eastAsia="맑은 고딕" w:hAnsi="Calibri" w:cs="Calibri"/>
+          <w:b w:val="0"/>
+          <w:sz w:val="22"/>
+          <w:szCs w:val="22"/>
+        </w:rPr>
+      </w:r>
+      <w:proofErr w:type="spellEnd"/>
+      <w:r>
+        <w:rPr>
+          <w:rFonts w:ascii="Calibri" w:eastAsia="맑은 고딕" w:hAnsi="Calibri" w:cs="Calibri"/>
+          <w:b w:val="0"/>
+          <w:sz w:val="22"/>
+          <w:szCs w:val="22"/>
+        </w:rPr>
+      </w:r>
+      <w:proofErr w:type="spellStart"/>
+      <w:r>
+        <w:rPr>
+          <w:rFonts w:ascii="Calibri" w:eastAsia="맑은 고딕" w:hAnsi="Calibri" w:cs="Calibri"/>
+          <w:b w:val="0"/>
+          <w:sz w:val="22"/>
+          <w:szCs w:val="22"/>
+        </w:rPr>
+      </w:r>
+      <w:proofErr w:type="spellEnd"/>
+    </w:p>
+    <w:p>
+      <w:pPr>
+        <w:spacing w:after="40" w:line="240" w:lineRule="auto"/>
+      </w:pPr>
+      <w:r>
+        <w:rPr>
+          <w:rFonts w:ascii="Calibri" w:eastAsia="맑은 고딕" w:hAnsi="Calibri" w:cs="Calibri"/>
           <w:b/>
           <w:bCs/>
           <w:color w:val="333333"/>
@@ -1893,9 +1730,8 @@
       </w:pPr>
       <w:r>
         <w:rPr>
-          <w:rFonts w:eastAsia="맑은 고딕" w:ascii="맑은 고딕" w:hAnsi="맑은 고딕" w:cs="맑은 고딕"/>
-          <w:b w:val="0"/>
-          <w:sz w:val="20"/>
+          <w:rFonts w:eastAsia="맑은 고딕"/>
+          <w:b w:val="0"/>
         </w:rPr>
         <w:t>• 배경: 자율주행 인식에는 거리·높이 같은 3D 정보가 필요해, LiDAR와 카메라를 결합하는 센서 퓨전을 연구</w:t>
       </w:r>
@@ -1907,8 +1743,7 @@
       </w:pPr>
       <w:r>
         <w:rPr>
-          <w:rFonts w:eastAsia="맑은 고딕" w:ascii="맑은 고딕" w:hAnsi="맑은 고딕" w:cs="맑은 고딕"/>
-          <w:sz w:val="20"/>
+          <w:rFonts w:eastAsia="맑은 고딕"/>
         </w:rPr>
         <w:t>• 한국자동차공학회에 제1저자 논문 2편을 게재하고, 제1발명자로 특허 2건을 등록</w:t>
       </w:r>
@@ -1920,46 +1755,46 @@
       </w:pPr>
       <w:r>
         <w:rPr>
-          <w:rFonts w:eastAsia="맑은 고딕" w:ascii="맑은 고딕" w:hAnsi="맑은 고딕" w:cs="맑은 고딕"/>
-          <w:b w:val="0"/>
-          <w:bCs/>
-          <w:sz w:val="20"/>
+          <w:rFonts w:eastAsia="맑은 고딕"/>
+          <w:b w:val="0"/>
+          <w:bCs/>
+          <w:sz w:val="22"/>
           <w:szCs w:val="22"/>
         </w:rPr>
         <w:t>• 기술: Trans-Unet, LiDAR + Camera Sensor Fusion, PyTorch</w:t>
       </w:r>
       <w:r>
         <w:rPr>
-          <w:rFonts w:ascii="맑은 고딕" w:eastAsia="맑은 고딕" w:hAnsi="맑은 고딕" w:cs="맑은 고딕"/>
-          <w:b w:val="0"/>
-          <w:sz w:val="20"/>
-          <w:szCs w:val="22"/>
-        </w:rPr>
-      </w:r>
-      <w:proofErr w:type="spellStart"/>
-      <w:r>
-        <w:rPr>
-          <w:rFonts w:ascii="맑은 고딕" w:eastAsia="맑은 고딕" w:hAnsi="맑은 고딕" w:cs="맑은 고딕"/>
-          <w:b w:val="0"/>
-          <w:sz w:val="20"/>
-          <w:szCs w:val="22"/>
-        </w:rPr>
-      </w:r>
-      <w:proofErr w:type="spellEnd"/>
-      <w:r>
-        <w:rPr>
-          <w:rFonts w:ascii="맑은 고딕" w:eastAsia="맑은 고딕" w:hAnsi="맑은 고딕" w:cs="맑은 고딕"/>
-          <w:b w:val="0"/>
-          <w:sz w:val="20"/>
-          <w:szCs w:val="22"/>
-        </w:rPr>
-      </w:r>
-      <w:proofErr w:type="spellStart"/>
-      <w:r>
-        <w:rPr>
-          <w:rFonts w:ascii="맑은 고딕" w:eastAsia="맑은 고딕" w:hAnsi="맑은 고딕" w:cs="맑은 고딕"/>
-          <w:b w:val="0"/>
-          <w:sz w:val="20"/>
+          <w:rFonts w:ascii="Calibri" w:eastAsia="맑은 고딕" w:hAnsi="Calibri" w:cs="Calibri"/>
+          <w:b w:val="0"/>
+          <w:sz w:val="22"/>
+          <w:szCs w:val="22"/>
+        </w:rPr>
+      </w:r>
+      <w:proofErr w:type="spellStart"/>
+      <w:r>
+        <w:rPr>
+          <w:rFonts w:ascii="Calibri" w:eastAsia="맑은 고딕" w:hAnsi="Calibri" w:cs="Calibri"/>
+          <w:b w:val="0"/>
+          <w:sz w:val="22"/>
+          <w:szCs w:val="22"/>
+        </w:rPr>
+      </w:r>
+      <w:proofErr w:type="spellEnd"/>
+      <w:r>
+        <w:rPr>
+          <w:rFonts w:ascii="Calibri" w:eastAsia="맑은 고딕" w:hAnsi="Calibri" w:cs="Calibri"/>
+          <w:b w:val="0"/>
+          <w:sz w:val="22"/>
+          <w:szCs w:val="22"/>
+        </w:rPr>
+      </w:r>
+      <w:proofErr w:type="spellStart"/>
+      <w:r>
+        <w:rPr>
+          <w:rFonts w:ascii="Calibri" w:eastAsia="맑은 고딕" w:hAnsi="Calibri" w:cs="Calibri"/>
+          <w:b w:val="0"/>
+          <w:sz w:val="22"/>
           <w:szCs w:val="22"/>
         </w:rPr>
       </w:r>
@@ -1974,10 +1809,6 @@
         <w:spacing w:before="160" w:after="80"/>
       </w:pPr>
       <w:r>
-        <w:rPr>
-          <w:rFonts w:ascii="맑은 고딕" w:hAnsi="맑은 고딕" w:eastAsia="맑은 고딕" w:cs="맑은 고딕"/>
-          <w:sz w:val="26"/>
-        </w:rPr>
         <w:t>이든티앤에스 (EDEN T&amp;S)</w:t>
       </w:r>
     </w:p>
@@ -1987,7 +1818,7 @@
       </w:pPr>
       <w:r>
         <w:rPr>
-          <w:rFonts w:ascii="맑은 고딕" w:eastAsia="맑은 고딕" w:hAnsi="맑은 고딕" w:cs="맑은 고딕"/>
+          <w:rFonts w:ascii="Calibri" w:eastAsia="맑은 고딕" w:hAnsi="Calibri" w:cs="Calibri"/>
           <w:b/>
           <w:bCs/>
           <w:color w:val="333333"/>
@@ -1999,7 +1830,7 @@
       <w:proofErr w:type="gramStart"/>
       <w:r>
         <w:rPr>
-          <w:rFonts w:ascii="맑은 고딕" w:eastAsia="맑은 고딕" w:hAnsi="맑은 고딕" w:cs="맑은 고딕"/>
+          <w:rFonts w:ascii="Calibri" w:eastAsia="맑은 고딕" w:hAnsi="Calibri" w:cs="Calibri"/>
           <w:b/>
           <w:bCs/>
           <w:color w:val="333333"/>
@@ -2010,7 +1841,7 @@
       </w:r>
       <w:r>
         <w:rPr>
-          <w:rFonts w:eastAsia="맑은 고딕" w:ascii="맑은 고딕" w:hAnsi="맑은 고딕" w:cs="맑은 고딕"/>
+          <w:rFonts w:eastAsia="맑은 고딕"/>
           <w:sz w:val="24"/>
           <w:szCs w:val="24"/>
         </w:rPr>
@@ -2018,11 +1849,11 @@
       </w:r>
       <w:r>
         <w:rPr>
-          <w:rFonts w:ascii="맑은 고딕" w:eastAsia="맑은 고딕" w:hAnsi="맑은 고딕" w:cs="맑은 고딕"/>
+          <w:rFonts w:ascii="Calibri" w:eastAsia="맑은 고딕" w:hAnsi="Calibri" w:cs="Calibri"/>
           <w:i/>
           <w:iCs/>
           <w:color w:val="666666"/>
-          <w:sz w:val="20"/>
+          <w:sz w:val="22"/>
           <w:szCs w:val="22"/>
         </w:rPr>
         <w:t>Apr</w:t>
@@ -2030,11 +1861,11 @@
       <w:proofErr w:type="gramEnd"/>
       <w:r>
         <w:rPr>
-          <w:rFonts w:ascii="맑은 고딕" w:eastAsia="맑은 고딕" w:hAnsi="맑은 고딕" w:cs="맑은 고딕"/>
+          <w:rFonts w:ascii="Calibri" w:eastAsia="맑은 고딕" w:hAnsi="Calibri" w:cs="Calibri"/>
           <w:i/>
           <w:iCs/>
           <w:color w:val="666666"/>
-          <w:sz w:val="20"/>
+          <w:sz w:val="22"/>
           <w:szCs w:val="22"/>
         </w:rPr>
         <w:t xml:space="preserve"> 2022 – Aug 2022</w:t>
@@ -2046,7 +1877,7 @@
       </w:pPr>
       <w:r>
         <w:rPr>
-          <w:rFonts w:ascii="맑은 고딕" w:eastAsia="맑은 고딕" w:hAnsi="맑은 고딕" w:cs="맑은 고딕"/>
+          <w:rFonts w:ascii="Calibri" w:eastAsia="맑은 고딕" w:hAnsi="Calibri" w:cs="Calibri"/>
           <w:b/>
           <w:bCs/>
           <w:color w:val="333333"/>
@@ -2062,9 +1893,8 @@
       </w:pPr>
       <w:r>
         <w:rPr>
-          <w:rFonts w:eastAsia="맑은 고딕" w:ascii="맑은 고딕" w:hAnsi="맑은 고딕" w:cs="맑은 고딕"/>
-          <w:b w:val="0"/>
-          <w:sz w:val="20"/>
+          <w:rFonts w:eastAsia="맑은 고딕"/>
+          <w:b w:val="0"/>
         </w:rPr>
         <w:t>• 배경: OCR 학습 데이터를 대량으로 만들어야 했지만 수동 주석 작업이 병목이었음</w:t>
       </w:r>
@@ -2076,8 +1906,7 @@
       </w:pPr>
       <w:r>
         <w:rPr>
-          <w:rFonts w:eastAsia="맑은 고딕" w:ascii="맑은 고딕" w:hAnsi="맑은 고딕" w:cs="맑은 고딕"/>
-          <w:sz w:val="20"/>
+          <w:rFonts w:eastAsia="맑은 고딕"/>
         </w:rPr>
         <w:t>• 이미지 로딩부터 라벨링, 저장까지 갖춘 어노테이션 툴을 혼자 설계하고 개발</w:t>
       </w:r>
@@ -2089,18 +1918,18 @@
       </w:pPr>
       <w:r>
         <w:rPr>
-          <w:rFonts w:eastAsia="맑은 고딕" w:ascii="맑은 고딕" w:hAnsi="맑은 고딕" w:cs="맑은 고딕"/>
-          <w:b/>
-          <w:bCs/>
-          <w:sz w:val="20"/>
+          <w:rFonts w:eastAsia="맑은 고딕"/>
+          <w:b/>
+          <w:bCs/>
+          <w:sz w:val="22"/>
           <w:szCs w:val="22"/>
         </w:rPr>
         <w:t xml:space="preserve">• </w:t>
       </w:r>
       <w:r>
         <w:rPr>
-          <w:rFonts w:ascii="맑은 고딕" w:eastAsia="맑은 고딕" w:hAnsi="맑은 고딕" w:cs="맑은 고딕"/>
-          <w:sz w:val="20"/>
+          <w:rFonts w:ascii="Calibri" w:eastAsia="맑은 고딕" w:hAnsi="Calibri" w:cs="Calibri"/>
+          <w:sz w:val="22"/>
           <w:szCs w:val="22"/>
         </w:rPr>
         <w:t xml:space="preserve">기술: </w:t>
@@ -2108,8 +1937,8 @@
       <w:proofErr w:type="spellStart"/>
       <w:r>
         <w:rPr>
-          <w:rFonts w:ascii="맑은 고딕" w:eastAsia="맑은 고딕" w:hAnsi="맑은 고딕" w:cs="맑은 고딕"/>
-          <w:sz w:val="20"/>
+          <w:rFonts w:ascii="Calibri" w:eastAsia="맑은 고딕" w:hAnsi="Calibri" w:cs="Calibri"/>
+          <w:sz w:val="22"/>
           <w:szCs w:val="22"/>
         </w:rPr>
         <w:t>PyQt</w:t>
@@ -2117,8 +1946,8 @@
       <w:proofErr w:type="spellEnd"/>
       <w:r>
         <w:rPr>
-          <w:rFonts w:ascii="맑은 고딕" w:eastAsia="맑은 고딕" w:hAnsi="맑은 고딕" w:cs="맑은 고딕"/>
-          <w:sz w:val="20"/>
+          <w:rFonts w:ascii="Calibri" w:eastAsia="맑은 고딕" w:hAnsi="Calibri" w:cs="Calibri"/>
+          <w:sz w:val="22"/>
           <w:szCs w:val="22"/>
         </w:rPr>
         <w:t xml:space="preserve">, Tesseract OCR, </w:t>
@@ -2126,8 +1955,8 @@
       <w:proofErr w:type="spellStart"/>
       <w:r>
         <w:rPr>
-          <w:rFonts w:ascii="맑은 고딕" w:eastAsia="맑은 고딕" w:hAnsi="맑은 고딕" w:cs="맑은 고딕"/>
-          <w:sz w:val="20"/>
+          <w:rFonts w:ascii="Calibri" w:eastAsia="맑은 고딕" w:hAnsi="Calibri" w:cs="Calibri"/>
+          <w:sz w:val="22"/>
           <w:szCs w:val="22"/>
         </w:rPr>
         <w:t>ViT</w:t>
@@ -2135,8 +1964,8 @@
       <w:proofErr w:type="spellEnd"/>
       <w:r>
         <w:rPr>
-          <w:rFonts w:ascii="맑은 고딕" w:eastAsia="맑은 고딕" w:hAnsi="맑은 고딕" w:cs="맑은 고딕"/>
-          <w:sz w:val="20"/>
+          <w:rFonts w:ascii="Calibri" w:eastAsia="맑은 고딕" w:hAnsi="Calibri" w:cs="Calibri"/>
+          <w:sz w:val="22"/>
           <w:szCs w:val="22"/>
         </w:rPr>
         <w:t>-based Table Detection, RNN Text Extraction</w:t>
@@ -2149,8 +1978,7 @@
       </w:pPr>
       <w:r>
         <w:rPr>
-          <w:rFonts w:eastAsia="맑은 고딕" w:ascii="맑은 고딕" w:hAnsi="맑은 고딕" w:cs="맑은 고딕"/>
-          <w:sz w:val="20"/>
+          <w:rFonts w:eastAsia="맑은 고딕"/>
         </w:rPr>
         <w:t>• 학습 데이터 생성을 자동화하고 문서 인식 성능을 개선해, 프로젝트 성공 성과금을 받음</w:t>
       </w:r>
@@ -2164,10 +1992,6 @@
         <w:spacing w:before="160" w:after="80"/>
       </w:pPr>
       <w:r>
-        <w:rPr>
-          <w:rFonts w:ascii="맑은 고딕" w:hAnsi="맑은 고딕" w:eastAsia="맑은 고딕" w:cs="맑은 고딕"/>
-          <w:sz w:val="26"/>
-        </w:rPr>
         <w:t>큐헷지 (QUHEDGE)</w:t>
       </w:r>
     </w:p>
@@ -2177,7 +2001,7 @@
       </w:pPr>
       <w:r>
         <w:rPr>
-          <w:rFonts w:ascii="맑은 고딕" w:eastAsia="맑은 고딕" w:hAnsi="맑은 고딕" w:cs="맑은 고딕"/>
+          <w:rFonts w:ascii="Calibri" w:eastAsia="맑은 고딕" w:hAnsi="Calibri" w:cs="Calibri"/>
           <w:b w:val="0"/>
           <w:bCs/>
           <w:color w:val="333333"/>
@@ -2189,7 +2013,7 @@
       <w:proofErr w:type="gramStart"/>
       <w:r>
         <w:rPr>
-          <w:rFonts w:ascii="맑은 고딕" w:eastAsia="맑은 고딕" w:hAnsi="맑은 고딕" w:cs="맑은 고딕"/>
+          <w:rFonts w:ascii="Calibri" w:eastAsia="맑은 고딕" w:hAnsi="Calibri" w:cs="Calibri"/>
           <w:b w:val="0"/>
           <w:bCs/>
           <w:color w:val="333333"/>
@@ -2199,7 +2023,7 @@
       </w:r>
       <w:r>
         <w:rPr>
-          <w:rFonts w:eastAsia="맑은 고딕" w:ascii="맑은 고딕" w:hAnsi="맑은 고딕" w:cs="맑은 고딕"/>
+          <w:rFonts w:eastAsia="맑은 고딕"/>
           <w:b w:val="0"/>
           <w:sz w:val="24"/>
           <w:szCs w:val="24"/>
@@ -2207,35 +2031,35 @@
       </w:r>
       <w:r>
         <w:rPr>
-          <w:rFonts w:ascii="맑은 고딕" w:eastAsia="맑은 고딕" w:hAnsi="맑은 고딕" w:cs="맑은 고딕"/>
+          <w:rFonts w:ascii="Calibri" w:eastAsia="맑은 고딕" w:hAnsi="Calibri" w:cs="Calibri"/>
           <w:b w:val="0"/>
           <w:i/>
           <w:iCs/>
           <w:color w:val="666666"/>
-          <w:sz w:val="20"/>
+          <w:sz w:val="22"/>
           <w:szCs w:val="22"/>
         </w:rPr>
       </w:r>
       <w:proofErr w:type="gramEnd"/>
       <w:r>
         <w:rPr>
-          <w:rFonts w:ascii="맑은 고딕" w:eastAsia="맑은 고딕" w:hAnsi="맑은 고딕" w:cs="맑은 고딕"/>
+          <w:rFonts w:ascii="Calibri" w:eastAsia="맑은 고딕" w:hAnsi="Calibri" w:cs="Calibri"/>
           <w:b w:val="0"/>
           <w:i/>
           <w:iCs/>
           <w:color w:val="666666"/>
-          <w:sz w:val="20"/>
-          <w:szCs w:val="22"/>
-        </w:rPr>
-      </w:r>
-    </w:p>
-    <w:p>
-      <w:pPr>
-        <w:spacing w:after="40" w:line="240" w:lineRule="auto"/>
-      </w:pPr>
-      <w:r>
-        <w:rPr>
-          <w:rFonts w:ascii="맑은 고딕" w:eastAsia="맑은 고딕" w:hAnsi="맑은 고딕" w:cs="맑은 고딕"/>
+          <w:sz w:val="22"/>
+          <w:szCs w:val="22"/>
+        </w:rPr>
+      </w:r>
+    </w:p>
+    <w:p>
+      <w:pPr>
+        <w:spacing w:after="40" w:line="240" w:lineRule="auto"/>
+      </w:pPr>
+      <w:r>
+        <w:rPr>
+          <w:rFonts w:ascii="맑은 고딕" w:eastAsia="맑은 고딕" w:hAnsi="맑은 고딕" w:cs="Calibri"/>
           <w:b/>
           <w:bCs/>
           <w:color w:val="333333"/>
@@ -2252,55 +2076,55 @@
       </w:pPr>
       <w:r>
         <w:rPr>
-          <w:rFonts w:eastAsia="맑은 고딕" w:ascii="맑은 고딕" w:hAnsi="맑은 고딕" w:cs="맑은 고딕"/>
-          <w:b w:val="0"/>
-          <w:bCs/>
-          <w:sz w:val="20"/>
+          <w:rFonts w:eastAsia="맑은 고딕"/>
+          <w:b w:val="0"/>
+          <w:bCs/>
+          <w:sz w:val="22"/>
           <w:szCs w:val="22"/>
         </w:rPr>
         <w:t>• 배경: 여러 소스에 흩어진 금융 데이터를 손으로 모아 쓰고 있었음</w:t>
       </w:r>
       <w:r>
         <w:rPr>
-          <w:rFonts w:ascii="맑은 고딕" w:eastAsia="맑은 고딕" w:hAnsi="맑은 고딕" w:cs="맑은 고딕"/>
-          <w:b w:val="0"/>
-          <w:sz w:val="20"/>
-          <w:szCs w:val="22"/>
-        </w:rPr>
-      </w:r>
-      <w:proofErr w:type="spellStart"/>
-      <w:r>
-        <w:rPr>
-          <w:rFonts w:ascii="맑은 고딕" w:eastAsia="맑은 고딕" w:hAnsi="맑은 고딕" w:cs="맑은 고딕"/>
-          <w:b w:val="0"/>
-          <w:sz w:val="20"/>
-          <w:szCs w:val="22"/>
-        </w:rPr>
-      </w:r>
-      <w:proofErr w:type="spellEnd"/>
-      <w:r>
-        <w:rPr>
-          <w:rFonts w:ascii="맑은 고딕" w:eastAsia="맑은 고딕" w:hAnsi="맑은 고딕" w:cs="맑은 고딕"/>
-          <w:b w:val="0"/>
-          <w:sz w:val="20"/>
-          <w:szCs w:val="22"/>
-        </w:rPr>
-      </w:r>
-      <w:proofErr w:type="spellStart"/>
-      <w:r>
-        <w:rPr>
-          <w:rFonts w:ascii="맑은 고딕" w:eastAsia="맑은 고딕" w:hAnsi="맑은 고딕" w:cs="맑은 고딕"/>
-          <w:b w:val="0"/>
-          <w:sz w:val="20"/>
-          <w:szCs w:val="22"/>
-        </w:rPr>
-      </w:r>
-      <w:proofErr w:type="spellEnd"/>
-      <w:r>
-        <w:rPr>
-          <w:rFonts w:ascii="맑은 고딕" w:eastAsia="맑은 고딕" w:hAnsi="맑은 고딕" w:cs="맑은 고딕"/>
-          <w:b w:val="0"/>
-          <w:sz w:val="20"/>
+          <w:rFonts w:ascii="Calibri" w:eastAsia="맑은 고딕" w:hAnsi="Calibri" w:cs="Calibri"/>
+          <w:b w:val="0"/>
+          <w:sz w:val="22"/>
+          <w:szCs w:val="22"/>
+        </w:rPr>
+      </w:r>
+      <w:proofErr w:type="spellStart"/>
+      <w:r>
+        <w:rPr>
+          <w:rFonts w:ascii="Calibri" w:eastAsia="맑은 고딕" w:hAnsi="Calibri" w:cs="Calibri"/>
+          <w:b w:val="0"/>
+          <w:sz w:val="22"/>
+          <w:szCs w:val="22"/>
+        </w:rPr>
+      </w:r>
+      <w:proofErr w:type="spellEnd"/>
+      <w:r>
+        <w:rPr>
+          <w:rFonts w:ascii="Calibri" w:eastAsia="맑은 고딕" w:hAnsi="Calibri" w:cs="Calibri"/>
+          <w:b w:val="0"/>
+          <w:sz w:val="22"/>
+          <w:szCs w:val="22"/>
+        </w:rPr>
+      </w:r>
+      <w:proofErr w:type="spellStart"/>
+      <w:r>
+        <w:rPr>
+          <w:rFonts w:ascii="Calibri" w:eastAsia="맑은 고딕" w:hAnsi="Calibri" w:cs="Calibri"/>
+          <w:b w:val="0"/>
+          <w:sz w:val="22"/>
+          <w:szCs w:val="22"/>
+        </w:rPr>
+      </w:r>
+      <w:proofErr w:type="spellEnd"/>
+      <w:r>
+        <w:rPr>
+          <w:rFonts w:ascii="Calibri" w:eastAsia="맑은 고딕" w:hAnsi="Calibri" w:cs="Calibri"/>
+          <w:b w:val="0"/>
+          <w:sz w:val="22"/>
           <w:szCs w:val="22"/>
         </w:rPr>
       </w:r>
@@ -2312,55 +2136,55 @@
       </w:pPr>
       <w:r>
         <w:rPr>
-          <w:rFonts w:eastAsia="맑은 고딕" w:ascii="맑은 고딕" w:hAnsi="맑은 고딕" w:cs="맑은 고딕"/>
-          <w:b w:val="0"/>
-          <w:bCs/>
-          <w:sz w:val="20"/>
+          <w:rFonts w:eastAsia="맑은 고딕"/>
+          <w:b w:val="0"/>
+          <w:bCs/>
+          <w:sz w:val="22"/>
           <w:szCs w:val="22"/>
         </w:rPr>
         <w:t>• 크롤링으로 데이터를 모으고 정제, 검증, 저장까지 이어지는 자동화 파이프라인을 구축해 수작업 수집을 대체</w:t>
       </w:r>
       <w:r>
         <w:rPr>
-          <w:rFonts w:ascii="맑은 고딕" w:eastAsia="맑은 고딕" w:hAnsi="맑은 고딕" w:cs="맑은 고딕"/>
-          <w:b w:val="0"/>
-          <w:sz w:val="20"/>
-          <w:szCs w:val="22"/>
-        </w:rPr>
-      </w:r>
-      <w:proofErr w:type="spellStart"/>
-      <w:r>
-        <w:rPr>
-          <w:rFonts w:ascii="맑은 고딕" w:eastAsia="맑은 고딕" w:hAnsi="맑은 고딕" w:cs="맑은 고딕"/>
-          <w:b w:val="0"/>
-          <w:sz w:val="20"/>
-          <w:szCs w:val="22"/>
-        </w:rPr>
-      </w:r>
-      <w:proofErr w:type="spellEnd"/>
-      <w:r>
-        <w:rPr>
-          <w:rFonts w:ascii="맑은 고딕" w:eastAsia="맑은 고딕" w:hAnsi="맑은 고딕" w:cs="맑은 고딕"/>
-          <w:b w:val="0"/>
-          <w:sz w:val="20"/>
-          <w:szCs w:val="22"/>
-        </w:rPr>
-      </w:r>
-      <w:proofErr w:type="spellStart"/>
-      <w:r>
-        <w:rPr>
-          <w:rFonts w:ascii="맑은 고딕" w:eastAsia="맑은 고딕" w:hAnsi="맑은 고딕" w:cs="맑은 고딕"/>
-          <w:b w:val="0"/>
-          <w:sz w:val="20"/>
-          <w:szCs w:val="22"/>
-        </w:rPr>
-      </w:r>
-      <w:proofErr w:type="spellEnd"/>
-      <w:r>
-        <w:rPr>
-          <w:rFonts w:ascii="맑은 고딕" w:eastAsia="맑은 고딕" w:hAnsi="맑은 고딕" w:cs="맑은 고딕"/>
-          <w:b w:val="0"/>
-          <w:sz w:val="20"/>
+          <w:rFonts w:ascii="Calibri" w:eastAsia="맑은 고딕" w:hAnsi="Calibri" w:cs="Calibri"/>
+          <w:b w:val="0"/>
+          <w:sz w:val="22"/>
+          <w:szCs w:val="22"/>
+        </w:rPr>
+      </w:r>
+      <w:proofErr w:type="spellStart"/>
+      <w:r>
+        <w:rPr>
+          <w:rFonts w:ascii="Calibri" w:eastAsia="맑은 고딕" w:hAnsi="Calibri" w:cs="Calibri"/>
+          <w:b w:val="0"/>
+          <w:sz w:val="22"/>
+          <w:szCs w:val="22"/>
+        </w:rPr>
+      </w:r>
+      <w:proofErr w:type="spellEnd"/>
+      <w:r>
+        <w:rPr>
+          <w:rFonts w:ascii="Calibri" w:eastAsia="맑은 고딕" w:hAnsi="Calibri" w:cs="Calibri"/>
+          <w:b w:val="0"/>
+          <w:sz w:val="22"/>
+          <w:szCs w:val="22"/>
+        </w:rPr>
+      </w:r>
+      <w:proofErr w:type="spellStart"/>
+      <w:r>
+        <w:rPr>
+          <w:rFonts w:ascii="Calibri" w:eastAsia="맑은 고딕" w:hAnsi="Calibri" w:cs="Calibri"/>
+          <w:b w:val="0"/>
+          <w:sz w:val="22"/>
+          <w:szCs w:val="22"/>
+        </w:rPr>
+      </w:r>
+      <w:proofErr w:type="spellEnd"/>
+      <w:r>
+        <w:rPr>
+          <w:rFonts w:ascii="Calibri" w:eastAsia="맑은 고딕" w:hAnsi="Calibri" w:cs="Calibri"/>
+          <w:b w:val="0"/>
+          <w:sz w:val="22"/>
           <w:szCs w:val="22"/>
         </w:rPr>
       </w:r>
@@ -2372,55 +2196,55 @@
       </w:pPr>
       <w:r>
         <w:rPr>
-          <w:rFonts w:eastAsia="맑은 고딕" w:ascii="맑은 고딕" w:hAnsi="맑은 고딕" w:cs="맑은 고딕"/>
-          <w:b w:val="0"/>
-          <w:bCs/>
-          <w:sz w:val="20"/>
+          <w:rFonts w:eastAsia="맑은 고딕"/>
+          <w:b w:val="0"/>
+          <w:bCs/>
+          <w:sz w:val="22"/>
           <w:szCs w:val="22"/>
         </w:rPr>
         <w:t>• 기술: Python, Pandas, NumPy, SQL</w:t>
       </w:r>
       <w:r>
         <w:rPr>
-          <w:rFonts w:ascii="맑은 고딕" w:eastAsia="맑은 고딕" w:hAnsi="맑은 고딕" w:cs="맑은 고딕"/>
-          <w:b w:val="0"/>
-          <w:sz w:val="20"/>
-          <w:szCs w:val="22"/>
-        </w:rPr>
-      </w:r>
-      <w:proofErr w:type="spellStart"/>
-      <w:r>
-        <w:rPr>
-          <w:rFonts w:ascii="맑은 고딕" w:eastAsia="맑은 고딕" w:hAnsi="맑은 고딕" w:cs="맑은 고딕"/>
-          <w:b w:val="0"/>
-          <w:sz w:val="20"/>
-          <w:szCs w:val="22"/>
-        </w:rPr>
-      </w:r>
-      <w:proofErr w:type="spellEnd"/>
-      <w:r>
-        <w:rPr>
-          <w:rFonts w:ascii="맑은 고딕" w:eastAsia="맑은 고딕" w:hAnsi="맑은 고딕" w:cs="맑은 고딕"/>
-          <w:b w:val="0"/>
-          <w:sz w:val="20"/>
-          <w:szCs w:val="22"/>
-        </w:rPr>
-      </w:r>
-      <w:proofErr w:type="spellStart"/>
-      <w:r>
-        <w:rPr>
-          <w:rFonts w:ascii="맑은 고딕" w:eastAsia="맑은 고딕" w:hAnsi="맑은 고딕" w:cs="맑은 고딕"/>
-          <w:b w:val="0"/>
-          <w:sz w:val="20"/>
-          <w:szCs w:val="22"/>
-        </w:rPr>
-      </w:r>
-      <w:proofErr w:type="spellEnd"/>
-      <w:r>
-        <w:rPr>
-          <w:rFonts w:ascii="맑은 고딕" w:eastAsia="맑은 고딕" w:hAnsi="맑은 고딕" w:cs="맑은 고딕"/>
-          <w:b w:val="0"/>
-          <w:sz w:val="20"/>
+          <w:rFonts w:ascii="Calibri" w:eastAsia="맑은 고딕" w:hAnsi="Calibri" w:cs="Calibri"/>
+          <w:b w:val="0"/>
+          <w:sz w:val="22"/>
+          <w:szCs w:val="22"/>
+        </w:rPr>
+      </w:r>
+      <w:proofErr w:type="spellStart"/>
+      <w:r>
+        <w:rPr>
+          <w:rFonts w:ascii="Calibri" w:eastAsia="맑은 고딕" w:hAnsi="Calibri" w:cs="Calibri"/>
+          <w:b w:val="0"/>
+          <w:sz w:val="22"/>
+          <w:szCs w:val="22"/>
+        </w:rPr>
+      </w:r>
+      <w:proofErr w:type="spellEnd"/>
+      <w:r>
+        <w:rPr>
+          <w:rFonts w:ascii="Calibri" w:eastAsia="맑은 고딕" w:hAnsi="Calibri" w:cs="Calibri"/>
+          <w:b w:val="0"/>
+          <w:sz w:val="22"/>
+          <w:szCs w:val="22"/>
+        </w:rPr>
+      </w:r>
+      <w:proofErr w:type="spellStart"/>
+      <w:r>
+        <w:rPr>
+          <w:rFonts w:ascii="Calibri" w:eastAsia="맑은 고딕" w:hAnsi="Calibri" w:cs="Calibri"/>
+          <w:b w:val="0"/>
+          <w:sz w:val="22"/>
+          <w:szCs w:val="22"/>
+        </w:rPr>
+      </w:r>
+      <w:proofErr w:type="spellEnd"/>
+      <w:r>
+        <w:rPr>
+          <w:rFonts w:ascii="Calibri" w:eastAsia="맑은 고딕" w:hAnsi="Calibri" w:cs="Calibri"/>
+          <w:b w:val="0"/>
+          <w:sz w:val="22"/>
           <w:szCs w:val="22"/>
         </w:rPr>
       </w:r>
@@ -2434,10 +2258,6 @@
         <w:spacing w:before="160" w:after="80"/>
       </w:pPr>
       <w:r>
-        <w:rPr>
-          <w:rFonts w:ascii="맑은 고딕" w:hAnsi="맑은 고딕" w:eastAsia="맑은 고딕" w:cs="맑은 고딕"/>
-          <w:sz w:val="26"/>
-        </w:rPr>
         <w:t>KISTI</w:t>
       </w:r>
     </w:p>
@@ -2447,7 +2267,7 @@
       </w:pPr>
       <w:r>
         <w:rPr>
-          <w:rFonts w:ascii="맑은 고딕" w:eastAsia="맑은 고딕" w:hAnsi="맑은 고딕" w:cs="맑은 고딕"/>
+          <w:rFonts w:ascii="Calibri" w:eastAsia="맑은 고딕" w:hAnsi="Calibri" w:cs="Calibri"/>
           <w:b w:val="0"/>
           <w:bCs/>
           <w:color w:val="333333"/>
@@ -2459,7 +2279,7 @@
       <w:proofErr w:type="gramStart"/>
       <w:r>
         <w:rPr>
-          <w:rFonts w:ascii="맑은 고딕" w:eastAsia="맑은 고딕" w:hAnsi="맑은 고딕" w:cs="맑은 고딕"/>
+          <w:rFonts w:ascii="Calibri" w:eastAsia="맑은 고딕" w:hAnsi="Calibri" w:cs="Calibri"/>
           <w:b w:val="0"/>
           <w:bCs/>
           <w:color w:val="333333"/>
@@ -2469,7 +2289,7 @@
       </w:r>
       <w:r>
         <w:rPr>
-          <w:rFonts w:eastAsia="맑은 고딕" w:ascii="맑은 고딕" w:hAnsi="맑은 고딕" w:cs="맑은 고딕"/>
+          <w:rFonts w:eastAsia="맑은 고딕"/>
           <w:b w:val="0"/>
           <w:sz w:val="24"/>
           <w:szCs w:val="24"/>
@@ -2477,35 +2297,35 @@
       </w:r>
       <w:r>
         <w:rPr>
-          <w:rFonts w:ascii="맑은 고딕" w:eastAsia="맑은 고딕" w:hAnsi="맑은 고딕" w:cs="맑은 고딕"/>
+          <w:rFonts w:ascii="Calibri" w:eastAsia="맑은 고딕" w:hAnsi="Calibri" w:cs="Calibri"/>
           <w:b w:val="0"/>
           <w:i/>
           <w:iCs/>
           <w:color w:val="666666"/>
-          <w:sz w:val="20"/>
+          <w:sz w:val="22"/>
           <w:szCs w:val="22"/>
         </w:rPr>
       </w:r>
       <w:proofErr w:type="gramEnd"/>
       <w:r>
         <w:rPr>
-          <w:rFonts w:ascii="맑은 고딕" w:eastAsia="맑은 고딕" w:hAnsi="맑은 고딕" w:cs="맑은 고딕"/>
+          <w:rFonts w:ascii="Calibri" w:eastAsia="맑은 고딕" w:hAnsi="Calibri" w:cs="Calibri"/>
           <w:b w:val="0"/>
           <w:i/>
           <w:iCs/>
           <w:color w:val="666666"/>
-          <w:sz w:val="20"/>
-          <w:szCs w:val="22"/>
-        </w:rPr>
-      </w:r>
-    </w:p>
-    <w:p>
-      <w:pPr>
-        <w:spacing w:after="40" w:line="240" w:lineRule="auto"/>
-      </w:pPr>
-      <w:r>
-        <w:rPr>
-          <w:rFonts w:ascii="맑은 고딕" w:eastAsia="맑은 고딕" w:hAnsi="맑은 고딕" w:cs="맑은 고딕"/>
+          <w:sz w:val="22"/>
+          <w:szCs w:val="22"/>
+        </w:rPr>
+      </w:r>
+    </w:p>
+    <w:p>
+      <w:pPr>
+        <w:spacing w:after="40" w:line="240" w:lineRule="auto"/>
+      </w:pPr>
+      <w:r>
+        <w:rPr>
+          <w:rFonts w:ascii="맑은 고딕" w:eastAsia="맑은 고딕" w:hAnsi="맑은 고딕" w:cs="Calibri"/>
           <w:b/>
           <w:bCs/>
           <w:color w:val="333333"/>
@@ -2522,55 +2342,55 @@
       </w:pPr>
       <w:r>
         <w:rPr>
-          <w:rFonts w:eastAsia="맑은 고딕" w:ascii="맑은 고딕" w:hAnsi="맑은 고딕" w:cs="맑은 고딕"/>
-          <w:b w:val="0"/>
-          <w:bCs/>
-          <w:sz w:val="20"/>
+          <w:rFonts w:eastAsia="맑은 고딕"/>
+          <w:b w:val="0"/>
+          <w:bCs/>
+          <w:sz w:val="22"/>
           <w:szCs w:val="22"/>
         </w:rPr>
         <w:t>• 한국어 고어(古語) 데이터 정제 및 전처리 작업 수행</w:t>
       </w:r>
       <w:r>
         <w:rPr>
-          <w:rFonts w:ascii="맑은 고딕" w:eastAsia="맑은 고딕" w:hAnsi="맑은 고딕" w:cs="맑은 고딕"/>
-          <w:b w:val="0"/>
-          <w:sz w:val="20"/>
-          <w:szCs w:val="22"/>
-        </w:rPr>
-      </w:r>
-      <w:proofErr w:type="spellStart"/>
-      <w:r>
-        <w:rPr>
-          <w:rFonts w:ascii="맑은 고딕" w:eastAsia="맑은 고딕" w:hAnsi="맑은 고딕" w:cs="맑은 고딕"/>
-          <w:b w:val="0"/>
-          <w:sz w:val="20"/>
-          <w:szCs w:val="22"/>
-        </w:rPr>
-      </w:r>
-      <w:proofErr w:type="spellEnd"/>
-      <w:r>
-        <w:rPr>
-          <w:rFonts w:ascii="맑은 고딕" w:eastAsia="맑은 고딕" w:hAnsi="맑은 고딕" w:cs="맑은 고딕"/>
-          <w:b w:val="0"/>
-          <w:sz w:val="20"/>
-          <w:szCs w:val="22"/>
-        </w:rPr>
-      </w:r>
-      <w:proofErr w:type="spellStart"/>
-      <w:r>
-        <w:rPr>
-          <w:rFonts w:ascii="맑은 고딕" w:eastAsia="맑은 고딕" w:hAnsi="맑은 고딕" w:cs="맑은 고딕"/>
-          <w:b w:val="0"/>
-          <w:sz w:val="20"/>
-          <w:szCs w:val="22"/>
-        </w:rPr>
-      </w:r>
-      <w:proofErr w:type="spellEnd"/>
-      <w:r>
-        <w:rPr>
-          <w:rFonts w:ascii="맑은 고딕" w:eastAsia="맑은 고딕" w:hAnsi="맑은 고딕" w:cs="맑은 고딕"/>
-          <w:b w:val="0"/>
-          <w:sz w:val="20"/>
+          <w:rFonts w:ascii="Calibri" w:eastAsia="맑은 고딕" w:hAnsi="Calibri" w:cs="Calibri"/>
+          <w:b w:val="0"/>
+          <w:sz w:val="22"/>
+          <w:szCs w:val="22"/>
+        </w:rPr>
+      </w:r>
+      <w:proofErr w:type="spellStart"/>
+      <w:r>
+        <w:rPr>
+          <w:rFonts w:ascii="Calibri" w:eastAsia="맑은 고딕" w:hAnsi="Calibri" w:cs="Calibri"/>
+          <w:b w:val="0"/>
+          <w:sz w:val="22"/>
+          <w:szCs w:val="22"/>
+        </w:rPr>
+      </w:r>
+      <w:proofErr w:type="spellEnd"/>
+      <w:r>
+        <w:rPr>
+          <w:rFonts w:ascii="Calibri" w:eastAsia="맑은 고딕" w:hAnsi="Calibri" w:cs="Calibri"/>
+          <w:b w:val="0"/>
+          <w:sz w:val="22"/>
+          <w:szCs w:val="22"/>
+        </w:rPr>
+      </w:r>
+      <w:proofErr w:type="spellStart"/>
+      <w:r>
+        <w:rPr>
+          <w:rFonts w:ascii="Calibri" w:eastAsia="맑은 고딕" w:hAnsi="Calibri" w:cs="Calibri"/>
+          <w:b w:val="0"/>
+          <w:sz w:val="22"/>
+          <w:szCs w:val="22"/>
+        </w:rPr>
+      </w:r>
+      <w:proofErr w:type="spellEnd"/>
+      <w:r>
+        <w:rPr>
+          <w:rFonts w:ascii="Calibri" w:eastAsia="맑은 고딕" w:hAnsi="Calibri" w:cs="Calibri"/>
+          <w:b w:val="0"/>
+          <w:sz w:val="22"/>
           <w:szCs w:val="22"/>
         </w:rPr>
       </w:r>
@@ -2584,10 +2404,6 @@
         <w:spacing w:before="160" w:after="80"/>
       </w:pPr>
       <w:r>
-        <w:rPr>
-          <w:rFonts w:ascii="맑은 고딕" w:hAnsi="맑은 고딕" w:eastAsia="맑은 고딕" w:cs="맑은 고딕"/>
-          <w:sz w:val="26"/>
-        </w:rPr>
         <w:t>PERSONAL PROJECTS</w:t>
       </w:r>
     </w:p>
@@ -2597,7 +2413,7 @@
       </w:pPr>
       <w:r>
         <w:rPr>
-          <w:rFonts w:ascii="맑은 고딕" w:eastAsia="맑은 고딕" w:hAnsi="맑은 고딕" w:cs="맑은 고딕"/>
+          <w:rFonts w:ascii="Calibri" w:eastAsia="맑은 고딕" w:hAnsi="Calibri" w:cs="Calibri"/>
           <w:b w:val="0"/>
           <w:bCs/>
           <w:color w:val="333333"/>
@@ -2609,7 +2425,7 @@
       <w:proofErr w:type="gramStart"/>
       <w:r>
         <w:rPr>
-          <w:rFonts w:ascii="맑은 고딕" w:eastAsia="맑은 고딕" w:hAnsi="맑은 고딕" w:cs="맑은 고딕"/>
+          <w:rFonts w:ascii="Calibri" w:eastAsia="맑은 고딕" w:hAnsi="Calibri" w:cs="Calibri"/>
           <w:b w:val="0"/>
           <w:bCs/>
           <w:color w:val="333333"/>
@@ -2619,7 +2435,7 @@
       </w:r>
       <w:r>
         <w:rPr>
-          <w:rFonts w:eastAsia="맑은 고딕" w:ascii="맑은 고딕" w:hAnsi="맑은 고딕" w:cs="맑은 고딕"/>
+          <w:rFonts w:eastAsia="맑은 고딕"/>
           <w:b w:val="0"/>
           <w:sz w:val="24"/>
           <w:szCs w:val="24"/>
@@ -2627,24 +2443,24 @@
       </w:r>
       <w:r>
         <w:rPr>
-          <w:rFonts w:ascii="맑은 고딕" w:eastAsia="맑은 고딕" w:hAnsi="맑은 고딕" w:cs="맑은 고딕"/>
+          <w:rFonts w:ascii="Calibri" w:eastAsia="맑은 고딕" w:hAnsi="Calibri" w:cs="Calibri"/>
           <w:b w:val="0"/>
           <w:i/>
           <w:iCs/>
           <w:color w:val="666666"/>
-          <w:sz w:val="20"/>
+          <w:sz w:val="22"/>
           <w:szCs w:val="22"/>
         </w:rPr>
       </w:r>
       <w:proofErr w:type="gramEnd"/>
       <w:r>
         <w:rPr>
-          <w:rFonts w:ascii="맑은 고딕" w:eastAsia="맑은 고딕" w:hAnsi="맑은 고딕" w:cs="맑은 고딕"/>
+          <w:rFonts w:ascii="Calibri" w:eastAsia="맑은 고딕" w:hAnsi="Calibri" w:cs="Calibri"/>
           <w:b w:val="0"/>
           <w:i/>
           <w:iCs/>
           <w:color w:val="666666"/>
-          <w:sz w:val="20"/>
+          <w:sz w:val="22"/>
           <w:szCs w:val="22"/>
         </w:rPr>
       </w:r>
@@ -2656,19 +2472,19 @@
       </w:pPr>
       <w:r>
         <w:rPr>
-          <w:rFonts w:eastAsia="맑은 고딕" w:ascii="맑은 고딕" w:hAnsi="맑은 고딕" w:cs="맑은 고딕"/>
-          <w:b/>
-          <w:bCs/>
-          <w:sz w:val="20"/>
+          <w:rFonts w:eastAsia="맑은 고딕"/>
+          <w:b/>
+          <w:bCs/>
+          <w:sz w:val="22"/>
           <w:szCs w:val="22"/>
         </w:rPr>
         <w:t>• rag-agent</w:t>
       </w:r>
       <w:r>
         <w:rPr>
-          <w:rFonts w:ascii="맑은 고딕" w:eastAsia="맑은 고딕" w:hAnsi="맑은 고딕" w:cs="맑은 고딕"/>
-          <w:b w:val="0"/>
-          <w:sz w:val="20"/>
+          <w:rFonts w:ascii="Calibri" w:eastAsia="맑은 고딕" w:hAnsi="Calibri" w:cs="Calibri"/>
+          <w:b w:val="0"/>
+          <w:sz w:val="22"/>
           <w:szCs w:val="22"/>
         </w:rPr>
         <w:t xml:space="preserve"> — LangGraph Corrective-RAG + 하이브리드 검색(FAISS·BM25 RRF). 51문항 유형별 평가셋으로 검색/생성 분리 측정, 채점기 결함을 스스로 검출해 6%p 보정</w:t>
@@ -2676,36 +2492,36 @@
       <w:proofErr w:type="spellStart"/>
       <w:r>
         <w:rPr>
-          <w:rFonts w:ascii="맑은 고딕" w:eastAsia="맑은 고딕" w:hAnsi="맑은 고딕" w:cs="맑은 고딕"/>
-          <w:b w:val="0"/>
-          <w:sz w:val="20"/>
-          <w:szCs w:val="22"/>
-        </w:rPr>
-      </w:r>
-      <w:proofErr w:type="spellEnd"/>
-      <w:r>
-        <w:rPr>
-          <w:rFonts w:ascii="맑은 고딕" w:eastAsia="맑은 고딕" w:hAnsi="맑은 고딕" w:cs="맑은 고딕"/>
-          <w:b w:val="0"/>
-          <w:sz w:val="20"/>
-          <w:szCs w:val="22"/>
-        </w:rPr>
-      </w:r>
-      <w:proofErr w:type="spellStart"/>
-      <w:r>
-        <w:rPr>
-          <w:rFonts w:ascii="맑은 고딕" w:eastAsia="맑은 고딕" w:hAnsi="맑은 고딕" w:cs="맑은 고딕"/>
-          <w:b w:val="0"/>
-          <w:sz w:val="20"/>
-          <w:szCs w:val="22"/>
-        </w:rPr>
-      </w:r>
-      <w:proofErr w:type="spellEnd"/>
-      <w:r>
-        <w:rPr>
-          <w:rFonts w:ascii="맑은 고딕" w:eastAsia="맑은 고딕" w:hAnsi="맑은 고딕" w:cs="맑은 고딕"/>
-          <w:b w:val="0"/>
-          <w:sz w:val="20"/>
+          <w:rFonts w:ascii="Calibri" w:eastAsia="맑은 고딕" w:hAnsi="Calibri" w:cs="Calibri"/>
+          <w:b w:val="0"/>
+          <w:sz w:val="22"/>
+          <w:szCs w:val="22"/>
+        </w:rPr>
+      </w:r>
+      <w:proofErr w:type="spellEnd"/>
+      <w:r>
+        <w:rPr>
+          <w:rFonts w:ascii="Calibri" w:eastAsia="맑은 고딕" w:hAnsi="Calibri" w:cs="Calibri"/>
+          <w:b w:val="0"/>
+          <w:sz w:val="22"/>
+          <w:szCs w:val="22"/>
+        </w:rPr>
+      </w:r>
+      <w:proofErr w:type="spellStart"/>
+      <w:r>
+        <w:rPr>
+          <w:rFonts w:ascii="Calibri" w:eastAsia="맑은 고딕" w:hAnsi="Calibri" w:cs="Calibri"/>
+          <w:b w:val="0"/>
+          <w:sz w:val="22"/>
+          <w:szCs w:val="22"/>
+        </w:rPr>
+      </w:r>
+      <w:proofErr w:type="spellEnd"/>
+      <w:r>
+        <w:rPr>
+          <w:rFonts w:ascii="Calibri" w:eastAsia="맑은 고딕" w:hAnsi="Calibri" w:cs="Calibri"/>
+          <w:b w:val="0"/>
+          <w:sz w:val="22"/>
           <w:szCs w:val="22"/>
         </w:rPr>
       </w:r>
@@ -2717,19 +2533,19 @@
       </w:pPr>
       <w:r>
         <w:rPr>
-          <w:rFonts w:eastAsia="맑은 고딕" w:ascii="맑은 고딕" w:hAnsi="맑은 고딕" w:cs="맑은 고딕"/>
-          <w:b/>
-          <w:bCs/>
-          <w:sz w:val="20"/>
+          <w:rFonts w:eastAsia="맑은 고딕"/>
+          <w:b/>
+          <w:bCs/>
+          <w:sz w:val="22"/>
           <w:szCs w:val="22"/>
         </w:rPr>
         <w:t>• portfolio-mcp</w:t>
       </w:r>
       <w:r>
         <w:rPr>
-          <w:rFonts w:ascii="맑은 고딕" w:eastAsia="맑은 고딕" w:hAnsi="맑은 고딕" w:cs="맑은 고딕"/>
-          <w:b w:val="0"/>
-          <w:sz w:val="20"/>
+          <w:rFonts w:ascii="Calibri" w:eastAsia="맑은 고딕" w:hAnsi="Calibri" w:cs="Calibri"/>
+          <w:b w:val="0"/>
+          <w:sz w:val="22"/>
           <w:szCs w:val="22"/>
         </w:rPr>
         <w:t xml:space="preserve"> — 포트폴리오 조회용 MCP 서버·클라이언트 양쪽 구현 (FastMCP, 의존성 2개)</w:t>
@@ -2737,36 +2553,36 @@
       <w:proofErr w:type="spellStart"/>
       <w:r>
         <w:rPr>
-          <w:rFonts w:ascii="맑은 고딕" w:eastAsia="맑은 고딕" w:hAnsi="맑은 고딕" w:cs="맑은 고딕"/>
-          <w:b w:val="0"/>
-          <w:sz w:val="20"/>
-          <w:szCs w:val="22"/>
-        </w:rPr>
-      </w:r>
-      <w:proofErr w:type="spellEnd"/>
-      <w:r>
-        <w:rPr>
-          <w:rFonts w:ascii="맑은 고딕" w:eastAsia="맑은 고딕" w:hAnsi="맑은 고딕" w:cs="맑은 고딕"/>
-          <w:b w:val="0"/>
-          <w:sz w:val="20"/>
-          <w:szCs w:val="22"/>
-        </w:rPr>
-      </w:r>
-      <w:proofErr w:type="spellStart"/>
-      <w:r>
-        <w:rPr>
-          <w:rFonts w:ascii="맑은 고딕" w:eastAsia="맑은 고딕" w:hAnsi="맑은 고딕" w:cs="맑은 고딕"/>
-          <w:b w:val="0"/>
-          <w:sz w:val="20"/>
-          <w:szCs w:val="22"/>
-        </w:rPr>
-      </w:r>
-      <w:proofErr w:type="spellEnd"/>
-      <w:r>
-        <w:rPr>
-          <w:rFonts w:ascii="맑은 고딕" w:eastAsia="맑은 고딕" w:hAnsi="맑은 고딕" w:cs="맑은 고딕"/>
-          <w:b w:val="0"/>
-          <w:sz w:val="20"/>
+          <w:rFonts w:ascii="Calibri" w:eastAsia="맑은 고딕" w:hAnsi="Calibri" w:cs="Calibri"/>
+          <w:b w:val="0"/>
+          <w:sz w:val="22"/>
+          <w:szCs w:val="22"/>
+        </w:rPr>
+      </w:r>
+      <w:proofErr w:type="spellEnd"/>
+      <w:r>
+        <w:rPr>
+          <w:rFonts w:ascii="Calibri" w:eastAsia="맑은 고딕" w:hAnsi="Calibri" w:cs="Calibri"/>
+          <w:b w:val="0"/>
+          <w:sz w:val="22"/>
+          <w:szCs w:val="22"/>
+        </w:rPr>
+      </w:r>
+      <w:proofErr w:type="spellStart"/>
+      <w:r>
+        <w:rPr>
+          <w:rFonts w:ascii="Calibri" w:eastAsia="맑은 고딕" w:hAnsi="Calibri" w:cs="Calibri"/>
+          <w:b w:val="0"/>
+          <w:sz w:val="22"/>
+          <w:szCs w:val="22"/>
+        </w:rPr>
+      </w:r>
+      <w:proofErr w:type="spellEnd"/>
+      <w:r>
+        <w:rPr>
+          <w:rFonts w:ascii="Calibri" w:eastAsia="맑은 고딕" w:hAnsi="Calibri" w:cs="Calibri"/>
+          <w:b w:val="0"/>
+          <w:sz w:val="22"/>
           <w:szCs w:val="22"/>
         </w:rPr>
       </w:r>
@@ -2778,19 +2594,19 @@
       </w:pPr>
       <w:r>
         <w:rPr>
-          <w:rFonts w:eastAsia="맑은 고딕" w:ascii="맑은 고딕" w:hAnsi="맑은 고딕" w:cs="맑은 고딕"/>
-          <w:b/>
-          <w:bCs/>
-          <w:sz w:val="20"/>
+          <w:rFonts w:eastAsia="맑은 고딕"/>
+          <w:b/>
+          <w:bCs/>
+          <w:sz w:val="22"/>
           <w:szCs w:val="22"/>
         </w:rPr>
         <w:t>• pdm-agent</w:t>
       </w:r>
       <w:r>
         <w:rPr>
-          <w:rFonts w:ascii="맑은 고딕" w:eastAsia="맑은 고딕" w:hAnsi="맑은 고딕" w:cs="맑은 고딕"/>
-          <w:b w:val="0"/>
-          <w:sz w:val="20"/>
+          <w:rFonts w:ascii="Calibri" w:eastAsia="맑은 고딕" w:hAnsi="Calibri" w:cs="Calibri"/>
+          <w:b w:val="0"/>
+          <w:sz w:val="22"/>
           <w:szCs w:val="22"/>
         </w:rPr>
         <w:t xml:space="preserve"> — 센서 이상탐지 + LLM 진단 파이프라인. NASA C-MAPSS 검증 — 고장 전 경보 94/100대, RUL 오차(MAE) 12.9사이클(30사이클 전 기준)</w:t>
@@ -2798,36 +2614,36 @@
       <w:proofErr w:type="spellStart"/>
       <w:r>
         <w:rPr>
-          <w:rFonts w:ascii="맑은 고딕" w:eastAsia="맑은 고딕" w:hAnsi="맑은 고딕" w:cs="맑은 고딕"/>
-          <w:b w:val="0"/>
-          <w:sz w:val="20"/>
-          <w:szCs w:val="22"/>
-        </w:rPr>
-      </w:r>
-      <w:proofErr w:type="spellEnd"/>
-      <w:r>
-        <w:rPr>
-          <w:rFonts w:ascii="맑은 고딕" w:eastAsia="맑은 고딕" w:hAnsi="맑은 고딕" w:cs="맑은 고딕"/>
-          <w:b w:val="0"/>
-          <w:sz w:val="20"/>
-          <w:szCs w:val="22"/>
-        </w:rPr>
-      </w:r>
-      <w:proofErr w:type="spellStart"/>
-      <w:r>
-        <w:rPr>
-          <w:rFonts w:ascii="맑은 고딕" w:eastAsia="맑은 고딕" w:hAnsi="맑은 고딕" w:cs="맑은 고딕"/>
-          <w:b w:val="0"/>
-          <w:sz w:val="20"/>
-          <w:szCs w:val="22"/>
-        </w:rPr>
-      </w:r>
-      <w:proofErr w:type="spellEnd"/>
-      <w:r>
-        <w:rPr>
-          <w:rFonts w:ascii="맑은 고딕" w:eastAsia="맑은 고딕" w:hAnsi="맑은 고딕" w:cs="맑은 고딕"/>
-          <w:b w:val="0"/>
-          <w:sz w:val="20"/>
+          <w:rFonts w:ascii="Calibri" w:eastAsia="맑은 고딕" w:hAnsi="Calibri" w:cs="Calibri"/>
+          <w:b w:val="0"/>
+          <w:sz w:val="22"/>
+          <w:szCs w:val="22"/>
+        </w:rPr>
+      </w:r>
+      <w:proofErr w:type="spellEnd"/>
+      <w:r>
+        <w:rPr>
+          <w:rFonts w:ascii="Calibri" w:eastAsia="맑은 고딕" w:hAnsi="Calibri" w:cs="Calibri"/>
+          <w:b w:val="0"/>
+          <w:sz w:val="22"/>
+          <w:szCs w:val="22"/>
+        </w:rPr>
+      </w:r>
+      <w:proofErr w:type="spellStart"/>
+      <w:r>
+        <w:rPr>
+          <w:rFonts w:ascii="Calibri" w:eastAsia="맑은 고딕" w:hAnsi="Calibri" w:cs="Calibri"/>
+          <w:b w:val="0"/>
+          <w:sz w:val="22"/>
+          <w:szCs w:val="22"/>
+        </w:rPr>
+      </w:r>
+      <w:proofErr w:type="spellEnd"/>
+      <w:r>
+        <w:rPr>
+          <w:rFonts w:ascii="Calibri" w:eastAsia="맑은 고딕" w:hAnsi="Calibri" w:cs="Calibri"/>
+          <w:b w:val="0"/>
+          <w:sz w:val="22"/>
           <w:szCs w:val="22"/>
         </w:rPr>
       </w:r>
@@ -2839,19 +2655,19 @@
       </w:pPr>
       <w:r>
         <w:rPr>
-          <w:rFonts w:eastAsia="맑은 고딕" w:ascii="맑은 고딕" w:hAnsi="맑은 고딕" w:cs="맑은 고딕"/>
-          <w:b/>
-          <w:bCs/>
-          <w:sz w:val="20"/>
+          <w:rFonts w:eastAsia="맑은 고딕"/>
+          <w:b/>
+          <w:bCs/>
+          <w:sz w:val="22"/>
           <w:szCs w:val="22"/>
         </w:rPr>
         <w:t>• llm-bench</w:t>
       </w:r>
       <w:r>
         <w:rPr>
-          <w:rFonts w:ascii="맑은 고딕" w:eastAsia="맑은 고딕" w:hAnsi="맑은 고딕" w:cs="맑은 고딕"/>
-          <w:b w:val="0"/>
-          <w:sz w:val="20"/>
+          <w:rFonts w:ascii="Calibri" w:eastAsia="맑은 고딕" w:hAnsi="Calibri" w:cs="Calibri"/>
+          <w:b w:val="0"/>
+          <w:sz w:val="22"/>
           <w:szCs w:val="22"/>
         </w:rPr>
         <w:t xml:space="preserve"> — 추론 벤치마크 CLI. Ollama 직렬화 병목 진단·재측정 — TTFT p50 12.4초→0.93초</w:t>
@@ -2859,36 +2675,36 @@
       <w:proofErr w:type="spellStart"/>
       <w:r>
         <w:rPr>
-          <w:rFonts w:ascii="맑은 고딕" w:eastAsia="맑은 고딕" w:hAnsi="맑은 고딕" w:cs="맑은 고딕"/>
-          <w:b w:val="0"/>
-          <w:sz w:val="20"/>
-          <w:szCs w:val="22"/>
-        </w:rPr>
-      </w:r>
-      <w:proofErr w:type="spellEnd"/>
-      <w:r>
-        <w:rPr>
-          <w:rFonts w:ascii="맑은 고딕" w:eastAsia="맑은 고딕" w:hAnsi="맑은 고딕" w:cs="맑은 고딕"/>
-          <w:b w:val="0"/>
-          <w:sz w:val="20"/>
-          <w:szCs w:val="22"/>
-        </w:rPr>
-      </w:r>
-      <w:proofErr w:type="spellStart"/>
-      <w:r>
-        <w:rPr>
-          <w:rFonts w:ascii="맑은 고딕" w:eastAsia="맑은 고딕" w:hAnsi="맑은 고딕" w:cs="맑은 고딕"/>
-          <w:b w:val="0"/>
-          <w:sz w:val="20"/>
-          <w:szCs w:val="22"/>
-        </w:rPr>
-      </w:r>
-      <w:proofErr w:type="spellEnd"/>
-      <w:r>
-        <w:rPr>
-          <w:rFonts w:ascii="맑은 고딕" w:eastAsia="맑은 고딕" w:hAnsi="맑은 고딕" w:cs="맑은 고딕"/>
-          <w:b w:val="0"/>
-          <w:sz w:val="20"/>
+          <w:rFonts w:ascii="Calibri" w:eastAsia="맑은 고딕" w:hAnsi="Calibri" w:cs="Calibri"/>
+          <w:b w:val="0"/>
+          <w:sz w:val="22"/>
+          <w:szCs w:val="22"/>
+        </w:rPr>
+      </w:r>
+      <w:proofErr w:type="spellEnd"/>
+      <w:r>
+        <w:rPr>
+          <w:rFonts w:ascii="Calibri" w:eastAsia="맑은 고딕" w:hAnsi="Calibri" w:cs="Calibri"/>
+          <w:b w:val="0"/>
+          <w:sz w:val="22"/>
+          <w:szCs w:val="22"/>
+        </w:rPr>
+      </w:r>
+      <w:proofErr w:type="spellStart"/>
+      <w:r>
+        <w:rPr>
+          <w:rFonts w:ascii="Calibri" w:eastAsia="맑은 고딕" w:hAnsi="Calibri" w:cs="Calibri"/>
+          <w:b w:val="0"/>
+          <w:sz w:val="22"/>
+          <w:szCs w:val="22"/>
+        </w:rPr>
+      </w:r>
+      <w:proofErr w:type="spellEnd"/>
+      <w:r>
+        <w:rPr>
+          <w:rFonts w:ascii="Calibri" w:eastAsia="맑은 고딕" w:hAnsi="Calibri" w:cs="Calibri"/>
+          <w:b w:val="0"/>
+          <w:sz w:val="22"/>
           <w:szCs w:val="22"/>
         </w:rPr>
       </w:r>
@@ -2902,10 +2718,6 @@
         <w:spacing w:before="160" w:after="80"/>
       </w:pPr>
       <w:r>
-        <w:rPr>
-          <w:rFonts w:ascii="맑은 고딕" w:hAnsi="맑은 고딕" w:eastAsia="맑은 고딕" w:cs="맑은 고딕"/>
-          <w:sz w:val="26"/>
-        </w:rPr>
         <w:t>TECHNICAL SKILLS</w:t>
       </w:r>
     </w:p>
@@ -2915,18 +2727,18 @@
       </w:pPr>
       <w:r>
         <w:rPr>
-          <w:rFonts w:ascii="맑은 고딕" w:eastAsia="맑은 고딕" w:hAnsi="맑은 고딕" w:cs="맑은 고딕"/>
-          <w:b/>
-          <w:bCs/>
-          <w:sz w:val="20"/>
+          <w:rFonts w:ascii="Calibri" w:eastAsia="맑은 고딕" w:hAnsi="Calibri" w:cs="Calibri"/>
+          <w:b/>
+          <w:bCs/>
+          <w:sz w:val="22"/>
           <w:szCs w:val="22"/>
         </w:rPr>
         <w:t xml:space="preserve">Languages: </w:t>
       </w:r>
       <w:r>
         <w:rPr>
-          <w:rFonts w:ascii="맑은 고딕" w:eastAsia="맑은 고딕" w:hAnsi="맑은 고딕" w:cs="맑은 고딕"/>
-          <w:sz w:val="20"/>
+          <w:rFonts w:ascii="Calibri" w:eastAsia="맑은 고딕" w:hAnsi="Calibri" w:cs="Calibri"/>
+          <w:sz w:val="22"/>
           <w:szCs w:val="22"/>
         </w:rPr>
         <w:t>Python (Expert), TypeScript, Bash, SQL</w:t>
@@ -2938,10 +2750,10 @@
       </w:pPr>
       <w:r>
         <w:rPr>
-          <w:rFonts w:ascii="맑은 고딕" w:eastAsia="맑은 고딕" w:hAnsi="맑은 고딕" w:cs="맑은 고딕"/>
-          <w:b/>
-          <w:bCs/>
-          <w:sz w:val="20"/>
+          <w:rFonts w:ascii="Calibri" w:eastAsia="맑은 고딕" w:hAnsi="Calibri" w:cs="Calibri"/>
+          <w:b/>
+          <w:bCs/>
+          <w:sz w:val="22"/>
           <w:szCs w:val="22"/>
         </w:rPr>
         <w:t xml:space="preserve">AI/ML: </w:t>
@@ -2949,8 +2761,8 @@
       <w:proofErr w:type="spellStart"/>
       <w:r>
         <w:rPr>
-          <w:rFonts w:ascii="맑은 고딕" w:eastAsia="맑은 고딕" w:hAnsi="맑은 고딕" w:cs="맑은 고딕"/>
-          <w:sz w:val="20"/>
+          <w:rFonts w:ascii="Calibri" w:eastAsia="맑은 고딕" w:hAnsi="Calibri" w:cs="Calibri"/>
+          <w:sz w:val="22"/>
           <w:szCs w:val="22"/>
         </w:rPr>
         <w:t>PyTorch</w:t>
@@ -2958,8 +2770,8 @@
       <w:proofErr w:type="spellEnd"/>
       <w:r>
         <w:rPr>
-          <w:rFonts w:ascii="맑은 고딕" w:eastAsia="맑은 고딕" w:hAnsi="맑은 고딕" w:cs="맑은 고딕"/>
-          <w:sz w:val="20"/>
+          <w:rFonts w:ascii="Calibri" w:eastAsia="맑은 고딕" w:hAnsi="Calibri" w:cs="Calibri"/>
+          <w:sz w:val="22"/>
           <w:szCs w:val="22"/>
         </w:rPr>
         <w:t xml:space="preserve">, Hugging Face, </w:t>
@@ -2967,8 +2779,8 @@
       <w:proofErr w:type="spellStart"/>
       <w:r>
         <w:rPr>
-          <w:rFonts w:ascii="맑은 고딕" w:eastAsia="맑은 고딕" w:hAnsi="맑은 고딕" w:cs="맑은 고딕"/>
-          <w:sz w:val="20"/>
+          <w:rFonts w:ascii="Calibri" w:eastAsia="맑은 고딕" w:hAnsi="Calibri" w:cs="Calibri"/>
+          <w:sz w:val="22"/>
           <w:szCs w:val="22"/>
         </w:rPr>
         <w:t>vLLM</w:t>
@@ -2976,8 +2788,8 @@
       <w:proofErr w:type="spellEnd"/>
       <w:r>
         <w:rPr>
-          <w:rFonts w:ascii="맑은 고딕" w:eastAsia="맑은 고딕" w:hAnsi="맑은 고딕" w:cs="맑은 고딕"/>
-          <w:sz w:val="20"/>
+          <w:rFonts w:ascii="Calibri" w:eastAsia="맑은 고딕" w:hAnsi="Calibri" w:cs="Calibri"/>
+          <w:sz w:val="22"/>
           <w:szCs w:val="22"/>
         </w:rPr>
         <w:t>, ONNX Runtime, Whisper</w:t>
@@ -2989,10 +2801,10 @@
       </w:pPr>
       <w:r>
         <w:rPr>
-          <w:rFonts w:ascii="맑은 고딕" w:eastAsia="맑은 고딕" w:hAnsi="맑은 고딕" w:cs="맑은 고딕"/>
-          <w:b/>
-          <w:bCs/>
-          <w:sz w:val="20"/>
+          <w:rFonts w:ascii="Calibri" w:eastAsia="맑은 고딕" w:hAnsi="Calibri" w:cs="Calibri"/>
+          <w:b/>
+          <w:bCs/>
+          <w:sz w:val="22"/>
           <w:szCs w:val="22"/>
         </w:rPr>
         <w:t xml:space="preserve">Model Serving: </w:t>
@@ -3000,8 +2812,8 @@
       <w:proofErr w:type="spellStart"/>
       <w:r>
         <w:rPr>
-          <w:rFonts w:ascii="맑은 고딕" w:eastAsia="맑은 고딕" w:hAnsi="맑은 고딕" w:cs="맑은 고딕"/>
-          <w:sz w:val="20"/>
+          <w:rFonts w:ascii="Calibri" w:eastAsia="맑은 고딕" w:hAnsi="Calibri" w:cs="Calibri"/>
+          <w:sz w:val="22"/>
           <w:szCs w:val="22"/>
         </w:rPr>
         <w:t>vLLM</w:t>
@@ -3009,8 +2821,8 @@
       <w:proofErr w:type="spellEnd"/>
       <w:r>
         <w:rPr>
-          <w:rFonts w:ascii="맑은 고딕" w:eastAsia="맑은 고딕" w:hAnsi="맑은 고딕" w:cs="맑은 고딕"/>
-          <w:sz w:val="20"/>
+          <w:rFonts w:ascii="Calibri" w:eastAsia="맑은 고딕" w:hAnsi="Calibri" w:cs="Calibri"/>
+          <w:sz w:val="22"/>
           <w:szCs w:val="22"/>
         </w:rPr>
         <w:t>, Triton Inference Server, ONNX Runtime</w:t>
@@ -3022,10 +2834,10 @@
       </w:pPr>
       <w:r>
         <w:rPr>
-          <w:rFonts w:ascii="맑은 고딕" w:eastAsia="맑은 고딕" w:hAnsi="맑은 고딕" w:cs="맑은 고딕"/>
-          <w:b/>
-          <w:bCs/>
-          <w:sz w:val="20"/>
+          <w:rFonts w:ascii="Calibri" w:eastAsia="맑은 고딕" w:hAnsi="Calibri" w:cs="Calibri"/>
+          <w:b/>
+          <w:bCs/>
+          <w:sz w:val="22"/>
           <w:szCs w:val="22"/>
         </w:rPr>
         <w:t xml:space="preserve">Backend: </w:t>
@@ -3033,8 +2845,8 @@
       <w:proofErr w:type="spellStart"/>
       <w:r>
         <w:rPr>
-          <w:rFonts w:ascii="맑은 고딕" w:eastAsia="맑은 고딕" w:hAnsi="맑은 고딕" w:cs="맑은 고딕"/>
-          <w:sz w:val="20"/>
+          <w:rFonts w:ascii="Calibri" w:eastAsia="맑은 고딕" w:hAnsi="Calibri" w:cs="Calibri"/>
+          <w:sz w:val="22"/>
           <w:szCs w:val="22"/>
         </w:rPr>
         <w:t>FastAPI</w:t>
@@ -3042,8 +2854,8 @@
       <w:proofErr w:type="spellEnd"/>
       <w:r>
         <w:rPr>
-          <w:rFonts w:ascii="맑은 고딕" w:eastAsia="맑은 고딕" w:hAnsi="맑은 고딕" w:cs="맑은 고딕"/>
-          <w:sz w:val="20"/>
+          <w:rFonts w:ascii="Calibri" w:eastAsia="맑은 고딕" w:hAnsi="Calibri" w:cs="Calibri"/>
+          <w:sz w:val="22"/>
           <w:szCs w:val="22"/>
         </w:rPr>
         <w:t xml:space="preserve">, </w:t>
@@ -3051,8 +2863,8 @@
       <w:proofErr w:type="spellStart"/>
       <w:r>
         <w:rPr>
-          <w:rFonts w:ascii="맑은 고딕" w:eastAsia="맑은 고딕" w:hAnsi="맑은 고딕" w:cs="맑은 고딕"/>
-          <w:sz w:val="20"/>
+          <w:rFonts w:ascii="Calibri" w:eastAsia="맑은 고딕" w:hAnsi="Calibri" w:cs="Calibri"/>
+          <w:sz w:val="22"/>
           <w:szCs w:val="22"/>
         </w:rPr>
         <w:t>gRPC</w:t>
@@ -3060,8 +2872,8 @@
       <w:proofErr w:type="spellEnd"/>
       <w:r>
         <w:rPr>
-          <w:rFonts w:ascii="맑은 고딕" w:eastAsia="맑은 고딕" w:hAnsi="맑은 고딕" w:cs="맑은 고딕"/>
-          <w:sz w:val="20"/>
+          <w:rFonts w:ascii="Calibri" w:eastAsia="맑은 고딕" w:hAnsi="Calibri" w:cs="Calibri"/>
+          <w:sz w:val="22"/>
           <w:szCs w:val="22"/>
         </w:rPr>
         <w:t xml:space="preserve">, WebSocket, REST APIs, </w:t>
@@ -3069,8 +2881,8 @@
       <w:proofErr w:type="spellStart"/>
       <w:r>
         <w:rPr>
-          <w:rFonts w:ascii="맑은 고딕" w:eastAsia="맑은 고딕" w:hAnsi="맑은 고딕" w:cs="맑은 고딕"/>
-          <w:sz w:val="20"/>
+          <w:rFonts w:ascii="Calibri" w:eastAsia="맑은 고딕" w:hAnsi="Calibri" w:cs="Calibri"/>
+          <w:sz w:val="22"/>
           <w:szCs w:val="22"/>
         </w:rPr>
         <w:t>Asyncio</w:t>
@@ -3083,18 +2895,18 @@
       </w:pPr>
       <w:r>
         <w:rPr>
-          <w:rFonts w:ascii="맑은 고딕" w:eastAsia="맑은 고딕" w:hAnsi="맑은 고딕" w:cs="맑은 고딕"/>
-          <w:b/>
-          <w:bCs/>
-          <w:sz w:val="20"/>
+          <w:rFonts w:ascii="Calibri" w:eastAsia="맑은 고딕" w:hAnsi="Calibri" w:cs="Calibri"/>
+          <w:b/>
+          <w:bCs/>
+          <w:sz w:val="22"/>
           <w:szCs w:val="22"/>
         </w:rPr>
         <w:t xml:space="preserve">DevOps: </w:t>
       </w:r>
       <w:r>
         <w:rPr>
-          <w:rFonts w:ascii="맑은 고딕" w:eastAsia="맑은 고딕" w:hAnsi="맑은 고딕" w:cs="맑은 고딕"/>
-          <w:sz w:val="20"/>
+          <w:rFonts w:ascii="Calibri" w:eastAsia="맑은 고딕" w:hAnsi="Calibri" w:cs="Calibri"/>
+          <w:sz w:val="22"/>
           <w:szCs w:val="22"/>
         </w:rPr>
         <w:t xml:space="preserve">Kubernetes, Docker, GitLab CI, Jenkins, </w:t>
@@ -3102,8 +2914,8 @@
       <w:proofErr w:type="spellStart"/>
       <w:r>
         <w:rPr>
-          <w:rFonts w:ascii="맑은 고딕" w:eastAsia="맑은 고딕" w:hAnsi="맑은 고딕" w:cs="맑은 고딕"/>
-          <w:sz w:val="20"/>
+          <w:rFonts w:ascii="Calibri" w:eastAsia="맑은 고딕" w:hAnsi="Calibri" w:cs="Calibri"/>
+          <w:sz w:val="22"/>
           <w:szCs w:val="22"/>
         </w:rPr>
         <w:t>ArgoCD</w:t>
@@ -3111,8 +2923,8 @@
       <w:proofErr w:type="spellEnd"/>
       <w:r>
         <w:rPr>
-          <w:rFonts w:ascii="맑은 고딕" w:eastAsia="맑은 고딕" w:hAnsi="맑은 고딕" w:cs="맑은 고딕"/>
-          <w:sz w:val="20"/>
+          <w:rFonts w:ascii="Calibri" w:eastAsia="맑은 고딕" w:hAnsi="Calibri" w:cs="Calibri"/>
+          <w:sz w:val="22"/>
           <w:szCs w:val="22"/>
         </w:rPr>
         <w:t>, Harbor, Nginx</w:t>
@@ -3124,18 +2936,18 @@
       </w:pPr>
       <w:r>
         <w:rPr>
-          <w:rFonts w:ascii="맑은 고딕" w:eastAsia="맑은 고딕" w:hAnsi="맑은 고딕" w:cs="맑은 고딕"/>
-          <w:b/>
-          <w:bCs/>
-          <w:sz w:val="20"/>
+          <w:rFonts w:ascii="Calibri" w:eastAsia="맑은 고딕" w:hAnsi="Calibri" w:cs="Calibri"/>
+          <w:b/>
+          <w:bCs/>
+          <w:sz w:val="22"/>
           <w:szCs w:val="22"/>
         </w:rPr>
         <w:t xml:space="preserve">Data &amp; Storage: </w:t>
       </w:r>
       <w:r>
         <w:rPr>
-          <w:rFonts w:ascii="맑은 고딕" w:eastAsia="맑은 고딕" w:hAnsi="맑은 고딕" w:cs="맑은 고딕"/>
-          <w:sz w:val="20"/>
+          <w:rFonts w:ascii="Calibri" w:eastAsia="맑은 고딕" w:hAnsi="Calibri" w:cs="Calibri"/>
+          <w:sz w:val="22"/>
           <w:szCs w:val="22"/>
         </w:rPr>
         <w:t>Redis, PostgreSQL, MongoDB, S3, NFS</w:t>
@@ -3147,18 +2959,18 @@
       </w:pPr>
       <w:r>
         <w:rPr>
-          <w:rFonts w:ascii="맑은 고딕" w:eastAsia="맑은 고딕" w:hAnsi="맑은 고딕" w:cs="맑은 고딕"/>
-          <w:b/>
-          <w:bCs/>
-          <w:sz w:val="20"/>
+          <w:rFonts w:ascii="Calibri" w:eastAsia="맑은 고딕" w:hAnsi="Calibri" w:cs="Calibri"/>
+          <w:b/>
+          <w:bCs/>
+          <w:sz w:val="22"/>
           <w:szCs w:val="22"/>
         </w:rPr>
         <w:t xml:space="preserve">Monitoring: </w:t>
       </w:r>
       <w:r>
         <w:rPr>
-          <w:rFonts w:ascii="맑은 고딕" w:eastAsia="맑은 고딕" w:hAnsi="맑은 고딕" w:cs="맑은 고딕"/>
-          <w:sz w:val="20"/>
+          <w:rFonts w:ascii="Calibri" w:eastAsia="맑은 고딕" w:hAnsi="Calibri" w:cs="Calibri"/>
+          <w:sz w:val="22"/>
           <w:szCs w:val="22"/>
         </w:rPr>
         <w:t xml:space="preserve">Prometheus, Grafana, Loki, ELK Stack, </w:t>
@@ -3166,8 +2978,8 @@
       <w:proofErr w:type="spellStart"/>
       <w:r>
         <w:rPr>
-          <w:rFonts w:ascii="맑은 고딕" w:eastAsia="맑은 고딕" w:hAnsi="맑은 고딕" w:cs="맑은 고딕"/>
-          <w:sz w:val="20"/>
+          <w:rFonts w:ascii="Calibri" w:eastAsia="맑은 고딕" w:hAnsi="Calibri" w:cs="Calibri"/>
+          <w:sz w:val="22"/>
           <w:szCs w:val="22"/>
         </w:rPr>
         <w:t>AlertManager</w:t>
@@ -3183,10 +2995,6 @@
         <w:spacing w:before="160" w:after="80"/>
       </w:pPr>
       <w:r>
-        <w:rPr>
-          <w:rFonts w:ascii="맑은 고딕" w:hAnsi="맑은 고딕" w:eastAsia="맑은 고딕" w:cs="맑은 고딕"/>
-          <w:sz w:val="26"/>
-        </w:rPr>
         <w:t>EDUCATION &amp; CREDENTIALS</w:t>
       </w:r>
     </w:p>
@@ -3196,10 +3004,10 @@
       </w:pPr>
       <w:r>
         <w:rPr>
-          <w:rFonts w:ascii="맑은 고딕" w:eastAsia="맑은 고딕" w:hAnsi="맑은 고딕" w:cs="맑은 고딕"/>
-          <w:b/>
-          <w:bCs/>
-          <w:sz w:val="20"/>
+          <w:rFonts w:ascii="Calibri" w:eastAsia="맑은 고딕" w:hAnsi="Calibri" w:cs="Calibri"/>
+          <w:b/>
+          <w:bCs/>
+          <w:sz w:val="22"/>
           <w:szCs w:val="22"/>
         </w:rPr>
         <w:t>M.S. Computer Science  |  Inha University (2021.08)</w:t>
@@ -3207,39 +3015,39 @@
       <w:proofErr w:type="gramStart"/>
       <w:r>
         <w:rPr>
-          <w:rFonts w:ascii="맑은 고딕" w:eastAsia="맑은 고딕" w:hAnsi="맑은 고딕" w:cs="맑은 고딕"/>
-          <w:b/>
-          <w:bCs/>
-          <w:sz w:val="20"/>
-          <w:szCs w:val="22"/>
-        </w:rPr>
-      </w:r>
-      <w:r>
-        <w:rPr>
-          <w:rFonts w:ascii="맑은 고딕" w:eastAsia="맑은 고딕" w:hAnsi="맑은 고딕" w:cs="맑은 고딕"/>
-          <w:sz w:val="20"/>
+          <w:rFonts w:ascii="Calibri" w:eastAsia="맑은 고딕" w:hAnsi="Calibri" w:cs="Calibri"/>
+          <w:b/>
+          <w:bCs/>
+          <w:sz w:val="22"/>
+          <w:szCs w:val="22"/>
+        </w:rPr>
+      </w:r>
+      <w:r>
+        <w:rPr>
+          <w:rFonts w:ascii="Calibri" w:eastAsia="맑은 고딕" w:hAnsi="Calibri" w:cs="Calibri"/>
+          <w:sz w:val="22"/>
           <w:szCs w:val="22"/>
         </w:rPr>
       </w:r>
       <w:proofErr w:type="gramEnd"/>
       <w:r>
         <w:rPr>
-          <w:rFonts w:ascii="맑은 고딕" w:eastAsia="맑은 고딕" w:hAnsi="맑은 고딕" w:cs="맑은 고딕"/>
-          <w:sz w:val="20"/>
-          <w:szCs w:val="22"/>
-        </w:rPr>
-      </w:r>
-    </w:p>
-    <w:p>
-      <w:pPr>
-        <w:spacing w:after="40" w:line="240" w:lineRule="auto"/>
-      </w:pPr>
-      <w:r>
-        <w:rPr>
-          <w:rFonts w:ascii="맑은 고딕" w:eastAsia="맑은 고딕" w:hAnsi="맑은 고딕" w:cs="맑은 고딕"/>
-          <w:b/>
-          <w:bCs/>
-          <w:sz w:val="20"/>
+          <w:rFonts w:ascii="Calibri" w:eastAsia="맑은 고딕" w:hAnsi="Calibri" w:cs="Calibri"/>
+          <w:sz w:val="22"/>
+          <w:szCs w:val="22"/>
+        </w:rPr>
+      </w:r>
+    </w:p>
+    <w:p>
+      <w:pPr>
+        <w:spacing w:after="40" w:line="240" w:lineRule="auto"/>
+      </w:pPr>
+      <w:r>
+        <w:rPr>
+          <w:rFonts w:ascii="Calibri" w:eastAsia="맑은 고딕" w:hAnsi="Calibri" w:cs="Calibri"/>
+          <w:b/>
+          <w:bCs/>
+          <w:sz w:val="22"/>
           <w:szCs w:val="22"/>
         </w:rPr>
         <w:t>B.S. Computer Science  |  Hannam University (2018.02)</w:t>
@@ -3247,25 +3055,25 @@
       <w:proofErr w:type="gramStart"/>
       <w:r>
         <w:rPr>
-          <w:rFonts w:ascii="맑은 고딕" w:eastAsia="맑은 고딕" w:hAnsi="맑은 고딕" w:cs="맑은 고딕"/>
-          <w:b/>
-          <w:bCs/>
-          <w:sz w:val="20"/>
-          <w:szCs w:val="22"/>
-        </w:rPr>
-      </w:r>
-      <w:r>
-        <w:rPr>
-          <w:rFonts w:ascii="맑은 고딕" w:eastAsia="맑은 고딕" w:hAnsi="맑은 고딕" w:cs="맑은 고딕"/>
-          <w:sz w:val="20"/>
+          <w:rFonts w:ascii="Calibri" w:eastAsia="맑은 고딕" w:hAnsi="Calibri" w:cs="Calibri"/>
+          <w:b/>
+          <w:bCs/>
+          <w:sz w:val="22"/>
+          <w:szCs w:val="22"/>
+        </w:rPr>
+      </w:r>
+      <w:r>
+        <w:rPr>
+          <w:rFonts w:ascii="Calibri" w:eastAsia="맑은 고딕" w:hAnsi="Calibri" w:cs="Calibri"/>
+          <w:sz w:val="22"/>
           <w:szCs w:val="22"/>
         </w:rPr>
       </w:r>
       <w:proofErr w:type="gramEnd"/>
       <w:r>
         <w:rPr>
-          <w:rFonts w:ascii="맑은 고딕" w:eastAsia="맑은 고딕" w:hAnsi="맑은 고딕" w:cs="맑은 고딕"/>
-          <w:sz w:val="20"/>
+          <w:rFonts w:ascii="Calibri" w:eastAsia="맑은 고딕" w:hAnsi="Calibri" w:cs="Calibri"/>
+          <w:sz w:val="22"/>
           <w:szCs w:val="22"/>
         </w:rPr>
       </w:r>
@@ -3276,18 +3084,18 @@
       </w:pPr>
       <w:r>
         <w:rPr>
-          <w:rFonts w:ascii="맑은 고딕" w:eastAsia="맑은 고딕" w:hAnsi="맑은 고딕" w:cs="맑은 고딕"/>
-          <w:b/>
-          <w:bCs/>
-          <w:sz w:val="20"/>
+          <w:rFonts w:ascii="Calibri" w:eastAsia="맑은 고딕" w:hAnsi="Calibri" w:cs="Calibri"/>
+          <w:b/>
+          <w:bCs/>
+          <w:sz w:val="22"/>
           <w:szCs w:val="22"/>
         </w:rPr>
         <w:t xml:space="preserve">Certifications: </w:t>
       </w:r>
       <w:r>
         <w:rPr>
-          <w:rFonts w:ascii="맑은 고딕" w:eastAsia="맑은 고딕" w:hAnsi="맑은 고딕" w:cs="맑은 고딕"/>
-          <w:sz w:val="20"/>
+          <w:rFonts w:ascii="Calibri" w:eastAsia="맑은 고딕" w:hAnsi="Calibri" w:cs="Calibri"/>
+          <w:sz w:val="22"/>
           <w:szCs w:val="22"/>
         </w:rPr>
         <w:t>Linux Master (2016), Data Analytics Semi-Professional (2021)</w:t>
@@ -3299,18 +3107,18 @@
       </w:pPr>
       <w:r>
         <w:rPr>
-          <w:rFonts w:ascii="맑은 고딕" w:eastAsia="맑은 고딕" w:hAnsi="맑은 고딕" w:cs="맑은 고딕"/>
-          <w:b/>
-          <w:bCs/>
-          <w:sz w:val="20"/>
+          <w:rFonts w:ascii="Calibri" w:eastAsia="맑은 고딕" w:hAnsi="Calibri" w:cs="Calibri"/>
+          <w:b/>
+          <w:bCs/>
+          <w:sz w:val="22"/>
           <w:szCs w:val="22"/>
         </w:rPr>
         <w:t>Language: English (Intermediate, OPIc IM1)</w:t>
       </w:r>
       <w:r>
         <w:rPr>
-          <w:rFonts w:ascii="맑은 고딕" w:eastAsia="맑은 고딕" w:hAnsi="맑은 고딕" w:cs="맑은 고딕"/>
-          <w:sz w:val="20"/>
+          <w:rFonts w:ascii="Calibri" w:eastAsia="맑은 고딕" w:hAnsi="Calibri" w:cs="Calibri"/>
+          <w:sz w:val="22"/>
           <w:szCs w:val="22"/>
         </w:rPr>
       </w:r>
@@ -3324,23 +3132,19 @@
         <w:spacing w:before="160" w:after="80"/>
       </w:pPr>
       <w:r>
-        <w:rPr>
-          <w:rFonts w:ascii="맑은 고딕" w:hAnsi="맑은 고딕" w:eastAsia="맑은 고딕" w:cs="맑은 고딕"/>
-          <w:sz w:val="26"/>
-        </w:rPr>
         <w:t>PUBLICATIONS &amp; PATENTS</w:t>
       </w:r>
     </w:p>
     <w:p>
       <w:pPr>
-        <w:spacing w:after="0" w:line="240" w:lineRule="auto"/>
-      </w:pPr>
-      <w:r>
-        <w:rPr>
-          <w:rFonts w:ascii="맑은 고딕" w:eastAsia="맑은 고딕" w:hAnsi="맑은 고딕" w:cs="맑은 고딕"/>
-          <w:b/>
-          <w:bCs/>
-          <w:sz w:val="20"/>
+        <w:spacing w:after="40" w:line="240" w:lineRule="auto"/>
+      </w:pPr>
+      <w:r>
+        <w:rPr>
+          <w:rFonts w:ascii="Calibri" w:eastAsia="맑은 고딕" w:hAnsi="Calibri" w:cs="Calibri"/>
+          <w:b/>
+          <w:bCs/>
+          <w:sz w:val="22"/>
           <w:szCs w:val="22"/>
         </w:rPr>
         <w:t xml:space="preserve">Publications (First Author): </w:t>
@@ -3348,105 +3152,98 @@
     </w:p>
     <w:p>
       <w:pPr>
-        <w:spacing w:after="0" w:line="240" w:lineRule="auto"/>
+        <w:spacing w:after="40" w:line="240" w:lineRule="auto"/>
         <w:ind w:left="360"/>
       </w:pPr>
       <w:r>
         <w:rPr>
-          <w:rFonts w:eastAsia="맑은 고딕" w:ascii="맑은 고딕" w:hAnsi="맑은 고딕" w:cs="맑은 고딕"/>
-          <w:sz w:val="20"/>
+          <w:rFonts w:eastAsia="맑은 고딕"/>
         </w:rPr>
         <w:t>• 국방 데이터 확보를 위한 생성모델 Latent Diffusion 실험  |  국방기술학회 (2023) 우수논문상</w:t>
       </w:r>
     </w:p>
     <w:p>
       <w:pPr>
-        <w:spacing w:after="0" w:line="240" w:lineRule="auto"/>
+        <w:spacing w:after="40" w:line="240" w:lineRule="auto"/>
         <w:ind w:left="360"/>
       </w:pPr>
       <w:r>
         <w:rPr>
-          <w:rFonts w:eastAsia="맑은 고딕" w:ascii="맑은 고딕" w:hAnsi="맑은 고딕" w:cs="맑은 고딕"/>
-          <w:sz w:val="20"/>
+          <w:rFonts w:eastAsia="맑은 고딕"/>
         </w:rPr>
         <w:t>• GAN을 활용한 데이터 생성 연구 동향  |  한국항공우주학회 (2023)</w:t>
       </w:r>
     </w:p>
     <w:p>
       <w:pPr>
-        <w:spacing w:after="0" w:line="240" w:lineRule="auto"/>
+        <w:spacing w:after="40" w:line="240" w:lineRule="auto"/>
         <w:ind w:left="360"/>
       </w:pPr>
       <w:r>
         <w:rPr>
-          <w:rFonts w:eastAsia="맑은 고딕" w:ascii="맑은 고딕" w:hAnsi="맑은 고딕" w:cs="맑은 고딕"/>
-          <w:sz w:val="20"/>
+          <w:rFonts w:eastAsia="맑은 고딕"/>
         </w:rPr>
         <w:t>• 센서 퓨전 기반의 Trans-Unet을 활용한 2차원 시맨틱 세그멘테이션의 3차원적 해석  |  한국자동차공학회 (2023)</w:t>
       </w:r>
     </w:p>
     <w:p>
       <w:pPr>
-        <w:spacing w:after="0" w:line="240" w:lineRule="auto"/>
+        <w:spacing w:after="40" w:line="240" w:lineRule="auto"/>
         <w:ind w:left="360"/>
       </w:pPr>
       <w:r>
         <w:rPr>
-          <w:rFonts w:eastAsia="맑은 고딕" w:ascii="맑은 고딕" w:hAnsi="맑은 고딕" w:cs="맑은 고딕"/>
-          <w:sz w:val="20"/>
+          <w:rFonts w:eastAsia="맑은 고딕"/>
         </w:rPr>
         <w:t>• 자율 주행 도메인의 3차원 시맨틱 세그멘테이션을 위한 센서 퓨전 기반의 Trans-Unet  |  한국자동차공학회 (2022)</w:t>
       </w:r>
     </w:p>
     <w:p>
       <w:pPr>
-        <w:spacing w:after="0" w:line="240" w:lineRule="auto"/>
+        <w:spacing w:after="40" w:line="240" w:lineRule="auto"/>
         <w:ind w:left="360"/>
       </w:pPr>
       <w:r>
         <w:rPr>
-          <w:rFonts w:eastAsia="맑은 고딕" w:ascii="맑은 고딕" w:hAnsi="맑은 고딕" w:cs="맑은 고딕"/>
-          <w:sz w:val="20"/>
+          <w:rFonts w:eastAsia="맑은 고딕"/>
         </w:rPr>
         <w:t>• 비정형, 정형 데이터의 이미지 학습을 활용한 시장예측  |  스마트미디어학회 (2021)</w:t>
       </w:r>
     </w:p>
     <w:p>
       <w:pPr>
-        <w:spacing w:after="0" w:line="240" w:lineRule="auto"/>
+        <w:spacing w:after="40" w:line="240" w:lineRule="auto"/>
         <w:ind w:left="360"/>
       </w:pPr>
       <w:r>
         <w:rPr>
-          <w:rFonts w:eastAsia="맑은 고딕" w:ascii="맑은 고딕" w:hAnsi="맑은 고딕" w:cs="맑은 고딕"/>
-          <w:sz w:val="20"/>
+          <w:rFonts w:eastAsia="맑은 고딕"/>
         </w:rPr>
         <w:t>• Trend of Malware Detection Using Deep Learning  |  ACM International Conference (2018)</w:t>
       </w:r>
     </w:p>
     <w:p>
       <w:pPr>
-        <w:spacing w:after="0" w:line="240" w:lineRule="auto"/>
+        <w:spacing w:after="40" w:line="240" w:lineRule="auto"/>
         <w:ind w:left="360"/>
       </w:pPr>
       <w:r>
         <w:rPr>
-          <w:rFonts w:eastAsia="맑은 고딕" w:ascii="맑은 고딕" w:hAnsi="맑은 고딕" w:cs="맑은 고딕"/>
-          <w:sz w:val="20"/>
+          <w:rFonts w:eastAsia="맑은 고딕"/>
         </w:rPr>
         <w:t>• Deep Learning을 활용한 악성코드 탐지 방법 동향 분석  |  한국정보기술학회 (2018)</w:t>
       </w:r>
     </w:p>
     <w:p>
       <w:pPr>
-        <w:spacing w:after="0" w:line="240" w:lineRule="auto"/>
-      </w:pPr>
-      <w:r>
-        <w:rPr>
-          <w:rFonts w:ascii="맑은 고딕" w:eastAsia="맑은 고딕" w:hAnsi="맑은 고딕" w:cs="맑은 고딕"/>
-          <w:b/>
-          <w:bCs/>
-          <w:sz w:val="20"/>
+        <w:spacing w:after="40" w:line="240" w:lineRule="auto"/>
+      </w:pPr>
+      <w:r>
+        <w:rPr>
+          <w:rFonts w:ascii="Calibri" w:eastAsia="맑은 고딕" w:hAnsi="Calibri" w:cs="Calibri"/>
+          <w:b/>
+          <w:bCs/>
+          <w:sz w:val="22"/>
           <w:szCs w:val="22"/>
         </w:rPr>
         <w:t xml:space="preserve">Patents (First Inventor): </w:t>
@@ -3454,48 +3251,46 @@
     </w:p>
     <w:p>
       <w:pPr>
-        <w:spacing w:after="0" w:line="240" w:lineRule="auto"/>
+        <w:spacing w:after="40" w:line="240" w:lineRule="auto"/>
         <w:ind w:left="360"/>
       </w:pPr>
       <w:r>
         <w:rPr>
-          <w:rFonts w:eastAsia="맑은 고딕" w:ascii="맑은 고딕" w:hAnsi="맑은 고딕" w:cs="맑은 고딕"/>
-          <w:sz w:val="20"/>
+          <w:rFonts w:eastAsia="맑은 고딕"/>
         </w:rPr>
         <w:t>• Sensor Fusion-based Semantic Segmentation Method  |  Reg. No. 1025382250000</w:t>
       </w:r>
     </w:p>
     <w:p>
       <w:pPr>
-        <w:spacing w:after="0" w:line="240" w:lineRule="auto"/>
+        <w:spacing w:after="40" w:line="240" w:lineRule="auto"/>
         <w:ind w:left="360"/>
       </w:pPr>
       <w:r>
         <w:rPr>
-          <w:rFonts w:eastAsia="맑은 고딕" w:ascii="맑은 고딕" w:hAnsi="맑은 고딕" w:cs="맑은 고딕"/>
-          <w:sz w:val="20"/>
+          <w:rFonts w:eastAsia="맑은 고딕"/>
         </w:rPr>
         <w:t>• 3D Interpretation Method for Semantic Segmentation  |  Reg. No. 1025382310000</w:t>
       </w:r>
     </w:p>
     <w:p>
       <w:pPr>
-        <w:spacing w:after="0" w:line="240" w:lineRule="auto"/>
-      </w:pPr>
-      <w:r>
-        <w:rPr>
-          <w:rFonts w:ascii="맑은 고딕" w:eastAsia="맑은 고딕" w:hAnsi="맑은 고딕" w:cs="맑은 고딕"/>
-          <w:b/>
-          <w:bCs/>
-          <w:sz w:val="20"/>
+        <w:spacing w:after="78" w:line="240" w:lineRule="auto"/>
+      </w:pPr>
+      <w:r>
+        <w:rPr>
+          <w:rFonts w:ascii="Calibri" w:eastAsia="맑은 고딕" w:hAnsi="Calibri" w:cs="Calibri"/>
+          <w:b/>
+          <w:bCs/>
+          <w:sz w:val="22"/>
           <w:szCs w:val="22"/>
         </w:rPr>
         <w:t xml:space="preserve">Awards: </w:t>
       </w:r>
       <w:r>
         <w:rPr>
-          <w:rFonts w:ascii="맑은 고딕" w:eastAsia="맑은 고딕" w:hAnsi="맑은 고딕" w:cs="맑은 고딕"/>
-          <w:sz w:val="20"/>
+          <w:rFonts w:ascii="Calibri" w:eastAsia="맑은 고딕" w:hAnsi="Calibri" w:cs="Calibri"/>
+          <w:sz w:val="22"/>
           <w:szCs w:val="22"/>
         </w:rPr>
         <w:t>Outstanding Paper Award – Korea Defense Technology Society (Nov 2023)</w:t>
@@ -3503,7 +3298,7 @@
     </w:p>
     <w:sectPr>
       <w:pgSz w:w="11906" w:h="16838"/>
-      <w:pgMar w:top="1077" w:right="1247" w:bottom="907" w:left="1247" w:header="708" w:footer="708" w:gutter="0"/>
+      <w:pgMar w:top="1077" w:right="1440" w:bottom="1077" w:left="1440" w:header="708" w:footer="708" w:gutter="0"/>
       <w:cols w:space="720"/>
       <w:docGrid w:linePitch="360"/>
     </w:sectPr>

</xml_diff>

<commit_message>
ZipVoice TTFB 수치 정정 — 2292→334ms 대신 1943→985ms
같은 페이지에 붙여둔 데모 스크린샷에는 1943→985가 찍혀 있는데
헤드라인은 2292→334(85.4%)라 서로 어긋났음. 노션 로그를 대조하니
둘은 서로 다른 런이고, 334ms 런은 상태가 '중지됨'(첫 청크만 받고
중단)이라 완주 비교가 아니었음.

양쪽 다 완주한 데모 런(1943ms/342청크·58.0초 → 985ms/364청크·59.4초)을
대표값으로 채택. 334ms는 단일 런이라 대표값에서 제외하고 상세에만
부기. 신버전 TTFB는 첫 문장 합성 시간에 좌우돼 런별 편차가 큼.

Co-Authored-By: Claude Fable 5 <noreply@anthropic.com>
</commit_message>
<xml_diff>
--- a/assets/resume.docx
+++ b/assets/resume.docx
@@ -80,7 +80,7 @@
           <w:rFonts w:eastAsia="맑은 고딕"/>
           <w:b w:val="0"/>
         </w:rPr>
-        <w:t>지금은 AI 모델 추론 서빙을 맡아 기존 TTS 스트리밍 API의 첫 응답을 2.3초에서 0.33초로 줄였고, GPU/CPU 듀얼 엔진 서빙 플랫폼을 단독 설계·구축해 엔진 처리량을 4.5배(0.68→3.09rps) 끌어올렸습니다.</w:t>
+        <w:t>지금은 AI 모델 추론 서빙을 맡아 기존 TTS 스트리밍 API의 첫 응답을 1.9초에서 1.0초로 줄였고, GPU/CPU 듀얼 엔진 서빙 플랫폼을 단독 설계·구축해 엔진 처리량을 4.5배(0.68→3.09rps) 끌어올렸습니다.</w:t>
       </w:r>
     </w:p>
     <w:p>
@@ -323,7 +323,7 @@
           <w:rFonts w:eastAsia="맑은 고딕"/>
           <w:b w:val="0"/>
         </w:rPr>
-        <w:t>• 기존 TTS(ZipVoice 기반)의 TTFB 2.3초가 실시간 상담에 부적합해, 기존 담당자에게 인수인계 받아 스트리밍 API 리팩토링을 담당 (기여도 100%)</w:t>
+        <w:t>• 기존 TTS(ZipVoice 기반)의 TTFB가 텍스트 길이에 비례해 늘어나 실시간 상담에 부적합했고, 기존 담당자에게 인수인계 받아 스트리밍 API 리팩토링을 담당 (기여도 100%)</w:t>
       </w:r>
     </w:p>
     <w:p>
@@ -359,7 +359,7 @@
           <w:rFonts w:eastAsia="맑은 고딕"/>
           <w:b w:val="0"/>
         </w:rPr>
-        <w:t>• 성과: TTFB 2292ms → 334ms (85.4% 단축, 6.85배 개선 — 측정 로그 기록) | Python, FastAPI, Streaming API, ZipVoice</w:t>
+        <w:t>• 성과: 같은 텍스트 완주 비교에서 TTFB 1,943ms → 985ms (약 2배 단축, 데모 페이지 콘솔 로그) | Python, FastAPI, Streaming API, ZipVoice</w:t>
       </w:r>
     </w:p>
     <w:p>

</xml_diff>